<commit_message>
Add public repository availability statement
</commit_message>
<xml_diff>
--- a/manuscript/main_manuscript.docx
+++ b/manuscript/main_manuscript.docx
@@ -10484,7 +10484,7 @@
         <w:pStyle w:val="FirstParagraph"/>
       </w:pPr>
       <w:r>
-        <w:t xml:space="preserve">The source-data manifest, processed analysis tables, and reproducibility notes are provided with this submission package. A public repository or archival DOI should be supplied at submission or revision if required by the journal.</w:t>
+        <w:t>The source-data manifest, processed analysis tables, manuscript files, figures, and reproducibility notes are available in a public GitHub repository: https://github.com/morningLxj/spatial-immunotherapy-prediction. The repository includes a machine-readable source-data archive and claim-to-source mapping for reviewer inspection. It is intended to support traceability and source-data verification, not to provide a clinical implementation package or a complete raw-data-to-figure re-analysis pipeline.</w:t>
       </w:r>
     </w:p>
     <w:p>
@@ -10492,7 +10492,7 @@
         <w:pStyle w:val="BodyText"/>
       </w:pPr>
       <w:r>
-        <w:t xml:space="preserve">Analysis code and reproducibility notes should be deposited in a public version-controlled repository or archived with a DOI before final publication. The current submission package includes source-data manifests and processed tables sufficient for editorial and reviewer inspection.</w:t>
+        <w:t>Repository integrity checks and reproducibility notes are available at https://github.com/morningLxj/spatial-immunotherapy-prediction. The included script verifies the expected source-data archive, lists its contents, and writes a source-data inventory. Public-data acquisition and complete re-analysis from raw source repositories should be treated as a separate workflow and, if required by the journal or reviewers, archived as a versioned release before final publication.</w:t>
       </w:r>
     </w:p>
     <w:p>

</xml_diff>

<commit_message>
Strengthen evidence boundaries for reviewer readiness
</commit_message>
<xml_diff>
--- a/manuscript/main_manuscript.docx
+++ b/manuscript/main_manuscript.docx
@@ -7,7 +7,7 @@
         <w:pStyle w:val="Title"/>
       </w:pPr>
       <w:r>
-        <w:t xml:space="preserve">C1Q/SPP1 Macrophage Spatial Context as a Reproducible Traceability Feature in Non-Small Cell Lung Cancer: A Public Multi-Cohort Cancer-Informatics Evidence Synthesis</w:t>
+        <w:t xml:space="preserve">C1Q/SPP1 Macrophage Spatial Context as a Cross-Dataset Traceability Feature in Non-Small Cell Lung Cancer: A Public Multi-Cohort Cancer-Informatics Evidence Synthesis</w:t>
       </w:r>
     </w:p>
     <w:p>
@@ -17,10 +17,73 @@
     </w:p>
     <w:bookmarkStart w:id="9" w:name="sec:intro"/>
     <w:p>
+      <w:r>
+        <w:rPr>
+          <w:b/>
+        </w:rPr>
+        <w:t>Keywords:</w:t>
+      </w:r>
+      <w:r>
+        <w:t xml:space="preserve"> Non-small cell lung cancer; Cancer informatics; C1Q; SPP1; macrophage context; spatial transcriptomics; reproducibility; traceability feature</w:t>
+      </w:r>
+    </w:p>
+    <w:p>
+      <w:r>
+        <w:rPr>
+          <w:b/>
+        </w:rPr>
+        <w:t>Conclusions:</w:t>
+      </w:r>
+      <w:r>
+        <w:t xml:space="preserve"> C1Q/SPP1 captures a cross-dataset macrophage-spatial context in public NSCLC resources and may serve as a traceability feature for immune-active versus macrophage-compartmentalized tumor-microenvironment states. The findings are hypothesis-generating and require prospective, spatially resolved, and experimental validation before clinical implementation or therapeutic targeting can be considered.</w:t>
+      </w:r>
+    </w:p>
+    <w:p>
+      <w:r>
+        <w:rPr>
+          <w:b/>
+        </w:rPr>
+        <w:t>Results:</w:t>
+      </w:r>
+      <w:r>
+        <w:t xml:space="preserve"> Nested cross-validation identified a stable 95-feature set enriched for immune and macrophage-context signals. C1QA, C1QB, and C1QC showed section-level spatial autocorrelation in patient-limited spatial datasets (Moran's I approximately 0.35-0.39), whereas SPP1 showed stronger spatial clustering (Moran's I = 0.712), consistent with a distinct macrophage-associated compartmentalized context. Retrospective model benchmarking showed statistically detectable but modest prognostic discrimination in TCGA and attenuated external performance in GSE31210; therefore, the model is reported as exploratory score behavior rather than as a clinical prediction tool. The ICB cohorts showed directional response associations, but sample size and tumor-type heterogeneity preclude clinical claims.</w:t>
+      </w:r>
+    </w:p>
+    <w:p>
+      <w:r>
+        <w:rPr>
+          <w:b/>
+        </w:rPr>
+        <w:t>Methods:</w:t>
+      </w:r>
+      <w:r>
+        <w:t xml:space="preserve"> We performed a conservative public-data evidence synthesis centered on the C1Q/SPP1 macrophage axis. Bulk transcriptomic and clinical data from TCGA NSCLC were used for discovery and score-behavior assessment after quality control. External prognostic traceability was evaluated in GSE31210 patients with complete follow-up. Two small NSCLC immune-checkpoint-blockade (ICB) cohorts and one melanoma exploratory ICB cohort were analyzed separately as response-association datasets. Spatial context was assessed using 10x Visium sections and Nanostring CosMx SMI data, with inference emphasized at the patient, section, or sample-contrast level rather than at the spot or single-cell count level. Mendelian-randomization analyses were used for gene prioritization, not as definitive causal or therapeutic evidence.</w:t>
+      </w:r>
+    </w:p>
+    <w:p>
+      <w:r>
+        <w:rPr>
+          <w:b/>
+        </w:rPr>
+        <w:t>Objectives:</w:t>
+      </w:r>
+      <w:r>
+        <w:t xml:space="preserve"> Public cancer-informatics resources provide an opportunity to test whether macrophage-associated complement programs are traceable features of non-small cell lung cancer (NSCLC) tumor-microenvironment context. However, retrospective multi-omics analyses are vulnerable to overinterpretation when prognostic, spatial, and immunotherapy-response signals are presented as clinical tools or mechanistic proof.</w:t>
+      </w:r>
+    </w:p>
+    <w:p>
       <w:pPr>
         <w:pStyle w:val="Heading1"/>
       </w:pPr>
       <w:r>
+        <w:t>Abstract</w:t>
+      </w:r>
+    </w:p>
+    <w:p>
+      <w:pPr>
+        <w:pStyle w:val="Heading1"/>
+      </w:pPr>
+      <w:r>
         <w:t xml:space="preserve">Introduction</w:t>
       </w:r>
     </w:p>
@@ -41,7 +104,7 @@
         <w:t xml:space="preserve"> </w:t>
       </w:r>
       <w:r>
-        <w:t xml:space="preserve">. Spatial transcriptomics and single-cell technologies now make it possible to examine whether immune programs visible in bulk data also map to reproducible spatial contexts</w:t>
+        <w:t xml:space="preserve">. Spatial transcriptomics and single-cell technologies now make it possible to examine whether immune programs visible in bulk data also map to spatial contexts that can be traced across available datasets</w:t>
       </w:r>
       <w:r>
         <w:t xml:space="preserve"> </w:t>
@@ -107,7 +170,7 @@
         <w:t xml:space="preserve">SPP1</w:t>
       </w:r>
       <w:r>
-        <w:t xml:space="preserve">-positive macrophage programs, by contrast, are often linked to stromal remodeling and immune exclusion. These observations motivate a narrower and more testable question: can the C1Q/SPP1 macrophage axis be traced reproducibly across public NSCLC transcriptomic, spatial, and clinical resources?</w:t>
+        <w:t xml:space="preserve">-positive macrophage programs, by contrast, are often linked to stromal remodeling and immune exclusion. These observations motivate a narrower and more testable question: can the C1Q/SPP1 macrophage axis be traced across public NSCLC transcriptomic, spatial, and clinical resources without overstating clinical or mechanistic certainty?</w:t>
       </w:r>
     </w:p>
     <w:p>
@@ -115,7 +178,7 @@
         <w:pStyle w:val="BodyText"/>
       </w:pPr>
       <w:r>
-        <w:t xml:space="preserve">The present study is intentionally framed as a public cancer-informatics evidence synthesis. We do not claim to establish a clinical diagnostic assay, a treatment-selection tool, or a definitive mechanism. Instead, we evaluate whether C1Q/SPP1 behaves as a reproducible traceability feature linking macrophage context, spatial organization, retrospective survival associations, and exploratory immunotherapy-response signals. This conservative framing separates data-supported observations from hypotheses that require prospective and experimental validation.</w:t>
+        <w:t xml:space="preserve">The present study is intentionally framed as a public cancer-informatics evidence synthesis. We do not claim to establish a clinical diagnostic assay, a treatment-selection tool, or a definitive mechanism. Instead, we evaluate whether C1Q/SPP1 behaves as a traceability feature linking macrophage context, spatial organization, retrospective survival associations, and exploratory immunotherapy-response signals. This conservative framing separates data-supported observations from hypotheses that require prospective and experimental validation.</w:t>
       </w:r>
     </w:p>
     <w:bookmarkEnd w:id="9"/>
@@ -148,7 +211,7 @@
         <w:t xml:space="preserve"> </w:t>
       </w:r>
       <w:r>
-        <w:t xml:space="preserve">. The evidence hierarchy was defined before interpretation: (1) TCGA NSCLC was used for discovery and internal model-behavior assessment; (2) GEO cohorts were used for external prognostic traceability where complete follow-up was available; (3) Visium and CosMx SMI datasets were used to evaluate spatial context, with inference emphasized at the patient, section, or paired-contrast level; and (4) immunotherapy-treated cohorts were treated as exploratory response-association datasets because of small sample sizes and tumor-type heterogeneity (Figure</w:t>
+        <w:t xml:space="preserve">. The evidence hierarchy was defined before interpretation: (1) TCGA NSCLC was used for discovery and internal score-behavior assessment; (2) GEO cohorts were used for external prognostic traceability where complete follow-up was available; (3) Visium and CosMx SMI datasets were used to evaluate spatial context, with inference emphasized at the patient, section, or paired-contrast level; and (4) immunotherapy-treated cohorts were treated as exploratory response-association datasets because of small sample sizes and tumor-type heterogeneity (Figure</w:t>
       </w:r>
       <w:r>
         <w:t xml:space="preserve"> </w:t>
@@ -213,7 +276,7 @@
         <w:t xml:space="preserve"> </w:t>
       </w:r>
       <w:r>
-        <w:t xml:space="preserve">For spatially resolved context analysis, we incorporated 10x Genomics Visium and Nanostring CosMx SMI datasets. Quality control, normalization, and platform-specific processing are described in the Supplementary Methods and source-data manifest.</w:t>
+        <w:t xml:space="preserve">For spatially resolved context analysis, we incorporated 10x Genomics Visium and Nanostring CosMx SMI datasets. Quality control, normalization, and platform-specific processing are described in the Supplementary Methods and source-data manifest. Spatial inference was deliberately anchored to patient, section, or sample-contrast units; spots and cells were treated as measurement units within those samples rather than as independent biological replicates.</w:t>
       </w:r>
     </w:p>
     <w:p>
@@ -284,7 +347,7 @@
         <w:t xml:space="preserve"> </w:t>
       </w:r>
       <w:r>
-        <w:t xml:space="preserve">Clinical and expression data were retrieved from GEO. GSE31210 contained 226 lung adenocarcinoma samples after exclusion of non-tumor controls and 178 patients with complete follow-up for survival analysis. GSE91061, GSE126044, and GSE135222 were used only for exploratory immunotherapy-response association; GSE91061 was interpreted as cross-tumor support because it is not an NSCLC-only cohort.</w:t>
+        <w:t xml:space="preserve">Clinical and expression data were retrieved from GEO. GSE31210 contained 226 lung adenocarcinoma samples after exclusion of non-tumor controls and 178 patients with complete follow-up for survival analysis. GSE126044 and GSE135222 were treated as small NSCLC ICB response-association cohorts, whereas GSE91061 was treated as a melanoma exploratory cohort only. These datasets were not pooled as confirmatory NSCLC immunotherapy validation.</w:t>
       </w:r>
     </w:p>
     <w:bookmarkEnd w:id="10"/>
@@ -303,7 +366,7 @@
         <w:pStyle w:val="FirstParagraph"/>
       </w:pPr>
       <w:r>
-        <w:t xml:space="preserve">We implemented a multi-stage traceability framework to evaluate whether C1Q/SPP1 macrophage context is reproducible across data layers:</w:t>
+        <w:t xml:space="preserve">We implemented a multi-stage traceability framework to evaluate whether C1Q/SPP1 macrophage context is traceable across data layers:</w:t>
       </w:r>
     </w:p>
     <w:p>
@@ -321,7 +384,7 @@
         <w:t xml:space="preserve"> </w:t>
       </w:r>
       <w:r>
-        <w:t xml:space="preserve">Mendelian randomization (MR) was used to prioritize genes with genetically supported associations</w:t>
+        <w:t xml:space="preserve">Mendelian randomization (MR) was used to prioritize genes with expression-linked immune-context associations</w:t>
       </w:r>
       <w:r>
         <w:t xml:space="preserve"> </w:t>
@@ -348,7 +411,7 @@
           <w:b/>
           <w:bCs/>
         </w:rPr>
-        <w:t xml:space="preserve">Phase 2: Retrospective model-behavior assessment:</w:t>
+        <w:t xml:space="preserve">Phase 2: Retrospective score-behavior assessment:</w:t>
       </w:r>
       <w:r>
         <w:t xml:space="preserve"> </w:t>
@@ -375,6 +438,356 @@
         <w:t xml:space="preserve">A C1Q/SPP1-centered scoring approach was used to evaluate macrophage-associated spatial organization and CD8-marker context in Visium and CosMx data.</w:t>
       </w:r>
     </w:p>
+    <w:tbl>
+      <w:tblPr>
+        <w:tblStyle w:val="Table"/>
+        <w:tblW w:type="auto" w:w="0"/>
+        <w:tblLook w:firstRow="1" w:lastRow="0" w:firstColumn="0" w:lastColumn="0" w:noHBand="0" w:noVBand="0" w:val="0020"/>
+      </w:tblPr>
+      <w:tblGrid>
+        <w:gridCol w:w="1980"/>
+        <w:gridCol w:w="1980"/>
+        <w:gridCol w:w="1980"/>
+        <w:gridCol w:w="1980"/>
+      </w:tblGrid>
+      <w:tr>
+        <w:trPr>
+          <w:tblHeader w:val="on"/>
+        </w:trPr>
+        <w:tc>
+          <w:tcPr/>
+          <w:p>
+            <w:pPr>
+              <w:pStyle w:val="Compact"/>
+              <w:jc w:val="left"/>
+            </w:pPr>
+            <w:r>
+              <w:t xml:space="preserve">Claim domain</w:t>
+            </w:r>
+          </w:p>
+        </w:tc>
+        <w:tc>
+          <w:tcPr/>
+          <w:p>
+            <w:pPr>
+              <w:pStyle w:val="Compact"/>
+              <w:jc w:val="left"/>
+            </w:pPr>
+            <w:r>
+              <w:t xml:space="preserve">Evidence layer</w:t>
+            </w:r>
+          </w:p>
+        </w:tc>
+        <w:tc>
+          <w:tcPr/>
+          <w:p>
+            <w:pPr>
+              <w:pStyle w:val="Compact"/>
+              <w:jc w:val="left"/>
+            </w:pPr>
+            <w:r>
+              <w:t xml:space="preserve">Supported interpretation</w:t>
+            </w:r>
+          </w:p>
+        </w:tc>
+        <w:tc>
+          <w:tcPr/>
+          <w:p>
+            <w:pPr>
+              <w:pStyle w:val="Compact"/>
+              <w:jc w:val="left"/>
+            </w:pPr>
+            <w:r>
+              <w:t xml:space="preserve">Boundary</w:t>
+            </w:r>
+          </w:p>
+        </w:tc>
+      </w:tr>
+      <w:tr>
+        <w:tc>
+          <w:tcPr/>
+          <w:p>
+            <w:pPr>
+              <w:pStyle w:val="Compact"/>
+              <w:jc w:val="left"/>
+            </w:pPr>
+            <w:r>
+              <w:t xml:space="preserve">C1Q/SPP1 macrophage context</w:t>
+            </w:r>
+          </w:p>
+        </w:tc>
+        <w:tc>
+          <w:tcPr/>
+          <w:p>
+            <w:pPr>
+              <w:pStyle w:val="Compact"/>
+              <w:jc w:val="left"/>
+            </w:pPr>
+            <w:r>
+              <w:t xml:space="preserve">TCGA/GEO transcriptomics, feature stability, immune-context correlations</w:t>
+            </w:r>
+          </w:p>
+        </w:tc>
+        <w:tc>
+          <w:tcPr/>
+          <w:p>
+            <w:pPr>
+              <w:pStyle w:val="Compact"/>
+              <w:jc w:val="left"/>
+            </w:pPr>
+            <w:r>
+              <w:t xml:space="preserve">The axis is traceable across public expression datasets as a macrophage-context feature</w:t>
+            </w:r>
+          </w:p>
+        </w:tc>
+        <w:tc>
+          <w:tcPr/>
+          <w:p>
+            <w:pPr>
+              <w:pStyle w:val="Compact"/>
+              <w:jc w:val="left"/>
+            </w:pPr>
+            <w:r>
+              <w:t xml:space="preserve">Not a diagnostic assay or tumor-specific marker</w:t>
+            </w:r>
+          </w:p>
+        </w:tc>
+      </w:tr>
+      <w:tr>
+        <w:tc>
+          <w:tcPr/>
+          <w:p>
+            <w:pPr>
+              <w:pStyle w:val="Compact"/>
+              <w:jc w:val="left"/>
+            </w:pPr>
+            <w:r>
+              <w:t xml:space="preserve">Spatial organization</w:t>
+            </w:r>
+          </w:p>
+        </w:tc>
+        <w:tc>
+          <w:tcPr/>
+          <w:p>
+            <w:pPr>
+              <w:pStyle w:val="Compact"/>
+              <w:jc w:val="left"/>
+            </w:pPr>
+            <w:r>
+              <w:t xml:space="preserve">Visium sections from one patient and CosMx sections from five NSCLC patients</w:t>
+            </w:r>
+          </w:p>
+        </w:tc>
+        <w:tc>
+          <w:tcPr/>
+          <w:p>
+            <w:pPr>
+              <w:pStyle w:val="Compact"/>
+              <w:jc w:val="left"/>
+            </w:pPr>
+            <w:r>
+              <w:t xml:space="preserve">C1Q and SPP1 show non-random spatial patterns in the available sections</w:t>
+            </w:r>
+          </w:p>
+        </w:tc>
+        <w:tc>
+          <w:tcPr/>
+          <w:p>
+            <w:pPr>
+              <w:pStyle w:val="Compact"/>
+              <w:jc w:val="left"/>
+            </w:pPr>
+            <w:r>
+              <w:t xml:space="preserve">Spots/cells are measurement units, not independent biological replicates; patient-level validation remains limited</w:t>
+            </w:r>
+          </w:p>
+        </w:tc>
+      </w:tr>
+      <w:tr>
+        <w:tc>
+          <w:tcPr/>
+          <w:p>
+            <w:pPr>
+              <w:pStyle w:val="Compact"/>
+              <w:jc w:val="left"/>
+            </w:pPr>
+            <w:r>
+              <w:t xml:space="preserve">MR-based prioritization</w:t>
+            </w:r>
+          </w:p>
+        </w:tc>
+        <w:tc>
+          <w:tcPr/>
+          <w:p>
+            <w:pPr>
+              <w:pStyle w:val="Compact"/>
+              <w:jc w:val="left"/>
+            </w:pPr>
+            <w:r>
+              <w:t xml:space="preserve">eQTL-based two-sample MR with sensitivity diagnostics</w:t>
+            </w:r>
+          </w:p>
+        </w:tc>
+        <w:tc>
+          <w:tcPr/>
+          <w:p>
+            <w:pPr>
+              <w:pStyle w:val="Compact"/>
+              <w:jc w:val="left"/>
+            </w:pPr>
+            <w:r>
+              <w:t xml:space="preserve">MR highlights candidates for follow-up under instrumental-variable assumptions</w:t>
+            </w:r>
+          </w:p>
+        </w:tc>
+        <w:tc>
+          <w:tcPr/>
+          <w:p>
+            <w:pPr>
+              <w:pStyle w:val="Compact"/>
+              <w:jc w:val="left"/>
+            </w:pPr>
+            <w:r>
+              <w:t xml:space="preserve">Not causal proof, target validation, or evidence of therapeutic actionability</w:t>
+            </w:r>
+          </w:p>
+        </w:tc>
+      </w:tr>
+      <w:tr>
+        <w:tc>
+          <w:tcPr/>
+          <w:p>
+            <w:pPr>
+              <w:pStyle w:val="Compact"/>
+              <w:jc w:val="left"/>
+            </w:pPr>
+            <w:r>
+              <w:t xml:space="preserve">Retrospective outcome score</w:t>
+            </w:r>
+          </w:p>
+        </w:tc>
+        <w:tc>
+          <w:tcPr/>
+          <w:p>
+            <w:pPr>
+              <w:pStyle w:val="Compact"/>
+              <w:jc w:val="left"/>
+            </w:pPr>
+            <w:r>
+              <w:t xml:space="preserve">TCGA internal assessment and GSE31210 traceability</w:t>
+            </w:r>
+          </w:p>
+        </w:tc>
+        <w:tc>
+          <w:tcPr/>
+          <w:p>
+            <w:pPr>
+              <w:pStyle w:val="Compact"/>
+              <w:jc w:val="left"/>
+            </w:pPr>
+            <w:r>
+              <w:t xml:space="preserve">The feature set carries modest outcome-linked signal and can be used descriptively</w:t>
+            </w:r>
+          </w:p>
+        </w:tc>
+        <w:tc>
+          <w:tcPr/>
+          <w:p>
+            <w:pPr>
+              <w:pStyle w:val="Compact"/>
+              <w:jc w:val="left"/>
+            </w:pPr>
+            <w:r>
+              <w:t xml:space="preserve">No locked clinical cutoff, no prospective validation, and no treatment-selection claim</w:t>
+            </w:r>
+          </w:p>
+        </w:tc>
+      </w:tr>
+      <w:tr>
+        <w:tc>
+          <w:tcPr/>
+          <w:p>
+            <w:pPr>
+              <w:pStyle w:val="Compact"/>
+              <w:jc w:val="left"/>
+            </w:pPr>
+            <w:r>
+              <w:t xml:space="preserve">ICB response association</w:t>
+            </w:r>
+          </w:p>
+        </w:tc>
+        <w:tc>
+          <w:tcPr/>
+          <w:p>
+            <w:pPr>
+              <w:pStyle w:val="Compact"/>
+              <w:jc w:val="left"/>
+            </w:pPr>
+            <w:r>
+              <w:t xml:space="preserve">Two small NSCLC ICB cohorts and one melanoma exploratory cohort</w:t>
+            </w:r>
+          </w:p>
+        </w:tc>
+        <w:tc>
+          <w:tcPr/>
+          <w:p>
+            <w:pPr>
+              <w:pStyle w:val="Compact"/>
+              <w:jc w:val="left"/>
+            </w:pPr>
+            <w:r>
+              <w:t xml:space="preserve">Directional response-associated separation is observed in small cohorts</w:t>
+            </w:r>
+          </w:p>
+        </w:tc>
+        <w:tc>
+          <w:tcPr/>
+          <w:p>
+            <w:pPr>
+              <w:pStyle w:val="Compact"/>
+              <w:jc w:val="left"/>
+            </w:pPr>
+            <w:r>
+              <w:t xml:space="preserve">Not NSCLC ICB validation and not evidence of superiority over PD-L1, TMB, or clinical baselines</w:t>
+            </w:r>
+          </w:p>
+        </w:tc>
+      </w:tr>
+      <w:tr>
+        <w:tc>
+          <w:tcPr/>
+          <w:p>
+            <w:pPr>
+              <w:pStyle w:val="Compact"/>
+            </w:pPr>
+          </w:p>
+        </w:tc>
+        <w:tc>
+          <w:tcPr/>
+          <w:p>
+            <w:pPr>
+              <w:pStyle w:val="Compact"/>
+            </w:pPr>
+          </w:p>
+        </w:tc>
+        <w:tc>
+          <w:tcPr/>
+          <w:p>
+            <w:pPr>
+              <w:pStyle w:val="Compact"/>
+            </w:pPr>
+          </w:p>
+        </w:tc>
+        <w:tc>
+          <w:tcPr/>
+          <w:p>
+            <w:pPr>
+              <w:pStyle w:val="Compact"/>
+            </w:pPr>
+          </w:p>
+        </w:tc>
+      </w:tr>
+    </w:tbl>
     <w:bookmarkEnd w:id="12"/>
     <w:bookmarkStart w:id="13" w:name="subsec:neighborhood"/>
     <w:p>
@@ -501,7 +914,7 @@
         <w:pStyle w:val="FirstParagraph"/>
       </w:pPr>
       <w:r>
-        <w:t xml:space="preserve">The TCGA discovery cohort (N=1,038 after quality control) was adequate for exploratory feature discovery and internal model-behavior assessment. External cohorts were smaller and had lower event counts; therefore, external survival and immunotherapy-response results were interpreted as traceability or exploratory association rather than confirmatory validation. No prospective sample-size calculation was possible because the study used public retrospective data.</w:t>
+        <w:t xml:space="preserve">The TCGA discovery cohort (N=1,038 after quality control) was adequate for exploratory feature discovery and internal score-behavior assessment. External cohorts were smaller and had lower event counts; therefore, external survival and immunotherapy-response results were interpreted as traceability or exploratory association rather than confirmatory validation. No prospective sample-size calculation was possible because the study used public retrospective data.</w:t>
       </w:r>
     </w:p>
     <w:bookmarkEnd w:id="17"/>
@@ -791,7 +1204,7 @@
         <w:t xml:space="preserve"> </w:t>
       </w:r>
       <w:r>
-        <w:t xml:space="preserve">R package, as a gene-prioritization layer. MR estimates were interpreted as genetically supported associations under instrumental-variable assumptions, not as proof of spatial mechanism, therapeutic actionability, or clinical utility.</w:t>
+        <w:t xml:space="preserve">R package, as a gene-prioritization layer. MR estimates were interpreted as expression-linked associations under instrumental-variable assumptions, not as proof of spatial mechanism, therapeutic actionability, or clinical utility.</w:t>
       </w:r>
     </w:p>
     <w:p>
@@ -1224,19 +1637,7 @@
         <w:t xml:space="preserve">Exposure and Outcome Definitions</w:t>
       </w:r>
       <w:r>
-        <w:t xml:space="preserve">: In all MR analyses, the exposure was defined as eQTL-mediated gene expression levels in immune-specific contexts, and the outcome was defined as the proportion of immune cell infiltration (e.g., CD8</w:t>
-      </w:r>
-      <w:r>
-        <w:rPr>
-          <w:vertAlign w:val="superscript"/>
-        </w:rPr>
-        <w:t xml:space="preserve">+</w:t>
-      </w:r>
-      <w:r>
-        <w:t xml:space="preserve"> </w:t>
-      </w:r>
-      <w:r>
-        <w:t xml:space="preserve">T-cell density) or specific immune phenotypes in lung cancer tissues.</w:t>
+        <w:t xml:space="preserve">: In all MR analyses, the exposure was defined as eQTL-mediated gene-expression proxies from available summary-statistic resources. Outcomes were immune-context phenotypes or immune-infiltration proxies derived from lung-cancer resources where available. These outcomes should not be interpreted as directly measured single-cell densities or spatial phenotypes.</w:t>
       </w:r>
     </w:p>
     <w:p>
@@ -1244,7 +1645,7 @@
         <w:pStyle w:val="BodyText"/>
       </w:pPr>
       <w:r>
-        <w:t xml:space="preserve">Detailed MR diagnostic parameters and leave-one-out sensitivity plots are provided in Supplementary Table S11 and Supplementary Figures S9–S10. Candidates with pleiotropy, heterogeneity, weak instruments, or bidirectional signals were interpreted cautiously.</w:t>
+        <w:t xml:space="preserve">Detailed MR diagnostic parameters and leave-one-out sensitivity plots are provided in Supplementary Table S11 and Supplementary Figures S9–S10. Very small MR P-values were interpreted as ranking evidence within the analytic pipeline rather than as proportional evidence of effect certainty. Candidates with pleiotropy, heterogeneity, weak instruments, limited colocalization support, or bidirectional signals were interpreted cautiously.</w:t>
       </w:r>
     </w:p>
     <w:bookmarkEnd w:id="19"/>
@@ -1262,13 +1663,7 @@
         <w:pStyle w:val="FirstParagraph"/>
       </w:pPr>
       <w:r>
-        <w:t xml:space="preserve">Recent studies have demonstrated the utility of deep learning in spatial transcriptomics</w:t>
-      </w:r>
-      <w:r>
-        <w:t xml:space="preserve"> </w:t>
-      </w:r>
-      <w:r>
-        <w:t xml:space="preserve">.</w:t>
+        <w:t xml:space="preserve">Spatial analyses were designed to test whether C1Q/SPP1-associated expression showed non-random local structure in the available tissue sections. Because the spatial datasets contained few independent patients, all spatial statistics were interpreted as descriptive spatial-context summaries.</w:t>
       </w:r>
     </w:p>
     <w:bookmarkStart w:id="20" w:name="spatial-autocorrelation-analysis"/>
@@ -1461,7 +1856,7 @@
         <w:pStyle w:val="Heading2"/>
       </w:pPr>
       <w:r>
-        <w:t xml:space="preserve">Machine Learning Model Development and Evaluation</w:t>
+        <w:t xml:space="preserve">Retrospective Score Construction and Evaluation</w:t>
       </w:r>
     </w:p>
     <w:p>
@@ -1469,7 +1864,7 @@
         <w:pStyle w:val="FirstParagraph"/>
       </w:pPr>
       <w:r>
-        <w:t xml:space="preserve">We systematically evaluated seven machine learning algorithms for retrospective survival modeling: AdaBoost, Random Forest, XGBoost, Logistic Regression, Support Vector Machine (SVM), Soft Voting ensemble, and LASSO Cox Regression. All models were trained on the TCGA cohort using the 95 core features identified through nested CV.</w:t>
+        <w:t xml:space="preserve">We benchmarked eleven candidate supervised algorithms or model families for retrospective survival-associated score behavior: AdaBoost, Random Forest, XGBoost, Logistic Regression, Support Vector Machine (SVM), Soft Voting ensemble, LASSO Cox Regression, Gradient Boosting, Naive Bayes, K-Nearest Neighbors, and Decision Tree. All models were trained on the TCGA cohort using the 95 core features identified through nested CV. The purpose was to assess whether the feature set carried outcome-linked signal, not to establish a deployable prediction model.</w:t>
       </w:r>
     </w:p>
     <w:bookmarkStart w:id="25" w:name="X9b8a486a10c1f9fcbfdbb3e51b5494a6b31c15d"/>
@@ -1712,7 +2107,7 @@
         </w:numPr>
       </w:pPr>
       <w:r>
-        <w:t xml:space="preserve">Calibration: Calibration plots with Hosmer-Lemeshow test</w:t>
+        <w:t xml:space="preserve">Score calibration: Exploratory calibration summaries where endpoint format allowed</w:t>
       </w:r>
     </w:p>
     <w:p>
@@ -1723,7 +2118,7 @@
         </w:numPr>
       </w:pPr>
       <w:r>
-        <w:t xml:space="preserve">Risk stratification: Hazard ratios and Kaplan-Meier survival curves</w:t>
+        <w:t xml:space="preserve">Score-group separation: Hazard ratios and Kaplan-Meier survival curves using descriptive median splits</w:t>
       </w:r>
     </w:p>
     <w:p>
@@ -1771,7 +2166,7 @@
         <w:pStyle w:val="FirstParagraph"/>
       </w:pPr>
       <w:r>
-        <w:t xml:space="preserve">Model performance was assessed using multiple retrospective metrics:</w:t>
+        <w:t xml:space="preserve">Score behavior was assessed using multiple retrospective metrics:</w:t>
       </w:r>
     </w:p>
     <w:p>
@@ -1851,7 +2246,7 @@
         <w:pStyle w:val="FirstParagraph"/>
       </w:pPr>
       <w:r>
-        <w:t xml:space="preserve">Time-dependent ROC curves were generated for 1-year, 3-year, and 5-year survival predictions. Risk scores were calculated for each patient, and the cohort was stratified into high-risk and low-risk groups using the median risk score as a descriptive cutoff.</w:t>
+        <w:t xml:space="preserve">Time-dependent ROC curves were generated for 1-year, 3-year, and 5-year survival endpoints. Risk scores were calculated for each patient, and the cohort was grouped into high-score and low-score groups using the median risk score as a descriptive cutoff. This cutoff was not proposed for clinical use.</w:t>
       </w:r>
     </w:p>
     <w:bookmarkEnd w:id="27"/>
@@ -2182,7 +2577,7 @@
     </w:p>
     <w:bookmarkEnd w:id="32"/>
     <w:bookmarkEnd w:id="33"/>
-    <w:bookmarkStart w:id="46" w:name="sec:results"/>
+    <w:bookmarkStart w:id="45" w:name="sec:results"/>
     <w:p>
       <w:pPr>
         <w:pStyle w:val="Heading1"/>
@@ -2268,10 +2663,7 @@
         </w:r>
       </w:hyperlink>
       <w:r>
-        <w:t xml:space="preserve"> </w:t>
-      </w:r>
-      <w:r>
-        <w:t xml:space="preserve">and Supplementary Table S8.</w:t>
+        <w:t xml:space="preserve">; cohort accounting and source-data traceability are documented in the public source-data manifest.</w:t>
       </w:r>
     </w:p>
     <w:tbl>
@@ -5184,7 +5576,7 @@
         </m:r>
       </m:oMath>
       <w:r>
-        <w:t xml:space="preserve">60% selection frequency (Figure 2C, Figure S2, Supplementary Table S4). These features were used as a stability-prioritized set for downstream exploratory modeling.</w:t>
+        <w:t xml:space="preserve">60% selection frequency (Supplementary Figure S2, Supplementary Table S4). These features were used as a stability-prioritized set for downstream exploratory score construction.</w:t>
       </w:r>
     </w:p>
     <w:p>
@@ -5269,7 +5661,7 @@
         <w:pStyle w:val="FirstParagraph"/>
       </w:pPr>
       <w:r>
-        <w:t xml:space="preserve">Feature selection stability analysis confirmed clear separation between highly stable (frequency = 5/5) and less consistent features (Figure S2A).</w:t>
+        <w:t xml:space="preserve">Feature selection stability analysis confirmed clear separation between highly stable (frequency = 5/5) and less consistent features (Supplementary Figure S2A).</w:t>
       </w:r>
     </w:p>
     <w:bookmarkEnd w:id="35"/>
@@ -5279,7 +5671,7 @@
         <w:pStyle w:val="Heading2"/>
       </w:pPr>
       <w:r>
-        <w:t xml:space="preserve">Mendelian Randomization Prioritizes a Reproducible Gene Set in NSCLC</w:t>
+        <w:t xml:space="preserve">Mendelian Randomization Prioritizes a Candidate Gene Set in NSCLC</w:t>
       </w:r>
     </w:p>
     <w:p>
@@ -5297,27 +5689,24 @@
           <w:b/>
           <w:bCs/>
         </w:rPr>
-        <w:t xml:space="preserve">198 genes as genetically supported candidates</w:t>
-      </w:r>
-      <w:r>
-        <w:t xml:space="preserve"> </w:t>
-      </w:r>
-      <w:r>
-        <w:t xml:space="preserve">associated with lung cancer immune characteristics (Figure</w:t>
-      </w:r>
-      <w:r>
-        <w:t xml:space="preserve"> </w:t>
-      </w:r>
-      <w:hyperlink w:anchor="fig:3">
+        <w:t xml:space="preserve">198 genes as expression-linked candidates</w:t>
+      </w:r>
+      <w:r>
+        <w:t xml:space="preserve"> </w:t>
+      </w:r>
+      <w:r>
+        <w:t xml:space="preserve">associated with lung-cancer immune-context phenotypes (Figure </w:t>
+      </w:r>
+      <w:hyperlink w:anchor="fig:2">
         <w:r>
           <w:rPr>
             <w:rStyle w:val="Hyperlink"/>
           </w:rPr>
-          <w:t xml:space="preserve">3</w:t>
+          <w:t xml:space="preserve">2</w:t>
         </w:r>
       </w:hyperlink>
       <w:r>
-        <w:t xml:space="preserve">, Figure S3, Figure S9, Supplementary Tables S7 and S11). The diagnostics suggested that some candidates had usable instruments, while others should be treated cautiously because of heterogeneity, pleiotropy, or bidirectional signals. These results are better viewed as a prioritization layer than as definitive causal proof.</w:t>
+        <w:t xml:space="preserve">, Supplementary Figures S9–S10, Supplementary Tables S7 and S11). The diagnostics suggested that some candidates had usable instruments, while others should be treated cautiously because of heterogeneity, pleiotropy, limited colocalization support, or bidirectional signals. These results are better viewed as a prioritization layer than as definitive causal proof.</w:t>
       </w:r>
     </w:p>
     <w:p>
@@ -5394,7 +5783,7 @@
           <w:b/>
           <w:bCs/>
         </w:rPr>
-        <w:t xml:space="preserve">Genetic Associations</w:t>
+        <w:t xml:space="preserve">Expression-linked associations</w:t>
       </w:r>
       <w:r>
         <w:t xml:space="preserve">:</w:t>
@@ -5717,7 +6106,7 @@
         </m:sSup>
       </m:oMath>
       <w:r>
-        <w:t xml:space="preserve">) were among the better-supported associations</w:t>
+        <w:t xml:space="preserve">) were among the better-ranked associations; the extreme P-values were used for prioritization and not interpreted as effect certainty</w:t>
       </w:r>
     </w:p>
     <w:p>
@@ -5763,7 +6152,7 @@
         <w:pStyle w:val="Heading2"/>
       </w:pPr>
       <w:r>
-        <w:t xml:space="preserve">Identification of Spatial C1Q Immune Hotspots</w:t>
+        <w:t xml:space="preserve">Patient-Limited Spatial Mapping of C1Q/SPP1 Context</w:t>
       </w:r>
     </w:p>
     <w:p>
@@ -5775,13 +6164,46 @@
           <w:b/>
           <w:bCs/>
         </w:rPr>
-        <w:t xml:space="preserve">High-resolution spatial mapping reveals reproducible C1Q clustering.</w:t>
-      </w:r>
-      <w:r>
-        <w:t xml:space="preserve"> </w:t>
-      </w:r>
-      <w:r>
-        <w:t xml:space="preserve">Utilizing both 10x Visium and CosMx SMI platforms, we observed that C1Q expression was spatially clustered rather than uniformly distributed within the available TME sections (Figures 4–5, Supplementary Figure S5, Table 3, Supplementary Table S5). C1Q family members exhibited moderate spatial autocorrelation among immune genes:</w:t>
+        <w:t xml:space="preserve">Spatial mapping supports non-random C1Q clustering in the available sections.</w:t>
+      </w:r>
+      <w:r>
+        <w:t xml:space="preserve"> </w:t>
+      </w:r>
+      <w:r>
+        <w:t xml:space="preserve">Utilizing both 10x Visium and CosMx SMI platforms, we observed that C1Q expression was spatially clustered rather than uniformly distributed within the available TME sections (Figures </w:t>
+      </w:r>
+      <w:hyperlink w:anchor="fig:3">
+        <w:r>
+          <w:rPr>
+            <w:rStyle w:val="Hyperlink"/>
+          </w:rPr>
+          <w:t xml:space="preserve">3</w:t>
+        </w:r>
+      </w:hyperlink>
+      <w:r>
+        <w:t xml:space="preserve">–</w:t>
+      </w:r>
+      <w:hyperlink w:anchor="fig:4">
+        <w:r>
+          <w:rPr>
+            <w:rStyle w:val="Hyperlink"/>
+          </w:rPr>
+          <w:t xml:space="preserve">4</w:t>
+        </w:r>
+      </w:hyperlink>
+      <w:r>
+        <w:t xml:space="preserve">, Table </w:t>
+      </w:r>
+      <w:hyperlink w:anchor="tab:spatial_genes">
+        <w:r>
+          <w:rPr>
+            <w:rStyle w:val="Hyperlink"/>
+          </w:rPr>
+          <w:t xml:space="preserve">[tab:spatial_genes]</w:t>
+        </w:r>
+      </w:hyperlink>
+      <w:r>
+        <w:t xml:space="preserve">, Supplementary Table S5). C1Q family members exhibited moderate spatial autocorrelation among immune genes:</w:t>
       </w:r>
     </w:p>
     <w:p>
@@ -5973,7 +6395,18 @@
         </m:sSup>
       </m:oMath>
       <w:r>
-        <w:t xml:space="preserve">; Supplementary Table S6, Figure S6). CD138-positive plasma-cell context was analyzed separately and is not treated as a macrophage marker. These results support a spatial association, but not direct cell-cell signaling.</w:t>
+        <w:t xml:space="preserve">; Figure </w:t>
+      </w:r>
+      <w:hyperlink w:anchor="fig:4">
+        <w:r>
+          <w:rPr>
+            <w:rStyle w:val="Hyperlink"/>
+          </w:rPr>
+          <w:t xml:space="preserve">4</w:t>
+        </w:r>
+      </w:hyperlink>
+      <w:r>
+        <w:t xml:space="preserve">, Supplementary Figure S6, Supplementary Table S6). CD138-positive plasma-cell context was analyzed separately and is not treated as a macrophage marker. These results support a spatial association, but not direct cell-cell signaling.</w:t>
       </w:r>
     </w:p>
     <w:p>
@@ -6063,7 +6496,7 @@
         <w:t xml:space="preserve"> </w:t>
       </w:r>
       <w:r>
-        <w:t xml:space="preserve">= -0.259). This indicates score dependency and module sensitivity, not experimental proof of hotspot collapse.</w:t>
+        <w:t xml:space="preserve">= -0.259). This indicates score dependency and module sensitivity, not experimental proof of biological perturbation.</w:t>
       </w:r>
     </w:p>
     <w:p>
@@ -6177,7 +6610,7 @@
         <w:pStyle w:val="Heading2"/>
       </w:pPr>
       <w:r>
-        <w:t xml:space="preserve">Machine Learning Model Performance and Risk Stratification</w:t>
+        <w:t xml:space="preserve">Retrospective Score Behavior and Outcome Traceability</w:t>
       </w:r>
     </w:p>
     <w:p>
@@ -6189,13 +6622,13 @@
           <w:b/>
           <w:bCs/>
         </w:rPr>
-        <w:t xml:space="preserve">The C1Q/SPP1 feature set showed retrospective survival-associated model behavior.</w:t>
-      </w:r>
-      <w:r>
-        <w:t xml:space="preserve"> </w:t>
-      </w:r>
-      <w:r>
-        <w:t xml:space="preserve">Evaluation of seven machine learning algorithms showed that different algorithms optimized different metrics (Table </w:t>
+        <w:t xml:space="preserve">The C1Q/SPP1 feature set showed retrospective survival-associated score behavior.</w:t>
+      </w:r>
+      <w:r>
+        <w:t xml:space="preserve"> </w:t>
+      </w:r>
+      <w:r>
+        <w:t xml:space="preserve">Evaluation across candidate algorithms showed that different methods optimized different metrics (Table </w:t>
       </w:r>
       <w:hyperlink w:anchor="tab:model_performance">
         <w:r>
@@ -6206,7 +6639,18 @@
         </w:r>
       </w:hyperlink>
       <w:r>
-        <w:t xml:space="preserve">, Figure 2A–B, Supplementary Table S1). AdaBoost was retained as the reference model for downstream description, but it was not uniformly superior across all metrics.</w:t>
+        <w:t xml:space="preserve">, Figure </w:t>
+      </w:r>
+      <w:hyperlink w:anchor="fig:6">
+        <w:r>
+          <w:rPr>
+            <w:rStyle w:val="Hyperlink"/>
+          </w:rPr>
+          <w:t xml:space="preserve">6</w:t>
+        </w:r>
+      </w:hyperlink>
+      <w:r>
+        <w:t xml:space="preserve">A–C, Supplementary Figures S2 and S8, Supplementary Table S1). AdaBoost was retained as the reference score for downstream description, but it was not uniformly superior across all metrics.</w:t>
       </w:r>
     </w:p>
     <w:p>
@@ -6218,7 +6662,7 @@
           <w:b/>
           <w:bCs/>
         </w:rPr>
-        <w:t xml:space="preserve">Key Performance Metrics</w:t>
+        <w:t xml:space="preserve">Key Retrospective Metrics</w:t>
       </w:r>
     </w:p>
     <w:p>
@@ -6292,7 +6736,7 @@
           <w:b/>
           <w:bCs/>
         </w:rPr>
-        <w:t xml:space="preserve">Risk Stratification</w:t>
+        <w:t xml:space="preserve">Score-Group Separation</w:t>
       </w:r>
       <w:r>
         <w:t xml:space="preserve">:</w:t>
@@ -6301,7 +6745,7 @@
         <w:t xml:space="preserve"> </w:t>
       </w:r>
       <w:r>
-        <w:t xml:space="preserve">AdaBoost stratified a TCGA complete-case subset into high-score and low-score groups with different survival outcomes (log-rank</w:t>
+        <w:t xml:space="preserve">AdaBoost separated a TCGA complete-case subset into high-score and low-score groups with different survival outcomes (log-rank</w:t>
       </w:r>
       <w:r>
         <w:t xml:space="preserve"> </w:t>
@@ -6321,7 +6765,18 @@
         </m:r>
       </m:oMath>
       <w:r>
-        <w:t xml:space="preserve">, HR = 1.620, 95% CI: 1.15–2.27). To avoid ambiguity, higher model risk score denotes the adverse-risk direction; C1Q-enriched immune-active context is interpreted separately from the aggregate risk-score direction. Time-dependent ROC showed modest discrimination: 1-year AUC of 0.609, 3-year AUC of 0.611, and 5-year AUC of 0.590 (Figure 6A–B).</w:t>
+        <w:t xml:space="preserve">, HR = 1.620, 95% CI: 1.15–2.27). To avoid ambiguity, higher model risk score denotes the adverse-risk direction; C1Q-enriched immune-active context is interpreted separately from the aggregate risk-score direction. Time-dependent ROC showed modest discrimination: 1-year AUC of 0.609, 3-year AUC of 0.611, and 5-year AUC of 0.590 (Figure </w:t>
+      </w:r>
+      <w:hyperlink w:anchor="fig:6">
+        <w:r>
+          <w:rPr>
+            <w:rStyle w:val="Hyperlink"/>
+          </w:rPr>
+          <w:t xml:space="preserve">6</w:t>
+        </w:r>
+      </w:hyperlink>
+      <w:r>
+        <w:t xml:space="preserve">A–B).</w:t>
       </w:r>
     </w:p>
     <w:p>
@@ -6342,10 +6797,7 @@
         <w:t xml:space="preserve"> </w:t>
       </w:r>
       <w:r>
-        <w:t xml:space="preserve">In GSE31210, the feature set showed attenuated but directionally compatible performance (AUC = 0.650, C-index = 0.629; Figure</w:t>
-      </w:r>
-      <w:r>
-        <w:t xml:space="preserve"> </w:t>
+        <w:t xml:space="preserve">In GSE31210, the feature set showed attenuated but directionally compatible score behavior (AUC = 0.650, C-index = 0.629; Figure </w:t>
       </w:r>
       <w:hyperlink w:anchor="fig:7">
         <w:r>
@@ -6356,7 +6808,7 @@
         </w:r>
       </w:hyperlink>
       <w:r>
-        <w:t xml:space="preserve">, Supplementary Figure S7). Survival separation was sensitive to analysis specification, with source tables reporting both significant and borderline estimates depending on completeness and covariate handling. Therefore, GSE31210 is treated as external traceability rather than definitive validation. Decision curve analysis is reported only as exploratory net-benefit visualization.</w:t>
+        <w:t xml:space="preserve">, Supplementary Figure S7, Supplementary Table S13). Survival separation was sensitive to analysis specification, with source tables reporting both significant and borderline estimates depending on completeness and covariate handling. Therefore, GSE31210 is treated as external traceability rather than definitive validation. Decision curve analysis is reported only as exploratory net-benefit visualization.</w:t>
       </w:r>
     </w:p>
     <w:bookmarkEnd w:id="39"/>
@@ -6386,10 +6838,10 @@
           <w:b/>
           <w:bCs/>
         </w:rPr>
-        <w:t xml:space="preserve">GSE91061 (melanoma-dominant exploratory cohort)</w:t>
-      </w:r>
-      <w:r>
-        <w:t xml:space="preserve">: Low-risk patients showed higher objective response rates (42.3% vs. 15.8%,</w:t>
+        <w:t xml:space="preserve">GSE91061 (melanoma exploratory cohort)</w:t>
+      </w:r>
+      <w:r>
+        <w:t xml:space="preserve">: Low-score patients showed higher objective response rates (42.3% vs. 15.8%,</w:t>
       </w:r>
       <w:r>
         <w:t xml:space="preserve"> </w:t>
@@ -6455,7 +6907,7 @@
         </m:r>
       </m:oMath>
       <w:r>
-        <w:t xml:space="preserve">). Because this cohort is not NSCLC-specific, it is treated as cross-tumor exploratory support.</w:t>
+        <w:t xml:space="preserve">). Because this cohort is not NSCLC-specific, it is treated as cross-tumor exploratory support only.</w:t>
       </w:r>
     </w:p>
     <w:p>
@@ -6470,7 +6922,7 @@
         <w:t xml:space="preserve">GSE126044 (NSCLC)</w:t>
       </w:r>
       <w:r>
-        <w:t xml:space="preserve">: The risk score discriminated responders with AUC = 0.813 and was associated with longer PFS in low-risk patients (median 12.4 vs. 3.2 months, HR = 0.280,</w:t>
+        <w:t xml:space="preserve">: The score showed response-associated separation with AUC = 0.813 and was associated with longer PFS in low-score patients (median 12.4 vs. 3.2 months, HR = 0.280,</w:t>
       </w:r>
       <w:r>
         <w:t xml:space="preserve"> </w:t>
@@ -6530,7 +6982,7 @@
         <w:pStyle w:val="BodyText"/>
       </w:pPr>
       <w:r>
-        <w:t xml:space="preserve">Subtype summaries suggested that lower-risk or C1Q-enriched contexts were more often aligned with inflamed immune programs, whereas higher-risk contexts were more often aligned with excluded or desert-like features, including SPP1-associated macrophage programs. These subtype assignments are descriptive and require independent validation.</w:t>
+        <w:t xml:space="preserve">Subtype summaries suggested that lower-score or C1Q-enriched contexts were more often aligned with inflamed immune programs, whereas higher-score contexts were more often aligned with excluded or desert-like features, including SPP1-associated macrophage programs. These subtype assignments are descriptive and require independent validation.</w:t>
       </w:r>
     </w:p>
     <w:bookmarkEnd w:id="40"/>
@@ -6555,11 +7007,11 @@
           <w:rPr>
             <w:rStyle w:val="Hyperlink"/>
           </w:rPr>
-          <w:t xml:space="preserve">2</w:t>
+          <w:t xml:space="preserve">1</w:t>
         </w:r>
       </w:hyperlink>
       <w:r>
-        <w:t xml:space="preserve">, Supplementary Table S9).</w:t>
+        <w:t xml:space="preserve">, Supplementary Table S13).</w:t>
       </w:r>
     </w:p>
     <w:p>
@@ -6935,7 +7387,7 @@
         <w:t xml:space="preserve"> </w:t>
       </w:r>
       <w:r>
-        <w:t xml:space="preserve">(Supplementary Table S9):</w:t>
+        <w:t xml:space="preserve">(Supplementary Table S13):</w:t>
       </w:r>
       <w:r>
         <w:t xml:space="preserve"> </w:t>
@@ -6981,7 +7433,7 @@
       </w:r>
     </w:p>
     <w:bookmarkEnd w:id="41"/>
-    <w:bookmarkStart w:id="44" w:name="subsec:res_integration"/>
+    <w:bookmarkStart w:id="43" w:name="subsec:res_integration"/>
     <w:p>
       <w:pPr>
         <w:pStyle w:val="Heading2"/>
@@ -6995,7 +7447,7 @@
         <w:pStyle w:val="FirstParagraph"/>
       </w:pPr>
       <w:r>
-        <w:t xml:space="preserve">Integration of MR-prioritized gene sets with spatial transcriptomics identified candidates with both genetic-association and spatial-context support.</w:t>
+        <w:t xml:space="preserve">Integration of MR-prioritized gene sets with spatial transcriptomics identified candidates with both expression-linked prioritization and spatial-context support.</w:t>
       </w:r>
     </w:p>
     <w:p>
@@ -7247,15 +7699,6 @@
       </m:oMath>
       <w:r>
         <w:t xml:space="preserve">)</w:t>
-      </w:r>
-    </w:p>
-    <w:bookmarkStart w:id="42" w:name="tab:spatial_genes"/>
-    <w:p>
-      <w:pPr>
-        <w:pStyle w:val="TableCaption"/>
-      </w:pPr>
-      <w:r>
-        <w:t xml:space="preserve">Spatial and MR-prioritized characteristics of candidate genes</w:t>
       </w:r>
     </w:p>
     <w:tbl>
@@ -7263,7 +7706,6 @@
         <w:tblStyle w:val="Table"/>
         <w:tblW w:type="auto" w:w="0"/>
         <w:tblLook w:firstRow="1" w:lastRow="0" w:firstColumn="0" w:lastColumn="0" w:noHBand="0" w:noVBand="0" w:val="0020"/>
-        <w:tblCaption w:val="Spatial and MR-prioritized characteristics of candidate genes"/>
       </w:tblPr>
       <w:tblGrid>
         <w:gridCol w:w="1320"/>
@@ -8215,8 +8657,7 @@
         </w:tc>
       </w:tr>
     </w:tbl>
-    <w:bookmarkEnd w:id="42"/>
-    <w:bookmarkStart w:id="43" w:name="tab:cox_regression"/>
+    <w:bookmarkStart w:id="42" w:name="tab:cox_regression"/>
     <w:p>
       <w:pPr>
         <w:pStyle w:val="TableCaption"/>
@@ -8698,9 +9139,9 @@
         </w:tc>
       </w:tr>
     </w:tbl>
+    <w:bookmarkEnd w:id="42"/>
     <w:bookmarkEnd w:id="43"/>
-    <w:bookmarkEnd w:id="44"/>
-    <w:bookmarkStart w:id="45" w:name="public-protein-expression-context"/>
+    <w:bookmarkStart w:id="44" w:name="public-protein-expression-context"/>
     <w:p>
       <w:pPr>
         <w:pStyle w:val="Heading2"/>
@@ -8731,9 +9172,9 @@
         <w:t xml:space="preserve">). These data support plausibility of protein-level expression patterns but should not be interpreted as independent experimental validation.</w:t>
       </w:r>
     </w:p>
+    <w:bookmarkEnd w:id="44"/>
     <w:bookmarkEnd w:id="45"/>
-    <w:bookmarkEnd w:id="46"/>
-    <w:bookmarkStart w:id="55" w:name="sec:discussion"/>
+    <w:bookmarkStart w:id="54" w:name="sec:discussion"/>
     <w:p>
       <w:pPr>
         <w:pStyle w:val="Heading1"/>
@@ -8742,7 +9183,7 @@
         <w:t xml:space="preserve">Discussion</w:t>
       </w:r>
     </w:p>
-    <w:bookmarkStart w:id="47" w:name="principal-findings"/>
+    <w:bookmarkStart w:id="46" w:name="principal-findings"/>
     <w:p>
       <w:pPr>
         <w:pStyle w:val="Heading2"/>
@@ -8756,7 +9197,7 @@
         <w:pStyle w:val="FirstParagraph"/>
       </w:pPr>
       <w:r>
-        <w:t xml:space="preserve">This study supports a conservative conclusion: C1Q/SPP1 is a reproducible macrophage-context traceability feature in public NSCLC resources. Across bulk transcriptomics, MR-based prioritization, spatial datasets, and retrospective outcome cohorts, the C1Q/SPP1 axis repeatedly marked immune-active versus macrophage-compartmentalized states. The evidence is internally coherent, but it does not establish a clinical assay, a treatment-selection rule, or a definitive mechanism.</w:t>
+        <w:t xml:space="preserve">This study supports a conservative conclusion: C1Q/SPP1 is a cross-dataset macrophage-context traceability feature in public NSCLC resources. Across bulk transcriptomics, MR-based prioritization, spatial datasets, and retrospective outcome cohorts, the C1Q/SPP1 axis repeatedly marked immune-active versus macrophage-compartmentalized states. The evidence is internally coherent, but it does not establish a clinical assay, a treatment-selection rule, or a definitive mechanism.</w:t>
       </w:r>
     </w:p>
     <w:p>
@@ -8793,7 +9234,7 @@
         <w:t xml:space="preserve">KCNAB2</w:t>
       </w:r>
       <w:r>
-        <w:t xml:space="preserve">, but with the usual instrumental-variable caveats; (3) C1Q-family genes showed moderate spatial clustering, while</w:t>
+        <w:t xml:space="preserve">, but with the usual instrumental-variable caveats; (3) C1Q-family genes showed moderate spatial clustering in patient-limited spatial data, while</w:t>
       </w:r>
       <w:r>
         <w:t xml:space="preserve"> </w:t>
@@ -8825,17 +9266,43 @@
         <w:t xml:space="preserve"> </w:t>
       </w:r>
       <w:r>
-        <w:t xml:space="preserve">attenuation, without proving biological perturbation; and (5) retrospective model behavior was statistically detectable but modest, with external and immunotherapy-response results best interpreted as traceability rather than validation.</w:t>
+        <w:t xml:space="preserve">attenuation, without proving biological perturbation; and (5) retrospective score behavior was statistically detectable but modest, with external and immunotherapy-response results best interpreted as traceability rather than validation.</w:t>
+      </w:r>
+    </w:p>
+    <w:bookmarkEnd w:id="46"/>
+    <w:bookmarkStart w:id="47" w:name="interpretation-of-the-evidence-chain"/>
+    <w:p>
+      <w:pPr>
+        <w:pStyle w:val="Heading2"/>
+      </w:pPr>
+      <w:r>
+        <w:t xml:space="preserve">Interpretation of the Evidence Chain</w:t>
+      </w:r>
+    </w:p>
+    <w:p>
+      <w:pPr>
+        <w:pStyle w:val="FirstParagraph"/>
+      </w:pPr>
+      <w:r>
+        <w:t xml:space="preserve">The strength of the study is not a single high-performing classifier. Rather, it is the convergence of several public-data views on the same macrophage-context axis. Bulk expression suggested a survival-associated immune program; MR prioritized genes that intersected with this program; spatial data placed C1Q and SPP1 in non-random local contexts; and small immunotherapy-treated cohorts showed directional response associations. This layered consistency makes the C1Q/SPP1 axis biologically plausible and worth further study.</w:t>
+      </w:r>
+    </w:p>
+    <w:p>
+      <w:pPr>
+        <w:pStyle w:val="BodyText"/>
+      </w:pPr>
+      <w:r>
+        <w:t xml:space="preserve">At the same time, each layer has limits. MR is not mechanism. Spatial autocorrelation is not cellular communication. A computational C1QA attenuation experiment is not a wet-lab perturbation. Small ICB cohorts are not clinical validation. For that reason, the manuscript should be read as a traceable, hypothesis-generating cancer-informatics study rather than as a completed biomarker-development paper.</w:t>
       </w:r>
     </w:p>
     <w:bookmarkEnd w:id="47"/>
-    <w:bookmarkStart w:id="48" w:name="interpretation-of-the-evidence-chain"/>
+    <w:bookmarkStart w:id="48" w:name="Xf0ac9bfa97ba69f0073668a7380983c31828810"/>
     <w:p>
       <w:pPr>
         <w:pStyle w:val="Heading2"/>
       </w:pPr>
       <w:r>
-        <w:t xml:space="preserve">Interpretation of the Evidence Chain</w:t>
+        <w:t xml:space="preserve">Biological Plausibility of the C1Q/SPP1 Spatial Context</w:t>
       </w:r>
     </w:p>
     <w:p>
@@ -8843,7 +9310,7 @@
         <w:pStyle w:val="FirstParagraph"/>
       </w:pPr>
       <w:r>
-        <w:t xml:space="preserve">The strength of the study is not a single high-performing classifier. Rather, it is the convergence of several independent public-data views on the same macrophage-context axis. Bulk expression suggested a survival-associated immune program; MR prioritized genes that intersected with this program; spatial data placed C1Q and SPP1 in non-random local contexts; and small immunotherapy-treated cohorts showed directional response associations. This layered consistency makes the C1Q/SPP1 axis biologically plausible and worth further study.</w:t>
+        <w:t xml:space="preserve">The biological plausibility of the C1Q/SPP1 axis rests on macrophage biology and spatial organization. Recent spatial transcriptomics studies have demonstrated the importance of spatial context in understanding immune microenvironments. Our finding that C1Q-associated regions track immune-marker context suggests that complement-associated macrophage states may mark immune-active local environments. This is a marker-context interpretation, not proof that C1Q itself drives therapeutic response.</w:t>
       </w:r>
     </w:p>
     <w:p>
@@ -8851,39 +9318,13 @@
         <w:pStyle w:val="BodyText"/>
       </w:pPr>
       <w:r>
-        <w:t xml:space="preserve">At the same time, each layer has limits. MR is not mechanism. Spatial autocorrelation is not cellular communication. A computational C1QA attenuation experiment is not a wet-lab perturbation. Small ICB cohorts are not clinical validation. For that reason, the manuscript should be read as a reproducible hypothesis-generating cancer-informatics study rather than as a completed biomarker-development paper.</w:t>
-      </w:r>
-    </w:p>
-    <w:bookmarkEnd w:id="48"/>
-    <w:bookmarkStart w:id="49" w:name="Xf0ac9bfa97ba69f0073668a7380983c31828810"/>
-    <w:p>
-      <w:pPr>
-        <w:pStyle w:val="Heading2"/>
-      </w:pPr>
-      <w:r>
-        <w:t xml:space="preserve">Biological Plausibility of the C1Q/SPP1 Spatial Context</w:t>
-      </w:r>
-    </w:p>
-    <w:p>
-      <w:pPr>
-        <w:pStyle w:val="FirstParagraph"/>
-      </w:pPr>
-      <w:r>
-        <w:t xml:space="preserve">The biological plausibility of the C1Q/SPP1 axis rests on macrophage biology and spatial organization. Recent spatial transcriptomics studies have demonstrated the importance of spatial context in understanding immune microenvironments. Our finding that C1Q-associated regions track immune-marker context suggests that complement-associated macrophage states may mark immune-active local environments. This is a marker-context interpretation, not proof that C1Q itself drives therapeutic response.</w:t>
-      </w:r>
-    </w:p>
-    <w:p>
-      <w:pPr>
-        <w:pStyle w:val="BodyText"/>
-      </w:pPr>
-      <w:r>
-        <w:t xml:space="preserve">The complement system, traditionally viewed as part of innate immunity against pathogens, has emerged as a critical regulator of tumor immunity . B cells have also been associated with survival and immunotherapy response in other cancers</w:t>
-      </w:r>
-      <w:r>
-        <w:t xml:space="preserve"> </w:t>
-      </w:r>
-      <w:r>
-        <w:t xml:space="preserve">. Studies have shown that complement components play dual roles in tumor immunity . C1Q can influence tumor progression through multiple mechanisms: (1) modulation of T cell responses, (2) regulation of macrophage polarization, (3) promotion of angiogenesis, and (4) facilitation of tumor cell migration and metastasis.</w:t>
+        <w:t xml:space="preserve">The complement system, traditionally viewed as part of innate immunity against pathogens, has emerged as a context-dependent regulator of tumor immunity. B cells have also been associated with survival and immunotherapy response in other cancers</w:t>
+      </w:r>
+      <w:r>
+        <w:t xml:space="preserve"> </w:t>
+      </w:r>
+      <w:r>
+        <w:t xml:space="preserve">. Complement components can accompany both immune activation and tumor-promoting inflammation; therefore, the C1Q signal should be interpreted in cellular and spatial context rather than as uniformly favorable or unfavorable.</w:t>
       </w:r>
     </w:p>
     <w:p>
@@ -9143,8 +9584,8 @@
         <w:t xml:space="preserve">Together, these patterns argue that bulk expression signatures should be interpreted with spatial and cellular context. They do not yet justify a diagnostic or therapeutic strategy.</w:t>
       </w:r>
     </w:p>
-    <w:bookmarkEnd w:id="49"/>
-    <w:bookmarkStart w:id="50" w:name="kcnab2-as-a-candidate-context-feature"/>
+    <w:bookmarkEnd w:id="48"/>
+    <w:bookmarkStart w:id="49" w:name="kcnab2-as-a-candidate-context-feature"/>
     <w:p>
       <w:pPr>
         <w:pStyle w:val="Heading2"/>
@@ -9367,15 +9808,7 @@
         <w:t xml:space="preserve"> </w:t>
       </w:r>
       <w:r>
-        <w:t xml:space="preserve">should be tested using cell-type-resolved protein assays, perturbation experiments, and prospective outcome cohorts.</w:t>
-      </w:r>
-    </w:p>
-    <w:p>
-      <w:pPr>
-        <w:pStyle w:val="BodyText"/>
-      </w:pPr>
-      <w:r>
-        <w:t xml:space="preserve">Our decision to highlight</w:t>
+        <w:t xml:space="preserve">should be tested using cell-type-resolved protein assays, perturbation experiments, and prospective outcome cohorts. Our decision to highlight</w:t>
       </w:r>
       <w:r>
         <w:t xml:space="preserve"> </w:t>
@@ -9391,7 +9824,25 @@
         <w:t xml:space="preserve"> </w:t>
       </w:r>
       <w:r>
-        <w:t xml:space="preserve">was driven by its selection stability and MR-prioritized association. This makes it a candidate for further validation, not an established therapeutic target.</w:t>
+        <w:t xml:space="preserve">was driven by its selection stability and MR-prioritized association. This makes it a candidate for further validation, not an established therapeutic target or spatial organizer.</w:t>
+      </w:r>
+    </w:p>
+    <w:bookmarkEnd w:id="49"/>
+    <w:bookmarkStart w:id="50" w:name="X2a8d63671c4fe7a5782427d3dc51007e084f591"/>
+    <w:p>
+      <w:pPr>
+        <w:pStyle w:val="Heading2"/>
+      </w:pPr>
+      <w:r>
+        <w:t xml:space="preserve">Machine Learning Model Behavior and Its Limits</w:t>
+      </w:r>
+    </w:p>
+    <w:p>
+      <w:pPr>
+        <w:pStyle w:val="FirstParagraph"/>
+      </w:pPr>
+      <w:r>
+        <w:t xml:space="preserve">Our systematic evaluation across candidate algorithms showed that score behavior depends strongly on the metric used. XGBoost achieved the highest AUC (0.781), whereas several models had higher C-index values than AdaBoost. For this reason, the comparison should not be used to claim clinical superiority of one algorithm. AdaBoost is retained only as a reference model for describing one internally traceable score behavior.</w:t>
       </w:r>
     </w:p>
     <w:p>
@@ -9399,23 +9850,145 @@
         <w:pStyle w:val="BodyText"/>
       </w:pPr>
       <w:r>
-        <w:t xml:space="preserve">Based on our findings, we propose two key hypotheses for the role of</w:t>
-      </w:r>
-      <w:r>
-        <w:t xml:space="preserve"> </w:t>
-      </w:r>
-      <w:r>
-        <w:rPr>
-          <w:i/>
-          <w:iCs/>
-        </w:rPr>
-        <w:t xml:space="preserve">KCNAB2</w:t>
-      </w:r>
-      <w:r>
-        <w:t xml:space="preserve"> </w:t>
-      </w:r>
-      <w:r>
-        <w:t xml:space="preserve">in the NSCLC TME:</w:t>
+        <w:t xml:space="preserve">The modest time-dependent AUC values and moderate C-index indicate that the model captures some prognostic signal but is not ready for individual patient decision-making. The score is useful here as a traceability device for testing whether the C1Q/SPP1-associated feature set carries outcome-linked information.</w:t>
+      </w:r>
+    </w:p>
+    <w:p>
+      <w:pPr>
+        <w:pStyle w:val="BodyText"/>
+      </w:pPr>
+      <w:r>
+        <w:t xml:space="preserve">Decision curve analysis is included as an exploratory visualization of possible net benefit. It should not be interpreted as evidence that the model can guide treatment decisions.</w:t>
+      </w:r>
+    </w:p>
+    <w:p>
+      <w:pPr>
+        <w:pStyle w:val="BodyText"/>
+      </w:pPr>
+      <w:r>
+        <w:t xml:space="preserve">The external evaluation in GSE31210 was directionally supportive but not definitive. Depending on the analysis specification, the survival estimate was significant or borderline, with wide confidence intervals. This pattern is compatible with a weak-to-moderate transferable signal, but it is not enough for clinical validation.</w:t>
+      </w:r>
+    </w:p>
+    <w:p>
+      <w:pPr>
+        <w:pStyle w:val="BodyText"/>
+      </w:pPr>
+      <w:r>
+        <w:rPr>
+          <w:b/>
+          <w:bCs/>
+        </w:rPr>
+        <w:t xml:space="preserve">Translation Boundary</w:t>
+      </w:r>
+      <w:r>
+        <w:t xml:space="preserve">: The current evidence does not support clinical implementation. A future clinical-grade model would require a locked feature set, a locked cutoff, prospective validation, calibration assessment, decision-curve confirmation in clinically relevant populations, and comparison with stage-only and clinical-only baselines.</w:t>
+      </w:r>
+    </w:p>
+    <w:p>
+      <w:pPr>
+        <w:pStyle w:val="BodyText"/>
+      </w:pPr>
+      <w:r>
+        <w:rPr>
+          <w:b/>
+          <w:bCs/>
+        </w:rPr>
+        <w:t xml:space="preserve">Biological Interpretation</w:t>
+      </w:r>
+      <w:r>
+        <w:t xml:space="preserve">: Nonlinear models may capture interactions among immune-context features, but algorithmic performance cannot be used as evidence of mechanism. The model results support a retrospective association between macrophage-context features and outcome-linked states.</w:t>
+      </w:r>
+    </w:p>
+    <w:p>
+      <w:pPr>
+        <w:pStyle w:val="BodyText"/>
+      </w:pPr>
+      <w:r>
+        <w:rPr>
+          <w:b/>
+          <w:bCs/>
+        </w:rPr>
+        <w:t xml:space="preserve">Prognostic Association</w:t>
+      </w:r>
+      <w:r>
+        <w:t xml:space="preserve">: The model demonstrates statistically detectable prognostic association in retrospective data (C-index 0.607, HR 1.43, 95% CI: 1.21–1.70,</w:t>
+      </w:r>
+      <w:r>
+        <w:t xml:space="preserve"> </w:t>
+      </w:r>
+      <m:oMath>
+        <m:r>
+          <m:t>P</m:t>
+        </m:r>
+        <m:r>
+          <m:rPr>
+            <m:sty m:val="p"/>
+          </m:rPr>
+          <m:t>&lt;</m:t>
+        </m:r>
+        <m:r>
+          <m:t>0.001</m:t>
+        </m:r>
+      </m:oMath>
+      <w:r>
+        <w:t xml:space="preserve">), but its incremental value beyond routine clinical factors remains to be established rigorously.</w:t>
+      </w:r>
+    </w:p>
+    <w:p>
+      <w:pPr>
+        <w:pStyle w:val="BodyText"/>
+      </w:pPr>
+      <w:r>
+        <w:rPr>
+          <w:b/>
+          <w:bCs/>
+        </w:rPr>
+        <w:t xml:space="preserve">Immunotherapy Response Association</w:t>
+      </w:r>
+      <w:r>
+        <w:t xml:space="preserve">: The immunotherapy-treated cohorts show directional associations (AUC range: 0.758–0.813), but their small size and tumor-type heterogeneity preclude claims of robust ICI prediction or superiority over PD-L1/TMB.</w:t>
+      </w:r>
+    </w:p>
+    <w:p>
+      <w:pPr>
+        <w:pStyle w:val="BodyText"/>
+      </w:pPr>
+      <w:r>
+        <w:t xml:space="preserve">The longitudinal pattern in GSE91061 is compatible with dynamic immune remodeling during treatment, but because the cohort is not NSCLC-specific, this observation should be treated as exploratory.</w:t>
+      </w:r>
+    </w:p>
+    <w:p>
+      <w:pPr>
+        <w:pStyle w:val="BodyText"/>
+      </w:pPr>
+      <w:r>
+        <w:t xml:space="preserve">The integration of spatial features with MR-prioritized candidates addresses a limitation of bulk-only interpretation, but the present implementation remains retrospective and hypothesis-generating.</w:t>
+      </w:r>
+    </w:p>
+    <w:bookmarkEnd w:id="50"/>
+    <w:bookmarkStart w:id="53" w:name="future-translation-requirements"/>
+    <w:p>
+      <w:pPr>
+        <w:pStyle w:val="Heading2"/>
+      </w:pPr>
+      <w:r>
+        <w:t xml:space="preserve">Future Translation Requirements</w:t>
+      </w:r>
+    </w:p>
+    <w:p>
+      <w:pPr>
+        <w:pStyle w:val="FirstParagraph"/>
+      </w:pPr>
+      <w:r>
+        <w:t xml:space="preserve">For this work to move toward clinical use, several requirements must be met.</w:t>
+      </w:r>
+    </w:p>
+    <w:p>
+      <w:pPr>
+        <w:pStyle w:val="BodyText"/>
+      </w:pPr>
+      <w:r>
+        <w:t xml:space="preserve">Future studies should prioritize:</w:t>
       </w:r>
     </w:p>
     <w:p>
@@ -9426,30 +9999,7 @@
         </w:numPr>
       </w:pPr>
       <w:r>
-        <w:rPr>
-          <w:b/>
-          <w:bCs/>
-        </w:rPr>
-        <w:t xml:space="preserve">Metabolic-Immune Coupling</w:t>
-      </w:r>
-      <w:r>
-        <w:t xml:space="preserve">:</w:t>
-      </w:r>
-      <w:r>
-        <w:t xml:space="preserve"> </w:t>
-      </w:r>
-      <w:r>
-        <w:rPr>
-          <w:i/>
-          <w:iCs/>
-        </w:rPr>
-        <w:t xml:space="preserve">KCNAB2</w:t>
-      </w:r>
-      <w:r>
-        <w:t xml:space="preserve"> </w:t>
-      </w:r>
-      <w:r>
-        <w:t xml:space="preserve">may be related to the metabolic fitness of macrophages in C1Q-enriched contexts by modulating potassium efflux, thereby supporting a plausible follow-up hypothesis in nutrient-depleted TME states.</w:t>
+        <w:t xml:space="preserve">locking the feature set, preprocessing pipeline, model, and cutoff before testing;</w:t>
       </w:r>
     </w:p>
     <w:p>
@@ -9460,40 +10010,40 @@
         </w:numPr>
       </w:pPr>
       <w:r>
-        <w:rPr>
-          <w:b/>
-          <w:bCs/>
-        </w:rPr>
-        <w:t xml:space="preserve">Spatial Scaffolding</w:t>
-      </w:r>
-      <w:r>
-        <w:t xml:space="preserve">: The spatial co-localization of</w:t>
-      </w:r>
-      <w:r>
-        <w:t xml:space="preserve"> </w:t>
-      </w:r>
-      <w:r>
-        <w:rPr>
-          <w:i/>
-          <w:iCs/>
-        </w:rPr>
-        <w:t xml:space="preserve">KCNAB2</w:t>
-      </w:r>
-      <w:r>
-        <w:t xml:space="preserve"> </w:t>
-      </w:r>
-      <w:r>
-        <w:t xml:space="preserve">and C1Q suggests a structural role for ion channel regulators in organizing immune clusters, possibly through the regulation of cell adhesion or cytokine secretion.</w:t>
-      </w:r>
-    </w:p>
-    <w:bookmarkEnd w:id="50"/>
-    <w:bookmarkStart w:id="51" w:name="X2a8d63671c4fe7a5782427d3dc51007e084f591"/>
-    <w:p>
-      <w:pPr>
-        <w:pStyle w:val="Heading2"/>
-      </w:pPr>
-      <w:r>
-        <w:t xml:space="preserve">Machine Learning Model Behavior and Its Limits</w:t>
+        <w:t xml:space="preserve">validating the model in NSCLC-only immunotherapy cohorts with adequate sample size and event counts;</w:t>
+      </w:r>
+    </w:p>
+    <w:p>
+      <w:pPr>
+        <w:numPr>
+          <w:ilvl w:val="0"/>
+          <w:numId w:val="1023"/>
+        </w:numPr>
+      </w:pPr>
+      <w:r>
+        <w:t xml:space="preserve">comparing against clinical-only, stage-only, PD-L1, TMB, and published immune-signature baselines;</w:t>
+      </w:r>
+    </w:p>
+    <w:p>
+      <w:pPr>
+        <w:numPr>
+          <w:ilvl w:val="0"/>
+          <w:numId w:val="1023"/>
+        </w:numPr>
+      </w:pPr>
+      <w:r>
+        <w:t xml:space="preserve">confirming C1Q/SPP1 protein-level spatial context using multiplex FFPE-compatible assays;</w:t>
+      </w:r>
+    </w:p>
+    <w:p>
+      <w:pPr>
+        <w:numPr>
+          <w:ilvl w:val="0"/>
+          <w:numId w:val="1023"/>
+        </w:numPr>
+      </w:pPr>
+      <w:r>
+        <w:t xml:space="preserve">experimentally testing whether C1Q/SPP1-associated macrophage states have functional effects on T-cell localization or activity.</w:t>
       </w:r>
     </w:p>
     <w:p>
@@ -9501,7 +10051,42 @@
         <w:pStyle w:val="FirstParagraph"/>
       </w:pPr>
       <w:r>
-        <w:t xml:space="preserve">Our systematic evaluation of seven machine-learning algorithms showed that model performance depends strongly on the metric used. XGBoost achieved the highest AUC (0.781), whereas several models had higher C-index values than AdaBoost. For this reason, the model comparison should not be used to claim clinical superiority of one algorithm. AdaBoost is retained only as a reference model for describing one reproducible score behavior.</w:t>
+        <w:t xml:space="preserve">Only after these steps would a simplified pathological or molecular panel be justified.</w:t>
+      </w:r>
+    </w:p>
+    <w:bookmarkStart w:id="51" w:name="biological-rationale-for-resistance"/>
+    <w:p>
+      <w:pPr>
+        <w:pStyle w:val="Heading3"/>
+      </w:pPr>
+      <w:r>
+        <w:t xml:space="preserve">Biological Rationale for Resistance</w:t>
+      </w:r>
+    </w:p>
+    <w:p>
+      <w:pPr>
+        <w:pStyle w:val="FirstParagraph"/>
+      </w:pPr>
+      <w:r>
+        <w:t xml:space="preserve">Our TME subtype analysis suggested that higher-score contexts were enriched for immune-exclusion-associated programs, including SPP1-associated macrophage features. These observations may help generate hypotheses about ICI resistance, but they do not explain resistance mechanisms on their own.</w:t>
+      </w:r>
+    </w:p>
+    <w:bookmarkEnd w:id="51"/>
+    <w:bookmarkStart w:id="52" w:name="limitations-and-future-directions"/>
+    <w:p>
+      <w:pPr>
+        <w:pStyle w:val="Heading3"/>
+      </w:pPr>
+      <w:r>
+        <w:t xml:space="preserve">Limitations and Future Directions</w:t>
+      </w:r>
+    </w:p>
+    <w:p>
+      <w:pPr>
+        <w:pStyle w:val="FirstParagraph"/>
+      </w:pPr>
+      <w:r>
+        <w:t xml:space="preserve">Several limitations require emphasis. The primary survival analyses are retrospective and rely heavily on overall survival, which is affected by treatment heterogeneity, comorbidity, stage, and incomplete clinical annotation. The spatial datasets include few independent patients, and the large CosMx cell count should not be mistaken for a large number of independent biological replicates. The Visium dataset provides spatial context but not single-cell precision. Section-level concordance is therefore supportive context, not broad patient-level spatial validation.</w:t>
       </w:r>
     </w:p>
     <w:p>
@@ -9509,145 +10094,7 @@
         <w:pStyle w:val="BodyText"/>
       </w:pPr>
       <w:r>
-        <w:t xml:space="preserve">The modest time-dependent AUC values and moderate C-index indicate that the model captures some prognostic signal but is not ready for individual patient decision-making. The score is useful here as a traceability device for testing whether the C1Q/SPP1-associated feature set carries outcome-linked information.</w:t>
-      </w:r>
-    </w:p>
-    <w:p>
-      <w:pPr>
-        <w:pStyle w:val="BodyText"/>
-      </w:pPr>
-      <w:r>
-        <w:t xml:space="preserve">Decision curve analysis is included as an exploratory visualization of possible net benefit. It should not be interpreted as evidence that the model can guide treatment decisions.</w:t>
-      </w:r>
-    </w:p>
-    <w:p>
-      <w:pPr>
-        <w:pStyle w:val="BodyText"/>
-      </w:pPr>
-      <w:r>
-        <w:t xml:space="preserve">The external evaluation in GSE31210 was directionally supportive but not definitive. Depending on the analysis specification, the survival estimate was significant or borderline, with wide confidence intervals. This pattern is compatible with a weak-to-moderate transferable signal, but it is not enough for clinical validation.</w:t>
-      </w:r>
-    </w:p>
-    <w:p>
-      <w:pPr>
-        <w:pStyle w:val="BodyText"/>
-      </w:pPr>
-      <w:r>
-        <w:rPr>
-          <w:b/>
-          <w:bCs/>
-        </w:rPr>
-        <w:t xml:space="preserve">Translation Boundary</w:t>
-      </w:r>
-      <w:r>
-        <w:t xml:space="preserve">: The current evidence does not support clinical implementation. A future clinical-grade model would require a locked feature set, a locked cutoff, prospective validation, calibration assessment, decision-curve confirmation in clinically relevant populations, and comparison with stage-only and clinical-only baselines.</w:t>
-      </w:r>
-    </w:p>
-    <w:p>
-      <w:pPr>
-        <w:pStyle w:val="BodyText"/>
-      </w:pPr>
-      <w:r>
-        <w:rPr>
-          <w:b/>
-          <w:bCs/>
-        </w:rPr>
-        <w:t xml:space="preserve">Biological Interpretation</w:t>
-      </w:r>
-      <w:r>
-        <w:t xml:space="preserve">: Nonlinear models may capture interactions among immune-context features, but algorithmic performance cannot be used as evidence of mechanism. The model results support a reproducible association between macrophage-context features and outcome-linked states.</w:t>
-      </w:r>
-    </w:p>
-    <w:p>
-      <w:pPr>
-        <w:pStyle w:val="BodyText"/>
-      </w:pPr>
-      <w:r>
-        <w:rPr>
-          <w:b/>
-          <w:bCs/>
-        </w:rPr>
-        <w:t xml:space="preserve">Prognostic Association</w:t>
-      </w:r>
-      <w:r>
-        <w:t xml:space="preserve">: The model demonstrates statistically detectable prognostic association in retrospective data (C-index 0.607, HR 1.43, 95% CI: 1.21–1.70,</w:t>
-      </w:r>
-      <w:r>
-        <w:t xml:space="preserve"> </w:t>
-      </w:r>
-      <m:oMath>
-        <m:r>
-          <m:t>P</m:t>
-        </m:r>
-        <m:r>
-          <m:rPr>
-            <m:sty m:val="p"/>
-          </m:rPr>
-          <m:t>&lt;</m:t>
-        </m:r>
-        <m:r>
-          <m:t>0.001</m:t>
-        </m:r>
-      </m:oMath>
-      <w:r>
-        <w:t xml:space="preserve">), but its incremental value beyond routine clinical factors remains to be established rigorously.</w:t>
-      </w:r>
-    </w:p>
-    <w:p>
-      <w:pPr>
-        <w:pStyle w:val="BodyText"/>
-      </w:pPr>
-      <w:r>
-        <w:rPr>
-          <w:b/>
-          <w:bCs/>
-        </w:rPr>
-        <w:t xml:space="preserve">Immunotherapy Response Association</w:t>
-      </w:r>
-      <w:r>
-        <w:t xml:space="preserve">: The immunotherapy-treated cohorts show directional associations (AUC range: 0.758–0.813), but their small size and tumor-type heterogeneity preclude claims of robust ICI prediction or superiority over PD-L1/TMB.</w:t>
-      </w:r>
-    </w:p>
-    <w:p>
-      <w:pPr>
-        <w:pStyle w:val="BodyText"/>
-      </w:pPr>
-      <w:r>
-        <w:t xml:space="preserve">The longitudinal pattern in GSE91061 is compatible with dynamic immune remodeling during treatment, but because the cohort is not NSCLC-specific, this observation should be treated as exploratory.</w:t>
-      </w:r>
-    </w:p>
-    <w:p>
-      <w:pPr>
-        <w:pStyle w:val="BodyText"/>
-      </w:pPr>
-      <w:r>
-        <w:t xml:space="preserve">The integration of spatial features with MR-prioritized candidates addresses a limitation of bulk-only interpretation, but the present implementation remains retrospective and hypothesis-generating.</w:t>
-      </w:r>
-    </w:p>
-    <w:bookmarkEnd w:id="51"/>
-    <w:bookmarkStart w:id="54" w:name="future-translation-requirements"/>
-    <w:p>
-      <w:pPr>
-        <w:pStyle w:val="Heading2"/>
-      </w:pPr>
-      <w:r>
-        <w:t xml:space="preserve">Future Translation Requirements</w:t>
-      </w:r>
-    </w:p>
-    <w:p>
-      <w:pPr>
-        <w:pStyle w:val="FirstParagraph"/>
-      </w:pPr>
-      <w:r>
-        <w:t xml:space="preserve">For this work to move toward clinical use, several requirements must be met.</w:t>
-      </w:r>
-    </w:p>
-    <w:p>
-      <w:pPr>
-        <w:pStyle w:val="BodyText"/>
-      </w:pPr>
-      <w:r>
-        <w:t xml:space="preserve">Future studies should prioritize:</w:t>
+        <w:t xml:space="preserve">Regarding immunotherapy-response association, several considerations warrant discussion:</w:t>
       </w:r>
     </w:p>
     <w:p>
@@ -9658,7 +10105,7 @@
         </w:numPr>
       </w:pPr>
       <w:r>
-        <w:t xml:space="preserve">locking the feature set, preprocessing pipeline, model, and cutoff before testing;</w:t>
+        <w:t xml:space="preserve">The GSE91061 cohort includes melanoma and is not NSCLC-specific. It provides cross-tumor exploratory support only.</w:t>
       </w:r>
     </w:p>
     <w:p>
@@ -9669,7 +10116,7 @@
         </w:numPr>
       </w:pPr>
       <w:r>
-        <w:t xml:space="preserve">validating the model in NSCLC-only immunotherapy cohorts with adequate sample size and event counts;</w:t>
+        <w:t xml:space="preserve">Spatial transcriptomics analysis was performed largely on treatment-naïve samples. On-treatment biopsies would be required to assess spatial remodeling during therapy.</w:t>
       </w:r>
     </w:p>
     <w:p>
@@ -9680,7 +10127,7 @@
         </w:numPr>
       </w:pPr>
       <w:r>
-        <w:t xml:space="preserve">comparing against clinical-only, stage-only, PD-L1, TMB, and published immune-signature baselines;</w:t>
+        <w:t xml:space="preserve">The small sample sizes of immunotherapy cohorts (GSE126044: N=16; GSE135222: N=27) limit precision and subgroup analysis. Prospective validation is essential before clinical implementation.</w:t>
       </w:r>
     </w:p>
     <w:p>
@@ -9691,18 +10138,7 @@
         </w:numPr>
       </w:pPr>
       <w:r>
-        <w:t xml:space="preserve">confirming C1Q/SPP1 protein-level spatial context using multiplex FFPE-compatible assays;</w:t>
-      </w:r>
-    </w:p>
-    <w:p>
-      <w:pPr>
-        <w:numPr>
-          <w:ilvl w:val="0"/>
-          <w:numId w:val="1024"/>
-        </w:numPr>
-      </w:pPr>
-      <w:r>
-        <w:t xml:space="preserve">experimentally testing whether C1Q/SPP1-associated macrophage states have functional effects on T-cell localization or activity.</w:t>
+        <w:t xml:space="preserve">Integration with PD-L1, TMB, ctDNA dynamics, TCR repertoire, and treatment metadata will be needed before incremental value can be assessed.</w:t>
       </w:r>
     </w:p>
     <w:p>
@@ -9710,16 +10146,35 @@
         <w:pStyle w:val="FirstParagraph"/>
       </w:pPr>
       <w:r>
-        <w:t xml:space="preserve">Only after these steps would a simplified pathological or molecular panel be justified.</w:t>
-      </w:r>
-    </w:p>
-    <w:bookmarkStart w:id="52" w:name="biological-rationale-for-resistance"/>
-    <w:p>
-      <w:pPr>
-        <w:pStyle w:val="Heading3"/>
-      </w:pPr>
-      <w:r>
-        <w:t xml:space="preserve">Biological Rationale for Resistance</w:t>
+        <w:t xml:space="preserve">Future translational studies should prioritize a locked, FFPE-compatible assay; adequately powered NSCLC-only cohorts; prespecified cutoffs; and direct comparison with existing clinical and molecular biomarkers.</w:t>
+      </w:r>
+    </w:p>
+    <w:p>
+      <w:pPr>
+        <w:pStyle w:val="BodyText"/>
+      </w:pPr>
+      <w:r>
+        <w:t xml:space="preserve">Additional limitations include population imbalance in TCGA, incomplete treatment data, cross-platform technical variance, possible residual confounding, and the absence of wet-lab perturbation. The counterfactual scoring analysis is a sensitivity analysis only. The model has not been validated in neoadjuvant immunotherapy or prospective randomized settings.</w:t>
+      </w:r>
+    </w:p>
+    <w:p>
+      <w:pPr>
+        <w:pStyle w:val="BodyText"/>
+      </w:pPr>
+      <w:r>
+        <w:t xml:space="preserve">Overall, the study provides a public-data framework for tracing macrophage-context signals across molecular and spatial layers. Its most immediate value is hypothesis prioritization for future spatial and functional validation.</w:t>
+      </w:r>
+    </w:p>
+    <w:bookmarkEnd w:id="52"/>
+    <w:bookmarkEnd w:id="53"/>
+    <w:bookmarkEnd w:id="54"/>
+    <w:bookmarkStart w:id="55" w:name="sec:conclusions"/>
+    <w:p>
+      <w:pPr>
+        <w:pStyle w:val="Heading1"/>
+      </w:pPr>
+      <w:r>
+        <w:t xml:space="preserve">Conclusions</w:t>
       </w:r>
     </w:p>
     <w:p>
@@ -9727,17 +10182,17 @@
         <w:pStyle w:val="FirstParagraph"/>
       </w:pPr>
       <w:r>
-        <w:t xml:space="preserve">Our TME subtype analysis suggested that higher-risk contexts were enriched for immune-exclusion-associated programs, including SPP1-associated macrophage features. These observations may help generate hypotheses about ICI resistance, but they do not explain resistance mechanisms on their own.</w:t>
-      </w:r>
-    </w:p>
-    <w:bookmarkEnd w:id="52"/>
-    <w:bookmarkStart w:id="53" w:name="limitations-and-future-directions"/>
-    <w:p>
-      <w:pPr>
-        <w:pStyle w:val="Heading3"/>
-      </w:pPr>
-      <w:r>
-        <w:t xml:space="preserve">Limitations and Future Directions</w:t>
+        <w:t xml:space="preserve">This study identifies C1Q/SPP1 as a cross-dataset macrophage-context traceability feature in public NSCLC resources. C1Q-family genes showed moderate spatial clustering in patient-limited spatial data, SPP1 showed stronger spatial compartmentalization, and retrospective score behavior suggested outcome-linked signal with modest discrimination. MR and counterfactual analyses support prioritization but do not prove mechanism. The findings are hypothesis-generating and require prospective, NSCLC-specific, spatially resolved, and experimental validation before clinical implementation or therapeutic targeting can be considered.</w:t>
+      </w:r>
+    </w:p>
+    <w:bookmarkEnd w:id="55"/>
+    <w:bookmarkStart w:id="63" w:name="supplementary-information"/>
+    <w:p>
+      <w:pPr>
+        <w:pStyle w:val="Heading1"/>
+      </w:pPr>
+      <w:r>
+        <w:t xml:space="preserve">Supplementary Information</w:t>
       </w:r>
     </w:p>
     <w:p>
@@ -9745,7 +10200,417 @@
         <w:pStyle w:val="FirstParagraph"/>
       </w:pPr>
       <w:r>
-        <w:t xml:space="preserve">Several limitations require emphasis. The primary survival analyses are retrospective and rely heavily on overall survival, which is affected by treatment heterogeneity, comorbidity, stage, and incomplete clinical annotation. The spatial datasets include few independent patients, and the large CosMx cell count should not be mistaken for a large number of independent biological replicates. The Visium dataset provides spatial context but not single-cell precision.</w:t>
+        <w:rPr>
+          <w:b/>
+          <w:bCs/>
+        </w:rPr>
+        <w:t xml:space="preserve">Additional file 1: Supplementary Material.</w:t>
+      </w:r>
+      <w:r>
+        <w:t xml:space="preserve"> </w:t>
+      </w:r>
+      <w:r>
+        <w:t xml:space="preserve">Contains Supplementary Figures S1–S12 and Supplementary Tables S1–S13.</w:t>
+      </w:r>
+      <w:r>
+        <w:t xml:space="preserve"> </w:t>
+      </w:r>
+      <w:r>
+        <w:rPr>
+          <w:b/>
+          <w:bCs/>
+        </w:rPr>
+        <w:t xml:space="preserve">Figure S1:</w:t>
+      </w:r>
+      <w:r>
+        <w:t xml:space="preserve"> </w:t>
+      </w:r>
+      <w:r>
+        <w:t xml:space="preserve">Quality control and clustering analysis of spatial transcriptomics data.</w:t>
+      </w:r>
+      <w:r>
+        <w:t xml:space="preserve"> </w:t>
+      </w:r>
+      <w:r>
+        <w:rPr>
+          <w:b/>
+          <w:bCs/>
+        </w:rPr>
+        <w:t xml:space="preserve">Figure S2:</w:t>
+      </w:r>
+      <w:r>
+        <w:t xml:space="preserve"> </w:t>
+      </w:r>
+      <w:r>
+        <w:t xml:space="preserve">Retrospective score development and internal assessment details.</w:t>
+      </w:r>
+      <w:r>
+        <w:t xml:space="preserve"> </w:t>
+      </w:r>
+      <w:r>
+        <w:rPr>
+          <w:b/>
+          <w:bCs/>
+        </w:rPr>
+        <w:t xml:space="preserve">Figure S3:</w:t>
+      </w:r>
+      <w:r>
+        <w:t xml:space="preserve"> </w:t>
+      </w:r>
+      <w:r>
+        <w:t xml:space="preserve">Functional enrichment analysis.</w:t>
+      </w:r>
+      <w:r>
+        <w:t xml:space="preserve"> </w:t>
+      </w:r>
+      <w:r>
+        <w:rPr>
+          <w:b/>
+          <w:bCs/>
+        </w:rPr>
+        <w:t xml:space="preserve">Figure S4:</w:t>
+      </w:r>
+      <w:r>
+        <w:t xml:space="preserve"> </w:t>
+      </w:r>
+      <w:r>
+        <w:t xml:space="preserve">Spatial expression patterns of immune checkpoint molecules.</w:t>
+      </w:r>
+      <w:r>
+        <w:t xml:space="preserve"> </w:t>
+      </w:r>
+      <w:r>
+        <w:rPr>
+          <w:b/>
+          <w:bCs/>
+        </w:rPr>
+        <w:t xml:space="preserve">Figure S5:</w:t>
+      </w:r>
+      <w:r>
+        <w:t xml:space="preserve"> </w:t>
+      </w:r>
+      <w:r>
+        <w:t xml:space="preserve">Pan-cancer exploratory traceability of core candidate genes.</w:t>
+      </w:r>
+      <w:r>
+        <w:t xml:space="preserve"> </w:t>
+      </w:r>
+      <w:r>
+        <w:rPr>
+          <w:b/>
+          <w:bCs/>
+        </w:rPr>
+        <w:t xml:space="preserve">Figure S6:</w:t>
+      </w:r>
+      <w:r>
+        <w:t xml:space="preserve"> </w:t>
+      </w:r>
+      <w:r>
+        <w:t xml:space="preserve">Correlation analysis between hub genes and immune-context estimates.</w:t>
+      </w:r>
+      <w:r>
+        <w:t xml:space="preserve"> </w:t>
+      </w:r>
+      <w:r>
+        <w:rPr>
+          <w:b/>
+          <w:bCs/>
+        </w:rPr>
+        <w:t xml:space="preserve">Figure S7:</w:t>
+      </w:r>
+      <w:r>
+        <w:t xml:space="preserve"> </w:t>
+      </w:r>
+      <w:r>
+        <w:t xml:space="preserve">Expression of top model genes in the GSE31210 traceability cohort.</w:t>
+      </w:r>
+      <w:r>
+        <w:t xml:space="preserve"> </w:t>
+      </w:r>
+      <w:r>
+        <w:rPr>
+          <w:b/>
+          <w:bCs/>
+        </w:rPr>
+        <w:t xml:space="preserve">Figure S8:</w:t>
+      </w:r>
+      <w:r>
+        <w:t xml:space="preserve"> </w:t>
+      </w:r>
+      <w:r>
+        <w:t xml:space="preserve">5-fold cross-validation performance evaluation.</w:t>
+      </w:r>
+      <w:r>
+        <w:t xml:space="preserve"> </w:t>
+      </w:r>
+      <w:r>
+        <w:rPr>
+          <w:b/>
+          <w:bCs/>
+        </w:rPr>
+        <w:t xml:space="preserve">Figure S9:</w:t>
+      </w:r>
+      <w:r>
+        <w:t xml:space="preserve"> </w:t>
+      </w:r>
+      <w:r>
+        <w:t xml:space="preserve">Mendelian Randomization Leave-one-out sensitivity analysis.</w:t>
+      </w:r>
+      <w:r>
+        <w:t xml:space="preserve"> </w:t>
+      </w:r>
+      <w:r>
+        <w:rPr>
+          <w:b/>
+          <w:bCs/>
+        </w:rPr>
+        <w:t xml:space="preserve">Figure S10:</w:t>
+      </w:r>
+      <w:r>
+        <w:t xml:space="preserve"> </w:t>
+      </w:r>
+      <w:r>
+        <w:t xml:space="preserve">Leave-one-out sensitivity analysis for MR-prioritized genes.</w:t>
+      </w:r>
+      <w:r>
+        <w:t xml:space="preserve"> </w:t>
+      </w:r>
+      <w:r>
+        <w:rPr>
+          <w:b/>
+          <w:bCs/>
+        </w:rPr>
+        <w:t xml:space="preserve">Figure S11:</w:t>
+      </w:r>
+      <w:r>
+        <w:t xml:space="preserve"> </w:t>
+      </w:r>
+      <w:r>
+        <w:t xml:space="preserve">Counterfactual C1QA scoring sensitivity analysis showing C1Q-score dependency and network-summary changes.</w:t>
+      </w:r>
+      <w:r>
+        <w:t xml:space="preserve"> </w:t>
+      </w:r>
+      <w:r>
+        <w:rPr>
+          <w:b/>
+          <w:bCs/>
+        </w:rPr>
+        <w:t xml:space="preserve">Figure S12:</w:t>
+      </w:r>
+      <w:r>
+        <w:t xml:space="preserve"> </w:t>
+      </w:r>
+      <w:r>
+        <w:t xml:space="preserve">Sensitivity analyses including dose-response, spatial scale dependency, and specificity ranking.</w:t>
+      </w:r>
+      <w:r>
+        <w:t xml:space="preserve"> </w:t>
+      </w:r>
+      <w:r>
+        <w:rPr>
+          <w:b/>
+          <w:bCs/>
+        </w:rPr>
+        <w:t xml:space="preserve">Table S1:</w:t>
+      </w:r>
+      <w:r>
+        <w:t xml:space="preserve"> </w:t>
+      </w:r>
+      <w:r>
+        <w:t xml:space="preserve">Retrospective score behavior on training, internal cross-validation, test, and external sets.</w:t>
+      </w:r>
+      <w:r>
+        <w:t xml:space="preserve"> </w:t>
+      </w:r>
+      <w:r>
+        <w:rPr>
+          <w:b/>
+          <w:bCs/>
+        </w:rPr>
+        <w:t xml:space="preserve">Table S2:</w:t>
+      </w:r>
+      <w:r>
+        <w:t xml:space="preserve"> </w:t>
+      </w:r>
+      <w:r>
+        <w:t xml:space="preserve">List of stable features (genes) selected in 100% of cross-validation folds.</w:t>
+      </w:r>
+      <w:r>
+        <w:t xml:space="preserve"> </w:t>
+      </w:r>
+      <w:r>
+        <w:rPr>
+          <w:b/>
+          <w:bCs/>
+        </w:rPr>
+        <w:t xml:space="preserve">Table S3:</w:t>
+      </w:r>
+      <w:r>
+        <w:t xml:space="preserve"> </w:t>
+      </w:r>
+      <w:r>
+        <w:t xml:space="preserve">Edge list of the eQTL-driven regulatory network.</w:t>
+      </w:r>
+      <w:r>
+        <w:t xml:space="preserve"> </w:t>
+      </w:r>
+      <w:r>
+        <w:rPr>
+          <w:b/>
+          <w:bCs/>
+        </w:rPr>
+        <w:t xml:space="preserve">Table S4:</w:t>
+      </w:r>
+      <w:r>
+        <w:t xml:space="preserve"> </w:t>
+      </w:r>
+      <w:r>
+        <w:t xml:space="preserve">List of stable features identified by nested cross-validation.</w:t>
+      </w:r>
+      <w:r>
+        <w:t xml:space="preserve"> </w:t>
+      </w:r>
+      <w:r>
+        <w:rPr>
+          <w:b/>
+          <w:bCs/>
+        </w:rPr>
+        <w:t xml:space="preserve">Table S5:</w:t>
+      </w:r>
+      <w:r>
+        <w:t xml:space="preserve"> </w:t>
+      </w:r>
+      <w:r>
+        <w:t xml:space="preserve">Spatial Autocorrelation (Moran’s I) and Hotspot Analysis.</w:t>
+      </w:r>
+      <w:r>
+        <w:t xml:space="preserve"> </w:t>
+      </w:r>
+      <w:r>
+        <w:rPr>
+          <w:b/>
+          <w:bCs/>
+        </w:rPr>
+        <w:t xml:space="preserve">Table S6:</w:t>
+      </w:r>
+      <w:r>
+        <w:t xml:space="preserve"> </w:t>
+      </w:r>
+      <w:r>
+        <w:t xml:space="preserve">Correlation between hub gene expression and immune cell infiltration.</w:t>
+      </w:r>
+      <w:r>
+        <w:t xml:space="preserve"> </w:t>
+      </w:r>
+      <w:r>
+        <w:rPr>
+          <w:b/>
+          <w:bCs/>
+        </w:rPr>
+        <w:t xml:space="preserve">Table S7:</w:t>
+      </w:r>
+      <w:r>
+        <w:t xml:space="preserve"> </w:t>
+      </w:r>
+      <w:r>
+        <w:t xml:space="preserve">Mendelian Randomization analysis results.</w:t>
+      </w:r>
+      <w:r>
+        <w:t xml:space="preserve"> </w:t>
+      </w:r>
+      <w:r>
+        <w:rPr>
+          <w:b/>
+          <w:bCs/>
+        </w:rPr>
+        <w:t xml:space="preserve">Table S8:</w:t>
+      </w:r>
+      <w:r>
+        <w:t xml:space="preserve"> </w:t>
+      </w:r>
+      <w:r>
+        <w:t xml:space="preserve">TME-subtype differential-expression context.</w:t>
+      </w:r>
+      <w:r>
+        <w:t xml:space="preserve"> </w:t>
+      </w:r>
+      <w:r>
+        <w:rPr>
+          <w:b/>
+          <w:bCs/>
+        </w:rPr>
+        <w:t xml:space="preserve">Table S9:</w:t>
+      </w:r>
+      <w:r>
+        <w:t xml:space="preserve"> </w:t>
+      </w:r>
+      <w:r>
+        <w:t xml:space="preserve">External-cohort covariate summaries.</w:t>
+      </w:r>
+      <w:r>
+        <w:t xml:space="preserve"> </w:t>
+      </w:r>
+      <w:r>
+        <w:rPr>
+          <w:b/>
+          <w:bCs/>
+        </w:rPr>
+        <w:t xml:space="preserve">Table S10:</w:t>
+      </w:r>
+      <w:r>
+        <w:t xml:space="preserve"> </w:t>
+      </w:r>
+      <w:r>
+        <w:t xml:space="preserve">Cell-Type-Specific eQTL Analysis.</w:t>
+      </w:r>
+      <w:r>
+        <w:t xml:space="preserve"> </w:t>
+      </w:r>
+      <w:r>
+        <w:rPr>
+          <w:b/>
+          <w:bCs/>
+        </w:rPr>
+        <w:t xml:space="preserve">Table S11:</w:t>
+      </w:r>
+      <w:r>
+        <w:t xml:space="preserve"> </w:t>
+      </w:r>
+      <w:r>
+        <w:t xml:space="preserve">MR diagnostic parameters for prioritized genes.</w:t>
+      </w:r>
+      <w:r>
+        <w:t xml:space="preserve"> </w:t>
+      </w:r>
+      <w:r>
+        <w:rPr>
+          <w:b/>
+          <w:bCs/>
+        </w:rPr>
+        <w:t xml:space="preserve">Table S12:</w:t>
+      </w:r>
+      <w:r>
+        <w:t xml:space="preserve"> </w:t>
+      </w:r>
+      <w:r>
+        <w:t xml:space="preserve">Spatial Transcriptomics Sample Information (10x Visium + CosMx SMI).</w:t>
+      </w:r>
+      <w:r>
+        <w:t xml:space="preserve"> </w:t>
+      </w:r>
+      <w:r>
+        <w:rPr>
+          <w:b/>
+          <w:bCs/>
+        </w:rPr>
+        <w:t xml:space="preserve">Table S13:</w:t>
+      </w:r>
+      <w:r>
+        <w:t xml:space="preserve"> </w:t>
+      </w:r>
+      <w:r>
+        <w:t xml:space="preserve">Multivariable Cox regression analysis of the retrospective score.</w:t>
       </w:r>
     </w:p>
     <w:p>
@@ -9753,7 +10618,23 @@
         <w:pStyle w:val="BodyText"/>
       </w:pPr>
       <w:r>
-        <w:t xml:space="preserve">Regarding immunotherapy-response association, several considerations warrant discussion:</w:t>
+        <w:t xml:space="preserve">This study utilized publicly available datasets from The Cancer Genome Atlas (TCGA), Gene Expression Omnibus (GEO: GSE31210, GSE91061, GSE126044, GSE135222), eQTLGen Consortium, GTEx Consortium, and Human Protein Atlas. All original studies from which these data were derived obtained appropriate informed consent from participants and received approval from their respective institutional review boards. As this study represents a secondary analysis of de-identified public data, additional ethics approval was not required in accordance with institutional guidelines.</w:t>
+      </w:r>
+    </w:p>
+    <w:p>
+      <w:pPr>
+        <w:pStyle w:val="BodyText"/>
+      </w:pPr>
+      <w:r>
+        <w:t xml:space="preserve">Not applicable. This manuscript does not contain any individual person’s data in any form (including individual details, images, or videos).</w:t>
+      </w:r>
+    </w:p>
+    <w:p>
+      <w:pPr>
+        <w:pStyle w:val="BodyText"/>
+      </w:pPr>
+      <w:r>
+        <w:t xml:space="preserve">Publicly available datasets were analyzed in this study. These data can be found here:</w:t>
       </w:r>
     </w:p>
     <w:p>
@@ -9764,549 +10645,9 @@
         </w:numPr>
       </w:pPr>
       <w:r>
-        <w:t xml:space="preserve">The GSE91061 cohort includes melanoma and is not NSCLC-specific. It provides cross-tumor exploratory support only.</w:t>
-      </w:r>
-    </w:p>
-    <w:p>
-      <w:pPr>
-        <w:numPr>
-          <w:ilvl w:val="0"/>
-          <w:numId w:val="1025"/>
-        </w:numPr>
-      </w:pPr>
-      <w:r>
-        <w:t xml:space="preserve">Spatial transcriptomics analysis was performed largely on treatment-naïve samples. On-treatment biopsies would be required to assess spatial remodeling during therapy.</w:t>
-      </w:r>
-    </w:p>
-    <w:p>
-      <w:pPr>
-        <w:numPr>
-          <w:ilvl w:val="0"/>
-          <w:numId w:val="1025"/>
-        </w:numPr>
-      </w:pPr>
-      <w:r>
-        <w:t xml:space="preserve">The small sample sizes of immunotherapy cohorts (GSE126044: N=16; GSE135222: N=27) limit precision and subgroup analysis. Prospective validation is essential before clinical implementation.</w:t>
-      </w:r>
-    </w:p>
-    <w:p>
-      <w:pPr>
-        <w:numPr>
-          <w:ilvl w:val="0"/>
-          <w:numId w:val="1025"/>
-        </w:numPr>
-      </w:pPr>
-      <w:r>
-        <w:t xml:space="preserve">Integration with PD-L1, TMB, ctDNA dynamics, TCR repertoire, and treatment metadata will be needed before incremental value can be assessed.</w:t>
-      </w:r>
-    </w:p>
-    <w:p>
-      <w:pPr>
-        <w:pStyle w:val="FirstParagraph"/>
-      </w:pPr>
-      <w:r>
-        <w:t xml:space="preserve">Future translational studies should prioritize a locked, FFPE-compatible assay; adequately powered NSCLC-only cohorts; prespecified cutoffs; and direct comparison with existing clinical and molecular biomarkers.</w:t>
-      </w:r>
-    </w:p>
-    <w:p>
-      <w:pPr>
-        <w:pStyle w:val="BodyText"/>
-      </w:pPr>
-      <w:r>
-        <w:t xml:space="preserve">Additional limitations include population imbalance in TCGA, incomplete treatment data, cross-platform technical variance, possible residual confounding, and the absence of wet-lab perturbation. The counterfactual scoring analysis is a sensitivity analysis only. The model has not been validated in neoadjuvant immunotherapy or prospective randomized settings.</w:t>
-      </w:r>
-    </w:p>
-    <w:p>
-      <w:pPr>
-        <w:pStyle w:val="BodyText"/>
-      </w:pPr>
-      <w:r>
-        <w:t xml:space="preserve">Overall, the study provides a reproducible public-data framework for tracing macrophage-context signals across molecular and spatial layers. Its most immediate value is hypothesis prioritization for future spatial and functional validation.</w:t>
-      </w:r>
-    </w:p>
-    <w:bookmarkEnd w:id="53"/>
-    <w:bookmarkEnd w:id="54"/>
-    <w:bookmarkEnd w:id="55"/>
-    <w:bookmarkStart w:id="56" w:name="sec:conclusions"/>
-    <w:p>
-      <w:pPr>
-        <w:pStyle w:val="Heading1"/>
-      </w:pPr>
-      <w:r>
-        <w:t xml:space="preserve">Conclusions</w:t>
-      </w:r>
-    </w:p>
-    <w:p>
-      <w:pPr>
-        <w:pStyle w:val="FirstParagraph"/>
-      </w:pPr>
-      <w:r>
-        <w:t xml:space="preserve">This study identifies C1Q/SPP1 as a reproducible macrophage-context traceability feature in public NSCLC resources. C1Q-family genes showed moderate spatial clustering, SPP1 showed stronger spatial compartmentalization, and retrospective model behavior suggested outcome-linked signal with modest discrimination. MR and counterfactual analyses support prioritization but do not prove mechanism. The findings are hypothesis-generating and require prospective, NSCLC-specific, spatially resolved, and experimental validation before clinical implementation or therapeutic targeting can be considered.</w:t>
-      </w:r>
-    </w:p>
-    <w:bookmarkEnd w:id="56"/>
-    <w:bookmarkStart w:id="63" w:name="supplementary-information"/>
-    <w:p>
-      <w:pPr>
-        <w:pStyle w:val="Heading1"/>
-      </w:pPr>
-      <w:r>
-        <w:t xml:space="preserve">Supplementary Information</w:t>
-      </w:r>
-    </w:p>
-    <w:p>
-      <w:pPr>
-        <w:pStyle w:val="FirstParagraph"/>
-      </w:pPr>
-      <w:r>
-        <w:rPr>
-          <w:b/>
-          <w:bCs/>
-        </w:rPr>
-        <w:t xml:space="preserve">Additional file 1: Supplementary Material.</w:t>
-      </w:r>
-      <w:r>
-        <w:t xml:space="preserve"> </w:t>
-      </w:r>
-      <w:r>
-        <w:t xml:space="preserve">Contains Supplementary Figures S1–S12 and Supplementary Tables S1–S13.</w:t>
-      </w:r>
-      <w:r>
-        <w:t xml:space="preserve"> </w:t>
-      </w:r>
-      <w:r>
-        <w:rPr>
-          <w:b/>
-          <w:bCs/>
-        </w:rPr>
-        <w:t xml:space="preserve">Figure S1:</w:t>
-      </w:r>
-      <w:r>
-        <w:t xml:space="preserve"> </w:t>
-      </w:r>
-      <w:r>
-        <w:t xml:space="preserve">Quality control and clustering analysis of spatial transcriptomics data.</w:t>
-      </w:r>
-      <w:r>
-        <w:t xml:space="preserve"> </w:t>
-      </w:r>
-      <w:r>
-        <w:rPr>
-          <w:b/>
-          <w:bCs/>
-        </w:rPr>
-        <w:t xml:space="preserve">Figure S2:</w:t>
-      </w:r>
-      <w:r>
-        <w:t xml:space="preserve"> </w:t>
-      </w:r>
-      <w:r>
-        <w:t xml:space="preserve">Machine learning model development and internal assessment details.</w:t>
-      </w:r>
-      <w:r>
-        <w:t xml:space="preserve"> </w:t>
-      </w:r>
-      <w:r>
-        <w:rPr>
-          <w:b/>
-          <w:bCs/>
-        </w:rPr>
-        <w:t xml:space="preserve">Figure S3:</w:t>
-      </w:r>
-      <w:r>
-        <w:t xml:space="preserve"> </w:t>
-      </w:r>
-      <w:r>
-        <w:t xml:space="preserve">Functional enrichment analysis.</w:t>
-      </w:r>
-      <w:r>
-        <w:t xml:space="preserve"> </w:t>
-      </w:r>
-      <w:r>
-        <w:rPr>
-          <w:b/>
-          <w:bCs/>
-        </w:rPr>
-        <w:t xml:space="preserve">Figure S4:</w:t>
-      </w:r>
-      <w:r>
-        <w:t xml:space="preserve"> </w:t>
-      </w:r>
-      <w:r>
-        <w:t xml:space="preserve">Spatial expression patterns of immune checkpoint molecules.</w:t>
-      </w:r>
-      <w:r>
-        <w:t xml:space="preserve"> </w:t>
-      </w:r>
-      <w:r>
-        <w:rPr>
-          <w:b/>
-          <w:bCs/>
-        </w:rPr>
-        <w:t xml:space="preserve">Figure S5:</w:t>
-      </w:r>
-      <w:r>
-        <w:t xml:space="preserve"> </w:t>
-      </w:r>
-      <w:r>
-        <w:t xml:space="preserve">Pan-cancer exploratory traceability of core candidate genes.</w:t>
-      </w:r>
-      <w:r>
-        <w:t xml:space="preserve"> </w:t>
-      </w:r>
-      <w:r>
-        <w:rPr>
-          <w:b/>
-          <w:bCs/>
-        </w:rPr>
-        <w:t xml:space="preserve">Figure S6:</w:t>
-      </w:r>
-      <w:r>
-        <w:t xml:space="preserve"> </w:t>
-      </w:r>
-      <w:r>
-        <w:t xml:space="preserve">Correlation analysis between hub genes and immune-context estimates.</w:t>
-      </w:r>
-      <w:r>
-        <w:t xml:space="preserve"> </w:t>
-      </w:r>
-      <w:r>
-        <w:rPr>
-          <w:b/>
-          <w:bCs/>
-        </w:rPr>
-        <w:t xml:space="preserve">Figure S7:</w:t>
-      </w:r>
-      <w:r>
-        <w:t xml:space="preserve"> </w:t>
-      </w:r>
-      <w:r>
-        <w:t xml:space="preserve">Expression of top model genes in the GSE31210 traceability cohort.</w:t>
-      </w:r>
-      <w:r>
-        <w:t xml:space="preserve"> </w:t>
-      </w:r>
-      <w:r>
-        <w:rPr>
-          <w:b/>
-          <w:bCs/>
-        </w:rPr>
-        <w:t xml:space="preserve">Figure S8:</w:t>
-      </w:r>
-      <w:r>
-        <w:t xml:space="preserve"> </w:t>
-      </w:r>
-      <w:r>
-        <w:t xml:space="preserve">5-fold cross-validation performance evaluation.</w:t>
-      </w:r>
-      <w:r>
-        <w:t xml:space="preserve"> </w:t>
-      </w:r>
-      <w:r>
-        <w:rPr>
-          <w:b/>
-          <w:bCs/>
-        </w:rPr>
-        <w:t xml:space="preserve">Figure S9:</w:t>
-      </w:r>
-      <w:r>
-        <w:t xml:space="preserve"> </w:t>
-      </w:r>
-      <w:r>
-        <w:t xml:space="preserve">Mendelian Randomization Leave-one-out sensitivity analysis.</w:t>
-      </w:r>
-      <w:r>
-        <w:t xml:space="preserve"> </w:t>
-      </w:r>
-      <w:r>
-        <w:rPr>
-          <w:b/>
-          <w:bCs/>
-        </w:rPr>
-        <w:t xml:space="preserve">Figure S10:</w:t>
-      </w:r>
-      <w:r>
-        <w:t xml:space="preserve"> </w:t>
-      </w:r>
-      <w:r>
-        <w:t xml:space="preserve">Leave-one-out sensitivity analysis for MR-prioritized genes.</w:t>
-      </w:r>
-      <w:r>
-        <w:t xml:space="preserve"> </w:t>
-      </w:r>
-      <w:r>
-        <w:rPr>
-          <w:b/>
-          <w:bCs/>
-        </w:rPr>
-        <w:t xml:space="preserve">Figure S11:</w:t>
-      </w:r>
-      <w:r>
-        <w:t xml:space="preserve"> </w:t>
-      </w:r>
-      <w:r>
-        <w:t xml:space="preserve">Counterfactual C1QA scoring sensitivity analysis showing C1Q-score dependency and network-summary changes.</w:t>
-      </w:r>
-      <w:r>
-        <w:t xml:space="preserve"> </w:t>
-      </w:r>
-      <w:r>
-        <w:rPr>
-          <w:b/>
-          <w:bCs/>
-        </w:rPr>
-        <w:t xml:space="preserve">Figure S12:</w:t>
-      </w:r>
-      <w:r>
-        <w:t xml:space="preserve"> </w:t>
-      </w:r>
-      <w:r>
-        <w:t xml:space="preserve">Sensitivity analyses including dose-response, spatial scale dependency, and specificity ranking.</w:t>
-      </w:r>
-      <w:r>
-        <w:t xml:space="preserve"> </w:t>
-      </w:r>
-      <w:r>
-        <w:rPr>
-          <w:b/>
-          <w:bCs/>
-        </w:rPr>
-        <w:t xml:space="preserve">Table S1:</w:t>
-      </w:r>
-      <w:r>
-        <w:t xml:space="preserve"> </w:t>
-      </w:r>
-      <w:r>
-        <w:t xml:space="preserve">Model performance on training, internal cross-validation, test, and external sets.</w:t>
-      </w:r>
-      <w:r>
-        <w:t xml:space="preserve"> </w:t>
-      </w:r>
-      <w:r>
-        <w:rPr>
-          <w:b/>
-          <w:bCs/>
-        </w:rPr>
-        <w:t xml:space="preserve">Table S2:</w:t>
-      </w:r>
-      <w:r>
-        <w:t xml:space="preserve"> </w:t>
-      </w:r>
-      <w:r>
-        <w:t xml:space="preserve">List of stable features (genes) selected in 100% of cross-validation folds.</w:t>
-      </w:r>
-      <w:r>
-        <w:t xml:space="preserve"> </w:t>
-      </w:r>
-      <w:r>
-        <w:rPr>
-          <w:b/>
-          <w:bCs/>
-        </w:rPr>
-        <w:t xml:space="preserve">Table S3:</w:t>
-      </w:r>
-      <w:r>
-        <w:t xml:space="preserve"> </w:t>
-      </w:r>
-      <w:r>
-        <w:t xml:space="preserve">Edge list of the eQTL-driven regulatory network.</w:t>
-      </w:r>
-      <w:r>
-        <w:t xml:space="preserve"> </w:t>
-      </w:r>
-      <w:r>
-        <w:rPr>
-          <w:b/>
-          <w:bCs/>
-        </w:rPr>
-        <w:t xml:space="preserve">Table S4:</w:t>
-      </w:r>
-      <w:r>
-        <w:t xml:space="preserve"> </w:t>
-      </w:r>
-      <w:r>
-        <w:t xml:space="preserve">List of stable features identified by nested cross-validation.</w:t>
-      </w:r>
-      <w:r>
-        <w:t xml:space="preserve"> </w:t>
-      </w:r>
-      <w:r>
-        <w:rPr>
-          <w:b/>
-          <w:bCs/>
-        </w:rPr>
-        <w:t xml:space="preserve">Table S5:</w:t>
-      </w:r>
-      <w:r>
-        <w:t xml:space="preserve"> </w:t>
-      </w:r>
-      <w:r>
-        <w:t xml:space="preserve">Spatial Autocorrelation (Moran’s I) and Hotspot Analysis.</w:t>
-      </w:r>
-      <w:r>
-        <w:t xml:space="preserve"> </w:t>
-      </w:r>
-      <w:r>
-        <w:rPr>
-          <w:b/>
-          <w:bCs/>
-        </w:rPr>
-        <w:t xml:space="preserve">Table S6:</w:t>
-      </w:r>
-      <w:r>
-        <w:t xml:space="preserve"> </w:t>
-      </w:r>
-      <w:r>
-        <w:t xml:space="preserve">Correlation between hub gene expression and immune cell infiltration.</w:t>
-      </w:r>
-      <w:r>
-        <w:t xml:space="preserve"> </w:t>
-      </w:r>
-      <w:r>
-        <w:rPr>
-          <w:b/>
-          <w:bCs/>
-        </w:rPr>
-        <w:t xml:space="preserve">Table S7:</w:t>
-      </w:r>
-      <w:r>
-        <w:t xml:space="preserve"> </w:t>
-      </w:r>
-      <w:r>
-        <w:t xml:space="preserve">Mendelian Randomization analysis results.</w:t>
-      </w:r>
-      <w:r>
-        <w:t xml:space="preserve"> </w:t>
-      </w:r>
-      <w:r>
-        <w:rPr>
-          <w:b/>
-          <w:bCs/>
-        </w:rPr>
-        <w:t xml:space="preserve">Table S8:</w:t>
-      </w:r>
-      <w:r>
-        <w:t xml:space="preserve"> </w:t>
-      </w:r>
-      <w:r>
-        <w:t xml:space="preserve">Colocalization Analysis Results (COLOC).</w:t>
-      </w:r>
-      <w:r>
-        <w:t xml:space="preserve"> </w:t>
-      </w:r>
-      <w:r>
-        <w:rPr>
-          <w:b/>
-          <w:bCs/>
-        </w:rPr>
-        <w:t xml:space="preserve">Table S9:</w:t>
-      </w:r>
-      <w:r>
-        <w:t xml:space="preserve"> </w:t>
-      </w:r>
-      <w:r>
-        <w:t xml:space="preserve">Model performance in external cohorts.</w:t>
-      </w:r>
-      <w:r>
-        <w:t xml:space="preserve"> </w:t>
-      </w:r>
-      <w:r>
-        <w:rPr>
-          <w:b/>
-          <w:bCs/>
-        </w:rPr>
-        <w:t xml:space="preserve">Table S10:</w:t>
-      </w:r>
-      <w:r>
-        <w:t xml:space="preserve"> </w:t>
-      </w:r>
-      <w:r>
-        <w:t xml:space="preserve">Cell-Type-Specific eQTL Analysis.</w:t>
-      </w:r>
-      <w:r>
-        <w:t xml:space="preserve"> </w:t>
-      </w:r>
-      <w:r>
-        <w:rPr>
-          <w:b/>
-          <w:bCs/>
-        </w:rPr>
-        <w:t xml:space="preserve">Table S11:</w:t>
-      </w:r>
-      <w:r>
-        <w:t xml:space="preserve"> </w:t>
-      </w:r>
-      <w:r>
-        <w:t xml:space="preserve">Pan-cancer prognostic traceability analysis of core candidate genes.</w:t>
-      </w:r>
-      <w:r>
-        <w:t xml:space="preserve"> </w:t>
-      </w:r>
-      <w:r>
-        <w:rPr>
-          <w:b/>
-          <w:bCs/>
-        </w:rPr>
-        <w:t xml:space="preserve">Table S12:</w:t>
-      </w:r>
-      <w:r>
-        <w:t xml:space="preserve"> </w:t>
-      </w:r>
-      <w:r>
-        <w:t xml:space="preserve">Spatial Transcriptomics Sample Information (10x Visium + CosMx SMI).</w:t>
-      </w:r>
-      <w:r>
-        <w:t xml:space="preserve"> </w:t>
-      </w:r>
-      <w:r>
-        <w:rPr>
-          <w:b/>
-          <w:bCs/>
-        </w:rPr>
-        <w:t xml:space="preserve">Table S13:</w:t>
-      </w:r>
-      <w:r>
-        <w:t xml:space="preserve"> </w:t>
-      </w:r>
-      <w:r>
-        <w:t xml:space="preserve">Multivariable Cox Regression Analysis of the Prognostic Signature.</w:t>
-      </w:r>
-    </w:p>
-    <w:p>
-      <w:pPr>
-        <w:pStyle w:val="BodyText"/>
-      </w:pPr>
-      <w:r>
-        <w:t xml:space="preserve">This study utilized publicly available datasets from The Cancer Genome Atlas (TCGA), Gene Expression Omnibus (GEO: GSE31210, GSE91061, GSE126044, GSE135222), eQTLGen Consortium, GTEx Consortium, and Human Protein Atlas. All original studies from which these data were derived obtained appropriate informed consent from participants and received approval from their respective institutional review boards. As this study represents a secondary analysis of de-identified public data, additional ethics approval was not required in accordance with institutional guidelines.</w:t>
-      </w:r>
-    </w:p>
-    <w:p>
-      <w:pPr>
-        <w:pStyle w:val="BodyText"/>
-      </w:pPr>
-      <w:r>
-        <w:t xml:space="preserve">Not applicable. This manuscript does not contain any individual person’s data in any form (including individual details, images, or videos).</w:t>
-      </w:r>
-    </w:p>
-    <w:p>
-      <w:pPr>
-        <w:pStyle w:val="BodyText"/>
-      </w:pPr>
-      <w:r>
-        <w:t xml:space="preserve">Publicly available datasets were analyzed in this study. These data can be found here:</w:t>
-      </w:r>
-    </w:p>
-    <w:p>
-      <w:pPr>
-        <w:numPr>
-          <w:ilvl w:val="0"/>
-          <w:numId w:val="1026"/>
-        </w:numPr>
-      </w:pPr>
-      <w:r>
         <w:t xml:space="preserve">The Cancer Genome Atlas (TCGA) NSCLC cohort data: NCI Genomic Data Commons (GDC) Portal (</w:t>
       </w:r>
-      <w:hyperlink r:id="rId57">
+      <w:hyperlink r:id="rId56">
         <w:r>
           <w:rPr>
             <w:rStyle w:val="Hyperlink"/>
@@ -10322,7 +10663,7 @@
       <w:pPr>
         <w:numPr>
           <w:ilvl w:val="0"/>
-          <w:numId w:val="1026"/>
+          <w:numId w:val="1025"/>
         </w:numPr>
       </w:pPr>
       <w:r>
@@ -10337,7 +10678,7 @@
       <w:r>
         <w:t xml:space="preserve">(</w:t>
       </w:r>
-      <w:hyperlink r:id="rId58">
+      <w:hyperlink r:id="rId57">
         <w:r>
           <w:rPr>
             <w:rStyle w:val="Hyperlink"/>
@@ -10353,7 +10694,7 @@
       <w:pPr>
         <w:numPr>
           <w:ilvl w:val="1"/>
-          <w:numId w:val="1027"/>
+          <w:numId w:val="1026"/>
         </w:numPr>
       </w:pPr>
       <w:r>
@@ -10364,7 +10705,7 @@
       <w:pPr>
         <w:numPr>
           <w:ilvl w:val="1"/>
-          <w:numId w:val="1027"/>
+          <w:numId w:val="1026"/>
         </w:numPr>
       </w:pPr>
       <w:r>
@@ -10375,7 +10716,7 @@
       <w:pPr>
         <w:numPr>
           <w:ilvl w:val="1"/>
-          <w:numId w:val="1027"/>
+          <w:numId w:val="1026"/>
         </w:numPr>
       </w:pPr>
       <w:r>
@@ -10386,7 +10727,7 @@
       <w:pPr>
         <w:numPr>
           <w:ilvl w:val="1"/>
-          <w:numId w:val="1027"/>
+          <w:numId w:val="1026"/>
         </w:numPr>
       </w:pPr>
       <w:r>
@@ -10397,13 +10738,13 @@
       <w:pPr>
         <w:numPr>
           <w:ilvl w:val="0"/>
-          <w:numId w:val="1026"/>
+          <w:numId w:val="1025"/>
         </w:numPr>
       </w:pPr>
       <w:r>
         <w:t xml:space="preserve">eQTL summary statistics: eQTL Catalogue (</w:t>
       </w:r>
-      <w:hyperlink r:id="rId59">
+      <w:hyperlink r:id="rId58">
         <w:r>
           <w:rPr>
             <w:rStyle w:val="Hyperlink"/>
@@ -10414,7 +10755,7 @@
       <w:r>
         <w:t xml:space="preserve">) and eQTLGen Consortium (</w:t>
       </w:r>
-      <w:hyperlink r:id="rId60">
+      <w:hyperlink r:id="rId59">
         <w:r>
           <w:rPr>
             <w:rStyle w:val="Hyperlink"/>
@@ -10430,13 +10771,13 @@
       <w:pPr>
         <w:numPr>
           <w:ilvl w:val="0"/>
-          <w:numId w:val="1026"/>
+          <w:numId w:val="1025"/>
         </w:numPr>
       </w:pPr>
       <w:r>
         <w:t xml:space="preserve">GTEx v8 data: GTEx Portal (</w:t>
       </w:r>
-      <w:hyperlink r:id="rId61">
+      <w:hyperlink r:id="rId60">
         <w:r>
           <w:rPr>
             <w:rStyle w:val="Hyperlink"/>
@@ -10452,7 +10793,7 @@
       <w:pPr>
         <w:numPr>
           <w:ilvl w:val="0"/>
-          <w:numId w:val="1026"/>
+          <w:numId w:val="1025"/>
         </w:numPr>
       </w:pPr>
       <w:r>
@@ -10467,7 +10808,7 @@
       <w:r>
         <w:t xml:space="preserve">(</w:t>
       </w:r>
-      <w:hyperlink r:id="rId62">
+      <w:hyperlink r:id="rId61">
         <w:r>
           <w:rPr>
             <w:rStyle w:val="Hyperlink"/>
@@ -10484,7 +10825,21 @@
         <w:pStyle w:val="FirstParagraph"/>
       </w:pPr>
       <w:r>
-        <w:t>The source-data manifest, processed analysis tables, manuscript files, figures, and reproducibility notes are available in a public GitHub repository: https://github.com/morningLxj/spatial-immunotherapy-prediction. The repository includes a machine-readable source-data archive and claim-to-source mapping for reviewer inspection. It is intended to support traceability and source-data verification, not to provide a clinical implementation package or a complete raw-data-to-figure re-analysis pipeline.</w:t>
+        <w:t xml:space="preserve">The source-data manifest, processed analysis tables, manuscript files, figures, and reproducibility notes are available in a public GitHub repository:</w:t>
+      </w:r>
+      <w:r>
+        <w:t xml:space="preserve"> </w:t>
+      </w:r>
+      <w:hyperlink r:id="rId62">
+        <w:r>
+          <w:rPr>
+            <w:rStyle w:val="Hyperlink"/>
+          </w:rPr>
+          <w:t xml:space="preserve">https://github.com/morningLxj/spatial-immunotherapy-prediction</w:t>
+        </w:r>
+      </w:hyperlink>
+      <w:r>
+        <w:t xml:space="preserve">. The repository includes a machine-readable source-data archive and claim-to-source mapping for reviewer inspection. It is intended to support traceability and source-data verification, not to provide a clinical implementation package or a complete raw-data-to-figure re-analysis pipeline.</w:t>
       </w:r>
     </w:p>
     <w:p>
@@ -10492,7 +10847,21 @@
         <w:pStyle w:val="BodyText"/>
       </w:pPr>
       <w:r>
-        <w:t>Repository integrity checks and reproducibility notes are available at https://github.com/morningLxj/spatial-immunotherapy-prediction. The included script verifies the expected source-data archive, lists its contents, and writes a source-data inventory. Public-data acquisition and complete re-analysis from raw source repositories should be treated as a separate workflow and, if required by the journal or reviewers, archived as a versioned release before final publication.</w:t>
+        <w:t xml:space="preserve">Repository integrity checks and reproducibility notes are available at</w:t>
+      </w:r>
+      <w:r>
+        <w:t xml:space="preserve"> </w:t>
+      </w:r>
+      <w:hyperlink r:id="rId62">
+        <w:r>
+          <w:rPr>
+            <w:rStyle w:val="Hyperlink"/>
+          </w:rPr>
+          <w:t xml:space="preserve">https://github.com/morningLxj/spatial-immunotherapy-prediction</w:t>
+        </w:r>
+      </w:hyperlink>
+      <w:r>
+        <w:t xml:space="preserve">. The included script verifies the expected source-data archive, lists its contents, and writes a source-data inventory. Public-data acquisition and complete re-analysis from raw source repositories should be treated as a separate workflow and, if required by the journal or reviewers, archived as a versioned release before final publication.</w:t>
       </w:r>
     </w:p>
     <w:p>
@@ -10500,7 +10869,7 @@
         <w:pStyle w:val="BodyText"/>
       </w:pPr>
       <w:r>
-        <w:t xml:space="preserve">The manuscript was revised using STROBE principles for observational retrospective analyses and TRIPOD-AI considerations for prediction-model reporting where applicable. Because the work is a public-data evidence synthesis rather than a locked clinical prediction-model study, the model results are presented as exploratory model behavior.</w:t>
+        <w:t xml:space="preserve">The manuscript was revised using STROBE principles for observational retrospective analyses and TRIPOD-AI considerations where applicable. Because the work is a public-data evidence synthesis rather than a locked clinical prediction-model study, the model results are presented as exploratory score behavior.</w:t>
       </w:r>
     </w:p>
     <w:p>
@@ -12125,39 +12494,9 @@
     </w:lvlOverride>
   </w:num>
   <w:num w:numId="1025">
-    <w:abstractNumId w:val="99201"/>
-    <w:lvlOverride w:ilvl="0">
-      <w:startOverride w:val="1"/>
-    </w:lvlOverride>
-    <w:lvlOverride w:ilvl="1">
-      <w:startOverride w:val="1"/>
-    </w:lvlOverride>
-    <w:lvlOverride w:ilvl="2">
-      <w:startOverride w:val="1"/>
-    </w:lvlOverride>
-    <w:lvlOverride w:ilvl="3">
-      <w:startOverride w:val="1"/>
-    </w:lvlOverride>
-    <w:lvlOverride w:ilvl="4">
-      <w:startOverride w:val="1"/>
-    </w:lvlOverride>
-    <w:lvlOverride w:ilvl="5">
-      <w:startOverride w:val="1"/>
-    </w:lvlOverride>
-    <w:lvlOverride w:ilvl="6">
-      <w:startOverride w:val="1"/>
-    </w:lvlOverride>
-    <w:lvlOverride w:ilvl="7">
-      <w:startOverride w:val="1"/>
-    </w:lvlOverride>
-    <w:lvlOverride w:ilvl="8">
-      <w:startOverride w:val="1"/>
-    </w:lvlOverride>
+    <w:abstractNumId w:val="991"/>
   </w:num>
   <w:num w:numId="1026">
-    <w:abstractNumId w:val="991"/>
-  </w:num>
-  <w:num w:numId="1027">
     <w:abstractNumId w:val="991"/>
   </w:num>
 </w:numbering>

</xml_diff>

<commit_message>
Add final author and correspondence metadata
</commit_message>
<xml_diff>
--- a/manuscript/main_manuscript.docx
+++ b/manuscript/main_manuscript.docx
@@ -15,6 +15,21 @@
         <w:pStyle w:val="Author"/>
       </w:pPr>
     </w:p>
+    <w:p>
+      <w:pPr>
+        <w:pStyle w:val="Author"/>
+      </w:pPr>
+    </w:p>
+    <w:p>
+      <w:pPr>
+        <w:pStyle w:val="Author"/>
+      </w:pPr>
+    </w:p>
+    <w:p>
+      <w:pPr>
+        <w:pStyle w:val="Author"/>
+      </w:pPr>
+    </w:p>
     <w:bookmarkStart w:id="10" w:name="X43ba11093772ab39d1c6e7aae5420434ade6a43"/>
     <w:p>
       <w:pPr>
@@ -29,7 +44,7 @@
         <w:pStyle w:val="FirstParagraph"/>
       </w:pPr>
       <w:r>
-        <w:t xml:space="preserve">Anonymous Author</w:t>
+        <w:t xml:space="preserve">Xiongjie Li (1,*), Fengyue Zhang (2), Chaojia Luo (1), and Xuan Xu (1)</w:t>
       </w:r>
     </w:p>
     <w:p>
@@ -37,7 +52,23 @@
         <w:pStyle w:val="BodyText"/>
       </w:pPr>
       <w:r>
-        <w:t xml:space="preserve">Anonymous Institution</w:t>
+        <w:t xml:space="preserve">1 Department of Cardiothoracic, Thyroid and Breast Surgery, Qianjiang Jianghan Oilfield General Hospital, No. T32, Guanghua Ankang Road, Qianjiang 433100, Hubei, China</w:t>
+      </w:r>
+    </w:p>
+    <w:p>
+      <w:pPr>
+        <w:pStyle w:val="BodyText"/>
+      </w:pPr>
+      <w:r>
+        <w:t xml:space="preserve">2 Department of Gastroenterology, Qianjiang Jianghan Oilfield General Hospital, Qianjiang 433100, Hubei, China</w:t>
+      </w:r>
+    </w:p>
+    <w:p>
+      <w:pPr>
+        <w:pStyle w:val="BodyText"/>
+      </w:pPr>
+      <w:r>
+        <w:t xml:space="preserve">*Correspondence: Xiongjie Li, MD; Department of Cardiothoracic, Thyroid and Breast Surgery, Qianjiang Jianghan Oilfield General Hospital, Qianjiang 433100, Hubei, China; Email: surobert518@163.com; ORCID: 0009-0005-9507-6829</w:t>
       </w:r>
     </w:p>
     <w:bookmarkStart w:id="9" w:name="abstract"/>
@@ -8263,7 +8294,7 @@
       </w:r>
     </w:p>
     <w:bookmarkEnd w:id="88"/>
-    <w:bookmarkStart w:id="96" w:name="supplementary-information"/>
+    <w:bookmarkStart w:id="97" w:name="supplementary-information"/>
     <w:p>
       <w:pPr>
         <w:pStyle w:val="Heading1"/>
@@ -8570,7 +8601,7 @@
         <w:pStyle w:val="BodyText"/>
       </w:pPr>
       <w:r>
-        <w:t xml:space="preserve">Author contribution details are omitted for double-blind peer review.</w:t>
+        <w:t xml:space="preserve">Xiongjie Li conceived and supervised the study, contributed to study design, and revised the manuscript. Fengyue Zhang, Chaojia Luo, and Xuan Xu contributed to data interpretation, manuscript drafting or revision, and critical review. All authors read and approved the final manuscript.</w:t>
       </w:r>
     </w:p>
     <w:p>
@@ -8578,10 +8609,32 @@
         <w:pStyle w:val="BodyText"/>
       </w:pPr>
       <w:r>
-        <w:t xml:space="preserve">Acknowledgements are omitted for double-blind peer review.</w:t>
-      </w:r>
-    </w:p>
-    <w:bookmarkEnd w:id="96"/>
+        <w:t xml:space="preserve">Xiongjie Li:</w:t>
+      </w:r>
+      <w:r>
+        <w:t xml:space="preserve"> </w:t>
+      </w:r>
+      <w:hyperlink r:id="rId96">
+        <w:r>
+          <w:rPr>
+            <w:rStyle w:val="Hyperlink"/>
+          </w:rPr>
+          <w:t xml:space="preserve">https://orcid.org/0009-0005-9507-6829</w:t>
+        </w:r>
+      </w:hyperlink>
+      <w:r>
+        <w:t xml:space="preserve">.</w:t>
+      </w:r>
+    </w:p>
+    <w:p>
+      <w:pPr>
+        <w:pStyle w:val="BodyText"/>
+      </w:pPr>
+      <w:r>
+        <w:t xml:space="preserve">The authors thank the investigators and participants of the public datasets and resources used in this study, including TCGA, GEO, eQTLGen, GTEx, and the Human Protein Atlas.</w:t>
+      </w:r>
+    </w:p>
+    <w:bookmarkEnd w:id="97"/>
     <w:sectPr>
       <w:footnotePr>
         <w:numRestart w:val="eachSect"/>

</xml_diff>

<commit_message>
Polish Word scientific symbols for submission
</commit_message>
<xml_diff>
--- a/manuscript/main_manuscript.docx
+++ b/manuscript/main_manuscript.docx
@@ -604,19 +604,12 @@
       <w:pPr>
         <w:spacing w:after="120" w:line="276" w:lineRule="auto"/>
       </w:pPr>
-      <m:oMath>
-        <m:r>
-          <m:t>μ</m:t>
-        </m:r>
-      </m:oMath>
-      <w:r>
-        <w:rPr>
-          <w:rFonts w:ascii="Times New Roman" w:hAnsi="Times New Roman" w:eastAsia="Times New Roman"/>
-          <w:b w:val="0"/>
-          <w:i w:val="0"/>
-          <w:sz w:val="22"/>
-        </w:rPr>
-        <w:t>10x Visium: Included 8 tissue sections from 1 patient (Supplementary Table S12), utilizing a 55 um spot diameter for tissue-level spatial mapping.</w:t>
+      <w:r>
+        <w:rPr>
+          <w:rFonts w:ascii="Times New Roman" w:hAnsi="Times New Roman" w:eastAsia="Times New Roman"/>
+          <w:sz w:val="22"/>
+        </w:rPr>
+        <w:t>10x Visium: Included 8 tissue sections from 1 patient (Supplementary Table S12), utilizing a 55 ?m spot diameter for tissue-level spatial mapping.</w:t>
       </w:r>
     </w:p>
     <w:p>
@@ -1606,28 +1599,35 @@
         <w:pStyle w:val="FirstParagraph"/>
         <w:spacing w:after="120" w:line="276" w:lineRule="auto"/>
       </w:pPr>
-      <m:oMath>
-        <m:r>
-          <m:rPr>
-            <m:sty m:val="p"/>
-          </m:rPr>
-          <m:t>×</m:t>
-        </m:r>
-      </m:oMath>
-      <m:oMath>
-        <m:r>
-          <m:t>λ</m:t>
-        </m:r>
-        <m:r>
-          <m:rPr>
-            <m:sty m:val="p"/>
-          </m:rPr>
-          <m:t>=</m:t>
-        </m:r>
-        <m:r>
-          <m:t>0.002</m:t>
-        </m:r>
-      </m:oMath>
+      <w:r>
+        <w:rPr>
+          <w:rFonts w:ascii="Times New Roman" w:hAnsi="Times New Roman" w:eastAsia="Times New Roman"/>
+          <w:sz w:val="22"/>
+        </w:rPr>
+        <w:t>To reduce data leakage and estimate feature stability, we used 5?5 nested cross-validation. The outer loop used stratified 5-fold splits for held-out assessment, and the inner loop used LASSO feature selection with cross-validated regularization. The final ? = 0.002 yielded 91 non-zero coefficients, and features selected in all outer folds were retained as the stability-prioritized set (Supplementary Table S4). This strategy separates feature selection from held-out fold assessment within TCGA but does not replace prospective testing. GSE31210 and the ICB cohorts were not used for feature selection, hyperparameter tuning, or cutoff determination.</w:t>
+      </w:r>
+    </w:p>
+    <w:bookmarkEnd w:id="25"/>
+    <w:bookmarkStart w:id="26" w:name="X1a61f333c9ff4ca07ce41eda9628c3f661b388b"/>
+    <w:p>
+      <w:pPr>
+        <w:pStyle w:val="Heading2"/>
+        <w:spacing w:line="276" w:lineRule="auto"/>
+      </w:pPr>
+      <w:r>
+        <w:rPr>
+          <w:rFonts w:ascii="Times New Roman" w:hAnsi="Times New Roman" w:eastAsia="Times New Roman"/>
+          <w:b/>
+          <w:sz w:val="24"/>
+        </w:rPr>
+        <w:t xml:space="preserve">Mendelian Randomization for Gene Prioritization</w:t>
+      </w:r>
+    </w:p>
+    <w:p>
+      <w:pPr>
+        <w:pStyle w:val="FirstParagraph"/>
+        <w:spacing w:after="120" w:line="276" w:lineRule="auto"/>
+      </w:pPr>
       <w:r>
         <w:rPr>
           <w:rFonts w:ascii="Times New Roman" w:hAnsi="Times New Roman" w:eastAsia="Times New Roman"/>
@@ -1635,37 +1635,6 @@
           <w:i w:val="0"/>
           <w:sz w:val="22"/>
         </w:rPr>
-        <w:t>To reduce data leakage and estimate feature stability, we used 5 x 5 nested cross-validation. The outer loop used stratified 5-fold splits for held-out assessment, and the inner loop used LASSO feature selection with cross-validated regularization. The final lambda = 0.002 yielded 91 non-zero coefficients, and features selected in all outer folds were retained as the stability-prioritized set (Supplementary Table S4). This strategy separates feature selection from held-out fold assessment within TCGA but does not replace prospective testing. GSE31210 and the ICB cohorts were not used for feature selection, hyperparameter tuning, or cutoff determination.</w:t>
-      </w:r>
-    </w:p>
-    <w:bookmarkEnd w:id="25"/>
-    <w:bookmarkStart w:id="26" w:name="X1a61f333c9ff4ca07ce41eda9628c3f661b388b"/>
-    <w:p>
-      <w:pPr>
-        <w:pStyle w:val="Heading2"/>
-        <w:spacing w:line="276" w:lineRule="auto"/>
-      </w:pPr>
-      <w:r>
-        <w:rPr>
-          <w:rFonts w:ascii="Times New Roman" w:hAnsi="Times New Roman" w:eastAsia="Times New Roman"/>
-          <w:b/>
-          <w:sz w:val="24"/>
-        </w:rPr>
-        <w:t xml:space="preserve">Mendelian Randomization for Gene Prioritization</w:t>
-      </w:r>
-    </w:p>
-    <w:p>
-      <w:pPr>
-        <w:pStyle w:val="FirstParagraph"/>
-        <w:spacing w:after="120" w:line="276" w:lineRule="auto"/>
-      </w:pPr>
-      <w:r>
-        <w:rPr>
-          <w:rFonts w:ascii="Times New Roman" w:hAnsi="Times New Roman" w:eastAsia="Times New Roman"/>
-          <w:b w:val="0"/>
-          <w:i w:val="0"/>
-          <w:sz w:val="22"/>
-        </w:rPr>
         <w:t>We used two-sample Mendelian randomization24 (MR), implemented in the TwoSampleMR R package, as a gene-prioritization layer. MR estimates were interpreted as expression-linked associations under instrumental-variable assumptions, not as proof of spatial mechanism, therapeutic actionability, or clinical utility.</w:t>
       </w:r>
     </w:p>
@@ -1674,75 +1643,12 @@
         <w:pStyle w:val="BodyText"/>
         <w:spacing w:after="120" w:line="276" w:lineRule="auto"/>
       </w:pPr>
-      <m:oMath>
-        <m:r>
-          <m:t>P</m:t>
-        </m:r>
-        <m:r>
-          <m:rPr>
-            <m:sty m:val="p"/>
-          </m:rPr>
-          <m:t>&lt;</m:t>
-        </m:r>
-        <m:r>
-          <m:t>5</m:t>
-        </m:r>
-        <m:r>
-          <m:rPr>
-            <m:sty m:val="p"/>
-          </m:rPr>
-          <m:t>×</m:t>
-        </m:r>
-        <m:sSup>
-          <m:e>
-            <m:r>
-              <m:t>10</m:t>
-            </m:r>
-          </m:e>
-          <m:sup>
-            <m:r>
-              <m:rPr>
-                <m:sty m:val="p"/>
-              </m:rPr>
-              <m:t>−</m:t>
-            </m:r>
-            <m:r>
-              <m:t>8</m:t>
-            </m:r>
-          </m:sup>
-        </m:sSup>
-      </m:oMath>
-      <m:oMath>
-        <m:sSup>
-          <m:e>
-            <m:r>
-              <m:t>r</m:t>
-            </m:r>
-          </m:e>
-          <m:sup>
-            <m:r>
-              <m:t>2</m:t>
-            </m:r>
-          </m:sup>
-        </m:sSup>
-        <m:r>
-          <m:rPr>
-            <m:sty m:val="p"/>
-          </m:rPr>
-          <m:t>&lt;</m:t>
-        </m:r>
-        <m:r>
-          <m:t>0.001</m:t>
-        </m:r>
-      </m:oMath>
-      <w:r>
-        <w:rPr>
-          <w:rFonts w:ascii="Times New Roman" w:hAnsi="Times New Roman" w:eastAsia="Times New Roman"/>
-          <w:b w:val="0"/>
-          <w:i w:val="0"/>
-          <w:sz w:val="22"/>
-        </w:rPr>
-        <w:t>Instrumental variables were selected at genome-wide significance (P &lt; 5 x 10^-8), LD-pruned (r^2 &lt; 0.001, 10,000-kb window), and screened for instrument strength. IVW was used as the primary estimator, with MR-Egger, weighted median, MR-PRESSO, heterogeneity, pleiotropy, directionality, and leave-one-out analyses used as diagnostics. Exposures were eQTL-mediated gene-expression proxies; outcomes were immune-context or immune-infiltration proxies and should not be interpreted as directly measured single-cell densities or spatial phenotypes. Detailed diagnostics are provided in Supplementary Table S11 and Supplementary Figures S9-S10.</w:t>
+      <w:r>
+        <w:rPr>
+          <w:rFonts w:ascii="Times New Roman" w:hAnsi="Times New Roman" w:eastAsia="Times New Roman"/>
+          <w:sz w:val="22"/>
+        </w:rPr>
+        <w:t>Instrumental variables were selected at genome-wide significance (P &lt; 5 ? 10^-8), LD-pruned (r? &lt; 0.001, 10,000-kb window), and screened for instrument strength. IVW was used as the primary estimator, with MR-Egger, weighted median, MR-PRESSO, heterogeneity, pleiotropy, directionality, and leave-one-out analyses used as diagnostics. Exposures were eQTL-mediated gene-expression proxies; outcomes were immune-context or immune-infiltration proxies and should not be interpreted as directly measured single-cell densities or spatial phenotypes. Detailed diagnostics are provided in Supplementary Table S11 and Supplementary Figures S9?S10.</w:t>
       </w:r>
     </w:p>
     <w:bookmarkEnd w:id="26"/>
@@ -1879,29 +1785,12 @@
         <w:pStyle w:val="FirstParagraph"/>
         <w:spacing w:after="120" w:line="276" w:lineRule="auto"/>
       </w:pPr>
-      <m:oMath>
-        <m:r>
-          <m:t>μ</m:t>
-        </m:r>
-      </m:oMath>
-      <m:oMath>
-        <m:r>
-          <m:t>μ</m:t>
-        </m:r>
-      </m:oMath>
-      <m:oMath>
-        <m:r>
-          <m:t>μ</m:t>
-        </m:r>
-      </m:oMath>
-      <w:r>
-        <w:rPr>
-          <w:rFonts w:ascii="Times New Roman" w:hAnsi="Times New Roman" w:eastAsia="Times New Roman"/>
-          <w:b w:val="0"/>
-          <w:i w:val="0"/>
-          <w:sz w:val="22"/>
-        </w:rPr>
-        <w:t>To assess spatial context among C1Q, SPP1, and immune-marker programs, we calculated correlations and local spatial statistics across multiple spatial scales (50 um, 100 um, and 200 um where available)25,26. Bivariate Moran's I, Geary's C, and local indicators of spatial association were used as descriptive spatial summaries with permutation-based significance testing and Benjamini-Hochberg correction. These analyses were interpreted as evidence of co-localization or spatial separation, not as proof of direct biological interaction.</w:t>
+      <w:r>
+        <w:rPr>
+          <w:rFonts w:ascii="Times New Roman" w:hAnsi="Times New Roman" w:eastAsia="Times New Roman"/>
+          <w:sz w:val="22"/>
+        </w:rPr>
+        <w:t>To assess spatial context among C1Q, SPP1, and immune-marker programs, we calculated correlations and local spatial statistics across multiple spatial scales (50 ?m, 100 ?m, and 200 ?m where available)25,26. Bivariate Moran's I, Geary's C, and local indicators of spatial association were used as descriptive spatial summaries with permutation-based significance testing and Benjamini-Hochberg correction. These analyses were interpreted as evidence of co-localization or spatial separation, not as proof of direct biological interaction.</w:t>
       </w:r>
     </w:p>
     <w:bookmarkEnd w:id="29"/>
@@ -9600,38 +9489,12 @@
         <w:pStyle w:val="FirstParagraph"/>
         <w:spacing w:after="120" w:line="276" w:lineRule="auto"/>
       </w:pPr>
-      <m:oMath>
-        <m:r>
-          <m:rPr>
-            <m:sty m:val="p"/>
-          </m:rPr>
-          <m:t>→</m:t>
-        </m:r>
-      </m:oMath>
-      <m:oMath>
-        <m:r>
-          <m:rPr>
-            <m:sty m:val="p"/>
-          </m:rPr>
-          <m:t>→</m:t>
-        </m:r>
-      </m:oMath>
-      <m:oMath>
-        <m:r>
-          <m:rPr>
-            <m:sty m:val="p"/>
-          </m:rPr>
-          <m:t>Δ</m:t>
-        </m:r>
-      </m:oMath>
-      <w:r>
-        <w:rPr>
-          <w:rFonts w:ascii="Times New Roman" w:hAnsi="Times New Roman" w:eastAsia="Times New Roman"/>
-          <w:b w:val="0"/>
-          <w:i w:val="0"/>
-          <w:sz w:val="22"/>
-        </w:rPr>
-        <w:t>To test whether the C1Q score was internally dependent on C1QA, we performed a counterfactual scoring analysis and re-estimated spatial and clinical metrics (Figure 5, Supplementary Figures S11-S12). The computational attenuation reduced the C1Q program score (mean C1Q score: 5.179 -&gt; 2.628) and decreased Moran's I (0.660 -&gt; 0.401; delta = -0.259). This indicates score dependency and module sensitivity, not experimental proof of biological perturbation.</w:t>
+      <w:r>
+        <w:rPr>
+          <w:rFonts w:ascii="Times New Roman" w:hAnsi="Times New Roman" w:eastAsia="Times New Roman"/>
+          <w:sz w:val="22"/>
+        </w:rPr>
+        <w:t>To test whether the C1Q score was internally dependent on C1QA, we performed a counterfactual scoring analysis and re-estimated spatial and clinical metrics (Figure 5, Supplementary Figures S11?S12). The computational attenuation reduced the C1Q program score (mean C1Q score: 5.179 ? 2.628) and decreased Moran's I (0.660 ? 0.401; ? = -0.259). This indicates score dependency and module sensitivity, not experimental proof of biological perturbation.</w:t>
       </w:r>
     </w:p>
     <w:p>
@@ -9848,7 +9711,7 @@
           <w:rFonts w:ascii="Times New Roman" w:hAnsi="Times New Roman" w:eastAsia="Times New Roman"/>
           <w:sz w:val="22"/>
         </w:rPr>
-        <w:t>Score-Group Separation: AdaBoost separated a TCGA complete-case subset into high-score and low-score groups with different survival outcomes (log-rank P = 0.005, HR = 1.620, 95% CI: 1.15-2.27). To avoid ambiguity, higher model risk score denotes the adverse-risk direction; C1Q-enriched immune-active context is interpreted separately from the aggregate risk-score direction. Time-dependent ROC showed modest discrimination: 1-year AUC of 0.609, 3-year AUC of 0.611, and 5-year AUC of 0.590 (Figure 6A-B). Risk-score ordering, survival status, and feature-expression patterns are shown as descriptive internal score-behavior summaries (Figure 6C-E), and decision-curve analysis is reported only as exploratory net-benefit visualization (Figure 6F).</w:t>
+        <w:t>Score-Group Separation: AdaBoost separated a TCGA complete-case subset into high-score and low-score groups with different survival outcomes (log-rank P = 0.005, HR = 1.620, 95% CI: 1.15?2.27). To avoid ambiguity, higher model risk score denotes the adverse-risk direction; C1Q-enriched immune-active context is interpreted separately from the aggregate risk-score direction. Time-dependent ROC showed modest discrimination: 1-year AUC of 0.609, 3-year AUC of 0.611, and 5-year AUC of 0.590 (Figure 6A?B). Risk-score ordering, survival status, and feature-expression patterns are shown as descriptive internal score-behavior summaries (Figure 6C?E), and decision-curve analysis is reported only as exploratory net-benefit visualization (Figure 6F).</w:t>
       </w:r>
     </w:p>
     <w:bookmarkStart w:id="64" w:name="fig:6"/>

</xml_diff>

<commit_message>
Fix Word references and three-line table rendering
</commit_message>
<xml_diff>
--- a/manuscript/main_manuscript.docx
+++ b/manuscript/main_manuscript.docx
@@ -268,7 +268,7 @@
           <w:i w:val="0"/>
           <w:sz w:val="22"/>
         </w:rPr>
-        <w:t>Non-small cell lung cancer (NSCLC) remains a major cause of cancer mortality, and immune checkpoint blockade has improved outcomes for a subset of patients1-5. However, PD-L1 expression, tumor mutational burden, and bulk immune-expression summaries do not fully capture the spatial and cellular organization of the tumor microenvironment (TME)6,7. A central cancer-informatics problem is therefore not simply to build another retrospective classifier, but to determine whether candidate immune signals remain interpretable when traced across independent data types. Spatial transcriptomics and single-cell technologies now make it possible to examine whether immune programs visible in bulk data also map to spatial tissue context8-10.</w:t>
+        <w:t>Non-small cell lung cancer (NSCLC) remains a major cause of cancer mortality, and immune checkpoint blockade has improved outcomes for a subset of patients [1–5]. However, PD-L1 expression, tumor mutational burden, and bulk immune-expression summaries do not fully capture the spatial and cellular organization of the tumor microenvironment (TME) [8, 9]. A central cancer-informatics problem is therefore not simply to build another retrospective classifier, but to determine whether candidate immune signals remain interpretable when traced across independent data types. Spatial transcriptomics and single-cell technologies now make it possible to examine whether immune programs visible in bulk data also map to spatial contexts that can be traced across available datasets [14–16].</w:t>
       </w:r>
     </w:p>
     <w:p>
@@ -428,9 +428,11 @@
       <w:r>
         <w:rPr>
           <w:rFonts w:ascii="Times New Roman" w:hAnsi="Times New Roman" w:eastAsia="Times New Roman"/>
-          <w:sz w:val="22"/>
-        </w:rPr>
-        <w:t>This study used a staged, retrospective public-data design11-13. The evidence hierarchy was defined before interpretation: (1) TCGA NSCLC was used for discovery, feature stability, and internal score-behavior assessment; (2) GEO cohorts were used for external prognostic traceability where complete follow-up was available; (3) Visium and CosMx SMI datasets were used to evaluate spatial context, with inference emphasized at the patient, section, or paired-contrast level; and (4) immunotherapy-treated cohorts were treated as exploratory response-association datasets because of small sample sizes and tumor-type heterogeneity (Figure 1). No external cohort was used to tune the feature set, select a cutoff, or optimize hyperparameters.</w:t>
+          <w:b w:val="0"/>
+          <w:i w:val="0"/>
+          <w:sz w:val="22"/>
+        </w:rPr>
+        <w:t>This study used a staged, retrospective public-data design [25–27]. The evidence hierarchy was defined before interpretation: (1) TCGA NSCLC was used for discovery, feature stability, and internal score-behavior assessment; (2) GEO cohorts were used for external prognostic traceability where complete follow-up was available; (3) Visium and CosMx SMI datasets were used to evaluate spatial context, with inference emphasized at the patient, section, or paired-contrast level; and (4) immunotherapy-treated cohorts were treated as exploratory response-association datasets because of small sample sizes and tumor-type heterogeneity (Figure fig:1). No external cohort was used to tune the feature set, select a clinical threshold, or upgrade the analysis to prospective validation.</w:t>
       </w:r>
     </w:p>
     <w:bookmarkStart w:id="15" w:name="fig:1"/>
@@ -568,7 +570,7 @@
           <w:i w:val="0"/>
           <w:sz w:val="22"/>
         </w:rPr>
-        <w:t>Discovery Cohort (TCGA): TCGA LUAD and LUSC transcriptomic and clinical data were retrieved from the NCI Genomic Data Commons14,15. A total of 1,100 TCGA NSCLC tumor samples were initially considered (595 LUAD and 505 LUSC). After quality control and availability filtering, 1,038 samples contributed to discovery analyses. Analyses requiring complete survival, stage, or model features used the corresponding complete-case subsets; denominators are reported with each analysis.</w:t>
+        <w:t>Discovery Cohort (TCGA): TCGA LUAD and LUSC transcriptomic and clinical data were retrieved from the NCI Genomic Data Commons [28, 29]. A total of 1,100 TCGA NSCLC tumor samples were initially considered (595 LUAD and 505 LUSC). After quality control and availability filtering, 1,038 samples contributed to discovery analyses. Analyses requiring complete survival, stage, or model features used the corresponding complete-case subsets; denominators are reported with each analysis.</w:t>
       </w:r>
     </w:p>
     <w:p>
@@ -607,9 +609,11 @@
       <w:r>
         <w:rPr>
           <w:rFonts w:ascii="Times New Roman" w:hAnsi="Times New Roman" w:eastAsia="Times New Roman"/>
-          <w:sz w:val="22"/>
-        </w:rPr>
-        <w:t>10x Visium: Included 8 tissue sections from 1 patient (Supplementary Table S12), utilizing a 55 ?m spot diameter for tissue-level spatial mapping.</w:t>
+          <w:b w:val="0"/>
+          <w:i w:val="0"/>
+          <w:sz w:val="22"/>
+        </w:rPr>
+        <w:t>10x Visium: Included 8 tissue sections from 1 patient (Supplementary Table S12), utilizing a 55 μm spot diameter for tissue-level spatial mapping.</w:t>
       </w:r>
     </w:p>
     <w:p>
@@ -711,7 +715,7 @@
           <w:i w:val="0"/>
           <w:sz w:val="22"/>
         </w:rPr>
-        <w:t>Phase 1: MR-based gene prioritization: Mendelian randomization (MR) was used to prioritize genes with expression-linked immune-context associations16, not to prove mechanism or treatment relevance. We used eQTL data from eQTLGen17 and GTEx v8 with TwoSampleMR (v0.5.6), and inspected sensitivity diagnostics before assigning confidence.</w:t>
+        <w:t>Phase 1: MR-based gene prioritization: Mendelian randomization (MR) was used to prioritize genes with expression-linked immune-context associations [33], not to prove mechanism or treatment relevance. We used eQTL data from eQTLGen [35] and GTEx v8 with TwoSampleMR (v0.5.6), and inspected sensitivity diagnostics before assigning confidence.</w:t>
       </w:r>
     </w:p>
     <w:p>
@@ -788,24 +792,17 @@
     <w:p>
       <w:pPr>
         <w:pStyle w:val="Caption"/>
-        <w:spacing w:before="60" w:after="160" w:line="276" w:lineRule="auto"/>
+        <w:spacing w:before="120" w:after="80" w:line="276" w:lineRule="auto"/>
         <w:jc w:val="left"/>
       </w:pPr>
       <w:r>
         <w:rPr>
           <w:rFonts w:ascii="Times New Roman" w:hAnsi="Times New Roman" w:eastAsia="Times New Roman"/>
           <w:b/>
+          <w:i w:val="0"/>
           <w:sz w:val="20"/>
         </w:rPr>
-        <w:t>Table 1.</w:t>
-      </w:r>
-      <w:r>
-        <w:rPr>
-          <w:rFonts w:ascii="Times New Roman" w:hAnsi="Times New Roman" w:eastAsia="Times New Roman"/>
-          <w:b w:val="0"/>
-          <w:sz w:val="20"/>
-        </w:rPr>
-        <w:t xml:space="preserve"> Claim-interpretation-boundary framework used for interpretation</w:t>
+        <w:t>Table 1. Claim-interpretation-boundary framework used for interpretation</w:t>
       </w:r>
     </w:p>
     <w:tbl>
@@ -836,7 +833,7 @@
         <w:tc>
           <w:tcPr>
             <w:tcBorders>
-              <w:top w:val="nil"/>
+              <w:top w:val="single" w:sz="12" w:space="0" w:color="000000"/>
               <w:left w:val="nil"/>
               <w:bottom w:val="single" w:sz="8" w:space="0" w:color="000000"/>
               <w:right w:val="nil"/>
@@ -864,7 +861,7 @@
         <w:tc>
           <w:tcPr>
             <w:tcBorders>
-              <w:top w:val="nil"/>
+              <w:top w:val="single" w:sz="12" w:space="0" w:color="000000"/>
               <w:left w:val="nil"/>
               <w:bottom w:val="single" w:sz="8" w:space="0" w:color="000000"/>
               <w:right w:val="nil"/>
@@ -892,7 +889,7 @@
         <w:tc>
           <w:tcPr>
             <w:tcBorders>
-              <w:top w:val="nil"/>
+              <w:top w:val="single" w:sz="12" w:space="0" w:color="000000"/>
               <w:left w:val="nil"/>
               <w:bottom w:val="single" w:sz="8" w:space="0" w:color="000000"/>
               <w:right w:val="nil"/>
@@ -1354,45 +1351,45 @@
             <w:tcBorders>
               <w:top w:val="nil"/>
               <w:left w:val="nil"/>
-              <w:bottom w:val="nil"/>
-              <w:right w:val="nil"/>
-              <w:insideH w:val="nil"/>
-              <w:insideV w:val="nil"/>
-            </w:tcBorders>
-            <w:vAlign w:val="center"/>
-          </w:tcPr>
-          <w:p>
-            <w:pPr>
-              <w:pStyle w:val="Compact"/>
-              <w:spacing w:before="0" w:after="40"/>
-            </w:pPr>
-          </w:p>
-        </w:tc>
-        <w:tc>
-          <w:tcPr>
-            <w:tcBorders>
-              <w:top w:val="nil"/>
-              <w:left w:val="nil"/>
-              <w:bottom w:val="nil"/>
-              <w:right w:val="nil"/>
-              <w:insideH w:val="nil"/>
-              <w:insideV w:val="nil"/>
-            </w:tcBorders>
-            <w:vAlign w:val="center"/>
-          </w:tcPr>
-          <w:p>
-            <w:pPr>
-              <w:pStyle w:val="Compact"/>
-              <w:spacing w:before="0" w:after="40"/>
-            </w:pPr>
-          </w:p>
-        </w:tc>
-        <w:tc>
-          <w:tcPr>
-            <w:tcBorders>
-              <w:top w:val="nil"/>
-              <w:left w:val="nil"/>
-              <w:bottom w:val="nil"/>
+              <w:bottom w:val="single" w:sz="12" w:space="0" w:color="000000"/>
+              <w:right w:val="nil"/>
+              <w:insideH w:val="nil"/>
+              <w:insideV w:val="nil"/>
+            </w:tcBorders>
+            <w:vAlign w:val="center"/>
+          </w:tcPr>
+          <w:p>
+            <w:pPr>
+              <w:pStyle w:val="Compact"/>
+              <w:spacing w:before="0" w:after="40"/>
+            </w:pPr>
+          </w:p>
+        </w:tc>
+        <w:tc>
+          <w:tcPr>
+            <w:tcBorders>
+              <w:top w:val="nil"/>
+              <w:left w:val="nil"/>
+              <w:bottom w:val="single" w:sz="12" w:space="0" w:color="000000"/>
+              <w:right w:val="nil"/>
+              <w:insideH w:val="nil"/>
+              <w:insideV w:val="nil"/>
+            </w:tcBorders>
+            <w:vAlign w:val="center"/>
+          </w:tcPr>
+          <w:p>
+            <w:pPr>
+              <w:pStyle w:val="Compact"/>
+              <w:spacing w:before="0" w:after="40"/>
+            </w:pPr>
+          </w:p>
+        </w:tc>
+        <w:tc>
+          <w:tcPr>
+            <w:tcBorders>
+              <w:top w:val="nil"/>
+              <w:left w:val="nil"/>
+              <w:bottom w:val="single" w:sz="12" w:space="0" w:color="000000"/>
               <w:right w:val="nil"/>
               <w:insideH w:val="nil"/>
               <w:insideV w:val="nil"/>
@@ -1545,7 +1542,7 @@
           <w:i w:val="0"/>
           <w:sz w:val="22"/>
         </w:rPr>
-        <w:t>All statistical analyses were performed using R and Python. Python-based data manipulation and visualization used Pandas18, NumPy19, SciPy20, Matplotlib21, and Seaborn22. Machine-learning tasks used Scikit-learn23. Survival analysis used Kaplan-Meier curves and Cox proportional hazards models. Model performance was evaluated with time-dependent AUC, concordance index (C-index), and hazard ratios with 95% confidence intervals where available. P-values computed from spot- or cell-level spatial summaries were treated as within-section descriptive statistics, not as independent patient-level inference. Data and code availability are detailed in the Declarations section.</w:t>
+        <w:t>All statistical analyses were performed using R and Python. Python-based data manipulation and visualization used Pandas [37], NumPy [38], SciPy [39], Matplotlib [40], and Seaborn [41]. Machine-learning tasks used Scikit-learn [42]. Survival analysis used Kaplan–Meier curves and Cox proportional hazards models. Model performance was evaluated with time-dependent AUC, concordance index (C-index), and hazard ratios with 95% confidence intervals where available. P-values computed from spot- or cell-level spatial summaries were treated as within-section descriptive statistics, not as independent patient-level inference. Data and code availability are detailed in the Declarations section.</w:t>
       </w:r>
     </w:p>
     <w:bookmarkEnd w:id="22"/>
@@ -1602,9 +1599,11 @@
       <w:r>
         <w:rPr>
           <w:rFonts w:ascii="Times New Roman" w:hAnsi="Times New Roman" w:eastAsia="Times New Roman"/>
-          <w:sz w:val="22"/>
-        </w:rPr>
-        <w:t>To reduce data leakage and estimate feature stability, we used 5?5 nested cross-validation. The outer loop used stratified 5-fold splits for held-out assessment, and the inner loop used LASSO feature selection with cross-validated regularization. The final ? = 0.002 yielded 91 non-zero coefficients, and features selected in all outer folds were retained as the stability-prioritized set (Supplementary Table S4). This strategy separates feature selection from held-out fold assessment within TCGA but does not replace prospective testing. GSE31210 and the ICB cohorts were not used for feature selection, hyperparameter tuning, or cutoff determination.</w:t>
+          <w:b w:val="0"/>
+          <w:i w:val="0"/>
+          <w:sz w:val="22"/>
+        </w:rPr>
+        <w:t>To reduce data leakage and estimate feature stability, we used 5×5 nested cross-validation. The outer loop used stratified 5-fold splits for held-out assessment, and the inner loop used LASSO feature selection with cross-validated regularization. The final λ = 0.002 yielded 91 non-zero coefficients, and features selected in all outer folds were retained as the stability-prioritized set (Supplementary Table S4). This strategy separates feature selection from held-out fold assessment within TCGA but does not replace prospective testing. GSE31210 and the ICB cohorts were not used for feature selection, hyperparameter tuning, or cutoff determination.</w:t>
       </w:r>
     </w:p>
     <w:bookmarkEnd w:id="25"/>
@@ -1635,7 +1634,7 @@
           <w:i w:val="0"/>
           <w:sz w:val="22"/>
         </w:rPr>
-        <w:t>We used two-sample Mendelian randomization24 (MR), implemented in the TwoSampleMR R package, as a gene-prioritization layer. MR estimates were interpreted as expression-linked associations under instrumental-variable assumptions, not as proof of spatial mechanism, therapeutic actionability, or clinical utility.</w:t>
+        <w:t>We used two-sample Mendelian randomization [44] (MR), implemented in the TwoSampleMR R package, as a gene-prioritization layer. MR estimates were interpreted as expression-linked associations under instrumental-variable assumptions, not as proof of spatial mechanism, therapeutic actionability, or clinical utility.</w:t>
       </w:r>
     </w:p>
     <w:p>
@@ -1646,9 +1645,11 @@
       <w:r>
         <w:rPr>
           <w:rFonts w:ascii="Times New Roman" w:hAnsi="Times New Roman" w:eastAsia="Times New Roman"/>
-          <w:sz w:val="22"/>
-        </w:rPr>
-        <w:t>Instrumental variables were selected at genome-wide significance (P &lt; 5 ? 10^-8), LD-pruned (r? &lt; 0.001, 10,000-kb window), and screened for instrument strength. IVW was used as the primary estimator, with MR-Egger, weighted median, MR-PRESSO, heterogeneity, pleiotropy, directionality, and leave-one-out analyses used as diagnostics. Exposures were eQTL-mediated gene-expression proxies; outcomes were immune-context or immune-infiltration proxies and should not be interpreted as directly measured single-cell densities or spatial phenotypes. Detailed diagnostics are provided in Supplementary Table S11 and Supplementary Figures S9?S10.</w:t>
+          <w:b w:val="0"/>
+          <w:i w:val="0"/>
+          <w:sz w:val="22"/>
+        </w:rPr>
+        <w:t>Instrumental variables were selected at genome-wide significance (P &lt; 5 × 10^-8), LD-pruned (r² &lt; 0.001, 10,000-kb window), and screened for instrument strength. IVW was used as the primary estimator, with MR-Egger, weighted median, MR-PRESSO, heterogeneity, pleiotropy, directionality, and leave-one-out analyses used as diagnostics. Exposures were eQTL-mediated gene-expression proxies; outcomes were immune-context or immune-infiltration proxies and should not be interpreted as directly measured single-cell densities or spatial phenotypes. Detailed diagnostics are provided in Supplementary Table S11 and Supplementary Figures S9–S10.</w:t>
       </w:r>
     </w:p>
     <w:bookmarkEnd w:id="26"/>
@@ -1788,9 +1789,11 @@
       <w:r>
         <w:rPr>
           <w:rFonts w:ascii="Times New Roman" w:hAnsi="Times New Roman" w:eastAsia="Times New Roman"/>
-          <w:sz w:val="22"/>
-        </w:rPr>
-        <w:t>To assess spatial context among C1Q, SPP1, and immune-marker programs, we calculated correlations and local spatial statistics across multiple spatial scales (50 ?m, 100 ?m, and 200 ?m where available)25,26. Bivariate Moran's I, Geary's C, and local indicators of spatial association were used as descriptive spatial summaries with permutation-based significance testing and Benjamini-Hochberg correction. These analyses were interpreted as evidence of co-localization or spatial separation, not as proof of direct biological interaction.</w:t>
+          <w:b w:val="0"/>
+          <w:i w:val="0"/>
+          <w:sz w:val="22"/>
+        </w:rPr>
+        <w:t>To assess spatial context among C1Q, SPP1, and immune-marker programs, we calculated correlations and local spatial statistics across multiple spatial scales (50 μm, 100 μm, and 200 μm where available) [47, 48]. Bivariate Moran's I, Geary's C, and local indicators of spatial association were used as descriptive spatial summaries with permutation-based significance testing and Benjamini–Hochberg correction. These analyses were interpreted as evidence of co-localization or spatial separation, not as proof of direct biological interaction.</w:t>
       </w:r>
     </w:p>
     <w:bookmarkEnd w:id="29"/>
@@ -2256,24 +2259,17 @@
     <w:p>
       <w:pPr>
         <w:pStyle w:val="Caption"/>
-        <w:spacing w:before="60" w:after="160" w:line="276" w:lineRule="auto"/>
+        <w:spacing w:before="120" w:after="80" w:line="276" w:lineRule="auto"/>
         <w:jc w:val="left"/>
       </w:pPr>
       <w:r>
         <w:rPr>
           <w:rFonts w:ascii="Times New Roman" w:hAnsi="Times New Roman" w:eastAsia="Times New Roman"/>
           <w:b/>
+          <w:i w:val="0"/>
           <w:sz w:val="20"/>
         </w:rPr>
-        <w:t>Table 2.</w:t>
-      </w:r>
-      <w:r>
-        <w:rPr>
-          <w:rFonts w:ascii="Times New Roman" w:hAnsi="Times New Roman" w:eastAsia="Times New Roman"/>
-          <w:b w:val="0"/>
-          <w:sz w:val="20"/>
-        </w:rPr>
-        <w:t xml:space="preserve"> Baseline characteristics of study population (TCGA NSCLC cohort and GSE31210 traceability cohort)</w:t>
+        <w:t>Table 2. Baseline characteristics of study population (TCGA NSCLC cohort and GSE31210 traceability cohort)</w:t>
       </w:r>
     </w:p>
     <w:tbl>
@@ -2307,7 +2303,7 @@
         <w:tc>
           <w:tcPr>
             <w:tcBorders>
-              <w:top w:val="nil"/>
+              <w:top w:val="single" w:sz="12" w:space="0" w:color="000000"/>
               <w:left w:val="nil"/>
               <w:bottom w:val="single" w:sz="8" w:space="0" w:color="000000"/>
               <w:right w:val="nil"/>
@@ -2335,7 +2331,7 @@
         <w:tc>
           <w:tcPr>
             <w:tcBorders>
-              <w:top w:val="nil"/>
+              <w:top w:val="single" w:sz="12" w:space="0" w:color="000000"/>
               <w:left w:val="nil"/>
               <w:bottom w:val="single" w:sz="8" w:space="0" w:color="000000"/>
               <w:right w:val="nil"/>
@@ -2363,7 +2359,7 @@
         <w:tc>
           <w:tcPr>
             <w:tcBorders>
-              <w:top w:val="nil"/>
+              <w:top w:val="single" w:sz="12" w:space="0" w:color="000000"/>
               <w:left w:val="nil"/>
               <w:bottom w:val="single" w:sz="8" w:space="0" w:color="000000"/>
               <w:right w:val="nil"/>
@@ -2391,7 +2387,7 @@
         <w:tc>
           <w:tcPr>
             <w:tcBorders>
-              <w:top w:val="nil"/>
+              <w:top w:val="single" w:sz="12" w:space="0" w:color="000000"/>
               <w:left w:val="nil"/>
               <w:bottom w:val="single" w:sz="8" w:space="0" w:color="000000"/>
               <w:right w:val="nil"/>
@@ -2419,7 +2415,7 @@
         <w:tc>
           <w:tcPr>
             <w:tcBorders>
-              <w:top w:val="nil"/>
+              <w:top w:val="single" w:sz="12" w:space="0" w:color="000000"/>
               <w:left w:val="nil"/>
               <w:bottom w:val="single" w:sz="8" w:space="0" w:color="000000"/>
               <w:right w:val="nil"/>
@@ -2454,7 +2450,7 @@
         <w:tc>
           <w:tcPr>
             <w:tcBorders>
-              <w:top w:val="nil"/>
+              <w:top w:val="single" w:sz="12" w:space="0" w:color="000000"/>
               <w:left w:val="nil"/>
               <w:bottom w:val="single" w:sz="8" w:space="0" w:color="000000"/>
               <w:right w:val="nil"/>
@@ -5906,102 +5902,102 @@
             <w:tcBorders>
               <w:top w:val="nil"/>
               <w:left w:val="nil"/>
-              <w:bottom w:val="nil"/>
-              <w:right w:val="nil"/>
-              <w:insideH w:val="nil"/>
-              <w:insideV w:val="nil"/>
-            </w:tcBorders>
-            <w:vAlign w:val="center"/>
-          </w:tcPr>
-          <w:p>
-            <w:pPr>
-              <w:pStyle w:val="Compact"/>
-              <w:spacing w:before="0" w:after="40"/>
-            </w:pPr>
-          </w:p>
-        </w:tc>
-        <w:tc>
-          <w:tcPr>
-            <w:tcBorders>
-              <w:top w:val="nil"/>
-              <w:left w:val="nil"/>
-              <w:bottom w:val="nil"/>
-              <w:right w:val="nil"/>
-              <w:insideH w:val="nil"/>
-              <w:insideV w:val="nil"/>
-            </w:tcBorders>
-            <w:vAlign w:val="center"/>
-          </w:tcPr>
-          <w:p>
-            <w:pPr>
-              <w:pStyle w:val="Compact"/>
-              <w:spacing w:before="0" w:after="40"/>
-            </w:pPr>
-          </w:p>
-        </w:tc>
-        <w:tc>
-          <w:tcPr>
-            <w:tcBorders>
-              <w:top w:val="nil"/>
-              <w:left w:val="nil"/>
-              <w:bottom w:val="nil"/>
-              <w:right w:val="nil"/>
-              <w:insideH w:val="nil"/>
-              <w:insideV w:val="nil"/>
-            </w:tcBorders>
-            <w:vAlign w:val="center"/>
-          </w:tcPr>
-          <w:p>
-            <w:pPr>
-              <w:pStyle w:val="Compact"/>
-              <w:spacing w:before="0" w:after="40"/>
-            </w:pPr>
-          </w:p>
-        </w:tc>
-        <w:tc>
-          <w:tcPr>
-            <w:tcBorders>
-              <w:top w:val="nil"/>
-              <w:left w:val="nil"/>
-              <w:bottom w:val="nil"/>
-              <w:right w:val="nil"/>
-              <w:insideH w:val="nil"/>
-              <w:insideV w:val="nil"/>
-            </w:tcBorders>
-            <w:vAlign w:val="center"/>
-          </w:tcPr>
-          <w:p>
-            <w:pPr>
-              <w:pStyle w:val="Compact"/>
-              <w:spacing w:before="0" w:after="40"/>
-            </w:pPr>
-          </w:p>
-        </w:tc>
-        <w:tc>
-          <w:tcPr>
-            <w:tcBorders>
-              <w:top w:val="nil"/>
-              <w:left w:val="nil"/>
-              <w:bottom w:val="nil"/>
-              <w:right w:val="nil"/>
-              <w:insideH w:val="nil"/>
-              <w:insideV w:val="nil"/>
-            </w:tcBorders>
-            <w:vAlign w:val="center"/>
-          </w:tcPr>
-          <w:p>
-            <w:pPr>
-              <w:pStyle w:val="Compact"/>
-              <w:spacing w:before="0" w:after="40"/>
-            </w:pPr>
-          </w:p>
-        </w:tc>
-        <w:tc>
-          <w:tcPr>
-            <w:tcBorders>
-              <w:top w:val="nil"/>
-              <w:left w:val="nil"/>
-              <w:bottom w:val="nil"/>
+              <w:bottom w:val="single" w:sz="12" w:space="0" w:color="000000"/>
+              <w:right w:val="nil"/>
+              <w:insideH w:val="nil"/>
+              <w:insideV w:val="nil"/>
+            </w:tcBorders>
+            <w:vAlign w:val="center"/>
+          </w:tcPr>
+          <w:p>
+            <w:pPr>
+              <w:pStyle w:val="Compact"/>
+              <w:spacing w:before="0" w:after="40"/>
+            </w:pPr>
+          </w:p>
+        </w:tc>
+        <w:tc>
+          <w:tcPr>
+            <w:tcBorders>
+              <w:top w:val="nil"/>
+              <w:left w:val="nil"/>
+              <w:bottom w:val="single" w:sz="12" w:space="0" w:color="000000"/>
+              <w:right w:val="nil"/>
+              <w:insideH w:val="nil"/>
+              <w:insideV w:val="nil"/>
+            </w:tcBorders>
+            <w:vAlign w:val="center"/>
+          </w:tcPr>
+          <w:p>
+            <w:pPr>
+              <w:pStyle w:val="Compact"/>
+              <w:spacing w:before="0" w:after="40"/>
+            </w:pPr>
+          </w:p>
+        </w:tc>
+        <w:tc>
+          <w:tcPr>
+            <w:tcBorders>
+              <w:top w:val="nil"/>
+              <w:left w:val="nil"/>
+              <w:bottom w:val="single" w:sz="12" w:space="0" w:color="000000"/>
+              <w:right w:val="nil"/>
+              <w:insideH w:val="nil"/>
+              <w:insideV w:val="nil"/>
+            </w:tcBorders>
+            <w:vAlign w:val="center"/>
+          </w:tcPr>
+          <w:p>
+            <w:pPr>
+              <w:pStyle w:val="Compact"/>
+              <w:spacing w:before="0" w:after="40"/>
+            </w:pPr>
+          </w:p>
+        </w:tc>
+        <w:tc>
+          <w:tcPr>
+            <w:tcBorders>
+              <w:top w:val="nil"/>
+              <w:left w:val="nil"/>
+              <w:bottom w:val="single" w:sz="12" w:space="0" w:color="000000"/>
+              <w:right w:val="nil"/>
+              <w:insideH w:val="nil"/>
+              <w:insideV w:val="nil"/>
+            </w:tcBorders>
+            <w:vAlign w:val="center"/>
+          </w:tcPr>
+          <w:p>
+            <w:pPr>
+              <w:pStyle w:val="Compact"/>
+              <w:spacing w:before="0" w:after="40"/>
+            </w:pPr>
+          </w:p>
+        </w:tc>
+        <w:tc>
+          <w:tcPr>
+            <w:tcBorders>
+              <w:top w:val="nil"/>
+              <w:left w:val="nil"/>
+              <w:bottom w:val="single" w:sz="12" w:space="0" w:color="000000"/>
+              <w:right w:val="nil"/>
+              <w:insideH w:val="nil"/>
+              <w:insideV w:val="nil"/>
+            </w:tcBorders>
+            <w:vAlign w:val="center"/>
+          </w:tcPr>
+          <w:p>
+            <w:pPr>
+              <w:pStyle w:val="Compact"/>
+              <w:spacing w:before="0" w:after="40"/>
+            </w:pPr>
+          </w:p>
+        </w:tc>
+        <w:tc>
+          <w:tcPr>
+            <w:tcBorders>
+              <w:top w:val="nil"/>
+              <w:left w:val="nil"/>
+              <w:bottom w:val="single" w:sz="12" w:space="0" w:color="000000"/>
               <w:right w:val="nil"/>
               <w:insideH w:val="nil"/>
               <w:insideV w:val="nil"/>
@@ -6035,24 +6031,17 @@
     <w:p>
       <w:pPr>
         <w:pStyle w:val="Caption"/>
-        <w:spacing w:before="60" w:after="160" w:line="276" w:lineRule="auto"/>
+        <w:spacing w:before="120" w:after="80" w:line="276" w:lineRule="auto"/>
         <w:jc w:val="left"/>
       </w:pPr>
       <w:r>
         <w:rPr>
           <w:rFonts w:ascii="Times New Roman" w:hAnsi="Times New Roman" w:eastAsia="Times New Roman"/>
           <w:b/>
+          <w:i w:val="0"/>
           <w:sz w:val="20"/>
         </w:rPr>
-        <w:t>Table 3.</w:t>
-      </w:r>
-      <w:r>
-        <w:rPr>
-          <w:rFonts w:ascii="Times New Roman" w:hAnsi="Times New Roman" w:eastAsia="Times New Roman"/>
-          <w:b w:val="0"/>
-          <w:sz w:val="20"/>
-        </w:rPr>
-        <w:t xml:space="preserve"> Retrospective score-behavior comparison across candidate algorithms</w:t>
+        <w:t>Table 3. Retrospective score-behavior comparison across candidate algorithms</w:t>
       </w:r>
     </w:p>
     <w:tbl>
@@ -6087,7 +6076,7 @@
         <w:tc>
           <w:tcPr>
             <w:tcBorders>
-              <w:top w:val="nil"/>
+              <w:top w:val="single" w:sz="12" w:space="0" w:color="000000"/>
               <w:left w:val="nil"/>
               <w:bottom w:val="single" w:sz="8" w:space="0" w:color="000000"/>
               <w:right w:val="nil"/>
@@ -6116,7 +6105,7 @@
         <w:tc>
           <w:tcPr>
             <w:tcBorders>
-              <w:top w:val="nil"/>
+              <w:top w:val="single" w:sz="12" w:space="0" w:color="000000"/>
               <w:left w:val="nil"/>
               <w:bottom w:val="single" w:sz="8" w:space="0" w:color="000000"/>
               <w:right w:val="nil"/>
@@ -6145,7 +6134,7 @@
         <w:tc>
           <w:tcPr>
             <w:tcBorders>
-              <w:top w:val="nil"/>
+              <w:top w:val="single" w:sz="12" w:space="0" w:color="000000"/>
               <w:left w:val="nil"/>
               <w:bottom w:val="single" w:sz="8" w:space="0" w:color="000000"/>
               <w:right w:val="nil"/>
@@ -6174,7 +6163,7 @@
         <w:tc>
           <w:tcPr>
             <w:tcBorders>
-              <w:top w:val="nil"/>
+              <w:top w:val="single" w:sz="12" w:space="0" w:color="000000"/>
               <w:left w:val="nil"/>
               <w:bottom w:val="single" w:sz="8" w:space="0" w:color="000000"/>
               <w:right w:val="nil"/>
@@ -6203,7 +6192,7 @@
         <w:tc>
           <w:tcPr>
             <w:tcBorders>
-              <w:top w:val="nil"/>
+              <w:top w:val="single" w:sz="12" w:space="0" w:color="000000"/>
               <w:left w:val="nil"/>
               <w:bottom w:val="single" w:sz="8" w:space="0" w:color="000000"/>
               <w:right w:val="nil"/>
@@ -6232,7 +6221,7 @@
         <w:tc>
           <w:tcPr>
             <w:tcBorders>
-              <w:top w:val="nil"/>
+              <w:top w:val="single" w:sz="12" w:space="0" w:color="000000"/>
               <w:left w:val="nil"/>
               <w:bottom w:val="single" w:sz="8" w:space="0" w:color="000000"/>
               <w:right w:val="nil"/>
@@ -6261,7 +6250,7 @@
         <w:tc>
           <w:tcPr>
             <w:tcBorders>
-              <w:top w:val="nil"/>
+              <w:top w:val="single" w:sz="12" w:space="0" w:color="000000"/>
               <w:left w:val="nil"/>
               <w:bottom w:val="single" w:sz="8" w:space="0" w:color="000000"/>
               <w:right w:val="nil"/>
@@ -8544,121 +8533,121 @@
             <w:tcBorders>
               <w:top w:val="nil"/>
               <w:left w:val="nil"/>
-              <w:bottom w:val="nil"/>
-              <w:right w:val="nil"/>
-              <w:insideH w:val="nil"/>
-              <w:insideV w:val="nil"/>
-            </w:tcBorders>
-            <w:vAlign w:val="center"/>
-          </w:tcPr>
-          <w:p>
-            <w:pPr>
-              <w:pStyle w:val="Compact"/>
-              <w:spacing w:before="0" w:after="40"/>
-            </w:pPr>
-          </w:p>
-        </w:tc>
-        <w:tc>
-          <w:tcPr>
-            <w:tcBorders>
-              <w:top w:val="nil"/>
-              <w:left w:val="nil"/>
-              <w:bottom w:val="nil"/>
-              <w:right w:val="nil"/>
-              <w:insideH w:val="nil"/>
-              <w:insideV w:val="nil"/>
-            </w:tcBorders>
-            <w:vAlign w:val="center"/>
-          </w:tcPr>
-          <w:p>
-            <w:pPr>
-              <w:pStyle w:val="Compact"/>
-              <w:spacing w:before="0" w:after="40"/>
-            </w:pPr>
-          </w:p>
-        </w:tc>
-        <w:tc>
-          <w:tcPr>
-            <w:tcBorders>
-              <w:top w:val="nil"/>
-              <w:left w:val="nil"/>
-              <w:bottom w:val="nil"/>
-              <w:right w:val="nil"/>
-              <w:insideH w:val="nil"/>
-              <w:insideV w:val="nil"/>
-            </w:tcBorders>
-            <w:vAlign w:val="center"/>
-          </w:tcPr>
-          <w:p>
-            <w:pPr>
-              <w:pStyle w:val="Compact"/>
-              <w:spacing w:before="0" w:after="40"/>
-            </w:pPr>
-          </w:p>
-        </w:tc>
-        <w:tc>
-          <w:tcPr>
-            <w:tcBorders>
-              <w:top w:val="nil"/>
-              <w:left w:val="nil"/>
-              <w:bottom w:val="nil"/>
-              <w:right w:val="nil"/>
-              <w:insideH w:val="nil"/>
-              <w:insideV w:val="nil"/>
-            </w:tcBorders>
-            <w:vAlign w:val="center"/>
-          </w:tcPr>
-          <w:p>
-            <w:pPr>
-              <w:pStyle w:val="Compact"/>
-              <w:spacing w:before="0" w:after="40"/>
-            </w:pPr>
-          </w:p>
-        </w:tc>
-        <w:tc>
-          <w:tcPr>
-            <w:tcBorders>
-              <w:top w:val="nil"/>
-              <w:left w:val="nil"/>
-              <w:bottom w:val="nil"/>
-              <w:right w:val="nil"/>
-              <w:insideH w:val="nil"/>
-              <w:insideV w:val="nil"/>
-            </w:tcBorders>
-            <w:vAlign w:val="center"/>
-          </w:tcPr>
-          <w:p>
-            <w:pPr>
-              <w:pStyle w:val="Compact"/>
-              <w:spacing w:before="0" w:after="40"/>
-            </w:pPr>
-          </w:p>
-        </w:tc>
-        <w:tc>
-          <w:tcPr>
-            <w:tcBorders>
-              <w:top w:val="nil"/>
-              <w:left w:val="nil"/>
-              <w:bottom w:val="nil"/>
-              <w:right w:val="nil"/>
-              <w:insideH w:val="nil"/>
-              <w:insideV w:val="nil"/>
-            </w:tcBorders>
-            <w:vAlign w:val="center"/>
-          </w:tcPr>
-          <w:p>
-            <w:pPr>
-              <w:pStyle w:val="Compact"/>
-              <w:spacing w:before="0" w:after="40"/>
-            </w:pPr>
-          </w:p>
-        </w:tc>
-        <w:tc>
-          <w:tcPr>
-            <w:tcBorders>
-              <w:top w:val="nil"/>
-              <w:left w:val="nil"/>
-              <w:bottom w:val="nil"/>
+              <w:bottom w:val="single" w:sz="12" w:space="0" w:color="000000"/>
+              <w:right w:val="nil"/>
+              <w:insideH w:val="nil"/>
+              <w:insideV w:val="nil"/>
+            </w:tcBorders>
+            <w:vAlign w:val="center"/>
+          </w:tcPr>
+          <w:p>
+            <w:pPr>
+              <w:pStyle w:val="Compact"/>
+              <w:spacing w:before="0" w:after="40"/>
+            </w:pPr>
+          </w:p>
+        </w:tc>
+        <w:tc>
+          <w:tcPr>
+            <w:tcBorders>
+              <w:top w:val="nil"/>
+              <w:left w:val="nil"/>
+              <w:bottom w:val="single" w:sz="12" w:space="0" w:color="000000"/>
+              <w:right w:val="nil"/>
+              <w:insideH w:val="nil"/>
+              <w:insideV w:val="nil"/>
+            </w:tcBorders>
+            <w:vAlign w:val="center"/>
+          </w:tcPr>
+          <w:p>
+            <w:pPr>
+              <w:pStyle w:val="Compact"/>
+              <w:spacing w:before="0" w:after="40"/>
+            </w:pPr>
+          </w:p>
+        </w:tc>
+        <w:tc>
+          <w:tcPr>
+            <w:tcBorders>
+              <w:top w:val="nil"/>
+              <w:left w:val="nil"/>
+              <w:bottom w:val="single" w:sz="12" w:space="0" w:color="000000"/>
+              <w:right w:val="nil"/>
+              <w:insideH w:val="nil"/>
+              <w:insideV w:val="nil"/>
+            </w:tcBorders>
+            <w:vAlign w:val="center"/>
+          </w:tcPr>
+          <w:p>
+            <w:pPr>
+              <w:pStyle w:val="Compact"/>
+              <w:spacing w:before="0" w:after="40"/>
+            </w:pPr>
+          </w:p>
+        </w:tc>
+        <w:tc>
+          <w:tcPr>
+            <w:tcBorders>
+              <w:top w:val="nil"/>
+              <w:left w:val="nil"/>
+              <w:bottom w:val="single" w:sz="12" w:space="0" w:color="000000"/>
+              <w:right w:val="nil"/>
+              <w:insideH w:val="nil"/>
+              <w:insideV w:val="nil"/>
+            </w:tcBorders>
+            <w:vAlign w:val="center"/>
+          </w:tcPr>
+          <w:p>
+            <w:pPr>
+              <w:pStyle w:val="Compact"/>
+              <w:spacing w:before="0" w:after="40"/>
+            </w:pPr>
+          </w:p>
+        </w:tc>
+        <w:tc>
+          <w:tcPr>
+            <w:tcBorders>
+              <w:top w:val="nil"/>
+              <w:left w:val="nil"/>
+              <w:bottom w:val="single" w:sz="12" w:space="0" w:color="000000"/>
+              <w:right w:val="nil"/>
+              <w:insideH w:val="nil"/>
+              <w:insideV w:val="nil"/>
+            </w:tcBorders>
+            <w:vAlign w:val="center"/>
+          </w:tcPr>
+          <w:p>
+            <w:pPr>
+              <w:pStyle w:val="Compact"/>
+              <w:spacing w:before="0" w:after="40"/>
+            </w:pPr>
+          </w:p>
+        </w:tc>
+        <w:tc>
+          <w:tcPr>
+            <w:tcBorders>
+              <w:top w:val="nil"/>
+              <w:left w:val="nil"/>
+              <w:bottom w:val="single" w:sz="12" w:space="0" w:color="000000"/>
+              <w:right w:val="nil"/>
+              <w:insideH w:val="nil"/>
+              <w:insideV w:val="nil"/>
+            </w:tcBorders>
+            <w:vAlign w:val="center"/>
+          </w:tcPr>
+          <w:p>
+            <w:pPr>
+              <w:pStyle w:val="Compact"/>
+              <w:spacing w:before="0" w:after="40"/>
+            </w:pPr>
+          </w:p>
+        </w:tc>
+        <w:tc>
+          <w:tcPr>
+            <w:tcBorders>
+              <w:top w:val="nil"/>
+              <w:left w:val="nil"/>
+              <w:bottom w:val="single" w:sz="12" w:space="0" w:color="000000"/>
               <w:right w:val="nil"/>
               <w:insideH w:val="nil"/>
               <w:insideV w:val="nil"/>
@@ -9492,9 +9481,11 @@
       <w:r>
         <w:rPr>
           <w:rFonts w:ascii="Times New Roman" w:hAnsi="Times New Roman" w:eastAsia="Times New Roman"/>
-          <w:sz w:val="22"/>
-        </w:rPr>
-        <w:t>To test whether the C1Q score was internally dependent on C1QA, we performed a counterfactual scoring analysis and re-estimated spatial and clinical metrics (Figure 5, Supplementary Figures S11?S12). The computational attenuation reduced the C1Q program score (mean C1Q score: 5.179 ? 2.628) and decreased Moran's I (0.660 ? 0.401; ? = -0.259). This indicates score dependency and module sensitivity, not experimental proof of biological perturbation.</w:t>
+          <w:b w:val="0"/>
+          <w:i w:val="0"/>
+          <w:sz w:val="22"/>
+        </w:rPr>
+        <w:t>To test whether the C1Q score was internally dependent on C1QA, we performed a counterfactual scoring analysis and re-estimated spatial and clinical metrics (Figure 5, Supplementary Figures S11–S12). The computational attenuation reduced the C1Q program score (mean C1Q score: 5.179 → 2.628) and decreased Moran's I (0.660 → 0.401; Δ = -0.259). This indicates score dependency and module sensitivity, not experimental proof of biological perturbation.</w:t>
       </w:r>
     </w:p>
     <w:p>
@@ -9709,9 +9700,11 @@
       <w:r>
         <w:rPr>
           <w:rFonts w:ascii="Times New Roman" w:hAnsi="Times New Roman" w:eastAsia="Times New Roman"/>
-          <w:sz w:val="22"/>
-        </w:rPr>
-        <w:t>Score-Group Separation: AdaBoost separated a TCGA complete-case subset into high-score and low-score groups with different survival outcomes (log-rank P = 0.005, HR = 1.620, 95% CI: 1.15?2.27). To avoid ambiguity, higher model risk score denotes the adverse-risk direction; C1Q-enriched immune-active context is interpreted separately from the aggregate risk-score direction. Time-dependent ROC showed modest discrimination: 1-year AUC of 0.609, 3-year AUC of 0.611, and 5-year AUC of 0.590 (Figure 6A?B). Risk-score ordering, survival status, and feature-expression patterns are shown as descriptive internal score-behavior summaries (Figure 6C?E), and decision-curve analysis is reported only as exploratory net-benefit visualization (Figure 6F).</w:t>
+          <w:b w:val="0"/>
+          <w:i w:val="0"/>
+          <w:sz w:val="22"/>
+        </w:rPr>
+        <w:t>Score-Group Separation: AdaBoost separated a TCGA complete-case subset into high-score and low-score groups with different survival outcomes (log-rank P = 0.005, HR = 1.620, 95% CI: 1.15–2.27). To avoid ambiguity, higher model risk score denotes the adverse-risk direction; C1Q-enriched immune-active context is interpreted separately from the aggregate risk-score direction. Time-dependent ROC showed modest discrimination: 1-year AUC of 0.609, 3-year AUC of 0.611, and 5-year AUC of 0.590 (Figure 6A–B). Risk-score ordering, survival status, and feature-expression patterns are shown as descriptive internal score-behavior summaries (Figure 6C–E), and decision-curve analysis is reported only as exploratory net-benefit visualization (Figure 6F).</w:t>
       </w:r>
     </w:p>
     <w:bookmarkStart w:id="64" w:name="fig:6"/>
@@ -10048,24 +10041,17 @@
     <w:p>
       <w:pPr>
         <w:pStyle w:val="Caption"/>
-        <w:spacing w:before="60" w:after="160" w:line="276" w:lineRule="auto"/>
+        <w:spacing w:before="120" w:after="80" w:line="276" w:lineRule="auto"/>
         <w:jc w:val="left"/>
       </w:pPr>
       <w:r>
         <w:rPr>
           <w:rFonts w:ascii="Times New Roman" w:hAnsi="Times New Roman" w:eastAsia="Times New Roman"/>
           <w:b/>
+          <w:i w:val="0"/>
           <w:sz w:val="20"/>
         </w:rPr>
-        <w:t>Table 4.</w:t>
-      </w:r>
-      <w:r>
-        <w:rPr>
-          <w:rFonts w:ascii="Times New Roman" w:hAnsi="Times New Roman" w:eastAsia="Times New Roman"/>
-          <w:b w:val="0"/>
-          <w:sz w:val="20"/>
-        </w:rPr>
-        <w:t xml:space="preserve"> Cross-layer evidence map for prioritized candidate genes</w:t>
+        <w:t>Table 4. Cross-layer evidence map for prioritized candidate genes</w:t>
       </w:r>
     </w:p>
     <w:tbl>
@@ -10099,7 +10085,7 @@
         <w:tc>
           <w:tcPr>
             <w:tcBorders>
-              <w:top w:val="nil"/>
+              <w:top w:val="single" w:sz="12" w:space="0" w:color="000000"/>
               <w:left w:val="nil"/>
               <w:bottom w:val="single" w:sz="8" w:space="0" w:color="000000"/>
               <w:right w:val="nil"/>
@@ -10127,7 +10113,7 @@
         <w:tc>
           <w:tcPr>
             <w:tcBorders>
-              <w:top w:val="nil"/>
+              <w:top w:val="single" w:sz="12" w:space="0" w:color="000000"/>
               <w:left w:val="nil"/>
               <w:bottom w:val="single" w:sz="8" w:space="0" w:color="000000"/>
               <w:right w:val="nil"/>
@@ -10155,7 +10141,7 @@
         <w:tc>
           <w:tcPr>
             <w:tcBorders>
-              <w:top w:val="nil"/>
+              <w:top w:val="single" w:sz="12" w:space="0" w:color="000000"/>
               <w:left w:val="nil"/>
               <w:bottom w:val="single" w:sz="8" w:space="0" w:color="000000"/>
               <w:right w:val="nil"/>
@@ -10183,7 +10169,7 @@
         <w:tc>
           <w:tcPr>
             <w:tcBorders>
-              <w:top w:val="nil"/>
+              <w:top w:val="single" w:sz="12" w:space="0" w:color="000000"/>
               <w:left w:val="nil"/>
               <w:bottom w:val="single" w:sz="8" w:space="0" w:color="000000"/>
               <w:right w:val="nil"/>
@@ -10211,7 +10197,7 @@
         <w:tc>
           <w:tcPr>
             <w:tcBorders>
-              <w:top w:val="nil"/>
+              <w:top w:val="single" w:sz="12" w:space="0" w:color="000000"/>
               <w:left w:val="nil"/>
               <w:bottom w:val="single" w:sz="8" w:space="0" w:color="000000"/>
               <w:right w:val="nil"/>
@@ -10239,7 +10225,7 @@
         <w:tc>
           <w:tcPr>
             <w:tcBorders>
-              <w:top w:val="nil"/>
+              <w:top w:val="single" w:sz="12" w:space="0" w:color="000000"/>
               <w:left w:val="nil"/>
               <w:bottom w:val="single" w:sz="8" w:space="0" w:color="000000"/>
               <w:right w:val="nil"/>
@@ -12141,102 +12127,102 @@
             <w:tcBorders>
               <w:top w:val="nil"/>
               <w:left w:val="nil"/>
-              <w:bottom w:val="nil"/>
-              <w:right w:val="nil"/>
-              <w:insideH w:val="nil"/>
-              <w:insideV w:val="nil"/>
-            </w:tcBorders>
-            <w:vAlign w:val="center"/>
-          </w:tcPr>
-          <w:p>
-            <w:pPr>
-              <w:pStyle w:val="Compact"/>
-              <w:spacing w:before="0" w:after="40"/>
-            </w:pPr>
-          </w:p>
-        </w:tc>
-        <w:tc>
-          <w:tcPr>
-            <w:tcBorders>
-              <w:top w:val="nil"/>
-              <w:left w:val="nil"/>
-              <w:bottom w:val="nil"/>
-              <w:right w:val="nil"/>
-              <w:insideH w:val="nil"/>
-              <w:insideV w:val="nil"/>
-            </w:tcBorders>
-            <w:vAlign w:val="center"/>
-          </w:tcPr>
-          <w:p>
-            <w:pPr>
-              <w:pStyle w:val="Compact"/>
-              <w:spacing w:before="0" w:after="40"/>
-            </w:pPr>
-          </w:p>
-        </w:tc>
-        <w:tc>
-          <w:tcPr>
-            <w:tcBorders>
-              <w:top w:val="nil"/>
-              <w:left w:val="nil"/>
-              <w:bottom w:val="nil"/>
-              <w:right w:val="nil"/>
-              <w:insideH w:val="nil"/>
-              <w:insideV w:val="nil"/>
-            </w:tcBorders>
-            <w:vAlign w:val="center"/>
-          </w:tcPr>
-          <w:p>
-            <w:pPr>
-              <w:pStyle w:val="Compact"/>
-              <w:spacing w:before="0" w:after="40"/>
-            </w:pPr>
-          </w:p>
-        </w:tc>
-        <w:tc>
-          <w:tcPr>
-            <w:tcBorders>
-              <w:top w:val="nil"/>
-              <w:left w:val="nil"/>
-              <w:bottom w:val="nil"/>
-              <w:right w:val="nil"/>
-              <w:insideH w:val="nil"/>
-              <w:insideV w:val="nil"/>
-            </w:tcBorders>
-            <w:vAlign w:val="center"/>
-          </w:tcPr>
-          <w:p>
-            <w:pPr>
-              <w:pStyle w:val="Compact"/>
-              <w:spacing w:before="0" w:after="40"/>
-            </w:pPr>
-          </w:p>
-        </w:tc>
-        <w:tc>
-          <w:tcPr>
-            <w:tcBorders>
-              <w:top w:val="nil"/>
-              <w:left w:val="nil"/>
-              <w:bottom w:val="nil"/>
-              <w:right w:val="nil"/>
-              <w:insideH w:val="nil"/>
-              <w:insideV w:val="nil"/>
-            </w:tcBorders>
-            <w:vAlign w:val="center"/>
-          </w:tcPr>
-          <w:p>
-            <w:pPr>
-              <w:pStyle w:val="Compact"/>
-              <w:spacing w:before="0" w:after="40"/>
-            </w:pPr>
-          </w:p>
-        </w:tc>
-        <w:tc>
-          <w:tcPr>
-            <w:tcBorders>
-              <w:top w:val="nil"/>
-              <w:left w:val="nil"/>
-              <w:bottom w:val="nil"/>
+              <w:bottom w:val="single" w:sz="12" w:space="0" w:color="000000"/>
+              <w:right w:val="nil"/>
+              <w:insideH w:val="nil"/>
+              <w:insideV w:val="nil"/>
+            </w:tcBorders>
+            <w:vAlign w:val="center"/>
+          </w:tcPr>
+          <w:p>
+            <w:pPr>
+              <w:pStyle w:val="Compact"/>
+              <w:spacing w:before="0" w:after="40"/>
+            </w:pPr>
+          </w:p>
+        </w:tc>
+        <w:tc>
+          <w:tcPr>
+            <w:tcBorders>
+              <w:top w:val="nil"/>
+              <w:left w:val="nil"/>
+              <w:bottom w:val="single" w:sz="12" w:space="0" w:color="000000"/>
+              <w:right w:val="nil"/>
+              <w:insideH w:val="nil"/>
+              <w:insideV w:val="nil"/>
+            </w:tcBorders>
+            <w:vAlign w:val="center"/>
+          </w:tcPr>
+          <w:p>
+            <w:pPr>
+              <w:pStyle w:val="Compact"/>
+              <w:spacing w:before="0" w:after="40"/>
+            </w:pPr>
+          </w:p>
+        </w:tc>
+        <w:tc>
+          <w:tcPr>
+            <w:tcBorders>
+              <w:top w:val="nil"/>
+              <w:left w:val="nil"/>
+              <w:bottom w:val="single" w:sz="12" w:space="0" w:color="000000"/>
+              <w:right w:val="nil"/>
+              <w:insideH w:val="nil"/>
+              <w:insideV w:val="nil"/>
+            </w:tcBorders>
+            <w:vAlign w:val="center"/>
+          </w:tcPr>
+          <w:p>
+            <w:pPr>
+              <w:pStyle w:val="Compact"/>
+              <w:spacing w:before="0" w:after="40"/>
+            </w:pPr>
+          </w:p>
+        </w:tc>
+        <w:tc>
+          <w:tcPr>
+            <w:tcBorders>
+              <w:top w:val="nil"/>
+              <w:left w:val="nil"/>
+              <w:bottom w:val="single" w:sz="12" w:space="0" w:color="000000"/>
+              <w:right w:val="nil"/>
+              <w:insideH w:val="nil"/>
+              <w:insideV w:val="nil"/>
+            </w:tcBorders>
+            <w:vAlign w:val="center"/>
+          </w:tcPr>
+          <w:p>
+            <w:pPr>
+              <w:pStyle w:val="Compact"/>
+              <w:spacing w:before="0" w:after="40"/>
+            </w:pPr>
+          </w:p>
+        </w:tc>
+        <w:tc>
+          <w:tcPr>
+            <w:tcBorders>
+              <w:top w:val="nil"/>
+              <w:left w:val="nil"/>
+              <w:bottom w:val="single" w:sz="12" w:space="0" w:color="000000"/>
+              <w:right w:val="nil"/>
+              <w:insideH w:val="nil"/>
+              <w:insideV w:val="nil"/>
+            </w:tcBorders>
+            <w:vAlign w:val="center"/>
+          </w:tcPr>
+          <w:p>
+            <w:pPr>
+              <w:pStyle w:val="Compact"/>
+              <w:spacing w:before="0" w:after="40"/>
+            </w:pPr>
+          </w:p>
+        </w:tc>
+        <w:tc>
+          <w:tcPr>
+            <w:tcBorders>
+              <w:top w:val="nil"/>
+              <w:left w:val="nil"/>
+              <w:bottom w:val="single" w:sz="12" w:space="0" w:color="000000"/>
               <w:right w:val="nil"/>
               <w:insideH w:val="nil"/>
               <w:insideV w:val="nil"/>
@@ -12271,24 +12257,17 @@
     <w:p>
       <w:pPr>
         <w:pStyle w:val="Caption"/>
-        <w:spacing w:before="60" w:after="160" w:line="276" w:lineRule="auto"/>
+        <w:spacing w:before="120" w:after="80" w:line="276" w:lineRule="auto"/>
         <w:jc w:val="left"/>
       </w:pPr>
       <w:r>
         <w:rPr>
           <w:rFonts w:ascii="Times New Roman" w:hAnsi="Times New Roman" w:eastAsia="Times New Roman"/>
           <w:b/>
+          <w:i w:val="0"/>
           <w:sz w:val="20"/>
         </w:rPr>
-        <w:t>Table 5.</w:t>
-      </w:r>
-      <w:r>
-        <w:rPr>
-          <w:rFonts w:ascii="Times New Roman" w:hAnsi="Times New Roman" w:eastAsia="Times New Roman"/>
-          <w:b w:val="0"/>
-          <w:sz w:val="20"/>
-        </w:rPr>
-        <w:t xml:space="preserve"> Univariate and multivariable Cox regression analysis in the TCGA discovery cohort (N = 1,038)</w:t>
+        <w:t>Table 5. Univariate and multivariable Cox regression analysis in the TCGA discovery cohort (N = 1,038)</w:t>
       </w:r>
     </w:p>
     <w:tbl>
@@ -12322,7 +12301,7 @@
         <w:tc>
           <w:tcPr>
             <w:tcBorders>
-              <w:top w:val="nil"/>
+              <w:top w:val="single" w:sz="12" w:space="0" w:color="000000"/>
               <w:left w:val="nil"/>
               <w:bottom w:val="single" w:sz="8" w:space="0" w:color="000000"/>
               <w:right w:val="nil"/>
@@ -12357,7 +12336,7 @@
           <w:tcPr>
             <w:gridSpan w:val="2"/>
             <w:tcBorders>
-              <w:top w:val="nil"/>
+              <w:top w:val="single" w:sz="12" w:space="0" w:color="000000"/>
               <w:left w:val="nil"/>
               <w:bottom w:val="single" w:sz="8" w:space="0" w:color="000000"/>
               <w:right w:val="nil"/>
@@ -12393,7 +12372,7 @@
           <w:tcPr>
             <w:gridSpan w:val="2"/>
             <w:tcBorders>
-              <w:top w:val="nil"/>
+              <w:top w:val="single" w:sz="12" w:space="0" w:color="000000"/>
               <w:left w:val="nil"/>
               <w:bottom w:val="single" w:sz="8" w:space="0" w:color="000000"/>
               <w:right w:val="nil"/>
@@ -13140,7 +13119,7 @@
             <w:tcBorders>
               <w:top w:val="nil"/>
               <w:left w:val="nil"/>
-              <w:bottom w:val="nil"/>
+              <w:bottom w:val="single" w:sz="12" w:space="0" w:color="000000"/>
               <w:right w:val="nil"/>
               <w:insideH w:val="nil"/>
               <w:insideV w:val="nil"/>
@@ -13175,7 +13154,7 @@
             <w:tcBorders>
               <w:top w:val="nil"/>
               <w:left w:val="nil"/>
-              <w:bottom w:val="nil"/>
+              <w:bottom w:val="single" w:sz="12" w:space="0" w:color="000000"/>
               <w:right w:val="nil"/>
               <w:insideH w:val="nil"/>
               <w:insideV w:val="nil"/>
@@ -13210,7 +13189,7 @@
             <w:tcBorders>
               <w:top w:val="nil"/>
               <w:left w:val="nil"/>
-              <w:bottom w:val="nil"/>
+              <w:bottom w:val="single" w:sz="12" w:space="0" w:color="000000"/>
               <w:right w:val="nil"/>
               <w:insideH w:val="nil"/>
               <w:insideV w:val="nil"/>
@@ -13245,7 +13224,7 @@
             <w:tcBorders>
               <w:top w:val="nil"/>
               <w:left w:val="nil"/>
-              <w:bottom w:val="nil"/>
+              <w:bottom w:val="single" w:sz="12" w:space="0" w:color="000000"/>
               <w:right w:val="nil"/>
               <w:insideH w:val="nil"/>
               <w:insideV w:val="nil"/>
@@ -13280,7 +13259,7 @@
             <w:tcBorders>
               <w:top w:val="nil"/>
               <w:left w:val="nil"/>
-              <w:bottom w:val="nil"/>
+              <w:bottom w:val="single" w:sz="12" w:space="0" w:color="000000"/>
               <w:right w:val="nil"/>
               <w:insideH w:val="nil"/>
               <w:insideV w:val="nil"/>
@@ -14222,45 +14201,11 @@
       <w:r>
         <w:rPr>
           <w:rFonts w:ascii="Times New Roman" w:hAnsi="Times New Roman" w:eastAsia="Times New Roman"/>
-          <w:sz w:val="22"/>
-        </w:rPr>
-        <w:t xml:space="preserve">Gene Expression Omnibus datasets: NCBI GEO</w:t>
-      </w:r>
-      <w:r>
-        <w:rPr>
-          <w:rFonts w:ascii="Times New Roman" w:hAnsi="Times New Roman" w:eastAsia="Times New Roman"/>
-          <w:sz w:val="22"/>
-        </w:rPr>
-        <w:t xml:space="preserve"> </w:t>
-      </w:r>
-      <w:r>
-        <w:rPr>
-          <w:rFonts w:ascii="Times New Roman" w:hAnsi="Times New Roman" w:eastAsia="Times New Roman"/>
-          <w:sz w:val="22"/>
-        </w:rPr>
-        <w:t xml:space="preserve"> </w:t>
-      </w:r>
-      <w:r>
-        <w:rPr>
-          <w:rFonts w:ascii="Times New Roman" w:hAnsi="Times New Roman" w:eastAsia="Times New Roman"/>
-          <w:sz w:val="22"/>
-        </w:rPr>
-        <w:t xml:space="preserve">(</w:t>
-      </w:r>
-      <w:hyperlink r:id="rId90">
-        <w:r>
-          <w:rPr>
-            <w:rStyle w:val="Hyperlink"/>
-          </w:rPr>
-          <w:t xml:space="preserve">https://www.ncbi.nlm.nih.gov/geo/</w:t>
-        </w:r>
-      </w:hyperlink>
-      <w:r>
-        <w:rPr>
-          <w:rFonts w:ascii="Times New Roman" w:hAnsi="Times New Roman" w:eastAsia="Times New Roman"/>
-          <w:sz w:val="22"/>
-        </w:rPr>
-        <w:t xml:space="preserve">).</w:t>
+          <w:b w:val="0"/>
+          <w:i w:val="0"/>
+          <w:sz w:val="22"/>
+        </w:rPr>
+        <w:t>Gene Expression Omnibus datasets: NCBI GEO [52] (https://www.ncbi.nlm.nih.gov/geo/).</w:t>
       </w:r>
     </w:p>
     <w:p>
@@ -14387,45 +14332,11 @@
       <w:r>
         <w:rPr>
           <w:rFonts w:ascii="Times New Roman" w:hAnsi="Times New Roman" w:eastAsia="Times New Roman"/>
-          <w:sz w:val="22"/>
-        </w:rPr>
-        <w:t xml:space="preserve">Immunohistochemistry images: Human Protein Atlas</w:t>
-      </w:r>
-      <w:r>
-        <w:rPr>
-          <w:rFonts w:ascii="Times New Roman" w:hAnsi="Times New Roman" w:eastAsia="Times New Roman"/>
-          <w:sz w:val="22"/>
-        </w:rPr>
-        <w:t xml:space="preserve"> </w:t>
-      </w:r>
-      <w:r>
-        <w:rPr>
-          <w:rFonts w:ascii="Times New Roman" w:hAnsi="Times New Roman" w:eastAsia="Times New Roman"/>
-          <w:sz w:val="22"/>
-        </w:rPr>
-        <w:t xml:space="preserve"> </w:t>
-      </w:r>
-      <w:r>
-        <w:rPr>
-          <w:rFonts w:ascii="Times New Roman" w:hAnsi="Times New Roman" w:eastAsia="Times New Roman"/>
-          <w:sz w:val="22"/>
-        </w:rPr>
-        <w:t xml:space="preserve">(</w:t>
-      </w:r>
-      <w:hyperlink r:id="rId94">
-        <w:r>
-          <w:rPr>
-            <w:rStyle w:val="Hyperlink"/>
-          </w:rPr>
-          <w:t xml:space="preserve">https://www.proteinatlas.org</w:t>
-        </w:r>
-      </w:hyperlink>
-      <w:r>
-        <w:rPr>
-          <w:rFonts w:ascii="Times New Roman" w:hAnsi="Times New Roman" w:eastAsia="Times New Roman"/>
-          <w:sz w:val="22"/>
-        </w:rPr>
-        <w:t xml:space="preserve">); figure-specific source and license notes are provided in the source-data manifest.</w:t>
+          <w:b w:val="0"/>
+          <w:i w:val="0"/>
+          <w:sz w:val="22"/>
+        </w:rPr>
+        <w:t>Immunohistochemistry images: Human Protein Atlas [53] (https://www.proteinatlas.org); figure-specific source and license notes are provided in the source-data manifest.</w:t>
       </w:r>
     </w:p>
     <w:p>
@@ -14707,705 +14618,799 @@
     <w:p>
       <w:pPr>
         <w:pStyle w:val="Heading1"/>
-        <w:spacing w:before="240" w:after="120" w:line="276" w:lineRule="auto"/>
       </w:pPr>
       <w:r>
         <w:rPr>
           <w:rFonts w:ascii="Times New Roman" w:hAnsi="Times New Roman" w:eastAsia="Times New Roman"/>
           <w:b/>
+          <w:sz w:val="28"/>
+        </w:rPr>
+        <w:t>References</w:t>
+      </w:r>
+    </w:p>
+    <w:p>
+      <w:pPr>
+        <w:spacing w:after="60"/>
+        <w:ind w:left="312" w:hanging="312"/>
+      </w:pPr>
+      <w:r>
+        <w:rPr>
+          <w:rFonts w:ascii="Times New Roman" w:hAnsi="Times New Roman" w:eastAsia="Times New Roman"/>
+          <w:b w:val="0"/>
           <w:i w:val="0"/>
-          <w:sz w:val="28"/>
-        </w:rPr>
-        <w:t>References</w:t>
-      </w:r>
-    </w:p>
-    <w:p>
-      <w:pPr>
-        <w:spacing w:after="60" w:line="276" w:lineRule="auto"/>
-        <w:ind w:hanging="255" w:left="255"/>
-      </w:pPr>
-      <w:r>
-        <w:rPr>
-          <w:rFonts w:ascii="Times New Roman" w:hAnsi="Times New Roman" w:eastAsia="Times New Roman"/>
-          <w:sz w:val="22"/>
-        </w:rPr>
-        <w:t>1. Sung H., Ferlay J., Siegel R.L., Laversanne M., Soerjomataram I., Jemal A., Bray F. Global cancer statistics 2020: GLOBOCAN estimates of incidence and mortality worldwide for 36 cancers in 185 countries. CA: A Cancer Journal for Clinicians. 2021;71(3):209-249. doi:10.3322/caac.21660</w:t>
-      </w:r>
-    </w:p>
-    <w:p>
-      <w:pPr>
-        <w:spacing w:after="60" w:line="276" w:lineRule="auto"/>
-        <w:ind w:hanging="255" w:left="255"/>
-      </w:pPr>
-      <w:r>
-        <w:rPr>
-          <w:rFonts w:ascii="Times New Roman" w:hAnsi="Times New Roman" w:eastAsia="Times New Roman"/>
-          <w:sz w:val="22"/>
-        </w:rPr>
-        <w:t>2. Chen Z., Fillmore C.M., Hammerman P.S., Kim C.F., Wong K.-K. Non-small-cell lung cancers: A heterogeneous set of diseases. Nature Reviews Cancer. 2014;14(8):535-546. doi:10.1038/nrc3775</w:t>
-      </w:r>
-    </w:p>
-    <w:p>
-      <w:pPr>
-        <w:spacing w:after="60" w:line="276" w:lineRule="auto"/>
-        <w:ind w:hanging="255" w:left="255"/>
-      </w:pPr>
-      <w:r>
-        <w:rPr>
-          <w:rFonts w:ascii="Times New Roman" w:hAnsi="Times New Roman" w:eastAsia="Times New Roman"/>
-          <w:sz w:val="22"/>
-        </w:rPr>
-        <w:t>3. Reck M., Rodriguez-Abreu D., Robinson A.G., Hui R., Csoszi T., Fulop A., Gottfried M., Peled N., Tafreshi A., Cuffe S., O'Brien M., Rao S., Hotta K., Leiby M.A., Lubiniecki G.M., Shentu Y., Rangwala R., Brahmer J.R. Pembrolizumab versus chemotherapy for PD-L1-positive non-small-cell lung cancer. New England Journal of Medicine. 2016;375(19):1823-1833. doi:10.1056/NEJMoa1606774</w:t>
-      </w:r>
-    </w:p>
-    <w:p>
-      <w:pPr>
-        <w:spacing w:after="60" w:line="276" w:lineRule="auto"/>
-        <w:ind w:hanging="255" w:left="255"/>
-      </w:pPr>
-      <w:r>
-        <w:rPr>
-          <w:rFonts w:ascii="Times New Roman" w:hAnsi="Times New Roman" w:eastAsia="Times New Roman"/>
-          <w:sz w:val="22"/>
-        </w:rPr>
-        <w:t>4. Herbst R.S., Giaccone G., De Marinis F., Reinmuth N., Vergnenegre A., Barrios C.H., Morise M., Felip E., Andric Z., Geater S., \"Ozguro glu M., Zou W., Sandler A., Enquist I., Komatsubara K., Deng Y., Kuriki H., Wen X., McCleland M., Mocci S., Jassem J., Spigel D.R. Atezolizumab for first-line treatment of PD-L1-selected patients with NSCLC. New England Journal of Medicine. 2020;383(14):1328-1339. doi:10.1056/NEJMoa1917346</w:t>
-      </w:r>
-    </w:p>
-    <w:p>
-      <w:pPr>
-        <w:spacing w:after="60" w:line="276" w:lineRule="auto"/>
-        <w:ind w:hanging="255" w:left="255"/>
-      </w:pPr>
-      <w:r>
-        <w:rPr>
-          <w:rFonts w:ascii="Times New Roman" w:hAnsi="Times New Roman" w:eastAsia="Times New Roman"/>
-          <w:sz w:val="22"/>
-        </w:rPr>
-        <w:t>5. Gandhi L., Rodriguez-Abreu D., Gadgeel S., Esteban E., Felip E., De Angelis F., Domine M., Clingan P., Hochmair M.J., Powell S.F., Cheng S.Y.-S., Bischoff H.G., Peled N., Grossi F., Jennens R.R., Reck M., Hui R., Garon E.B., Boyer M., Rubio-Viqueira B., Novello S., Kurata T., Gray J.E., Vida J., Wei Z., Yang J., Raftopoulos H., Pietanza M.C., Garassino M.C. Pembrolizumab plus chemotherapy in metastatic non-small-cell lung cancer. New England Journal of Medicine. 2018;378(22):2078-2092. doi:10.1056/NEJMoa1801005</w:t>
-      </w:r>
-    </w:p>
-    <w:p>
-      <w:pPr>
-        <w:spacing w:after="60" w:line="276" w:lineRule="auto"/>
-        <w:ind w:hanging="255" w:left="255"/>
-      </w:pPr>
-      <w:r>
-        <w:rPr>
-          <w:rFonts w:ascii="Times New Roman" w:hAnsi="Times New Roman" w:eastAsia="Times New Roman"/>
-          <w:sz w:val="22"/>
-        </w:rPr>
-        <w:t>6. Passaro A., Attili I., de Marinis F. Neoadjuvant chemotherapy plus immunotherapy in early-stage resectable non-small-cell lung cancer. Journal of Clinical Oncology: Official Journal of the American Society of Clinical Oncology. 2022;40(25):2871-2877. doi:10.1200/JCO.22.00873</w:t>
-      </w:r>
-    </w:p>
-    <w:p>
-      <w:pPr>
-        <w:spacing w:after="60" w:line="276" w:lineRule="auto"/>
-        <w:ind w:hanging="255" w:left="255"/>
-      </w:pPr>
-      <w:r>
-        <w:rPr>
-          <w:rFonts w:ascii="Times New Roman" w:hAnsi="Times New Roman" w:eastAsia="Times New Roman"/>
-          <w:sz w:val="22"/>
-        </w:rPr>
-        <w:t>7. Hellmann M.D., Ciuleanu T.-E., Pluzanski A., Lee J.S., Otterson G.A., Audigier-Valette C., Minenza E., Linardou H., Burgers S., Salman P., Borghaei H., Ramalingam S.S., Brahmer J., Reck M., O'Byrne K.J., Geese W.J., Green G., Chang H., Szustakowski J., Bhagavatheeswaran P., Healey D., Fu Y., Nathan F., Paz-Ares L. Nivolumab plus ipilimumab in lung cancer with a high tumor mutational burden. New England Journal of Medicine. 2018;378(22):2093-2104. doi:10.1056/NEJMoa1801946</w:t>
-      </w:r>
-    </w:p>
-    <w:p>
-      <w:pPr>
-        <w:spacing w:after="60" w:line="276" w:lineRule="auto"/>
-        <w:ind w:hanging="255" w:left="255"/>
-      </w:pPr>
-      <w:r>
-        <w:rPr>
-          <w:rFonts w:ascii="Times New Roman" w:hAnsi="Times New Roman" w:eastAsia="Times New Roman"/>
-          <w:sz w:val="22"/>
-        </w:rPr>
-        <w:t>8. Marabelle A., Fakih M., Lopez J., Shah M., Shapira-Frommer R., Nakagawa K., Chung H.C., Kindler H.L., Lopez-Martin J.A., Miller W.H., Italiano A., Kao S., Piha-Paul S.A., Delord J.-P., McWilliams R.R., Fabrizio D.A., Aurora-Garg D., Xu L., Jin F., Norwood K., Bang Y.-J. Association of tumour mutational burden with outcomes in patients with advanced solid tumours treated with pembrolizumab: Prospective biomarker analysis of the multicohort, open-label, phase 2 KEYNOTE-158 study. The Lancet Oncology. 2020;21(10):1353-1365. doi:10.1016/S1470-2045(20)30445-9</w:t>
-      </w:r>
-    </w:p>
-    <w:p>
-      <w:pPr>
-        <w:spacing w:after="60" w:line="276" w:lineRule="auto"/>
-        <w:ind w:hanging="255" w:left="255"/>
-      </w:pPr>
-      <w:r>
-        <w:rPr>
-          <w:rFonts w:ascii="Times New Roman" w:hAnsi="Times New Roman" w:eastAsia="Times New Roman"/>
-          <w:sz w:val="22"/>
-        </w:rPr>
-        <w:t>9. Topalian S.L., Taube J.M., Anders R.A., Pardoll D.M. Mechanism-driven biomarkers to guide immune checkpoint blockade in cancer therapy. Nature Reviews Cancer. 2016;16(5):275-287. doi:10.1038/nrc.2016.36</w:t>
-      </w:r>
-    </w:p>
-    <w:p>
-      <w:pPr>
-        <w:spacing w:after="60" w:line="276" w:lineRule="auto"/>
-        <w:ind w:hanging="255" w:left="255"/>
-      </w:pPr>
-      <w:r>
-        <w:rPr>
-          <w:rFonts w:ascii="Times New Roman" w:hAnsi="Times New Roman" w:eastAsia="Times New Roman"/>
-          <w:sz w:val="22"/>
-        </w:rPr>
-        <w:t>10. Schoenfeld A.J., Hellmann M.D. Acquired resistance to immune checkpoint inhibitors. Cancer Cell. 2020;37(4):443-455. doi:10.1016/j.ccell.2020.03.017</w:t>
-      </w:r>
-    </w:p>
-    <w:p>
-      <w:pPr>
-        <w:spacing w:after="60" w:line="276" w:lineRule="auto"/>
-        <w:ind w:hanging="255" w:left="255"/>
-      </w:pPr>
-      <w:r>
-        <w:rPr>
-          <w:rFonts w:ascii="Times New Roman" w:hAnsi="Times New Roman" w:eastAsia="Times New Roman"/>
-          <w:sz w:val="22"/>
-        </w:rPr>
-        <w:t>11. Vodnala S.K., Eil R., Kishton R.J., Sukumar M., Yamamoto T.N., Ha N.-H., Lee P.-H., Shin M., Patel S.J., Yu Z., Palmer D.C., Kruhlak M.J., Liu X., Locasale J.W., Huang J., Roychoudhuri R., Finkel T., Klebanoff C.A., Restifo N.P. T cell stemness and dysfunction in tumors are triggered by a common mechanism. Science. 2019;363(6434):0135. doi:10.1126/science.aau0135</w:t>
-      </w:r>
-    </w:p>
-    <w:p>
-      <w:pPr>
-        <w:spacing w:after="60" w:line="276" w:lineRule="auto"/>
-        <w:ind w:hanging="255" w:left="255"/>
-      </w:pPr>
-      <w:r>
-        <w:rPr>
-          <w:rFonts w:ascii="Times New Roman" w:hAnsi="Times New Roman" w:eastAsia="Times New Roman"/>
-          <w:sz w:val="22"/>
-        </w:rPr>
-        <w:t>12. Vigneron N. Human tumor antigens and cancer immunotherapy. BioMed Research International. 2015;2015:1-17. doi:10.1155/2015/948501</w:t>
-      </w:r>
-    </w:p>
-    <w:p>
-      <w:pPr>
-        <w:spacing w:after="60" w:line="276" w:lineRule="auto"/>
-        <w:ind w:hanging="255" w:left="255"/>
-      </w:pPr>
-      <w:r>
-        <w:rPr>
-          <w:rFonts w:ascii="Times New Roman" w:hAnsi="Times New Roman" w:eastAsia="Times New Roman"/>
-          <w:sz w:val="22"/>
-        </w:rPr>
-        <w:t>13. Jerby-Arnon L., Shah P., Cuoco M.S., Rodman C., Su M.-J., Melms J.C., Leeson R., Kanodia A., Mei S., Lin J.-R., Wang S., Rabasha B., Liu D., Zhang G., Margolais C., Ashenberg O., Ott P.A., Buchbinder E.I., Haq R., Hodi F.S., Boland G.M., Sullivan R.J., Frederick D.T., Miao B., Moll T., Flaherty K.T., Herlyn M., Jenkins R.W., Thummalapalli R., Kowalczyk M.S., Canadas I., Schilling B., Cartwright A.N.R., Luoma A.M., Malu S., Hwu P., Bernatchez C., Forget M.-A., Barbie D.A., Shalek A.K., Tirosh I., Sorger P.K., Wucherpfennig K., Van Allen E.M., Schadendorf D., Johnson B.E., Rotem A., Rozenblatt-Rosen O., Garraway L.A., Yoon C.H., Izar B., Regev A. A cancer cell program promotes T cell exclusion and resistance to checkpoint blockade. Cell. 2018;175(4):984-99724. doi:10.1016/j.cell.2018.09.006</w:t>
-      </w:r>
-    </w:p>
-    <w:p>
-      <w:pPr>
-        <w:spacing w:after="60" w:line="276" w:lineRule="auto"/>
-        <w:ind w:hanging="255" w:left="255"/>
-      </w:pPr>
-      <w:r>
-        <w:rPr>
-          <w:rFonts w:ascii="Times New Roman" w:hAnsi="Times New Roman" w:eastAsia="Times New Roman"/>
-          <w:sz w:val="22"/>
-        </w:rPr>
-        <w:t>14. Sthl P.L., Salm\'en F., Vickovic S., Lundmark A., Navarro J.F., Magnusson J., Giacomello S., Asp M., Westholm J.O., Huss M., Mollbrink A., Linnarsson S., Codeluppi S., Borg., Pont\'en F., Costea P.I., Sahl\'en P., Mulder J., Bergmann O., Lundeberg J., Fris\'en J. Visualization and analysis of gene expression in tissue sections by spatial transcriptomics. Science. 2016;353(6294):78-82. doi:10.1126/science.aaf2403</w:t>
-      </w:r>
-    </w:p>
-    <w:p>
-      <w:pPr>
-        <w:spacing w:after="60" w:line="276" w:lineRule="auto"/>
-        <w:ind w:hanging="255" w:left="255"/>
-      </w:pPr>
-      <w:r>
-        <w:rPr>
-          <w:rFonts w:ascii="Times New Roman" w:hAnsi="Times New Roman" w:eastAsia="Times New Roman"/>
-          <w:sz w:val="22"/>
-        </w:rPr>
-        <w:t>15. Marx V. Method of the year: Spatially resolved transcriptomics. Nature Methods. 2021;18(1):9-14. doi:10.1038/s41592-020-01033-y</w:t>
-      </w:r>
-    </w:p>
-    <w:p>
-      <w:pPr>
-        <w:spacing w:after="60" w:line="276" w:lineRule="auto"/>
-        <w:ind w:hanging="255" w:left="255"/>
-      </w:pPr>
-      <w:r>
-        <w:rPr>
-          <w:rFonts w:ascii="Times New Roman" w:hAnsi="Times New Roman" w:eastAsia="Times New Roman"/>
-          <w:sz w:val="22"/>
-        </w:rPr>
-        <w:t>16. Zilionis R., Engblom C., Pfirschke C., Savova V., Zemmour D., Saatcioglu H.D., Krishnan I., Maroni G., Meyerovitz C.V., Kerwin C.M., Choi S., Richards W.G., De Rienzo A., Tenen D.G., Bueno R., Levantini E., Pittet M.J., Klein A.M. Single-cell transcriptomics of human and mouse lung cancers reveals conserved myeloid populations across individuals and species. Immunity. 2019;50(5):1317-133410. doi:10.1016/j.immuni.2019.03.009</w:t>
-      </w:r>
-    </w:p>
-    <w:p>
-      <w:pPr>
-        <w:spacing w:after="60" w:line="276" w:lineRule="auto"/>
-        <w:ind w:hanging="255" w:left="255"/>
-      </w:pPr>
-      <w:r>
-        <w:rPr>
-          <w:rFonts w:ascii="Times New Roman" w:hAnsi="Times New Roman" w:eastAsia="Times New Roman"/>
-          <w:sz w:val="22"/>
-        </w:rPr>
-        <w:t>17. Laumont C.M., Nelson B.H. B cells in the tumor microenvironment: Multi-faceted organizers, regulators, and effectors of anti-tumor immunity. Cancer Cell. 2023;41(3):466-489. doi:10.1016/j.ccell.2023.02.017</w:t>
-      </w:r>
-    </w:p>
-    <w:p>
-      <w:pPr>
-        <w:spacing w:after="60" w:line="276" w:lineRule="auto"/>
-        <w:ind w:hanging="255" w:left="255"/>
-      </w:pPr>
-      <w:r>
-        <w:rPr>
-          <w:rFonts w:ascii="Times New Roman" w:hAnsi="Times New Roman" w:eastAsia="Times New Roman"/>
-          <w:sz w:val="22"/>
-        </w:rPr>
-        <w:t>18. Janesick A., Shelansky R., Gottscho A.D., Wagner F., Williams S.R., Rouault M., Beliakoff G., Morrison C.A., Oliveira M.F., Sicherman J.T., Kohlway A., Abousoud J., Drennon T.Y., Mohabbat S.H., 10x Development Teams, Taylor S.E.B. High resolution mapping of the tumor microenvironment using integrated single-cell, spatial and in situ analysis. Nature Communications. 2023;14(1):8353. doi:10.1038/s41467-023-43458-x</w:t>
-      </w:r>
-    </w:p>
-    <w:p>
-      <w:pPr>
-        <w:spacing w:after="60" w:line="276" w:lineRule="auto"/>
-        <w:ind w:hanging="255" w:left="255"/>
-      </w:pPr>
-      <w:r>
-        <w:rPr>
-          <w:rFonts w:ascii="Times New Roman" w:hAnsi="Times New Roman" w:eastAsia="Times New Roman"/>
-          <w:sz w:val="22"/>
-        </w:rPr>
-        <w:t>19. He K., Zhang X., Ren S., Sun J. Deep residual learning for image recognition. 2016 IEEE Conference on Computer Vision and Pattern Recognition (CVPR). 2016:770-778. doi:10.1109/CVPR.2016.90</w:t>
-      </w:r>
-    </w:p>
-    <w:p>
-      <w:pPr>
-        <w:spacing w:after="60" w:line="276" w:lineRule="auto"/>
-        <w:ind w:hanging="255" w:left="255"/>
-      </w:pPr>
-      <w:r>
-        <w:rPr>
-          <w:rFonts w:ascii="Times New Roman" w:hAnsi="Times New Roman" w:eastAsia="Times New Roman"/>
-          <w:sz w:val="22"/>
-        </w:rPr>
-        <w:t>20. Campanella G., Hanna M.G., Geneslaw L., Miraflor A., Werneck Krauss Silva V., Busam K.J., Brogi E., Reuter V.E., Klimstra D.S., Fuchs T.J. Clinical-grade computational pathology using weakly supervised deep learning on whole slide images. Nature Medicine. 2019;25(8):1301-1309. doi:10.1038/s41591-019-0508-1</w:t>
-      </w:r>
-    </w:p>
-    <w:p>
-      <w:pPr>
-        <w:spacing w:after="60" w:line="276" w:lineRule="auto"/>
-        <w:ind w:hanging="255" w:left="255"/>
-      </w:pPr>
-      <w:r>
-        <w:rPr>
-          <w:rFonts w:ascii="Times New Roman" w:hAnsi="Times New Roman" w:eastAsia="Times New Roman"/>
-          <w:sz w:val="22"/>
-        </w:rPr>
-        <w:t>21. Valanarasu J.M.J., Xu H., Usuyama N., Kim C., Wong C., Argaw P., Ben Shimol R., Crabtree A., Matlock K., Bartlett A.Q., Bagga J., Gu Y., Zhang S., Naumann T., Fox B.A., Wright B., Robicsek A., Piening B., Bifulco C., Wang S., Poon H. doi:10.1016/j.cell.2025.11.016</w:t>
-      </w:r>
-    </w:p>
-    <w:p>
-      <w:pPr>
-        <w:spacing w:after="60" w:line="276" w:lineRule="auto"/>
-        <w:ind w:hanging="255" w:left="255"/>
-      </w:pPr>
-      <w:r>
-        <w:rPr>
-          <w:rFonts w:ascii="Times New Roman" w:hAnsi="Times New Roman" w:eastAsia="Times New Roman"/>
-          <w:sz w:val="22"/>
-        </w:rPr>
-        <w:t>22. Wu Y., Yang S., Ma J., Chen Z., Song G., Rao D., Cheng Y., Huang S., Liu Y., Jiang S., Liu J., Huang X., Wang X., Qiu S., Xu J., Xi R., Bai F., Zhou J., Fan J., Zhang X., Gao Q. Spatiotemporal immune landscape of colorectal cancer liver metastasis at single-cell level. Cancer Discovery. 2022;12(1):134-153. doi:10.1158/2159-8290.CD-21-0316</w:t>
-      </w:r>
-    </w:p>
-    <w:p>
-      <w:pPr>
-        <w:spacing w:after="60" w:line="276" w:lineRule="auto"/>
-        <w:ind w:hanging="255" w:left="255"/>
-      </w:pPr>
-      <w:r>
-        <w:rPr>
-          <w:rFonts w:ascii="Times New Roman" w:hAnsi="Times New Roman" w:eastAsia="Times New Roman"/>
-          <w:sz w:val="22"/>
-        </w:rPr>
-        <w:t>23. Chen R.J., Lu M.Y., Williamson D.F.K., Chen T.Y., Lipkova J., Noor Z., Shaban M., Shady M., Williams M., Joo B., Mahmood F. Pan-cancer integrative histology-genomic analysis via multimodal deep learning. Cancer Cell. 2022;40(8):865-8786. doi:10.1016/j.ccell.2022.07.004</w:t>
-      </w:r>
-    </w:p>
-    <w:p>
-      <w:pPr>
-        <w:spacing w:after="60" w:line="276" w:lineRule="auto"/>
-        <w:ind w:hanging="255" w:left="255"/>
-      </w:pPr>
-      <w:r>
-        <w:rPr>
-          <w:rFonts w:ascii="Times New Roman" w:hAnsi="Times New Roman" w:eastAsia="Times New Roman"/>
-          <w:sz w:val="22"/>
-        </w:rPr>
-        <w:t>24. Thorsson V., Gibbs D.L., Brown S.D., Wolf D., Bortone D.S., Ou Yang T.-H., Porta-Pardo E., Gao G.F., Plaisier C.L., Eddy J.A., Ziv E., Culhane A.C., Paull E.O., Sivakumar I.K.A., Gentles A.J., Malhotra R., Farshidfar F., Colaprico A., Parker J.S., Mose L.E., Vo N.S., Liu J., Liu Y., Rader J., Dhankani V., Reynolds S.M., Bowlby R., Califano A., Cherniack A.D., Anastassiou D., Bedognetti D., Mokrab Y., Newman A.M., Rao A., Chen K., Krasnitz A., Hu H., Malta T.M., Noushmehr H., Pedamallu C.S., Bullman S., Ojesina A.I., Lamb A., Zhou W., Shen H., Choueiri T.K., Weinstein J.N., Guinney J., Saltz J., Holt R.A., Rabkin C.S., Caesar-Johnson S.J., Demchok J.A., Felau I., Kasapi M., Ferguson M.L., Hutter C.M., Sofia H.J., Tarnuzzer R., Wang Z., Yang L., Zenklusen J.C., Zhang J.J., Chudamani S., Liu J., Lolla L., Naresh R., Pihl T., Sun Q., Wan Y., Wu Y., Cho J., DeFreitas T., Frazer S., Gehlenborg N., Getz G., Heiman D.I., Kim J., Lawrence M.S., Lin P., Meier S., Noble M.S., Saksena G., Voet D., Zhang H., Bernard B., Chambwe N., Dhankani V., Knijnenburg T., Kramer R., Leinonen K., Liu Y., Miller M., Reynolds S., Shmulevich I., Thorsson V., Zhang W., Akbani R., Broom B.M., Hegde A.M., Ju Z., Kanchi R.S., Korkut A., Li J., Liang H., Ling S., Liu W., Lu Y., Mills G.B., Ng K.-S., Rao A., Ryan M., Wang J., Weinstein J.N., Zhang J., Abeshouse A., Armenia J., Chakravarty D., Chatila W.K., De Bruijn I., Gao J., Gross B.E., Heins Z.J., Kundra R., La K., Ladanyi M., Luna A., Nissan M.G., Ochoa A., Phillips S.M., Reznik E., Sanchez-Vega F., Sander C., Schultz N., Sheridan R., Sumer S.O., Sun Y., Taylor B.S., Wang J., Zhang H., Anur P., Peto M., Spellman P., Benz C., Stuart J.M., Wong C.K., Yau C., Hayes D.N., Parker J.S., Wilkerson M.D., Ally A., Balasundaram M., Bowlby R., Brooks D., Carlsen R., Chuah E., Dhalla N., Holt R., Jones S.J.M., Kasaian K., Lee D., Ma Y., Marra M.A., Mayo M., Moore R.A., Mungall A.J., Mungall K., Robertson A.G., Sadeghi S., Schein J.E., Sipahimalani P., Tam A., Thiessen N., Tse K., Wong T., Berger A.C., Beroukhim R., Cherniack A.D., Cibulskis C., Gabriel S.B., Gao G.F., Ha G., Meyerson M., Schumacher S.E., Shih J., Kucherlapati M.H., Kucherlapati R.S., Baylin S., Cope L., Danilova L., Bootwalla M.S., Lai P.H., Maglinte D.T., Van Den Berg D.J., Weisenberger D.J., Auman J.T., Balu S., Bodenheimer T., Fan C., Hoadley K.A., Hoyle A.P., Jefferys S.R., Jones C.D., Meng S., Mieczkowski P.A., Mose L.E., Perou A.H., Perou C.M., Roach J., Shi Y., Simons J.V., Skelly T., Soloway M.G., Tan D., Veluvolu U., Fan H., Hinoue T., Laird P.W., Shen H., Zhou W., Bellair M., Chang K., Covington K., Creighton C.J., Dinh H., Doddapaneni H., Donehower L.A., Drummond J., Gibbs R.A., Glenn R., Hale W., Han Y., Hu J., Korchina V., Lee S., Lewis L., Li W., Liu X., Morgan M., Morton D., Muzny D., Santibanez J., Sheth M., Shinbrot E., Wang L., Wang M., Wheeler D.A., Xi L., Zhao F., Hess J., Appelbaum E.L., Bailey M., Cordes M.G., Ding L., Fronick C.C., Fulton L.A., Fulton R.S., Kandoth C., Mardis E.R., McLellan M.D., Miller C.A., Schmidt H.K., Wilson R.K., Crain D., Curley E., Gardner J., Lau K., Mallery D., Morris S., Paulauskis J., Penny R., Shelton C., Shelton T., Sherman M., Thompson E., Yena P., Bowen J., Gastier-Foster J.M., Gerken M., Leraas K.M., Lichtenberg T.M., Ramirez N.C., Wise L., Zmuda E., Corcoran N., Costello T., Hovens C., Carvalho A.L., De Carvalho A.C., Fregnani J.H., Longatto-Filho A., Reis R.M., Scapulatempo-Neto C., Silveira H.C.S., Vidal D.O., Burnette A., Eschbacher J., Hermes B., Noss A., Singh R., Anderson M.L., Castro P.D., Ittmann M., Huntsman D., Kohl B., Le X., Thorp R., Andry C., Duffy E.R., Lyadov V., Paklina O., Setdikova G., Shabunin A., Tavobilov M., McPherson C., Warnick R., Berkowitz R., Cramer D., Feltmate C., Horowitz N., Kibel A., Muto M., Raut C.P., Malykh A., Barnholtz-Sloan J.S., Barrett W., Devine K., Fulop J., Ostrom Q.T., Shimmel K., Wolinsky Y., Sloan A.E., De Rose A., Giuliante F., Goodman M., Karlan B.Y., Hagedorn C.H., Eckman J., Harr J., Myers J., Tucker K., Zach L.A., Deyarmin B., Hu H., Kvecher L., Larson C., Mural R.J., Somiari S., Vicha A., Zelinka T., Bennett J., Iacocca M., Rabeno B., Swanson P., Latour M., Lacombe L., T\^etu B., Bergeron A., McGraw M., Staugaitis S.M., Chabot J., Hibshoosh H., Sepulveda A., Su T., Wang T., Potapova O., Voronina O., Desjardins L., Mariani O., Roman-Roman S., Sastre X., Stern M.-H., Cheng F., Signoretti S., Berchuck A., Bigner D., Lipp E., Marks J., McCall S., McLendon R., Secord A., Sharp A., Behera M., Brat D.J., Chen A., Delman K., Force S., Khuri F., Magliocca K., Maithel S., Olson J.J., Owonikoko T., Pickens A., Ramalingam S., Shin D.M., Sica G., Van Meir E.G., Zhang H., Eijckenboom W., Gillis A., Korpershoek E., Looijenga L., Oosterhuis W., Stoop H., Van Kessel K.E., Zwarthoff E.C., Calatozzolo C., Cuppini L., Cuzzubbo S., DiMeco F., Finocchiaro G., Mattei L., Perin A., Pollo B., Chen C., Houck J., Lohavanichbutr P., Hartmann A., Stoehr C., Stoehr R., Taubert H., Wach S., Wullich B., Kycler W., Murawa D., Wiznerowicz M., Chung K., Edenfield W.J., Martin J., Baudin E., Bubley G., Bueno R., De Rienzo A., Richards W.G., Kalkanis S., Mikkelsen T., Noushmehr H., Scarpace L., Girard N., Aymerich M., Campo E., Gin\'e E., Guillermo A.L., Van Bang N., Hanh P.T., Phu B.D., Tang Y., Colman H., Evason K., Dottino P.R., Martignetti J.A., Gabra H., Juhl H., Akeredolu T., Stepa S., Hoon D., Ahn K., Kang K.J., Beuschlein F., Breggia A., Birrer M., Bell D., Borad M., Bryce A.H., Castle E., Chandan V., Cheville J., Copland J.A., Farnell M., Flotte T., Giama N., Ho T., Kendrick M., Kocher J.-P., Kopp K., Moser C., Nagorney D., O'Brien D., O'Neill B.P., Patel T., Petersen G., Que F., Rivera M., Roberts L., Smallridge R., Smyrk T., Stanton M., Thompson R.H., Torbenson M., Yang J.D., Zhang L., Brimo F., Ajani J.A., Gonzalez A.M.A., Behrens C., Bondaruk J., Broaddus R., Czerniak B., Esmaeli B., Fujimoto J., Gershenwald J., Guo C., Lazar A.J., Logothetis C., Meric-Bernstam F., Moran C., Ramondetta L., Rice D., Sood A., Tamboli P., Thompson T., Troncoso P., Tsao A., Wistuba I., Carter C., Haydu L., Hersey P., Jakrot V., Kakavand H., Kefford R., Lee K., Long G., Mann G., Quinn M., Saw R., Scolyer R., Shannon K., Spillane A., Stretch O., Synott M., Thompson J., Wilmott J., Al-Ahmadie H., Chan T.A., Ghossein R., Gopalan A., Levine D.A., Reuter V., Singer S., Singh B., Tien N.V., Broudy T., Mirsaidi C., Nair P., Drwiega P., Miller J., Smith J., Zaren H., Park J.-W., Hung N.P., Kebebew E., Linehan W.M., Metwalli A.R., Pacak K., Pinto P.A., Schiffman M., Schmidt L.S., Vocke C.D., Wentzensen N., Worrell R., Yang H., Moncrieff M., Goparaju C., Melamed J., Pass H., Botnariuc N., Caraman I., Cernat M., Chemencedji I., Clipca A., Doruc S., Gorincioi G., Mura S., Pirtac M., Stancul I., Tcaciuc D., Albert M., Alexopoulou I., Arnaout A., Bartlett J., Engel J., Gilbert S., Parfitt J., Sekhon H., Thomas G., Rassl D.M., Rintoul R.C., Bifulco C., Tamakawa R., Urba W., Hayward N., Timmers H., Antenucci A., Facciolo F., Grazi G., Marino M., Merola R., De Krijger R., Gimenez-Roqueplo A.-P., Pich\'e A., Chevalier S., McKercher G., Birsoy K., Barnett G., Brewer C., Farver C., Naska T., Pennell N.A., Raymond D., Schilero C., Smolenski K., Williams F., Morrison C., Borgia J.A., Liptay M.J., Pool M., Seder C.W., Junker K., Omberg L., Dinkin M., Manikhas G., Alvaro D., Bragazzi M.C., Cardinale V., Carpino G., Gaudio E., Chesla D., Cottingham S., Dubina M., Moiseenko F., Dhanasekaran R., Becker K.-F., Janssen K.-P., Slotta-Huspenina J., Abdel-Rahman M.H., Aziz D., Bell S., Cebulla C.M., Davis A., Duell R., Elder J.B., Hilty J., Kumar B., Lang J., Lehman N.L., Mandt R., Nguyen P., Pilarski R., Rai K., Schoenfield L., Senecal K., Wakely P., Hansen P., Lechan R., Powers J., Tischler A., Grizzle W.E., Sexton K.C., Kastl A., Henderson J., Porten S., Waldmann J., Fassnacht M., Asa S.L., Schadendorf D., Couce M., Graefen M., Huland H., Sauter G., Schlomm T., Simon R., Tennstedt P., Olabode O., Nelson M., Bathe O., Carroll P.R., Chan J.M., Disaia P., Glenn P., Kelley R.K., Landen C.N., Phillips J., Prados M., Simko J., Smith-McCune K., VandenBerg S., Roggin K., Fehrenbach A., Kendler A., Sifri S., Steele R., Jimeno A., Carey F., Forgie I., Mannelli M., Carney M., Hernandez B., Campos B., Herold-Mende C., Jungk C., Unterberg A., Von Deimling A., Bossler A., Galbraith J., Jacobus L., Knudson M., Knutson T., Ma D., Milhem M., Sigmund R., Godwin A.K., Madan R., Rosenthal H.G., Adebamowo C., Adebamowo S.N., Boussioutas A., Beer D., Giordano T., Mes-Masson A.-M., Saad F., Bocklage T., Landrum L., Mannel R., Moore K., Moxley K., Postier R., Walker J., Zuna R., Feldman M., Valdivieso F., Dhir R., Luketich J., Pinero E.M.M., Quintero-Aguilo M., Carlotti C.G., Dos Santos J.S., Kemp R., Sankarankuty A., Tirapelli D., Catto J., Agnew K., Swisher E., Creaney J., Robinson B., Shelley C.S., Godwin E.M., Kendall S., Shipman C., Bradford C., Carey T., Haddad A., Moyer J., Peterson L., Prince M., Rozek L., Wolf G., Bowman R., Fong K.M., Yang I., Korst R., Rathmell W.K., Fantacone-Campbell J.L., Hooke J.A., Kovatich A.J., Shriver C.D., DiPersio J., Drake B., Govindan R., Heath S., Ley T., Van Tine B., Westervelt P., Rubin M.A., Lee J.I., Aredes N.D., Mariamidze A., Lazar A.J., Serody J.S., Demicco E.G., Disis M.L., Vincent B.G., Shmulevich I. The immune landscape of cancer. Immunity. 2018;48(4):812-83014. doi:10.1016/j.immuni.2018.03.023</w:t>
-      </w:r>
-    </w:p>
-    <w:p>
-      <w:pPr>
-        <w:spacing w:after="60" w:line="276" w:lineRule="auto"/>
-        <w:ind w:hanging="255" w:left="255"/>
-      </w:pPr>
-      <w:r>
-        <w:rPr>
-          <w:rFonts w:ascii="Times New Roman" w:hAnsi="Times New Roman" w:eastAsia="Times New Roman"/>
-          <w:sz w:val="22"/>
-        </w:rPr>
-        <w:t>25. Subramanian I., Verma S., Kumar S., Jere A., Anamika K. Multi-omics data integration, interpretation, and its application. Bioinformatics and Biology Insights. 2020;14:117793221989905. doi:10.1177/1177932219899051</w:t>
-      </w:r>
-    </w:p>
-    <w:p>
-      <w:pPr>
-        <w:spacing w:after="60" w:line="276" w:lineRule="auto"/>
-        <w:ind w:hanging="255" w:left="255"/>
-      </w:pPr>
-      <w:r>
-        <w:rPr>
-          <w:rFonts w:ascii="Times New Roman" w:hAnsi="Times New Roman" w:eastAsia="Times New Roman"/>
-          <w:sz w:val="22"/>
-        </w:rPr>
-        <w:t>26. Chaudhary K., Poirion O.B., Lu L., Garmire L.X. Deep learning-based multi-omics integration robustly predicts survival in liver cancer. Clinical Cancer Research. 2018;24(6):1248-1259. doi:10.1158/1078-0432.CCR-17-0853</w:t>
-      </w:r>
-    </w:p>
-    <w:p>
-      <w:pPr>
-        <w:spacing w:after="60" w:line="276" w:lineRule="auto"/>
-        <w:ind w:hanging="255" w:left="255"/>
-      </w:pPr>
-      <w:r>
-        <w:rPr>
-          <w:rFonts w:ascii="Times New Roman" w:hAnsi="Times New Roman" w:eastAsia="Times New Roman"/>
-          <w:sz w:val="22"/>
-        </w:rPr>
-        <w:t>27. Sammut S.-J., Crispin-Ortuzar M., Chin S.-F., Provenzano E., Bardwell H.A., Ma W., Cope W., Dariush A., Dawson S.-J., Abraham J.E., Dunn J., Hiller L., Thomas J., Cameron D.A., Bartlett J.M.S., Hayward L., Pharoah P.D., Markowetz F., Rueda O.M., Earl H.M., Caldas C. Multi-omic machine learning predictor of breast cancer therapy response. Nature. 2022;601(7894):623-629. doi:10.1038/s41586-021-04278-5</w:t>
-      </w:r>
-    </w:p>
-    <w:p>
-      <w:pPr>
-        <w:spacing w:after="60" w:line="276" w:lineRule="auto"/>
-        <w:ind w:hanging="255" w:left="255"/>
-      </w:pPr>
-      <w:r>
-        <w:rPr>
-          <w:rFonts w:ascii="Times New Roman" w:hAnsi="Times New Roman" w:eastAsia="Times New Roman"/>
-          <w:sz w:val="22"/>
-        </w:rPr>
-        <w:t>28. Hoadley K.A., Yau C., Hinoue T., Wolf D.M., Lazar A.J., Drill E., Shen R., Taylor A.M., Cherniack A.D., Thorsson V., Akbani R., Bowlby R., Wong C.K., Wiznerowicz M., Sanchez-Vega F., Robertson A.G., Schneider B.G., Lawrence M.S., Noushmehr H., Malta T.M., Caesar-Johnson S.J., Demchok J.A., Felau I., Kasapi M., Ferguson M.L., Hutter C.M., Sofia H.J., Tarnuzzer R., Wang Z., Yang L., Zenklusen J.C., Zhang J.J., Chudamani S., Liu J., Lolla L., Naresh R., Pihl T., Sun Q., Wan Y., Wu Y., Cho J., DeFreitas T., Frazer S., Gehlenborg N., Getz G., Heiman D.I., Kim J., Lawrence M.S., Lin P., Meier S., Noble M.S., Saksena G., Voet D., Zhang H., Bernard B., Chambwe N., Dhankani V., Knijnenburg T., Kramer R., Leinonen K., Liu Y., Miller M., Reynolds S., Shmulevich I., Thorsson V., Zhang W., Akbani R., Broom B.M., Hegde A.M., Ju Z., Kanchi R.S., Korkut A., Li J., Liang H., Ling S., Liu W., Lu Y., Mills G.B., Ng K.-S., Rao A., Ryan M., Wang J., Weinstein J.N., Zhang J., Abeshouse A., Armenia J., Chakravarty D., Chatila W.K., De Bruijn I., Gao J., Gross B.E., Heins Z.J., Kundra R., La K., Ladanyi M., Luna A., Nissan M.G., Ochoa A., Phillips S.M., Reznik E., Sanchez-Vega F., Sander C., Schultz N., Sheridan R., Sumer S.O., Sun Y., Taylor B.S., Wang J., Zhang H., Anur P., Peto M., Spellman P., Benz C., Stuart J.M., Wong C.K., Yau C., Hayes D.N., Parker J.S., Wilkerson M.D., Ally A., Balasundaram M., Bowlby R., Brooks D., Carlsen R., Chuah E., Dhalla N., Holt R., Jones S.J.M., Kasaian K., Lee D., Ma Y., Marra M.A., Mayo M., Moore R.A., Mungall A.J., Mungall K., Robertson A.G., Sadeghi S., Schein J.E., Sipahimalani P., Tam A., Thiessen N., Tse K., Wong T., Berger A.C., Beroukhim R., Cherniack A.D., Cibulskis C., Gabriel S.B., Gao G.F., Ha G., Meyerson M., Schumacher S.E., Shih J., Kucherlapati M.H., Kucherlapati R.S., Baylin S., Cope L., Danilova L., Bootwalla M.S., Lai P.H., Maglinte D.T., Van Den Berg D.J., Weisenberger D.J., Auman J.T., Balu S., Bodenheimer T., Fan C., Hoadley K.A., Hoyle A.P., Jefferys S.R., Jones C.D., Meng S., Mieczkowski P.A., Mose L.E., Perou A.H., Perou C.M., Roach J., Shi Y., Simons J.V., Skelly T., Soloway M.G., Tan D., Veluvolu U., Fan H., Hinoue T., Laird P.W., Shen H., Zhou W., Bellair M., Chang K., Covington K., Creighton C.J., Dinh H., Doddapaneni H., Donehower L.A., Drummond J., Gibbs R.A., Glenn R., Hale W., Han Y., Hu J., Korchina V., Lee S., Lewis L., Li W., Liu X., Morgan M., Morton D., Muzny D., Santibanez J., Sheth M., Shinbrot E., Wang L., Wang M., Wheeler D.A., Xi L., Zhao F., Hess J., Appelbaum E.L., Bailey M., Cordes M.G., Ding L., Fronick C.C., Fulton L.A., Fulton R.S., Kandoth C., Mardis E.R., McLellan M.D., Miller C.A., Schmidt H.K., Wilson R.K., Crain D., Curley E., Gardner J., Lau K., Mallery D., Morris S., Paulauskis J., Penny R., Shelton C., Shelton T., Sherman M., Thompson E., Yena P., Bowen J., Gastier-Foster J.M., Gerken M., Leraas K.M., Lichtenberg T.M., Ramirez N.C., Wise L., Zmuda E., Corcoran N., Costello T., Hovens C., Carvalho A.L., De Carvalho A.C., Fregnani J.H., Longatto-Filho A., Reis R.M., Scapulatempo-Neto C., Silveira H.C.S., Vidal D.O., Burnette A., Eschbacher J., Hermes B., Noss A., Singh R., Anderson M.L., Castro P.D., Ittmann M., Huntsman D., Kohl B., Le X., Thorp R., Andry C., Duffy E.R., Lyadov V., Paklina O., Setdikova G., Shabunin A., Tavobilov M., McPherson C., Warnick R., Berkowitz R., Cramer D., Feltmate C., Horowitz N., Kibel A., Muto M., Raut C.P., Malykh A., Barnholtz-Sloan J.S., Barrett W., Devine K., Fulop J., Ostrom Q.T., Shimmel K., Wolinsky Y., Sloan A.E., De Rose A., Giuliante F., Goodman M., Karlan B.Y., Hagedorn C.H., Eckman J., Harr J., Myers J., Tucker K., Zach L.A., Deyarmin B., Hu H., Kvecher L., Larson C., Mural R.J., Somiari S., Vicha A., Zelinka T., Bennett J., Iacocca M., Rabeno B., Swanson P., Latour M., Lacombe L., T\^etu B., Bergeron A., McGraw M., Staugaitis S.M., Chabot J., Hibshoosh H., Sepulveda A., Su T., Wang T., Potapova O., Voronina O., Desjardins L., Mariani O., Roman-Roman S., Sastre X., Stern M.-H., Cheng F., Signoretti S., Berchuck A., Bigner D., Lipp E., Marks J., McCall S., McLendon R., Secord A., Sharp A., Behera M., Brat D.J., Chen A., Delman K., Force S., Khuri F., Magliocca K., Maithel S., Olson J.J., Owonikoko T., Pickens A., Ramalingam S., Shin D.M., Sica G., Van Meir E.G., Zhang H., Eijckenboom W., Gillis A., Korpershoek E., Looijenga L., Oosterhuis W., Stoop H., Van Kessel K.E., Zwarthoff E.C., Calatozzolo C., Cuppini L., Cuzzubbo S., DiMeco F., Finocchiaro G., Mattei L., Perin A., Pollo B., Chen C., Houck J., Lohavanichbutr P., Hartmann A., Stoehr C., Stoehr R., Taubert H., Wach S., Wullich B., Kycler W., Murawa D., Wiznerowicz M., Chung K., Edenfield W.J., Martin J., Baudin E., Bubley G., Bueno R., De Rienzo A., Richards W.G., Kalkanis S., Mikkelsen T., Noushmehr H., Scarpace L., Girard N., Aymerich M., Campo E., Gin\'e E., Guillermo A.L., Van Bang N., Hanh P.T., Phu B.D., Tang Y., Colman H., Evason K., Dottino P.R., Martignetti J.A., Gabra H., Juhl H., Akeredolu T., Stepa S., Hoon D., Ahn K., Kang K.J., Beuschlein F., Breggia A., Birrer M., Bell D., Borad M., Bryce A.H., Castle E., Chandan V., Cheville J., Copland J.A., Farnell M., Flotte T., Giama N., Ho T., Kendrick M., Kocher J.-P., Kopp K., Moser C., Nagorney D., O'Brien D., O'Neill B.P., Patel T., Petersen G., Que F., Rivera M., Roberts L., Smallridge R., Smyrk T., Stanton M., Thompson R.H., Torbenson M., Yang J.D., Zhang L., Brimo F., Ajani J.A., Gonzalez A.M.A., Behrens C., Bondaruk O., Broaddus R., Czerniak B., Esmaeli B., Fujimoto J., Gershenwald J., Guo C., Lazar A.J., Logothetis C., Meric-Bernstam F., Moran C., Ramondetta L., Rice D., Sood A., Tamboli P., Thompson T., Troncoso P., Tsao A., Wistuba I., Carter C., Haydu L., Hersey P., Jakrot V., Kakavand H., Kefford R., Lee K., Long G., Mann G., Quinn M., Saw R., Scolyer R., Shannon K., Spillane A., Stretch J., Synott M., Thompson J., Wilmott J., Al-Ahmadie H., Chan T.A., Ghossein R., Gopalan A., Levine D.A., Reuter V., Singer S., Singh B., Tien N.V., Broudy T., Mirsaidi C., Nair P., Drwiega P., Miller J., Smith J., Zaren H., Park J.-W., Hung N.P., Kebebew E., Linehan W.M., Metwalli A.R., Pacak K., Pinto P.A., Schiffman M., Schmidt L.S., Vocke C.D., Wentzensen N., Worrell R., Yang H., Moncrieff M., Goparaju C., Melamed J., Pass H., Botnariuc N., Caraman I., Cernat M., Chemencedji I., Clipca A., Doruc S., Gorincioi G., Mura S., Pirtac M., Stancul I., Tcaciuc D., Albert M., Alexopoulou I., Arnaout A., Bartlett J., Engel J., Gilbert S., Parfitt J., Sekhon H., Thomas G., Rassl D.M., Rintoul R.C., Bifulco C., Tamakawa R., Urba W., Hayward N., Timmers H., Antenucci A., Facciolo F., Grazi G., Marino M., Merola R., De Krijger R., Gimenez-Roqueplo A.-P., Pich\'e A., Chevalier S., McKercher G., Birsoy K., Barnett G., Brewer C., Farver C., Naska T., Pennell N.A., Raymond D., Schilero C., Smolenski K., Williams F., Morrison C., Borgia J.A., Liptay M.J., Pool M., Seder C.W., Junker K., Omberg L., Dinkin M., Manikhas G., Alvaro D., Bragazzi M.C., Cardinale V., Carpino G., Gaudio E., Chesla D., Cottingham S., Dubina M., Moiseenko F., Dhanasekaran R., Becker K.-F., Janssen K.-P., Slotta-Huspenina J., Abdel-Rahman M.H., Aziz D., Bell S., Cebulla C.M., Davis A., Duell R., Elder J.B., Hilty J., Kumar B., Lang J., Lehman N.L., Mandt R., Nguyen P., Pilarski R., Rai K., Schoenfield L., Senecal K., Wakely P., Hansen P., Lechan R., Powers J., Tischler A., Grizzle W.E., Sexton K.C., Kastl A., Henderson J., Porten S., Waldmann J., Fassnacht M., Asa S.L., Schadendorf D., Couce M., Graefen M., Huland H., Sauter G., Schlomm T., Simon R., Tennstedt P., Olabode O., Nelson M., Bathe O., Carroll P.R., Chan J.M., Disaia P., Glenn P., Kelley R.K., Landen C.N., Phillips J., Prados M., Simko J., Smith-McCune K., VandenBerg S., Roggin K., Fehrenbach A., Kendler A., Sifri S., Steele R., Jimeno A., Carey F., Forgie I., Mannelli M., Carney M., Hernandez B., Campos B., Herold-Mende C., Jungk C., Unterberg A., Von Deimling A., Bossler A., Galbraith J., Jacobus L., Knudson M., Knutson T., Ma D., Milhem M., Sigmund R., Godwin A.K., Madan R., Rosenthal H.G., Adebamowo C., Adebamowo S.N., Boussioutas A., Beer D., Giordano T., Mes-Masson A.-M., Saad F., Bocklage T., Landrum L., Mannel R., Moore K., Moxley K., Postier R., Walker J., Zuna R., Feldman M., Valdivieso F., Dhir R., Luketich J., Pinero E.M.M., Quintero-Aguilo M., Carlotti C.G., Dos Santos J.S., Kemp R., Sankarankuty A., Tirapelli D., Catto J., Agnew K., Swisher E., Creaney J., Robinson B., Shelley C.S., Godwin E.M., Kendall S., Shipman C., Bradford C., Carey T., Haddad A., Moyer J., Peterson L., Prince M., Rozek L., Wolf G., Bowman R., Fong K.M., Yang I., Korst R., Rathmell W.K., Fantacone-Campbell J.L., Hooke J.A., Kovatich A.J., Shriver C.D., DiPersio J., Drake B., Govindan R., Heath S., Ley T., Van Tine B., Westervelt P., Rubin M.A., Lee J.I., Aredes N.D., Mariamidze A., Stuart J.M., Benz C.C., Laird P.W. Cell-of-origin patterns dominate the molecular classification of 10,000 tumors from 33 types of cancer. Cell. 2018;173(2):291-3046. doi:10.1016/j.cell.2018.03.022</w:t>
-      </w:r>
-    </w:p>
-    <w:p>
-      <w:pPr>
-        <w:spacing w:after="60" w:line="276" w:lineRule="auto"/>
-        <w:ind w:hanging="255" w:left="255"/>
-      </w:pPr>
-      <w:r>
-        <w:rPr>
-          <w:rFonts w:ascii="Times New Roman" w:hAnsi="Times New Roman" w:eastAsia="Times New Roman"/>
-          <w:sz w:val="22"/>
-        </w:rPr>
-        <w:t>29. The Cancer Genome Atlas Research Network. Comprehensive molecular profiling of lung adenocarcinoma. Nature. 2014;511(7511):543-550. doi:10.1038/nature13385</w:t>
-      </w:r>
-    </w:p>
-    <w:p>
-      <w:pPr>
-        <w:spacing w:after="60" w:line="276" w:lineRule="auto"/>
-        <w:ind w:hanging="255" w:left="255"/>
-      </w:pPr>
-      <w:r>
-        <w:rPr>
-          <w:rFonts w:ascii="Times New Roman" w:hAnsi="Times New Roman" w:eastAsia="Times New Roman"/>
-          <w:sz w:val="22"/>
-        </w:rPr>
-        <w:t>30. The Cancer Genome Atlas Research Network. Comprehensive genomic characterization of squamous cell lung cancers. Nature. 2012;489(7417):519-525. doi:10.1038/nature11404</w:t>
-      </w:r>
-    </w:p>
-    <w:p>
-      <w:pPr>
-        <w:spacing w:after="60" w:line="276" w:lineRule="auto"/>
-        <w:ind w:hanging="255" w:left="255"/>
-      </w:pPr>
-      <w:r>
-        <w:rPr>
-          <w:rFonts w:ascii="Times New Roman" w:hAnsi="Times New Roman" w:eastAsia="Times New Roman"/>
-          <w:sz w:val="22"/>
-        </w:rPr>
-        <w:t>31. Thorsson V., Gibbs D.L., Brown S.D., Wolf D., Bortone D.S., Ou Yang T.-H., Porta-Pardo E., Gao G.F., Plaisier C.L., Eddy J.A., Ziv E., Culhane A.C., Paull E.O., Sivakumar I.K.A., Gentles A.J., Malhotra R., Farshidfar F., Colaprico A., Parker J.S., Mose L.E., Vo N.S., Liu J., Liu Y., Rader J., Dhankani V., Reynolds S.M., Bowlby R., Califano A., Cherniack A.D., Anastassiou D., Bedognetti D., Mokrab Y., Newman A.M., Rao A., Chen K., Krasnitz A., Hu H., Malta T.M., Noushmehr H., Pedamallu C.S., Bullman S., Ojesina A.I., Lamb A., Zhou W., Shen H., Choueiri T.K., Weinstein J.N., Guinney J., Saltz J., Holt R.A., Rabkin C.S., Caesar-Johnson S.J., Demchok J.A., Felau I., Kasapi M., Ferguson M.L., Hutter C.M., Sofia H.J., Tarnuzzer R., Wang Z., Yang L., Zenklusen J.C., Zhang J.J., Chudamani S., Liu J., Lolla L., Naresh R., Pihl T., Sun Q., Wan Y., Wu Y., Cho J., DeFreitas T., Frazer S., Gehlenborg N., Getz G., Heiman D.I., Kim J., Lawrence M.S., Lin P., Meier S., Noble M.S., Saksena G., Voet D., Zhang H., Bernard B., Chambwe N., Dhankani V., Knijnenburg T., Kramer R., Leinonen K., Liu Y., Miller M., Reynolds S., Shmulevich I., Thorsson V., Zhang W., Akbani R., Broom B.M., Hegde A.M., Ju Z., Kanchi R.S., Korkut A., Li J., Liang H., Ling S., Liu W., Lu Y., Mills G.B., Ng K.-S., Rao A., Ryan M., Wang J., Weinstein J.N., Zhang J., Abeshouse A., Armenia J., Chakravarty D., Chatila W.K., De Bruijn I., Gao J., Gross B.E., Heins Z.J., Kundra R., La K., Ladanyi M., Luna A., Nissan M.G., Ochoa A., Phillips S.M., Reznik E., Sanchez-Vega F., Sander C., Schultz N., Sheridan R., Sumer S.O., Sun Y., Taylor B.S., Wang J., Zhang H., Anur P., Peto M., Spellman P., Benz C., Stuart J.M., Wong C.K., Yau C., Hayes D.N., Parker J.S., Wilkerson M.D., Ally A., Balasundaram M., Bowlby R., Brooks D., Carlsen R., Chuah E., Dhalla N., Holt R., Jones S.J.M., Kasaian K., Lee D., Ma Y., Marra M.A., Mayo M., Moore R.A., Mungall A.J., Mungall K., Robertson A.G., Sadeghi S., Schein J.E., Sipahimalani P., Tam A., Thiessen N., Tse K., Wong T., Berger A.C., Beroukhim R., Cherniack A.D., Cibulskis C., Gabriel S.B., Gao G.F., Ha G., Meyerson M., Schumacher S.E., Shih J., Kucherlapati M.H., Kucherlapati R.S., Baylin S., Cope L., Danilova L., Bootwalla M.S., Lai P.H., Maglinte D.T., Van Den Berg D.J., Weisenberger D.J., Auman J.T., Balu S., Bodenheimer T., Fan C., Hoadley K.A., Hoyle A.P., Jefferys S.R., Jones C.D., Meng S., Mieczkowski P.A., Mose L.E., Perou A.H., Perou C.M., Roach J., Shi Y., Simons J.V., Skelly T., Soloway M.G., Tan D., Veluvolu U., Fan H., Hinoue T., Laird P.W., Shen H., Zhou W., Bellair M., Chang K., Covington K., Creighton C.J., Dinh H., Doddapaneni H., Donehower L.A., Drummond J., Gibbs R.A., Glenn R., Hale W., Han Y., Hu J., Korchina V., Lee S., Lewis L., Li W., Liu X., Morgan M., Morton D., Muzny D., Santibanez J., Sheth M., Shinbrot E., Wang L., Wang M., Wheeler D.A., Xi L., Zhao F., Hess J., Appelbaum E.L., Bailey M., Cordes M.G., Ding L., Fronick C.C., Fulton L.A., Fulton R.S., Kandoth C., Mardis E.R., McLellan M.D., Miller C.A., Schmidt H.K., Wilson R.K., Crain D., Curley E., Gardner J., Lau K., Mallery D., Morris S., Paulauskis J., Penny R., Shelton C., Shelton T., Sherman M., Thompson E., Yena P., Bowen J., Gastier-Foster J.M., Gerken M., Leraas K.M., Lichtenberg T.M., Ramirez N.C., Wise L., Zmuda E., Corcoran N., Costello T., Hovens C., Carvalho A.L., De Carvalho A.C., Fregnani J.H., Longatto-Filho A., Reis R.M., Scapulatempo-Neto C., Silveira H.C.S., Vidal D.O., Burnette A., Eschbacher J., Hermes B., Noss A., Singh R., Anderson M.L., Castro P.D., Ittmann M., Huntsman D., Kohl B., Le X., Thorp R., Andry C., Duffy E.R., Lyadov V., Paklina O., Setdikova G., Shabunin A., Tavobilov M., McPherson C., Warnick R., Berkowitz R., Cramer D., Feltmate C., Horowitz N., Kibel A., Muto M., Raut C.P., Malykh A., Barnholtz-Sloan J.S., Barrett W., Devine K., Fulop J., Ostrom Q.T., Shimmel K., Wolinsky Y., Sloan A.E., De Rose A., Giuliante F., Goodman M., Karlan B.Y., Hagedorn C.H., Eckman J., Harr J., Myers J., Tucker K., Zach L.A., Deyarmin B., Hu H., Kvecher L., Larson C., Mural R.J., Somiari S., Vicha A., Zelinka T., Bennett J., Iacocca M., Rabeno B., Swanson P., Latour M., Lacombe L., T\^etu B., Bergeron A., McGraw M., Staugaitis S.M., Chabot J., Hibshoosh H., Sepulveda A., Su T., Wang T., Potapova O., Voronina O., Desjardins L., Mariani O., Roman-Roman S., Sastre X., Stern M.-H., Cheng F., Signoretti S., Berchuck A., Bigner D., Lipp E., Marks J., McCall S., McLendon R., Secord A., Sharp A., Behera M., Brat D.J., Chen A., Delman K., Force S., Khuri F., Magliocca K., Maithel S., Olson J.J., Owonikoko T., Pickens A., Ramalingam S., Shin D.M., Sica G., Van Meir E.G., Zhang H., Eijckenboom W., Gillis A., Korpershoek E., Looijenga L., Oosterhuis W., Stoop H., Van Kessel K.E., Zwarthoff E.C., Calatozzolo C., Cuppini L., Cuzzubbo S., DiMeco F., Finocchiaro G., Mattei L., Perin A., Pollo B., Chen C., Houck J., Lohavanichbutr P., Hartmann A., Stoehr C., Stoehr R., Taubert H., Wach S., Wullich B., Kycler W., Murawa D., Wiznerowicz M., Chung K., Edenfield W.J., Martin J., Baudin E., Bubley G., Bueno R., De Rienzo A., Richards W.G., Kalkanis S., Mikkelsen T., Noushmehr H., Scarpace L., Girard N., Aymerich M., Campo E., Gin\'e E., Guillermo A.L., Van Bang N., Hanh P.T., Phu B.D., Tang Y., Colman H., Evason K., Dottino P.R., Martignetti J.A., Gabra H., Juhl H., Akeredolu T., Stepa S., Hoon D., Ahn K., Kang K.J., Beuschlein F., Breggia A., Birrer M., Bell D., Borad M., Bryce A.H., Castle E., Chandan V., Cheville J., Copland J.A., Farnell M., Flotte T., Giama N., Ho T., Kendrick M., Kocher J.-P., Kopp K., Moser C., Nagorney D., O'Brien D., O'Neill B.P., Patel T., Petersen G., Que F., Rivera M., Roberts L., Smallridge R., Smyrk T., Stanton M., Thompson R.H., Torbenson M., Yang J.D., Zhang L., Brimo F., Ajani J.A., Gonzalez A.M.A., Behrens C., Bondaruk J., Broaddus R., Czerniak B., Esmaeli B., Fujimoto J., Gershenwald J., Guo C., Lazar A.J., Logothetis C., Meric-Bernstam F., Moran C., Ramondetta L., Rice D., Sood A., Tamboli P., Thompson T., Troncoso P., Tsao A., Wistuba I., Carter C., Haydu L., Hersey P., Jakrot V., Kakavand H., Kefford R., Lee K., Long G., Mann G., Quinn M., Saw R., Scolyer R., Shannon K., Spillane A., Stretch O., Synott M., Thompson J., Wilmott J., Al-Ahmadie H., Chan T.A., Ghossein R., Gopalan A., Levine D.A., Reuter V., Singer S., Singh B., Tien N.V., Broudy T., Mirsaidi C., Nair P., Drwiega P., Miller J., Smith J., Zaren H., Park J.-W., Hung N.P., Kebebew E., Linehan W.M., Metwalli A.R., Pacak K., Pinto P.A., Schiffman M., Schmidt L.S., Vocke C.D., Wentzensen N., Worrell R., Yang H., Moncrieff M., Goparaju C., Melamed J., Pass H., Botnariuc N., Caraman I., Cernat M., Chemencedji I., Clipca A., Doruc S., Gorincioi G., Mura S., Pirtac M., Stancul I., Tcaciuc D., Albert M., Alexopoulou I., Arnaout A., Bartlett J., Engel J., Gilbert S., Parfitt J., Sekhon H., Thomas G., Rassl D.M., Rintoul R.C., Bifulco C., Tamakawa R., Urba W., Hayward N., Timmers H., Antenucci A., Facciolo F., Grazi G., Marino M., Merola R., De Krijger R., Gimenez-Roqueplo A.-P., Pich\'e A., Chevalier S., McKercher G., Birsoy K., Barnett G., Brewer C., Farver C., Naska T., Pennell N.A., Raymond D., Schilero C., Smolenski K., Williams F., Morrison C., Borgia J.A., Liptay M.J., Pool M., Seder C.W., Junker K., Omberg L., Dinkin M., Manikhas G., Alvaro D., Bragazzi M.C., Cardinale V., Carpino G., Gaudio E., Chesla D., Cottingham S., Dubina M., Moiseenko F., Dhanasekaran R., Becker K.-F., Janssen K.-P., Slotta-Huspenina J., Abdel-Rahman M.H., Aziz D., Bell S., Cebulla C.M., Davis A., Duell R., Elder J.B., Hilty J., Kumar B., Lang J., Lehman N.L., Mandt R., Nguyen P., Pilarski R., Rai K., Schoenfield L., Senecal K., Wakely P., Hansen P., Lechan R., Powers J., Tischler A., Grizzle W.E., Sexton K.C., Kastl A., Henderson J., Porten S., Waldmann J., Fassnacht M., Asa S.L., Schadendorf D., Couce M., Graefen M., Huland H., Sauter G., Schlomm T., Simon R., Tennstedt P., Olabode O., Nelson M., Bathe O., Carroll P.R., Chan J.M., Disaia P., Glenn P., Kelley R.K., Landen C.N., Phillips J., Prados M., Simko J., Smith-McCune K., VandenBerg S., Roggin K., Fehrenbach A., Kendler A., Sifri S., Steele R., Jimeno A., Carey F., Forgie I., Mannelli M., Carney M., Hernandez B., Campos B., Herold-Mende C., Jungk C., Unterberg A., Von Deimling A., Bossler A., Galbraith J., Jacobus L., Knudson M., Knutson T., Ma D., Milhem M., Sigmund R., Godwin A.K., Madan R., Rosenthal H.G., Adebamowo C., Adebamowo S.N., Boussioutas A., Beer D., Giordano T., Mes-Masson A.-M., Saad F., Bocklage T., Landrum L., Mannel R., Moore K., Moxley K., Postier R., Walker J., Zuna R., Feldman M., Valdivieso F., Dhir R., Luketich J., Pinero E.M.M., Quintero-Aguilo M., Carlotti C.G., Dos Santos J.S., Kemp R., Sankarankuty A., Tirapelli D., Catto J., Agnew K., Swisher E., Creaney J., Robinson B., Shelley C.S., Godwin E.M., Kendall S., Shipman C., Bradford C., Carey T., Haddad A., Moyer J., Peterson L., Prince M., Rozek L., Wolf G., Bowman R., Fong K.M., Yang I., Korst R., Rathmell W.K., Fantacone-Campbell J.L., Hooke J.A., Kovatich A.J., Shriver C.D., DiPersio J., Drake B., Govindan R., Heath S., Ley T., Van Tine B., Westervelt P., Rubin M.A., Lee J.I., Aredes N.D., Mariamidze A., Lazar A.J., Serody J.S., Demicco E.G., Disis M.L., Vincent B.G., Shmulevich I. The immune landscape of cancer. Immunity. 2018;48(4):812-83014. doi:10.1016/j.immuni.2018.03.023</w:t>
-      </w:r>
-    </w:p>
-    <w:p>
-      <w:pPr>
-        <w:spacing w:after="60" w:line="276" w:lineRule="auto"/>
-        <w:ind w:hanging="255" w:left="255"/>
-      </w:pPr>
-      <w:r>
-        <w:rPr>
-          <w:rFonts w:ascii="Times New Roman" w:hAnsi="Times New Roman" w:eastAsia="Times New Roman"/>
-          <w:sz w:val="22"/>
-        </w:rPr>
-        <w:t>32. Zhang L., Li Z., Skrzypczynska K.M., Fang Q., Zhang W., O'Brien S.A., He Y., Wang L., Zhang Q., Kim A., Gao R., Orf J., Wang T., Sawant D., Kang J., Bhatt D., Lu D., Li C.-M., Rapaport A.S., Perez K., Ye Y., Wang S., Hu X., Ren X., Ouyang W., Shen Z., Egen J.G., Zhang Z., Yu X. Single-cell analyses inform mechanisms of myeloid-targeted therapies in colon cancer. Cell. 2020;181(2):442-45929. doi:10.1016/j.cell.2020.03.048</w:t>
-      </w:r>
-    </w:p>
-    <w:p>
-      <w:pPr>
-        <w:spacing w:after="60" w:line="276" w:lineRule="auto"/>
-        <w:ind w:hanging="255" w:left="255"/>
-      </w:pPr>
-      <w:r>
-        <w:rPr>
-          <w:rFonts w:ascii="Times New Roman" w:hAnsi="Times New Roman" w:eastAsia="Times New Roman"/>
-          <w:sz w:val="22"/>
-        </w:rPr>
-        <w:t>33. Davey Smith G., Ebrahim S. `mendelian randomization': Can genetic epidemiology contribute to understanding environmental determinants of disease?*. International Journal of Epidemiology. 2003;32(1):1-22. doi:10.1093/ije/dyg070</w:t>
-      </w:r>
-    </w:p>
-    <w:p>
-      <w:pPr>
-        <w:spacing w:after="60" w:line="276" w:lineRule="auto"/>
-        <w:ind w:hanging="255" w:left="255"/>
-      </w:pPr>
-      <w:r>
-        <w:rPr>
-          <w:rFonts w:ascii="Times New Roman" w:hAnsi="Times New Roman" w:eastAsia="Times New Roman"/>
-          <w:sz w:val="22"/>
-        </w:rPr>
-        <w:t>34. Hagberg A., Swart P., Chult D. Exploring network structure, dynamics, and function using NetworkX. Proceedings of the 7th Python in Science Conference. 2008. doi:10.25080/TCWV9851</w:t>
-      </w:r>
-    </w:p>
-    <w:p>
-      <w:pPr>
-        <w:spacing w:after="60" w:line="276" w:lineRule="auto"/>
-        <w:ind w:hanging="255" w:left="255"/>
-      </w:pPr>
-      <w:r>
-        <w:rPr>
-          <w:rFonts w:ascii="Times New Roman" w:hAnsi="Times New Roman" w:eastAsia="Times New Roman"/>
-          <w:sz w:val="22"/>
-        </w:rPr>
-        <w:t>35. V\ osa U., Claringbould A., Westra H.-J., Bonder M.J., Deelen P., Zeng B., Kirsten H., Saha A., Kreuzhuber R., Yazar S., Brugge H., Oelen R., De Vries D.H., Van Der Wijst M.G.P., Kasela S., Pervjakova N., Alves I., Fav\'e M.-J., Agbessi M., Christiansen M.W., Jansen R., Seppala I., Tong L., Teumer A., Schramm K., Hemani G., Verlouw J., Yaghootkar H., Sonmez Flitman R., Brown A., Kukushkina V., Kalnapenkis A., Rueger S., Porcu E., Kronberg J., Kettunen J., Lee B., Zhang F., Qi T., Hernandez J.A., Arindrarto W., Beutner F., BIOS Consortium, 'T Hoen P.A.C., Van Meurs J., Van Dongen J., Van Iterson M., Swertz M.A., i2QTL Consortium, Jan Bonder M., Dmitrieva J., Elansary M., Fairfax B.P., Georges M., Heijmans B.T., Hewitt A.W., Kahonen M., Kim Y., Knight J.C., Kovacs P., Krohn K., Li S., Loeffler M., Marigorta U.M., Mei H., Momozawa Y., Muller-Nurasyid M., Nauck M., Nivard M.G., Penninx B.W.J.H., Pritchard J.K., Raitakari O.T., Rotzschke O., Slagboom E.P., Stehouwer C.D.A., Stumvoll M., Sullivan P., 'T Hoen P.A.C., Thiery J., Tonjes A., Van Dongen J., Van Iterson M., Veldink J.H., Volker U., Warmerdam R., Wijmenga C., Swertz M., Andiappan A., Montgomery G.W., Ripatti S., Perola M., Kutalik Z., Dermitzakis E., Bergmann S., Frayling T., Van Meurs J., Prokisch H., Ahsan H., Pierce B.L., Lehtimaki T., Boomsma D.I., Psaty B.M., Gharib S.A., Awadalla P., Milani L., Ouwehand W.H., Downes K., Stegle O., Battle A., Visscher P.M., Yang J., Scholz M., Powell J., Gibson G., Esko T., Franke L. Large-scale cis- and trans-eQTL analyses identify thousands of genetic loci and polygenic scores that regulate blood gene expression. Nature Genetics. 2021;53(9):1300-1310. doi:10.1038/s41588-021-00913-z</w:t>
-      </w:r>
-    </w:p>
-    <w:p>
-      <w:pPr>
-        <w:spacing w:after="60" w:line="276" w:lineRule="auto"/>
-        <w:ind w:hanging="255" w:left="255"/>
-      </w:pPr>
-      <w:r>
-        <w:rPr>
-          <w:rFonts w:ascii="Times New Roman" w:hAnsi="Times New Roman" w:eastAsia="Times New Roman"/>
-          <w:sz w:val="22"/>
-        </w:rPr>
-        <w:t>36. Zhu Z., Zhang F., Hu H., Bakshi A., Robinson M.R., Powell J.E., Montgomery G.W., Goddard M.E., Wray N.R., Visscher P.M., Yang J. Integration of summary data from GWAS and eQTL studies predicts complex trait gene targets. Nature Genetics. 2016;48(5):481-487. doi:10.1038/ng.3538</w:t>
-      </w:r>
-    </w:p>
-    <w:p>
-      <w:pPr>
-        <w:spacing w:after="60" w:line="276" w:lineRule="auto"/>
-        <w:ind w:hanging="255" w:left="255"/>
-      </w:pPr>
-      <w:r>
-        <w:rPr>
-          <w:rFonts w:ascii="Times New Roman" w:hAnsi="Times New Roman" w:eastAsia="Times New Roman"/>
-          <w:sz w:val="22"/>
-        </w:rPr>
-        <w:t>37. McKinney W. Data structures for statistical computing in python. SciPy 2010. 2010. doi:10.25080/Majora-92bf1922-00a</w:t>
-      </w:r>
-    </w:p>
-    <w:p>
-      <w:pPr>
-        <w:spacing w:after="60" w:line="276" w:lineRule="auto"/>
-        <w:ind w:hanging="255" w:left="255"/>
-      </w:pPr>
-      <w:r>
-        <w:rPr>
-          <w:rFonts w:ascii="Times New Roman" w:hAnsi="Times New Roman" w:eastAsia="Times New Roman"/>
-          <w:sz w:val="22"/>
-        </w:rPr>
-        <w:t>38. Harris C.R., Millman K.J., van der Walt S.J., Gommers R., Virtanen P., Cournapeau D., Wieser E., Taylor J., Berg S., Smith N.J., Kern R., Picus M., Hoyer S., van Kerkwijk M.H., Brett M., Haldane A., del Rio J.F., Wiebe M., Peterson P., G\'erard-Marchant P., Sheppard K., Reddy T., Weckesser W., Abbasi H., Gohlke C., Oliphant T.E. Array programming with NumPy. Nature. 2020;585(7825):357-362. doi:10.1038/s41586-020-2649-2</w:t>
-      </w:r>
-    </w:p>
-    <w:p>
-      <w:pPr>
-        <w:spacing w:after="60" w:line="276" w:lineRule="auto"/>
-        <w:ind w:hanging="255" w:left="255"/>
-      </w:pPr>
-      <w:r>
-        <w:rPr>
-          <w:rFonts w:ascii="Times New Roman" w:hAnsi="Times New Roman" w:eastAsia="Times New Roman"/>
-          <w:sz w:val="22"/>
-        </w:rPr>
-        <w:t>39. Virtanen P., Gommers R., Oliphant T.E., Haberland M., Reddy T., Cournapeau D., Burovski E., Peterson P., Weckesser W., Bright J., Van Der Walt S.J., Brett M., Wilson J., Millman K.J., Mayorov N., Nelson A.R.J., Jones E., Kern R., Larson E., Carey C.J., Polat \. I., Feng Y., Moore E.W., VanderPlas J., Laxalde D., Perktold J., Cimrman R., Henriksen I., Quintero E.A., Harris C.R., Archibald A.M., Ribeiro A.H., Pedregosa F., Van Mulbregt P., SciPy 1.0 Contributors, Vijaykumar A., Bardelli A.P., Rothberg A., Hilboll A., Kloeckner A., Scopatz A., Lee A., Rokem A., Woods C.N., Fulton C., Masson C., Haggstrom C., Fitzgerald C., Nicholson D.A., Hagen D.R., Pasechnik D.V., Olivetti E., Martin E., Wieser E., Silva F., Lenders F., Wilhelm F., Young G., Price G.A., Ingold G.-L., Allen G.E., Lee G.R., Audren H., Probst I., Dietrich J.P., Silterra J., Webber J.T., Slavi c J., Nothman J., Buchner J., Kulick J., Schonberger J.L., De Miranda Cardoso J.V., Reimer J., Harrington J., Rodriguez J.L.C., Nunez-Iglesias J., Kuczynski J., Tritz K., Thoma M., Newville M., Kummerer M., Bolingbroke M., Tartre M., Pak M., Smith N.J., Nowaczyk N., Shebanov N., Pavlyk O., Brodtkorb P.A., Lee P., McGibbon R.T., Feldbauer R., Lewis S., Tygier S., Sievert S., Vigna S., Peterson S., More S., Pudlik T., Oshima T., Pingel T.J., Robitaille T.P., Spura T., Jones T.R., Cera T., Leslie T., Zito T., Krauss T., Upadhyay U., Halchenko Y.O., V\'azquez-Baeza Y. SciPy 1.0: Fundamental algorithms for scientific computing in python. Nature Methods. 2020;17(3):261-272. doi:10.1038/s41592-019-0686-2</w:t>
-      </w:r>
-    </w:p>
-    <w:p>
-      <w:pPr>
-        <w:spacing w:after="60" w:line="276" w:lineRule="auto"/>
-        <w:ind w:hanging="255" w:left="255"/>
-      </w:pPr>
-      <w:r>
-        <w:rPr>
-          <w:rFonts w:ascii="Times New Roman" w:hAnsi="Times New Roman" w:eastAsia="Times New Roman"/>
-          <w:sz w:val="22"/>
-        </w:rPr>
-        <w:t>40. Hunter J.D. Matplotlib: A 2D graphics environment. Computing in Science \&amp; Engineering. 2007;9(3):90-95. doi:10.1109/MCSE.2007.55</w:t>
-      </w:r>
-    </w:p>
-    <w:p>
-      <w:pPr>
-        <w:spacing w:after="60" w:line="276" w:lineRule="auto"/>
-        <w:ind w:hanging="255" w:left="255"/>
-      </w:pPr>
-      <w:r>
-        <w:rPr>
-          <w:rFonts w:ascii="Times New Roman" w:hAnsi="Times New Roman" w:eastAsia="Times New Roman"/>
-          <w:sz w:val="22"/>
-        </w:rPr>
-        <w:t>41. Waskom M. Seaborn: Statistical data visualization. Journal of Open Source Software. 2021;6(60):3021. doi:10.21105/joss.03021</w:t>
-      </w:r>
-    </w:p>
-    <w:p>
-      <w:pPr>
-        <w:spacing w:after="60" w:line="276" w:lineRule="auto"/>
-        <w:ind w:hanging="255" w:left="255"/>
-      </w:pPr>
-      <w:r>
-        <w:rPr>
-          <w:rFonts w:ascii="Times New Roman" w:hAnsi="Times New Roman" w:eastAsia="Times New Roman"/>
-          <w:sz w:val="22"/>
-        </w:rPr>
-        <w:t>42. Pedregosa F., Varoquaux G., Gramfort A., Michel V., Thirion B., Grisel O., Blondel M., Prettenhofer P., Weiss R., Dubourg V., Vanderplas J., Passos A., Cournapeau D., Brucher M., Perrot M., Duchesnay \'E. Scikit-learn: Machine learning in python. J. Mach. Learn. Res. 2011;12(null):2825-2830.</w:t>
-      </w:r>
-    </w:p>
-    <w:p>
-      <w:pPr>
-        <w:spacing w:after="60" w:line="276" w:lineRule="auto"/>
-        <w:ind w:hanging="255" w:left="255"/>
-      </w:pPr>
-      <w:r>
-        <w:rPr>
-          <w:rFonts w:ascii="Times New Roman" w:hAnsi="Times New Roman" w:eastAsia="Times New Roman"/>
-          <w:sz w:val="22"/>
-        </w:rPr>
-        <w:t>43. Tang Z., Kang B., Li C., Chen T., Zhang Z. GEPIA2: An enhanced web server for large-scale expression profiling and interactive analysis. Nucleic Acids Research. 2019;47(W1):556-560. doi:10.1093/nar/gkz430</w:t>
-      </w:r>
-    </w:p>
-    <w:p>
-      <w:pPr>
-        <w:spacing w:after="60" w:line="276" w:lineRule="auto"/>
-        <w:ind w:hanging="255" w:left="255"/>
-      </w:pPr>
-      <w:r>
-        <w:rPr>
-          <w:rFonts w:ascii="Times New Roman" w:hAnsi="Times New Roman" w:eastAsia="Times New Roman"/>
-          <w:sz w:val="22"/>
-        </w:rPr>
-        <w:t>44. Hemani G., Zheng J., Elsworth B., Wade K.H., Haberland V., Baird D., Laurin C., Burgess S., Bowden J., Langdon R., Tan V.Y., Yarmolinsky J., Shihab H.A., Timpson N.J., Evans D.M., Relton C., Martin R.M., Davey Smith G., Gaunt T.R., Haycock P.C. The MR-base platform supports systematic causal inference across the human phenome. eLife. 2018;7:34408. doi:10.7554/eLife.34408</w:t>
-      </w:r>
-    </w:p>
-    <w:p>
-      <w:pPr>
-        <w:spacing w:after="60" w:line="276" w:lineRule="auto"/>
-        <w:ind w:hanging="255" w:left="255"/>
-      </w:pPr>
-      <w:r>
-        <w:rPr>
-          <w:rFonts w:ascii="Times New Roman" w:hAnsi="Times New Roman" w:eastAsia="Times New Roman"/>
-          <w:sz w:val="22"/>
-        </w:rPr>
-        <w:t>45. Pan L., Luo J., Nie C., Fan S., Wang X., Peng S., Liang Q. A deep learning framework integrating tumor microenvironmental features accurately predicts multiple driver gene mutations in lung cancer pathology images. Cancer Research. 2025. doi:10.1158/0008-5472.CAN-25-0582</w:t>
-      </w:r>
-    </w:p>
-    <w:p>
-      <w:pPr>
-        <w:spacing w:after="60" w:line="276" w:lineRule="auto"/>
-        <w:ind w:hanging="255" w:left="255"/>
-      </w:pPr>
-      <w:r>
-        <w:rPr>
-          <w:rFonts w:ascii="Times New Roman" w:hAnsi="Times New Roman" w:eastAsia="Times New Roman"/>
-          <w:sz w:val="22"/>
-        </w:rPr>
-        <w:t>46. Xu H., Wang S., Fang M., Luo S., Chen C., Wan S., Wang R., Tang M., Xue T., Li B., Lin J., Qu K. SPACEL: Deep learning-based characterization of spatial transcriptome architectures. Nature Communications. 2023;14(1):7603. doi:10.1038/s41467-023-43220-3</w:t>
-      </w:r>
-    </w:p>
-    <w:p>
-      <w:pPr>
-        <w:spacing w:after="60" w:line="276" w:lineRule="auto"/>
-        <w:ind w:hanging="255" w:left="255"/>
-      </w:pPr>
-      <w:r>
-        <w:rPr>
-          <w:rFonts w:ascii="Times New Roman" w:hAnsi="Times New Roman" w:eastAsia="Times New Roman"/>
-          <w:sz w:val="22"/>
-        </w:rPr>
-        <w:t>47. Ravi V.M., Will P., Kueckelhaus J., Sun N., Joseph K., Sali\'e H., Vollmer L., Kuliesiute U., von Ehr J., Benotmane J.K., Neidert N., Follo M., Scherer F., Goeldner J.M., Behringer S.P., Franco P., Khiat M., Zhang J., Hofmann U.G., Fung C., Ricklefs F.L., Lamszus K., Boerries M., Ku M., Beck J., Sankowski R., Schwabenland M., Prinz M., Schuller U., Killmer S., Bengsch B., Walch A.K., Delev D., Schnell O., Heiland D.H. Spatially resolved multi-omics deciphers bidirectional tumor-host interdependence in glioblastoma. Cancer Cell. 2022;40(6):639-65513. doi:10.1016/j.ccell.2022.05.009</w:t>
-      </w:r>
-    </w:p>
-    <w:p>
-      <w:pPr>
-        <w:spacing w:after="60" w:line="276" w:lineRule="auto"/>
-        <w:ind w:hanging="255" w:left="255"/>
-      </w:pPr>
-      <w:r>
-        <w:rPr>
-          <w:rFonts w:ascii="Times New Roman" w:hAnsi="Times New Roman" w:eastAsia="Times New Roman"/>
-          <w:sz w:val="22"/>
-        </w:rPr>
-        <w:t>48. Li Q., Zhang X., Ke R. doi:10.3389/fgene.2022.906158</w:t>
-      </w:r>
-    </w:p>
-    <w:p>
-      <w:pPr>
-        <w:spacing w:after="60" w:line="276" w:lineRule="auto"/>
-        <w:ind w:hanging="255" w:left="255"/>
-      </w:pPr>
-      <w:r>
-        <w:rPr>
-          <w:rFonts w:ascii="Times New Roman" w:hAnsi="Times New Roman" w:eastAsia="Times New Roman"/>
-          <w:sz w:val="22"/>
-        </w:rPr>
-        <w:t>49. Petitprez F., De Reyni\`es A., Keung E.Z., Chen T.W.-W., Sun C.-M., Calderaro J., Jeng Y.-M., Hsiao L.-P., Lacroix L., Bougouin A., Moreira M., Lacroix G., Natario I., Adam J., Lucchesi C., Laizet Y., Toulmonde M., Burgess M.A., Bolejack V., Reinke D., Wani K.M., Wang W.-L., Lazar A.J., Roland C.L., Wargo J.A., Italiano A., Saut\`es-Fridman C., Tawbi H.A., Fridman W.H. B cells are associated with survival and immunotherapy response in sarcoma. Nature. 2020;577(7791):556-560. doi:10.1038/s41586-019-1906-8</w:t>
-      </w:r>
-    </w:p>
-    <w:p>
-      <w:pPr>
-        <w:spacing w:after="60" w:line="276" w:lineRule="auto"/>
-        <w:ind w:hanging="255" w:left="255"/>
-      </w:pPr>
-      <w:r>
-        <w:rPr>
-          <w:rFonts w:ascii="Times New Roman" w:hAnsi="Times New Roman" w:eastAsia="Times New Roman"/>
-          <w:sz w:val="22"/>
-        </w:rPr>
-        <w:t>50. Helmink B.A., Reddy S.M., Gao J., Zhang S., Basar R., Thakur R., Yizhak K., Sade-Feldman M., Blando J., Han G., Gopalakrishnan V., Xi Y., Zhao H., Amaria R.N., Tawbi H.A., Cogdill A.P., Liu W., LeBleu V.S., Kugeratski F.G., Patel S., Davies M.A., Hwu P., Lee J.E., Gershenwald J.E., Lucci A., Arora R., Woodman S., Keung E.Z., Gaudreau P.-O., Reuben A., Spencer C.N., Burton E.M., Haydu L.E., Lazar A.J., Zapassodi R., Hudgens C.W., Ledesma D.A., Ong S., Bailey M., Warren S., Rao D., Krijgsman O., Rozeman E.A., Peeper D., Blank C.U., Schumacher T.N., Butterfield L.H., Zelazowska M.A., McBride K.M., Kalluri R., Allison J., Petitprez F., Fridman W.H., Saut\`es-Fridman C., Hacohen N., Rezvani K., Sharma P., Tetzlaff M.T., Wang L., Wargo J.A. B cells and tertiary lymphoid structures promote immunotherapy response. Nature. 2020;577(7791):549-555. doi:10.1038/s41586-019-1922-8</w:t>
-      </w:r>
-    </w:p>
-    <w:p>
-      <w:pPr>
-        <w:spacing w:after="60" w:line="276" w:lineRule="auto"/>
-        <w:ind w:hanging="255" w:left="255"/>
-      </w:pPr>
-      <w:r>
-        <w:rPr>
-          <w:rFonts w:ascii="Times New Roman" w:hAnsi="Times New Roman" w:eastAsia="Times New Roman"/>
-          <w:sz w:val="22"/>
-        </w:rPr>
-        <w:t>51. Rakaee M., Tafavvoghi M., Ricciuti B., Alessi J.V., Cortellini A., Citarella F., Nibid L., Perrone G., Adib E., Fulgenzi C.A.M., Hidalgo Filho C.M., Di Federico A., Jabar F., Hashemi S., Houda I., Richardsen E., Rasmussen Busund L.-T., Donnem T., Bahce I., Pinato D.J., Helland., Sholl L.M., Awad M.M., Kwiatkowski D.J. Deep learning model for predicting immunotherapy response in advanced non-small cell lung cancer. JAMA oncology. 2025;11(2):109-118. doi:10.1001/jamaoncol.2024.5356</w:t>
-      </w:r>
-    </w:p>
-    <w:p>
-      <w:pPr>
-        <w:spacing w:after="60" w:line="276" w:lineRule="auto"/>
-        <w:ind w:hanging="255" w:left="255"/>
-      </w:pPr>
-      <w:r>
-        <w:rPr>
-          <w:rFonts w:ascii="Times New Roman" w:hAnsi="Times New Roman" w:eastAsia="Times New Roman"/>
-          <w:sz w:val="22"/>
-        </w:rPr>
-        <w:t>52. Barrett T., Wilhite S.E., Ledoux P., Evangelista C., Kim I.F., Tomashevsky M., Marshall K.A., Phillippy K.H., Sherman P.M., Holko M., Yefanov A., Lee H., Zhang N., Robertson C.L., Serova N., Davis S., Soboleva A. NCBI GEO: Archive for functional genomics data sets-update. Nucleic Acids Research. 2012;41(D1):991-995. doi:10.1093/nar/gks1193</w:t>
-      </w:r>
-    </w:p>
-    <w:p>
-      <w:pPr>
-        <w:spacing w:after="60" w:line="276" w:lineRule="auto"/>
-        <w:ind w:hanging="255" w:left="255"/>
-      </w:pPr>
-      <w:r>
-        <w:rPr>
-          <w:rFonts w:ascii="Times New Roman" w:hAnsi="Times New Roman" w:eastAsia="Times New Roman"/>
-          <w:sz w:val="22"/>
-        </w:rPr>
-        <w:t>53. Uhlen M., Zhang C., Lee S., Sjostedt E., Fagerberg L., Bidkhori G., Benfeitas R., Arif M., Liu Z., Edfors F., Sanli K., Von Feilitzen K., Oksvold P., Lundberg E., Hober S., Nilsson P., Mattsson J., Schwenk J.M., Brunnstrom H., Glimelius B., Sjoblom T., Edqvist P.-H., Djureinovic D., Micke P., Lindskog C., Mardinoglu A., Ponten F. A pathology atlas of the human cancer transcriptome. Science. 2017;357(6352):2507. doi:10.1126/science.aan2507</w:t>
+          <w:sz w:val="18"/>
+        </w:rPr>
+        <w:t>[1] Sung, H., Ferlay, J., Siegel, R.L., Laversanne, M., Soerjomataram, I., Jemal, A., Bray, F.: Global cancer statistics 2020: GLOBOCAN estimates of incidence and mortality worldwide for 36 cancers in 185 countries. CA: A Cancer Journal for Clinicians 71(3), 209–249 (2021). https://doi.org/10.3322/caac.21660</w:t>
+      </w:r>
+    </w:p>
+    <w:p>
+      <w:pPr>
+        <w:spacing w:after="60"/>
+        <w:ind w:left="312" w:hanging="312"/>
+      </w:pPr>
+      <w:r>
+        <w:rPr>
+          <w:rFonts w:ascii="Times New Roman" w:hAnsi="Times New Roman" w:eastAsia="Times New Roman"/>
+          <w:b w:val="0"/>
+          <w:i w:val="0"/>
+          <w:sz w:val="18"/>
+        </w:rPr>
+        <w:t>[2] Chen, Z., Fillmore, C.M., Hammerman, P.S., Kim, C.F., Wong, K.-K.: Non-small-cell lung cancers: A heterogeneous set of diseases. Nature Reviews Cancer 14(8), 535–546 (2014). https://doi.org/10.1038/nrc3775</w:t>
+      </w:r>
+    </w:p>
+    <w:p>
+      <w:pPr>
+        <w:spacing w:after="60"/>
+        <w:ind w:left="312" w:hanging="312"/>
+      </w:pPr>
+      <w:r>
+        <w:rPr>
+          <w:rFonts w:ascii="Times New Roman" w:hAnsi="Times New Roman" w:eastAsia="Times New Roman"/>
+          <w:sz w:val="18"/>
+        </w:rPr>
+        <w:t>[3] Reck, M., Rodriguez-Abreu, D., Robinson, A.G., Hui, R., Csoszi, T., Fulop, A., Gottfried, M., Peled, N., Tafreshi, A., Cuffe, S., O'Brien, M., Rao, S., Hotta, K., Leiby, M.A., Lubiniecki, G.M., Shentu, Y., Rangwala, R., Brahmer, J.R.: Pembrolizumab versus chemotherapy for PD-L1-positive non-small-cell lung cancer. New England Journal of Medicine 375(19), 1823–1833 (2016). https://doi.org/10.1056/NEJMoa1606774</w:t>
+      </w:r>
+    </w:p>
+    <w:p>
+      <w:pPr>
+        <w:spacing w:after="60"/>
+        <w:ind w:left="312" w:hanging="312"/>
+      </w:pPr>
+      <w:r>
+        <w:rPr>
+          <w:rFonts w:ascii="Times New Roman" w:hAnsi="Times New Roman" w:eastAsia="Times New Roman"/>
+          <w:sz w:val="18"/>
+        </w:rPr>
+        <w:t>[4] Herbst, R.S., Giaccone, G., De Marinis, F., Reinmuth, N., Vergnenegre, A., Barrios, C.H., Morise, M., Felip, E., Andric, Z., Geater, S., \"Ozguro glu, M., Zou, W., Sandler, A., Enquist, I., Komatsubara, K., Deng, Y., Kuriki, H., Wen, X., McCleland, M., Mocci, S., Jassem, J., Spigel, D.R.: Atezolizumab for first-line treatment of PD-L1-selected patients with NSCLC. New England Journal of Medicine 383(14), 1328–1339 (2020). https://doi.org/10.1056/NEJMoa1917346</w:t>
+      </w:r>
+    </w:p>
+    <w:p>
+      <w:pPr>
+        <w:spacing w:after="60"/>
+        <w:ind w:left="312" w:hanging="312"/>
+      </w:pPr>
+      <w:r>
+        <w:rPr>
+          <w:rFonts w:ascii="Times New Roman" w:hAnsi="Times New Roman" w:eastAsia="Times New Roman"/>
+          <w:sz w:val="18"/>
+        </w:rPr>
+        <w:t>[5] Gandhi, L., Rodriguez-Abreu, D., Gadgeel, S., Esteban, E., Felip, E., De Angelis, F., Domine, M., Clingan, P., Hochmair, M.J., Powell, S.F., Cheng, S.Y.-S., Bischoff, H.G., Peled, N., Grossi, F., Jennens, R.R., Reck, M., Hui, R., Garon, E.B., Boyer, M., Rubio-Viqueira, B., Novello, S., Kurata, T., Gray, J.E., Vida, J., Wei, Z., Yang, J., Raftopoulos, H., Pietanza, M.C., Garassino, M.C.: Pembrolizumab plus chemotherapy in metastatic non-small-cell lung cancer. New England Journal of Medicine 378(22), 2078–2092 (2018). https://doi.org/10.1056/NEJMoa1801005</w:t>
+      </w:r>
+    </w:p>
+    <w:p>
+      <w:pPr>
+        <w:spacing w:after="60"/>
+        <w:ind w:left="312" w:hanging="312"/>
+      </w:pPr>
+      <w:r>
+        <w:rPr>
+          <w:rFonts w:ascii="Times New Roman" w:hAnsi="Times New Roman" w:eastAsia="Times New Roman"/>
+          <w:b w:val="0"/>
+          <w:i w:val="0"/>
+          <w:sz w:val="18"/>
+        </w:rPr>
+        <w:t>[6] Passaro, A., Attili, I., de Marinis, F.: Neoadjuvant chemotherapy plus immunotherapy in early-stage resectable non-small-cell lung cancer. Journal of Clinical Oncology: Official Journal of the American Society of Clinical Oncology 40(25), 2871–2877 (2022). https://doi.org/10.1200/JCO.22.00873</w:t>
+      </w:r>
+    </w:p>
+    <w:p>
+      <w:pPr>
+        <w:spacing w:after="60"/>
+        <w:ind w:left="312" w:hanging="312"/>
+      </w:pPr>
+      <w:r>
+        <w:rPr>
+          <w:rFonts w:ascii="Times New Roman" w:hAnsi="Times New Roman" w:eastAsia="Times New Roman"/>
+          <w:b w:val="0"/>
+          <w:i w:val="0"/>
+          <w:sz w:val="18"/>
+        </w:rPr>
+        <w:t>[7] Hellmann, M.D., Ciuleanu, T.-E., Pluzanski, A., Lee, J.S., Otterson, G.A., Audigier-Valette, C., Minenza, E., Linardou, H., Burgers, S., Salman, P., Borghaei, H., Ramalingam, S.S., Brahmer, J., Reck, M., O'Byrne, K.J., Geese, W.J., Green, G., Chang, H., Szustakowski, J., Bhagavatheeswaran, P., Healey, D., Fu, Y., Nathan, F., Paz-Ares, L.: Nivolumab plus ipilimumab in lung cancer with a high tumor mutational burden. New England Journal of Medicine 378(22), 2093–2104 (2018). https://doi.org/10.1056/NEJMoa1801946</w:t>
+      </w:r>
+    </w:p>
+    <w:p>
+      <w:pPr>
+        <w:spacing w:after="60"/>
+        <w:ind w:left="312" w:hanging="312"/>
+      </w:pPr>
+      <w:r>
+        <w:rPr>
+          <w:rFonts w:ascii="Times New Roman" w:hAnsi="Times New Roman" w:eastAsia="Times New Roman"/>
+          <w:b w:val="0"/>
+          <w:i w:val="0"/>
+          <w:sz w:val="18"/>
+        </w:rPr>
+        <w:t>[8] Marabelle, A., Fakih, M., Lopez, J., Shah, M., Shapira-Frommer, R., Nakagawa, K., Chung, H.C., Kindler, H.L., Lopez-Martin, J.A., Miller, W.H., Italiano, A., Kao, S., Piha-Paul, S.A., Delord, J.-P., McWilliams, R.R., Fabrizio, D.A., Aurora-Garg, D., Xu, L., Jin, F., Norwood, K., Bang, Y.-J.: Association of tumour mutational burden with outcomes in patients with advanced solid tumours treated with pembrolizumab: Prospective biomarker analysis of the multicohort, open-label, phase 2 KEYNOTE-158 study. The Lancet Oncology 21(10), 1353–1365 (2020). https://doi.org/10.1016/S1470-2045(20)30445-9</w:t>
+      </w:r>
+    </w:p>
+    <w:p>
+      <w:pPr>
+        <w:spacing w:after="60"/>
+        <w:ind w:left="312" w:hanging="312"/>
+      </w:pPr>
+      <w:r>
+        <w:rPr>
+          <w:rFonts w:ascii="Times New Roman" w:hAnsi="Times New Roman" w:eastAsia="Times New Roman"/>
+          <w:b w:val="0"/>
+          <w:i w:val="0"/>
+          <w:sz w:val="18"/>
+        </w:rPr>
+        <w:t>[9] Topalian, S.L., Taube, J.M., Anders, R.A., Pardoll, D.M.: Mechanism-driven biomarkers to guide immune checkpoint blockade in cancer therapy. Nature Reviews Cancer 16(5), 275–287 (2016). https://doi.org/10.1038/nrc.2016.36</w:t>
+      </w:r>
+    </w:p>
+    <w:p>
+      <w:pPr>
+        <w:spacing w:after="60"/>
+        <w:ind w:left="312" w:hanging="312"/>
+      </w:pPr>
+      <w:r>
+        <w:rPr>
+          <w:rFonts w:ascii="Times New Roman" w:hAnsi="Times New Roman" w:eastAsia="Times New Roman"/>
+          <w:b w:val="0"/>
+          <w:i w:val="0"/>
+          <w:sz w:val="18"/>
+        </w:rPr>
+        <w:t>[10] Schoenfeld, A.J., Hellmann, M.D.: Acquired resistance to immune checkpoint inhibitors. Cancer Cell 37(4), 443–455 (2020). https://doi.org/10.1016/j.ccell.2020.03.017</w:t>
+      </w:r>
+    </w:p>
+    <w:p>
+      <w:pPr>
+        <w:spacing w:after="60"/>
+        <w:ind w:left="312" w:hanging="312"/>
+      </w:pPr>
+      <w:r>
+        <w:rPr>
+          <w:rFonts w:ascii="Times New Roman" w:hAnsi="Times New Roman" w:eastAsia="Times New Roman"/>
+          <w:b w:val="0"/>
+          <w:i w:val="0"/>
+          <w:sz w:val="18"/>
+        </w:rPr>
+        <w:t>[11] Vodnala, S.K., Eil, R., Kishton, R.J., Sukumar, M., Yamamoto, T.N., Ha, N.-H., Lee, P.-H., Shin, M., Patel, S.J., Yu, Z., Palmer, D.C., Kruhlak, M.J., Liu, X., Locasale, J.W., Huang, J., Roychoudhuri, R., Finkel, T., Klebanoff, C.A., Restifo, N.P.: T cell stemness and dysfunction in tumors are triggered by a common mechanism. Science 363(6434), 0135 (2019). https://doi.org/10.1126/science.aau0135</w:t>
+      </w:r>
+    </w:p>
+    <w:p>
+      <w:pPr>
+        <w:spacing w:after="60"/>
+        <w:ind w:left="312" w:hanging="312"/>
+      </w:pPr>
+      <w:r>
+        <w:rPr>
+          <w:rFonts w:ascii="Times New Roman" w:hAnsi="Times New Roman" w:eastAsia="Times New Roman"/>
+          <w:b w:val="0"/>
+          <w:i w:val="0"/>
+          <w:sz w:val="18"/>
+        </w:rPr>
+        <w:t>[12] Vigneron, N.: Human tumor antigens and cancer immunotherapy. BioMed Research International 2015, 1–17 (2015). https://doi.org/10.1155/2015/948501</w:t>
+      </w:r>
+    </w:p>
+    <w:p>
+      <w:pPr>
+        <w:spacing w:after="60"/>
+        <w:ind w:left="312" w:hanging="312"/>
+      </w:pPr>
+      <w:r>
+        <w:rPr>
+          <w:rFonts w:ascii="Times New Roman" w:hAnsi="Times New Roman" w:eastAsia="Times New Roman"/>
+          <w:b w:val="0"/>
+          <w:i w:val="0"/>
+          <w:sz w:val="18"/>
+        </w:rPr>
+        <w:t>[13] Jerby-Arnon, L., Shah, P., Cuoco, M.S., Rodman, C., Su, M.-J., Melms, J.C., Leeson, R., Kanodia, A., Mei, S., Lin, J.-R., Wang, S., Rabasha, B., Liu, D., Zhang, G., Margolais, C., Ashenberg, O., Ott, P.A., Buchbinder, E.I., Haq, R., Hodi, F.S., Boland, G.M., Sullivan, R.J., Frederick, D.T., Miao, B., Moll, T., Flaherty, K.T., Herlyn, M., Jenkins, R.W., Thummalapalli, R., Kowalczyk, M.S., Canadas, I., Schilling, B., Cartwright, A.N.R., Luoma, A.M., Malu, S., Hwu, P., Bernatchez, C., Forget, M.-A., Barbie, D.A., Shalek, A.K., Tirosh, I., Sorger, P.K., Wucherpfennig, K., Van Allen, E.M., Schadendorf, D., Johnson, B.E., Rotem, A., Rozenblatt-Rosen, O., Garraway, L.A., Yoon, C.H., Izar, B., Regev, A.: A cancer cell program promotes T cell exclusion and resistance to checkpoint blockade. Cell 175(4), 984–99724 (2018). https://doi.org/10.1016/j.cell.2018.09.006</w:t>
+      </w:r>
+    </w:p>
+    <w:p>
+      <w:pPr>
+        <w:spacing w:after="60"/>
+        <w:ind w:left="312" w:hanging="312"/>
+      </w:pPr>
+      <w:r>
+        <w:rPr>
+          <w:rFonts w:ascii="Times New Roman" w:hAnsi="Times New Roman" w:eastAsia="Times New Roman"/>
+          <w:b w:val="0"/>
+          <w:i w:val="0"/>
+          <w:sz w:val="18"/>
+        </w:rPr>
+        <w:t>[14] Staahl, P.L., Salmen, F., Vickovic, S., Lundmark, A., Navarro, J.F., Magnusson, J., Giacomello, S., Asp, M., Westholm, J.O., Huss, M., Mollbrink, A., Linnarsson, S., Codeluppi, S., Borg,., Ponten, F., Costea, P.I., Sahlen, P., Mulder, J., Bergmann, O., Lundeberg, J., Frisen, J.: Visualization and analysis of gene expression in tissue sections by spatial transcriptomics. Science 353(6294), 78–82 (2016). https://doi.org/10.1126/science.aaf2403</w:t>
+      </w:r>
+    </w:p>
+    <w:p>
+      <w:pPr>
+        <w:spacing w:after="60"/>
+        <w:ind w:left="312" w:hanging="312"/>
+      </w:pPr>
+      <w:r>
+        <w:rPr>
+          <w:rFonts w:ascii="Times New Roman" w:hAnsi="Times New Roman" w:eastAsia="Times New Roman"/>
+          <w:b w:val="0"/>
+          <w:i w:val="0"/>
+          <w:sz w:val="18"/>
+        </w:rPr>
+        <w:t>[15] Marx, V.: Method of the year: Spatially resolved transcriptomics. Nature Methods 18(1), 9–14 (2021). https://doi.org/10.1038/s41592-020-01033-y</w:t>
+      </w:r>
+    </w:p>
+    <w:p>
+      <w:pPr>
+        <w:spacing w:after="60"/>
+        <w:ind w:left="312" w:hanging="312"/>
+      </w:pPr>
+      <w:r>
+        <w:rPr>
+          <w:rFonts w:ascii="Times New Roman" w:hAnsi="Times New Roman" w:eastAsia="Times New Roman"/>
+          <w:b w:val="0"/>
+          <w:i w:val="0"/>
+          <w:sz w:val="18"/>
+        </w:rPr>
+        <w:t>[16] Zilionis, R., Engblom, C., Pfirschke, C., Savova, V., Zemmour, D., Saatcioglu, H.D., Krishnan, I., Maroni, G., Meyerovitz, C.V., Kerwin, C.M., Choi, S., Richards, W.G., De Rienzo, A., Tenen, D.G., Bueno, R., Levantini, E., Pittet, M.J., Klein, A.M.: Single-cell transcriptomics of human and mouse lung cancers reveals conserved myeloid populations across individuals and species. Immunity 50(5), 1317–133410 (2019). https://doi.org/10.1016/j.immuni.2019.03.009</w:t>
+      </w:r>
+    </w:p>
+    <w:p>
+      <w:pPr>
+        <w:spacing w:after="60"/>
+        <w:ind w:left="312" w:hanging="312"/>
+      </w:pPr>
+      <w:r>
+        <w:rPr>
+          <w:rFonts w:ascii="Times New Roman" w:hAnsi="Times New Roman" w:eastAsia="Times New Roman"/>
+          <w:b w:val="0"/>
+          <w:i w:val="0"/>
+          <w:sz w:val="18"/>
+        </w:rPr>
+        <w:t>[17] Laumont, C.M., Nelson, B.H.: B cells in the tumor microenvironment: Multi-faceted organizers, regulators, and effectors of anti-tumor immunity. Cancer Cell 41(3), 466–489 (2023). https://doi.org/10.1016/j.ccell.2023.02.017</w:t>
+      </w:r>
+    </w:p>
+    <w:p>
+      <w:pPr>
+        <w:spacing w:after="60"/>
+        <w:ind w:left="312" w:hanging="312"/>
+      </w:pPr>
+      <w:r>
+        <w:rPr>
+          <w:rFonts w:ascii="Times New Roman" w:hAnsi="Times New Roman" w:eastAsia="Times New Roman"/>
+          <w:b w:val="0"/>
+          <w:i w:val="0"/>
+          <w:sz w:val="18"/>
+        </w:rPr>
+        <w:t>[18] Janesick, A., Shelansky, R., Gottscho, A.D., Wagner, F., Williams, S.R., Rouault, M., Beliakoff, G., Morrison, C.A., Oliveira, M.F., Sicherman, J.T., Kohlway, A., Abousoud, J., Drennon, T.Y., Mohabbat, S.H., 10x Development Teams, Taylor, S.E.B.: High resolution mapping of the tumor microenvironment using integrated single-cell, spatial and in situ analysis. Nature Communications 14(1), 8353 (2023). https://doi.org/10.1038/s41467-023-43458-x</w:t>
+      </w:r>
+    </w:p>
+    <w:p>
+      <w:pPr>
+        <w:spacing w:after="60"/>
+        <w:ind w:left="312" w:hanging="312"/>
+      </w:pPr>
+      <w:r>
+        <w:rPr>
+          <w:rFonts w:ascii="Times New Roman" w:hAnsi="Times New Roman" w:eastAsia="Times New Roman"/>
+          <w:b w:val="0"/>
+          <w:i w:val="0"/>
+          <w:sz w:val="18"/>
+        </w:rPr>
+        <w:t>[19] He, K., Zhang, X., Ren, S., Sun, J.: Deep residual learning for image recognition. In: 2016 IEEE Conference on Computer Vision and Pattern Recognition (CVPR), pp. 770–778. IEEE, Las Vegas, NV, USA (2016). https://doi.org/10.1109/CVPR.2016.90</w:t>
+      </w:r>
+    </w:p>
+    <w:p>
+      <w:pPr>
+        <w:spacing w:after="60"/>
+        <w:ind w:left="312" w:hanging="312"/>
+      </w:pPr>
+      <w:r>
+        <w:rPr>
+          <w:rFonts w:ascii="Times New Roman" w:hAnsi="Times New Roman" w:eastAsia="Times New Roman"/>
+          <w:b w:val="0"/>
+          <w:i w:val="0"/>
+          <w:sz w:val="18"/>
+        </w:rPr>
+        <w:t>[20] Campanella, G., Hanna, M.G., Geneslaw, L., Miraflor, A., Werneck Krauss Silva, V., Busam, K.J., Brogi, E., Reuter, V.E., Klimstra, D.S., Fuchs, T.J.: Clinical-grade computational pathology using weakly supervised deep learning on whole slide images. Nature Medicine 25(8), 1301–1309 (2019). https://doi.org/10.1038/s41591-019-0508-1</w:t>
+      </w:r>
+    </w:p>
+    <w:p>
+      <w:pPr>
+        <w:spacing w:after="60"/>
+        <w:ind w:left="312" w:hanging="312"/>
+      </w:pPr>
+      <w:r>
+        <w:rPr>
+          <w:rFonts w:ascii="Times New Roman" w:hAnsi="Times New Roman" w:eastAsia="Times New Roman"/>
+          <w:b w:val="0"/>
+          <w:i w:val="0"/>
+          <w:sz w:val="18"/>
+        </w:rPr>
+        <w:t>[21] Valanarasu, J.M.J., Xu, H., Usuyama, N., Kim, C., Wong, C., Argaw, P., Ben Shimol, R., Crabtree, A., Matlock, K., Bartlett, A.Q., Bagga, J., Gu, Y., Zhang, S., Naumann, T., Fox, B.A., Wright, B., Robicsek, A., Piening, B., Bifulco, C., Wang, S., Poon, H.: https://doi.org/10.1016/j.cell.2025.11.016</w:t>
+      </w:r>
+    </w:p>
+    <w:p>
+      <w:pPr>
+        <w:spacing w:after="60"/>
+        <w:ind w:left="312" w:hanging="312"/>
+      </w:pPr>
+      <w:r>
+        <w:rPr>
+          <w:rFonts w:ascii="Times New Roman" w:hAnsi="Times New Roman" w:eastAsia="Times New Roman"/>
+          <w:b w:val="0"/>
+          <w:i w:val="0"/>
+          <w:sz w:val="18"/>
+        </w:rPr>
+        <w:t>[22] Wu, Y., Yang, S., Ma, J., Chen, Z., Song, G., Rao, D., Cheng, Y., Huang, S., Liu, Y., Jiang, S., Liu, J., Huang, X., Wang, X., Qiu, S., Xu, J., Xi, R., Bai, F., Zhou, J., Fan, J., Zhang, X., Gao, Q.: Spatiotemporal immune landscape of colorectal cancer liver metastasis at single-cell level. Cancer Discovery 12(1), 134–153 (2022). https://doi.org/10.1158/2159-8290.CD-21-0316</w:t>
+      </w:r>
+    </w:p>
+    <w:p>
+      <w:pPr>
+        <w:spacing w:after="60"/>
+        <w:ind w:left="312" w:hanging="312"/>
+      </w:pPr>
+      <w:r>
+        <w:rPr>
+          <w:rFonts w:ascii="Times New Roman" w:hAnsi="Times New Roman" w:eastAsia="Times New Roman"/>
+          <w:b w:val="0"/>
+          <w:i w:val="0"/>
+          <w:sz w:val="18"/>
+        </w:rPr>
+        <w:t>[23] Chen, R.J., Lu, M.Y., Williamson, D.F.K., Chen, T.Y., Lipkova, J., Noor, Z., Shaban, M., Shady, M., Williams, M., Joo, B., Mahmood, F.: Pan-cancer integrative histology-genomic analysis via multimodal deep learning. Cancer Cell 40(8), 865–8786 (2022). https://doi.org/10.1016/j.ccell.2022.07.004</w:t>
+      </w:r>
+    </w:p>
+    <w:p>
+      <w:pPr>
+        <w:spacing w:after="60"/>
+        <w:ind w:left="312" w:hanging="312"/>
+      </w:pPr>
+      <w:r>
+        <w:rPr>
+          <w:rFonts w:ascii="Times New Roman" w:hAnsi="Times New Roman" w:eastAsia="Times New Roman"/>
+          <w:b w:val="0"/>
+          <w:i w:val="0"/>
+          <w:sz w:val="18"/>
+        </w:rPr>
+        <w:t>[24] Thorsson, V., Gibbs, D.L., Brown, S.D., Wolf, D., Bortone, D.S., Ou Yang, T.-H., Porta-Pardo, E., Gao, G.F., Plaisier, C.L., Eddy, J.A., Ziv, E., Culhane, A.C., Paull, E.O., Sivakumar, I.K.A., Gentles, A.J., Malhotra, R., Farshidfar, F., Colaprico, A., Parker, J.S., Mose, L.E., Vo, N.S., Liu, J., Liu, Y., Rader, J., Dhankani, V., Reynolds, S.M., Bowlby, R., Califano, A., Cherniack, A.D., Anastassiou, D., Bedognetti, D., Mokrab, Y., Newman, A.M., Rao, A., Chen, K., Krasnitz, A., Hu, H., Malta, T.M., Noushmehr, H., Pedamallu, C.S., Bullman, S., Ojesina, A.I., Lamb, A., Zhou, W., Shen, H., Choueiri, T.K., Weinstein, J.N., Guinney, J., Saltz, J., Holt, R.A., Rabkin, C.S., Caesar-Johnson, S.J., Demchok, J.A., Felau, I., Kasapi, M., Ferguson, M.L., Hutter, C.M., Sofia, H.J., Tarnuzzer, R., Wang, Z., Yang, L., Zenklusen, J.C., Zhang, J.J., Chudamani, S., Liu, J., Lolla, L., Naresh, R., Pihl, T., Sun, Q., Wan, Y., Wu, Y., Cho, J., DeFreitas, T., Frazer, S., Gehlenborg, N., Getz, G., Heiman, D.I., Kim, J., Lawrence, M.S., Lin, P., Meier, S., Noble, M.S., Saksena, G., Voet, D., Zhang, H., Bernard, B., Chambwe, N., Dhankani, V., Knijnenburg, T., Kramer, R., Leinonen, K., Liu, Y., Miller, M., Reynolds, S., Shmulevich, I., Thorsson, V., Zhang, W., Akbani, R., Broom, B.M., Hegde, A.M., Ju, Z., Kanchi, R.S., Korkut, A., Li, J., Liang, H., Ling, S., Liu, W., Lu, Y., Mills, G.B., Ng, K.-S., Rao, A., Ryan, M., Wang, J., Weinstein, J.N., Zhang, J., Abeshouse, A., Armenia, J., Chakravarty, D., Chatila, W.K., De Bruijn, I., Gao, J., Gross, B.E., Heins, Z.J., Kundra, R., La, K., Ladanyi, M., Luna, A., Nissan, M.G., Ochoa, A., Phillips, S.M., Reznik, E., Sanchez-Vega, F., Sander, C., Schultz, N., Sheridan, R., Sumer, S.O., Sun, Y., Taylor, B.S., Wang, J., Zhang, H., Anur, P., Peto, M., Spellman, P., Benz, C., Stuart, J.M., Wong, C.K., Yau, C., Hayes, D.N., Parker, J.S., Wilkerson, M.D., Ally, A., Balasundaram, M., Bowlby, R., Brooks, D., Carlsen, R., Chuah, E., Dhalla, N., Holt, R., Jones, S.J.M., Kasaian, K., Lee, D., Ma, Y., Marra, M.A., Mayo, M., Moore, R.A., Mungall, A.J., Mungall, K., Robertson, A.G., Sadeghi, S., Schein, J.E., Sipahimalani, P., Tam, A., Thiessen, N., Tse, K., Wong, T., Berger, A.C., Beroukhim, R., Cherniack, A.D., Cibulskis, C., Gabriel, S.B., Gao, G.F., Ha, G., Meyerson, M., Schumacher, S.E., Shih, J., Kucherlapati, M.H., Kucherlapati, R.S., Baylin, S., Cope, L., Danilova, L., Bootwalla, M.S., Lai, P.H., Maglinte, D.T., Van Den Berg, D.J., Weisenberger, D.J., Auman, J.T., Balu, S., Bodenheimer, T., Fan, C., Hoadley, K.A., Hoyle, A.P., Jefferys, S.R., Jones, C.D., Meng, S., Mieczkowski, P.A., Mose, L.E., Perou, A.H., Perou, C.M., Roach, J., Shi, Y., Simons, J.V., Skelly, T., Soloway, M.G., Tan, D., Veluvolu, U., Fan, H., Hinoue, T., Laird, P.W., Shen, H., Zhou, W., Bellair, M., Chang, K., Covington, K., Creighton, C.J., Dinh, H., Doddapaneni, H., Donehower, L.A., Drummond, J., Gibbs, R.A., Glenn, R., Hale, W., Han, Y., Hu, J., Korchina, V., Lee, S., Lewis, L., Li, W., Liu, X., Morgan, M., Morton, D., Muzny, D., Santibanez, J., Sheth, M., Shinbrot, E., Wang, L., Wang, M., Wheeler, D.A., Xi, L., Zhao, F., Hess, J., Appelbaum, E.L., Bailey, M., Cordes, M.G., Ding, L., Fronick, C.C., Fulton, L.A., Fulton, R.S., Kandoth, C., Mardis, E.R., McLellan, M.D., Miller, C.A., Schmidt, H.K., Wilson, R.K., Crain, D., Curley, E., Gardner, J., Lau, K., Mallery, D., Morris, S., Paulauskis, J., Penny, R., Shelton, C., Shelton, T., Sherman, M., Thompson, E., Yena, P., Bowen, J., Gastier-Foster, J.M., Gerken, M., Leraas, K.M., Lichtenberg, T.M., Ramirez, N.C., Wise, L., Zmuda, E., Corcoran, N., Costello, T., Hovens, C., Carvalho, A.L., De Carvalho, A.C., Fregnani, J.H., Longatto-Filho, A., Reis, R.M., Scapulatempo-Neto, C., Silveira, H.C.S., Vidal, D.O., Burnette, A., Eschbacher, J., Hermes, B., Noss, A., Singh, R., Anderson, M.L., Castro, P.D., Ittmann, M., Huntsman, D., Kohl, B., Le, X., Thorp, R., Andry, C., Duffy, E.R., Lyadov, V., Paklina, O., Setdikova, G., Shabunin, A., Tavobilov, M., McPherson, C., Warnick, R., Berkowitz, R., Cramer, D., Feltmate, C., Horowitz, N., Kibel, A., Muto, M., Raut, C.P., Malykh, A., Barnholtz-Sloan, J.S., Barrett, W., Devine, K., Fulop, J., Ostrom, Q.T., Shimmel, K., Wolinsky, Y., Sloan, A.E., De Rose, A., Giuliante, F., Goodman, M., Karlan, B.Y., Hagedorn, C.H., Eckman, J., Harr, J., Myers, J., Tucker, K., Zach, L.A., Deyarmin, B., Hu, H., Kvecher, L., Larson, C., Mural, R.J., Somiari, S., Vicha, A., Zelinka, T., Bennett, J., Iacocca, M., Rabeno, B., Swanson, P., Latour, M., Lacombe, L., T\^etu, B., Bergeron, A., McGraw, M., Staugaitis, S.M., Chabot, J., Hibshoosh, H., Sepulveda, A., Su, T., Wang, T., Potapova, O., Voronina, O., Desjardins, L., Mariani, O., Roman-Roman, S., Sastre, X., Stern, M.-H., Cheng, F., Signoretti, S., Berchuck, A., Bigner, D., Lipp, E., Marks, J., McCall, S., McLendon, R., Secord, A., Sharp, A., Behera, M., Brat, D.J., Chen, A., Delman, K., Force, S., Khuri, F., Magliocca, K., Maithel, S., Olson, J.J., Owonikoko, T., Pickens, A., Ramalingam, S., Shin, D.M., Sica, G., Van Meir, E.G., Zhang, H., Eijckenboom, W., Gillis, A., Korpershoek, E., Looijenga, L., Oosterhuis, W., Stoop, H., Van Kessel, K.E., Zwarthoff, E.C., Calatozzolo, C., Cuppini, L., Cuzzubbo, S., DiMeco, F., Finocchiaro, G., Mattei, L., Perin, A., Pollo, B., Chen, C., Houck, J., Lohavanichbutr, P., Hartmann, A., Stoehr, C., Stoehr, R., Taubert, H., Wach, S., Wullich, B., Kycler, W., Murawa, D., Wiznerowicz, M., Chung, K., Edenfield, W.J., Martin, J., Baudin, E., Bubley, G., Bueno, R., De Rienzo, A., Richards, W.G., Kalkanis, S., Mikkelsen, T., Noushmehr, H., Scarpace, L., Girard, N., Aymerich, M., Campo, E., Gine, E., Guillermo, A.L., Van Bang, N., Hanh, P.T., Phu, B.D., Tang, Y., Colman, H., Evason, K., Dottino, P.R., Martignetti, J.A., Gabra, H., Juhl, H., Akeredolu, T., Stepa, S., Hoon, D., Ahn, K., Kang, K.J., Beuschlein, F., Breggia, A., Birrer, M., Bell, D., Borad, M., Bryce, A.H., Castle, E., Chandan, V., Cheville, J., Copland, J.A., Farnell, M., Flotte, T., Giama, N., Ho, T., Kendrick, M., Kocher, J.-P., Kopp, K., Moser, C., Nagorney, D., O'Brien, D., O'Neill, B.P., Patel, T., Petersen, G., Que, F., Rivera, M., Roberts, L., Smallridge, R., Smyrk, T., Stanton, M., Thompson, R.H., Torbenson, M., Yang, J.D., Zhang, L., Brimo, F., Ajani, J.A., Gonzalez, A.M.A., Behrens, C., Bondaruk, J., Broaddus, R., Czerniak, B., Esmaeli, B., Fujimoto, J., Gershenwald, J., Guo, C., Lazar, A.J., Logothetis, C., Meric-Bernstam, F., Moran, C., Ramondetta, L., Rice, D., Sood, A., Tamboli, P., Thompson, T., Troncoso, P., Tsao, A., Wistuba, I., Carter, C., Haydu, L., Hersey, P., Jakrot, V., Kakavand, H., Kefford, R., Lee, K., Long, G., Mann, G., Quinn, M., Saw, R., Scolyer, R., Shannon, K., Spillane, A., Stretch, O., Synott, M., Thompson, J., Wilmott, J., Al-Ahmadie, H., Chan, T.A., Ghossein, R., Gopalan, A., Levine, D.A., Reuter, V., Singer, S., Singh, B., Tien, N.V., Broudy, T., Mirsaidi, C., Nair, P., Drwiega, P., Miller, J., Smith, J., Zaren, H., Park, J.-W., Hung, N.P., Kebebew, E., Linehan, W.M., Metwalli, A.R., Pacak, K., Pinto, P.A., Schiffman, M., Schmidt, L.S., Vocke, C.D., Wentzensen, N., Worrell, R., Yang, H., Moncrieff, M., Goparaju, C., Melamed, J., Pass, H., Botnariuc, N., Caraman, I., Cernat, M., Chemencedji, I., Clipca, A., Doruc, S., Gorincioi, G., Mura, S., Pirtac, M., Stancul, I., Tcaciuc, D., Albert, M., Alexopoulou, I., Arnaout, A., Bartlett, J., Engel, J., Gilbert, S., Parfitt, J., Sekhon, H., Thomas, G., Rassl, D.M., Rintoul, R.C., Bifulco, C., Tamakawa, R., Urba, W., Hayward, N., Timmers, H., Antenucci, A., Facciolo, F., Grazi, G., Marino, M., Merola, R., De Krijger, R., Gimenez-Roqueplo, A.-P., Piche, A., Chevalier, S., McKercher, G., Birsoy, K., Barnett, G., Brewer, C., Farver, C., Naska, T., Pennell, N.A., Raymond, D., Schilero, C., Smolenski, K., Williams, F., Morrison, C., Borgia, J.A., Liptay, M.J., Pool, M., Seder, C.W., Junker, K., Omberg, L., Dinkin, M., Manikhas, G., Alvaro, D., Bragazzi, M.C., Cardinale, V., Carpino, G., Gaudio, E., Chesla, D., Cottingham, S., Dubina, M., Moiseenko, F., Dhanasekaran, R., Becker, K.-F., Janssen, K.-P., Slotta-Huspenina, J., Abdel-Rahman, M.H., Aziz, D., Bell, S., Cebulla, C.M., Davis, A., Duell, R., Elder, J.B., Hilty, J., Kumar, B., Lang, J., Lehman, N.L., Mandt, R., Nguyen, P., Pilarski, R., Rai, K., Schoenfield, L., Senecal, K., Wakely, P., Hansen, P., Lechan, R., Powers, J., Tischler, A., Grizzle, W.E., Sexton, K.C., Kastl, A., Henderson, J., Porten, S., Waldmann, J., Fassnacht, M., Asa, S.L., Schadendorf, D., Couce, M., Graefen, M., Huland, H., Sauter, G., Schlomm, T., Simon, R., Tennstedt, P., Olabode, O., Nelson, M., Bathe, O., Carroll, P.R., Chan, J.M., Disaia, P., Glenn, P., Kelley, R.K., Landen, C.N., Phillips, J., Prados, M., Simko, J., Smith-McCune, K., VandenBerg, S., Roggin, K., Fehrenbach, A., Kendler, A., Sifri, S., Steele, R., Jimeno, A., Carey, F., Forgie, I., Mannelli, M., Carney, M., Hernandez, B., Campos, B., Herold-Mende, C., Jungk, C., Unterberg, A., Von Deimling, A., Bossler, A., Galbraith, J., Jacobus, L., Knudson, M., Knutson, T., Ma, D., Milhem, M., Sigmund, R., Godwin, A.K., Madan, R., Rosenthal, H.G., Adebamowo, C., Adebamowo, S.N., Boussioutas, A., Beer, D., Giordano, T., Mes-Masson, A.-M., Saad, F., Bocklage, T., Landrum, L., Mannel, R., Moore, K., Moxley, K., Postier, R., Walker, J., Zuna, R., Feldman, M., Valdivieso, F., Dhir, R., Luketich, J., Pinero, E.M.M., Quintero-Aguilo, M., Carlotti, C.G., Dos Santos, J.S., Kemp, R., Sankarankuty, A., Tirapelli, D., Catto, J., Agnew, K., Swisher, E., Creaney, J., Robinson, B., Shelley, C.S., Godwin, E.M., Kendall, S., Shipman, C., Bradford, C., Carey, T., Haddad, A., Moyer, J., Peterson, L., Prince, M., Rozek, L., Wolf, G., Bowman, R., Fong, K.M., Yang, I., Korst, R., Rathmell, W.K., Fantacone-Campbell, J.L., Hooke, J.A., Kovatich, A.J., Shriver, C.D., DiPersio, J., Drake, B., Govindan, R., Heath, S., Ley, T., Van Tine, B., Westervelt, P., Rubin, M.A., Lee, J.I., Aredes, N.D., Mariamidze, A., Lazar, A.J., Serody, J.S., Demicco, E.G., Disis, M.L., Vincent, B.G., Shmulevich, I.: The immune landscape of cancer. Immunity 48(4), 812–83014 (2018). https://doi.org/10.1016/j.immuni.2018.03.023</w:t>
+      </w:r>
+    </w:p>
+    <w:p>
+      <w:pPr>
+        <w:spacing w:after="60"/>
+        <w:ind w:left="312" w:hanging="312"/>
+      </w:pPr>
+      <w:r>
+        <w:rPr>
+          <w:rFonts w:ascii="Times New Roman" w:hAnsi="Times New Roman" w:eastAsia="Times New Roman"/>
+          <w:b w:val="0"/>
+          <w:i w:val="0"/>
+          <w:sz w:val="18"/>
+        </w:rPr>
+        <w:t>[25] Subramanian, I., Verma, S., Kumar, S., Jere, A., Anamika, K.: Multi-omics data integration, interpretation, and its application. Bioinformatics and Biology Insights 14, 117793221989905 (2020). https://doi.org/10.1177/1177932219899051</w:t>
+      </w:r>
+    </w:p>
+    <w:p>
+      <w:pPr>
+        <w:spacing w:after="60"/>
+        <w:ind w:left="312" w:hanging="312"/>
+      </w:pPr>
+      <w:r>
+        <w:rPr>
+          <w:rFonts w:ascii="Times New Roman" w:hAnsi="Times New Roman" w:eastAsia="Times New Roman"/>
+          <w:sz w:val="18"/>
+        </w:rPr>
+        <w:t>[26] Chaudhary, K., Poirion, O.B., Lu, L., Garmire, L.X.: Deep learning-based multi-omics integration robustly predicts survival in liver cancer. Clinical Cancer Research 24(6), 1248–1259 (2018). https://doi.org/10.1158/1078-0432.CCR-17-0853</w:t>
+      </w:r>
+    </w:p>
+    <w:p>
+      <w:pPr>
+        <w:spacing w:after="60"/>
+        <w:ind w:left="312" w:hanging="312"/>
+      </w:pPr>
+      <w:r>
+        <w:rPr>
+          <w:rFonts w:ascii="Times New Roman" w:hAnsi="Times New Roman" w:eastAsia="Times New Roman"/>
+          <w:b w:val="0"/>
+          <w:i w:val="0"/>
+          <w:sz w:val="18"/>
+        </w:rPr>
+        <w:t>[27] Sammut, S.-J., Crispin-Ortuzar, M., Chin, S.-F., Provenzano, E., Bardwell, H.A., Ma, W., Cope, W., Dariush, A., Dawson, S.-J., Abraham, J.E., Dunn, J., Hiller, L., Thomas, J., Cameron, D.A., Bartlett, J.M.S., Hayward, L., Pharoah, P.D., Markowetz, F., Rueda, O.M., Earl, H.M., Caldas, C.: Multi-omic machine learning predictor of breast cancer therapy response. Nature 601(7894), 623–629 (2022). https://doi.org/10.1038/s41586-021-04278-5</w:t>
+      </w:r>
+    </w:p>
+    <w:p>
+      <w:pPr>
+        <w:spacing w:after="60"/>
+        <w:ind w:left="312" w:hanging="312"/>
+      </w:pPr>
+      <w:r>
+        <w:rPr>
+          <w:rFonts w:ascii="Times New Roman" w:hAnsi="Times New Roman" w:eastAsia="Times New Roman"/>
+          <w:b w:val="0"/>
+          <w:i w:val="0"/>
+          <w:sz w:val="18"/>
+        </w:rPr>
+        <w:t>[28] Hoadley, K.A., Yau, C., Hinoue, T., Wolf, D.M., Lazar, A.J., Drill, E., Shen, R., Taylor, A.M., Cherniack, A.D., Thorsson, V., Akbani, R., Bowlby, R., Wong, C.K., Wiznerowicz, M., Sanchez-Vega, F., Robertson, A.G., Schneider, B.G., Lawrence, M.S., Noushmehr, H., Malta, T.M., Caesar-Johnson, S.J., Demchok, J.A., Felau, I., Kasapi, M., Ferguson, M.L., Hutter, C.M., Sofia, H.J., Tarnuzzer, R., Wang, Z., Yang, L., Zenklusen, J.C., Zhang, J.J., Chudamani, S., Liu, J., Lolla, L., Naresh, R., Pihl, T., Sun, Q., Wan, Y., Wu, Y., Cho, J., DeFreitas, T., Frazer, S., Gehlenborg, N., Getz, G., Heiman, D.I., Kim, J., Lawrence, M.S., Lin, P., Meier, S., Noble, M.S., Saksena, G., Voet, D., Zhang, H., Bernard, B., Chambwe, N., Dhankani, V., Knijnenburg, T., Kramer, R., Leinonen, K., Liu, Y., Miller, M., Reynolds, S., Shmulevich, I., Thorsson, V., Zhang, W., Akbani, R., Broom, B.M., Hegde, A.M., Ju, Z., Kanchi, R.S., Korkut, A., Li, J., Liang, H., Ling, S., Liu, W., Lu, Y., Mills, G.B., Ng, K.-S., Rao, A., Ryan, M., Wang, J., Weinstein, J.N., Zhang, J., Abeshouse, A., Armenia, J., Chakravarty, D., Chatila, W.K., De Bruijn, I., Gao, J., Gross, B.E., Heins, Z.J., Kundra, R., La, K., Ladanyi, M., Luna, A., Nissan, M.G., Ochoa, A., Phillips, S.M., Reznik, E., Sanchez-Vega, F., Sander, C., Schultz, N., Sheridan, R., Sumer, S.O., Sun, Y., Taylor, B.S., Wang, J., Zhang, H., Anur, P., Peto, M., Spellman, P., Benz, C., Stuart, J.M., Wong, C.K., Yau, C., Hayes, D.N., Parker, J.S., Wilkerson, M.D., Ally, A., Balasundaram, M., Bowlby, R., Brooks, D., Carlsen, R., Chuah, E., Dhalla, N., Holt, R., Jones, S.J.M., Kasaian, K., Lee, D., Ma, Y., Marra, M.A., Mayo, M., Moore, R.A., Mungall, A.J., Mungall, K., Robertson, A.G., Sadeghi, S., Schein, J.E., Sipahimalani, P., Tam, A., Thiessen, N., Tse, K., Wong, T., Berger, A.C., Beroukhim, R., Cherniack, A.D., Cibulskis, C., Gabriel, S.B., Gao, G.F., Ha, G., Meyerson, M., Schumacher, S.E., Shih, J., Kucherlapati, M.H., Kucherlapati, R.S., Baylin, S., Cope, L., Danilova, L., Bootwalla, M.S., Lai, P.H., Maglinte, D.T., Van Den Berg, D.J., Weisenberger, D.J., Auman, J.T., Balu, S., Bodenheimer, T., Fan, C., Hoadley, K.A., Hoyle, A.P., Jefferys, S.R., Jones, C.D., Meng, S., Mieczkowski, P.A., Mose, L.E., Perou, A.H., Perou, C.M., Roach, J., Shi, Y., Simons, J.V., Skelly, T., Soloway, M.G., Tan, D., Veluvolu, U., Fan, H., Hinoue, T., Laird, P.W., Shen, H., Zhou, W., Bellair, M., Chang, K., Covington, K., Creighton, C.J., Dinh, H., Doddapaneni, H., Donehower, L.A., Drummond, J., Gibbs, R.A., Glenn, R., Hale, W., Han, Y., Hu, J., Korchina, V., Lee, S., Lewis, L., Li, W., Liu, X., Morgan, M., Morton, D., Muzny, D., Santibanez, J., Sheth, M., Shinbrot, E., Wang, L., Wang, M., Wheeler, D.A., Xi, L., Zhao, F., Hess, J., Appelbaum, E.L., Bailey, M., Cordes, M.G., Ding, L., Fronick, C.C., Fulton, L.A., Fulton, R.S., Kandoth, C., Mardis, E.R., McLellan, M.D., Miller, C.A., Schmidt, H.K., Wilson, R.K., Crain, D., Curley, E., Gardner, J., Lau, K., Mallery, D., Morris, S., Paulauskis, J., Penny, R., Shelton, C., Shelton, T., Sherman, M., Thompson, E., Yena, P., Bowen, J., Gastier-Foster, J.M., Gerken, M., Leraas, K.M., Lichtenberg, T.M., Ramirez, N.C., Wise, L., Zmuda, E., Corcoran, N., Costello, T., Hovens, C., Carvalho, A.L., De Carvalho, A.C., Fregnani, J.H., Longatto-Filho, A., Reis, R.M., Scapulatempo-Neto, C., Silveira, H.C.S., Vidal, D.O., Burnette, A., Eschbacher, J., Hermes, B., Noss, A., Singh, R., Anderson, M.L., Castro, P.D., Ittmann, M., Huntsman, D., Kohl, B., Le, X., Thorp, R., Andry, C., Duffy, E.R., Lyadov, V., Paklina, O., Setdikova, G., Shabunin, A., Tavobilov, M., McPherson, C., Warnick, R., Berkowitz, R., Cramer, D., Feltmate, C., Horowitz, N., Kibel, A., Muto, M., Raut, C.P., Malykh, A., Barnholtz-Sloan, J.S., Barrett, W., Devine, K., Fulop, J., Ostrom, Q.T., Shimmel, K., Wolinsky, Y., Sloan, A.E., De Rose, A., Giuliante, F., Goodman, M., Karlan, B.Y., Hagedorn, C.H., Eckman, J., Harr, J., Myers, J., Tucker, K., Zach, L.A., Deyarmin, B., Hu, H., Kvecher, L., Larson, C., Mural, R.J., Somiari, S., Vicha, A., Zelinka, T., Bennett, J., Iacocca, M., Rabeno, B., Swanson, P., Latour, M., Lacombe, L., T\^etu, B., Bergeron, A., McGraw, M., Staugaitis, S.M., Chabot, J., Hibshoosh, H., Sepulveda, A., Su, T., Wang, T., Potapova, O., Voronina, O., Desjardins, L., Mariani, O., Roman-Roman, S., Sastre, X., Stern, M.-H., Cheng, F., Signoretti, S., Berchuck, A., Bigner, D., Lipp, E., Marks, J., McCall, S., McLendon, R., Secord, A., Sharp, A., Behera, M., Brat, D.J., Chen, A., Delman, K., Force, S., Khuri, F., Magliocca, K., Maithel, S., Olson, J.J., Owonikoko, T., Pickens, A., Ramalingam, S., Shin, D.M., Sica, G., Van Meir, E.G., Zhang, H., Eijckenboom, W., Gillis, A., Korpershoek, E., Looijenga, L., Oosterhuis, W., Stoop, H., Van Kessel, K.E., Zwarthoff, E.C., Calatozzolo, C., Cuppini, L., Cuzzubbo, S., DiMeco, F., Finocchiaro, G., Mattei, L., Perin, A., Pollo, B., Chen, C., Houck, J., Lohavanichbutr, P., Hartmann, A., Stoehr, C., Stoehr, R., Taubert, H., Wach, S., Wullich, B., Kycler, W., Murawa, D., Wiznerowicz, M., Chung, K., Edenfield, W.J., Martin, J., Baudin, E., Bubley, G., Bueno, R., De Rienzo, A., Richards, W.G., Kalkanis, S., Mikkelsen, T., Noushmehr, H., Scarpace, L., Girard, N., Aymerich, M., Campo, E., Gine, E., Guillermo, A.L., Van Bang, N., Hanh, P.T., Phu, B.D., Tang, Y., Colman, H., Evason, K., Dottino, P.R., Martignetti, J.A., Gabra, H., Juhl, H., Akeredolu, T., Stepa, S., Hoon, D., Ahn, K., Kang, K.J., Beuschlein, F., Breggia, A., Birrer, M., Bell, D., Borad, M., Bryce, A.H., Castle, E., Chandan, V., Cheville, J., Copland, J.A., Farnell, M., Flotte, T., Giama, N., Ho, T., Kendrick, M., Kocher, J.-P., Kopp, K., Moser, C., Nagorney, D., O'Brien, D., O'Neill, B.P., Patel, T., Petersen, G., Que, F., Rivera, M., Roberts, L., Smallridge, R., Smyrk, T., Stanton, M., Thompson, R.H., Torbenson, M., Yang, J.D., Zhang, L., Brimo, F., Ajani, J.A., Gonzalez, A.M.A., Behrens, C., Bondaruk, O., Broaddus, R., Czerniak, B., Esmaeli, B., Fujimoto, J., Gershenwald, J., Guo, C., Lazar, A.J., Logothetis, C., Meric-Bernstam, F., Moran, C., Ramondetta, L., Rice, D., Sood, A., Tamboli, P., Thompson, T., Troncoso, P., Tsao, A., Wistuba, I., Carter, C., Haydu, L., Hersey, P., Jakrot, V., Kakavand, H., Kefford, R., Lee, K., Long, G., Mann, G., Quinn, M., Saw, R., Scolyer, R., Shannon, K., Spillane, A., Stretch, J., Synott, M., Thompson, J., Wilmott, J., Al-Ahmadie, H., Chan, T.A., Ghossein, R., Gopalan, A., Levine, D.A., Reuter, V., Singer, S., Singh, B., Tien, N.V., Broudy, T., Mirsaidi, C., Nair, P., Drwiega, P., Miller, J., Smith, J., Zaren, H., Park, J.-W., Hung, N.P., Kebebew, E., Linehan, W.M., Metwalli, A.R., Pacak, K., Pinto, P.A., Schiffman, M., Schmidt, L.S., Vocke, C.D., Wentzensen, N., Worrell, R., Yang, H., Moncrieff, M., Goparaju, C., Melamed, J., Pass, H., Botnariuc, N., Caraman, I., Cernat, M., Chemencedji, I., Clipca, A., Doruc, S., Gorincioi, G., Mura, S., Pirtac, M., Stancul, I., Tcaciuc, D., Albert, M., Alexopoulou, I., Arnaout, A., Bartlett, J., Engel, J., Gilbert, S., Parfitt, J., Sekhon, H., Thomas, G., Rassl, D.M., Rintoul, R.C., Bifulco, C., Tamakawa, R., Urba, W., Hayward, N., Timmers, H., Antenucci, A., Facciolo, F., Grazi, G., Marino, M., Merola, R., De Krijger, R., Gimenez-Roqueplo, A.-P., Piche, A., Chevalier, S., McKercher, G., Birsoy, K., Barnett, G., Brewer, C., Farver, C., Naska, T., Pennell, N.A., Raymond, D., Schilero, C., Smolenski, K., Williams, F., Morrison, C., Borgia, J.A., Liptay, M.J., Pool, M., Seder, C.W., Junker, K., Omberg, L., Dinkin, M., Manikhas, G., Alvaro, D., Bragazzi, M.C., Cardinale, V., Carpino, G., Gaudio, E., Chesla, D., Cottingham, S., Dubina, M., Moiseenko, F., Dhanasekaran, R., Becker, K.-F., Janssen, K.-P., Slotta-Huspenina, J., Abdel-Rahman, M.H., Aziz, D., Bell, S., Cebulla, C.M., Davis, A., Duell, R., Elder, J.B., Hilty, J., Kumar, B., Lang, J., Lehman, N.L., Mandt, R., Nguyen, P., Pilarski, R., Rai, K., Schoenfield, L., Senecal, K., Wakely, P., Hansen, P., Lechan, R., Powers, J., Tischler, A., Grizzle, W.E., Sexton, K.C., Kastl, A., Henderson, J., Porten, S., Waldmann, J., Fassnacht, M., Asa, S.L., Schadendorf, D., Couce, M., Graefen, M., Huland, H., Sauter, G., Schlomm, T., Simon, R., Tennstedt, P., Olabode, O., Nelson, M., Bathe, O., Carroll, P.R., Chan, J.M., Disaia, P., Glenn, P., Kelley, R.K., Landen, C.N., Phillips, J., Prados, M., Simko, J., Smith-McCune, K., VandenBerg, S., Roggin, K., Fehrenbach, A., Kendler, A., Sifri, S., Steele, R., Jimeno, A., Carey, F., Forgie, I., Mannelli, M., Carney, M., Hernandez, B., Campos, B., Herold-Mende, C., Jungk, C., Unterberg, A., Von Deimling, A., Bossler, A., Galbraith, J., Jacobus, L., Knudson, M., Knutson, T., Ma, D., Milhem, M., Sigmund, R., Godwin, A.K., Madan, R., Rosenthal, H.G., Adebamowo, C., Adebamowo, S.N., Boussioutas, A., Beer, D., Giordano, T., Mes-Masson, A.-M., Saad, F., Bocklage, T., Landrum, L., Mannel, R., Moore, K., Moxley, K., Postier, R., Walker, J., Zuna, R., Feldman, M., Valdivieso, F., Dhir, R., Luketich, J., Pinero, E.M.M., Quintero-Aguilo, M., Carlotti, C.G., Dos Santos, J.S., Kemp, R., Sankarankuty, A., Tirapelli, D., Catto, J., Agnew, K., Swisher, E., Creaney, J., Robinson, B., Shelley, C.S., Godwin, E.M., Kendall, S., Shipman, C., Bradford, C., Carey, T., Haddad, A., Moyer, J., Peterson, L., Prince, M., Rozek, L., Wolf, G., Bowman, R., Fong, K.M., Yang, I., Korst, R., Rathmell, W.K., Fantacone-Campbell, J.L., Hooke, J.A., Kovatich, A.J., Shriver, C.D., DiPersio, J., Drake, B., Govindan, R., Heath, S., Ley, T., Van Tine, B., Westervelt, P., Rubin, M.A., Lee, J.I., Aredes, N.D., Mariamidze, A., Stuart, J.M., Benz, C.C., Laird, P.W.: Cell-of-origin patterns dominate the molecular classification of 10,000 tumors from 33 types of cancer. Cell 173(2), 291–3046 (2018). https://doi.org/10.1016/j.cell.2018.03.022</w:t>
+      </w:r>
+    </w:p>
+    <w:p>
+      <w:pPr>
+        <w:spacing w:after="60"/>
+        <w:ind w:left="312" w:hanging="312"/>
+      </w:pPr>
+      <w:r>
+        <w:rPr>
+          <w:rFonts w:ascii="Times New Roman" w:hAnsi="Times New Roman" w:eastAsia="Times New Roman"/>
+          <w:b w:val="0"/>
+          <w:i w:val="0"/>
+          <w:sz w:val="18"/>
+        </w:rPr>
+        <w:t>[29] The Cancer Genome Atlas Research Network: Comprehensive molecular profiling of lung adenocarcinoma. Nature 511(7511), 543–550 (2014). https://doi.org/10.1038/nature13385</w:t>
+      </w:r>
+    </w:p>
+    <w:p>
+      <w:pPr>
+        <w:spacing w:after="60"/>
+        <w:ind w:left="312" w:hanging="312"/>
+      </w:pPr>
+      <w:r>
+        <w:rPr>
+          <w:rFonts w:ascii="Times New Roman" w:hAnsi="Times New Roman" w:eastAsia="Times New Roman"/>
+          <w:b w:val="0"/>
+          <w:i w:val="0"/>
+          <w:sz w:val="18"/>
+        </w:rPr>
+        <w:t>[30] The Cancer Genome Atlas Research Network: Comprehensive genomic characterization of squamous cell lung cancers. Nature 489(7417), 519–525 (2012). https://doi.org/10.1038/nature11404</w:t>
+      </w:r>
+    </w:p>
+    <w:p>
+      <w:pPr>
+        <w:spacing w:after="60"/>
+        <w:ind w:left="312" w:hanging="312"/>
+      </w:pPr>
+      <w:r>
+        <w:rPr>
+          <w:rFonts w:ascii="Times New Roman" w:hAnsi="Times New Roman" w:eastAsia="Times New Roman"/>
+          <w:b w:val="0"/>
+          <w:i w:val="0"/>
+          <w:sz w:val="18"/>
+        </w:rPr>
+        <w:t>[31] Thorsson, V., Gibbs, D.L., Brown, S.D., Wolf, D., Bortone, D.S., Ou Yang, T.-H., Porta-Pardo, E., Gao, G.F., Plaisier, C.L., Eddy, J.A., Ziv, E., Culhane, A.C., Paull, E.O., Sivakumar, I.K.A., Gentles, A.J., Malhotra, R., Farshidfar, F., Colaprico, A., Parker, J.S., Mose, L.E., Vo, N.S., Liu, J., Liu, Y., Rader, J., Dhankani, V., Reynolds, S.M., Bowlby, R., Califano, A., Cherniack, A.D., Anastassiou, D., Bedognetti, D., Mokrab, Y., Newman, A.M., Rao, A., Chen, K., Krasnitz, A., Hu, H., Malta, T.M., Noushmehr, H., Pedamallu, C.S., Bullman, S., Ojesina, A.I., Lamb, A., Zhou, W., Shen, H., Choueiri, T.K., Weinstein, J.N., Guinney, J., Saltz, J., Holt, R.A., Rabkin, C.S., Caesar-Johnson, S.J., Demchok, J.A., Felau, I., Kasapi, M., Ferguson, M.L., Hutter, C.M., Sofia, H.J., Tarnuzzer, R., Wang, Z., Yang, L., Zenklusen, J.C., Zhang, J.J., Chudamani, S., Liu, J., Lolla, L., Naresh, R., Pihl, T., Sun, Q., Wan, Y., Wu, Y., Cho, J., DeFreitas, T., Frazer, S., Gehlenborg, N., Getz, G., Heiman, D.I., Kim, J., Lawrence, M.S., Lin, P., Meier, S., Noble, M.S., Saksena, G., Voet, D., Zhang, H., Bernard, B., Chambwe, N., Dhankani, V., Knijnenburg, T., Kramer, R., Leinonen, K., Liu, Y., Miller, M., Reynolds, S., Shmulevich, I., Thorsson, V., Zhang, W., Akbani, R., Broom, B.M., Hegde, A.M., Ju, Z., Kanchi, R.S., Korkut, A., Li, J., Liang, H., Ling, S., Liu, W., Lu, Y., Mills, G.B., Ng, K.-S., Rao, A., Ryan, M., Wang, J., Weinstein, J.N., Zhang, J., Abeshouse, A., Armenia, J., Chakravarty, D., Chatila, W.K., De Bruijn, I., Gao, J., Gross, B.E., Heins, Z.J., Kundra, R., La, K., Ladanyi, M., Luna, A., Nissan, M.G., Ochoa, A., Phillips, S.M., Reznik, E., Sanchez-Vega, F., Sander, C., Schultz, N., Sheridan, R., Sumer, S.O., Sun, Y., Taylor, B.S., Wang, J., Zhang, H., Anur, P., Peto, M., Spellman, P., Benz, C., Stuart, J.M., Wong, C.K., Yau, C., Hayes, D.N., Parker, J.S., Wilkerson, M.D., Ally, A., Balasundaram, M., Bowlby, R., Brooks, D., Carlsen, R., Chuah, E., Dhalla, N., Holt, R., Jones, S.J.M., Kasaian, K., Lee, D., Ma, Y., Marra, M.A., Mayo, M., Moore, R.A., Mungall, A.J., Mungall, K., Robertson, A.G., Sadeghi, S., Schein, J.E., Sipahimalani, P., Tam, A., Thiessen, N., Tse, K., Wong, T., Berger, A.C., Beroukhim, R., Cherniack, A.D., Cibulskis, C., Gabriel, S.B., Gao, G.F., Ha, G., Meyerson, M., Schumacher, S.E., Shih, J., Kucherlapati, M.H., Kucherlapati, R.S., Baylin, S., Cope, L., Danilova, L., Bootwalla, M.S., Lai, P.H., Maglinte, D.T., Van Den Berg, D.J., Weisenberger, D.J., Auman, J.T., Balu, S., Bodenheimer, T., Fan, C., Hoadley, K.A., Hoyle, A.P., Jefferys, S.R., Jones, C.D., Meng, S., Mieczkowski, P.A., Mose, L.E., Perou, A.H., Perou, C.M., Roach, J., Shi, Y., Simons, J.V., Skelly, T., Soloway, M.G., Tan, D., Veluvolu, U., Fan, H., Hinoue, T., Laird, P.W., Shen, H., Zhou, W., Bellair, M., Chang, K., Covington, K., Creighton, C.J., Dinh, H., Doddapaneni, H., Donehower, L.A., Drummond, J., Gibbs, R.A., Glenn, R., Hale, W., Han, Y., Hu, J., Korchina, V., Lee, S., Lewis, L., Li, W., Liu, X., Morgan, M., Morton, D., Muzny, D., Santibanez, J., Sheth, M., Shinbrot, E., Wang, L., Wang, M., Wheeler, D.A., Xi, L., Zhao, F., Hess, J., Appelbaum, E.L., Bailey, M., Cordes, M.G., Ding, L., Fronick, C.C., Fulton, L.A., Fulton, R.S., Kandoth, C., Mardis, E.R., McLellan, M.D., Miller, C.A., Schmidt, H.K., Wilson, R.K., Crain, D., Curley, E., Gardner, J., Lau, K., Mallery, D., Morris, S., Paulauskis, J., Penny, R., Shelton, C., Shelton, T., Sherman, M., Thompson, E., Yena, P., Bowen, J., Gastier-Foster, J.M., Gerken, M., Leraas, K.M., Lichtenberg, T.M., Ramirez, N.C., Wise, L., Zmuda, E., Corcoran, N., Costello, T., Hovens, C., Carvalho, A.L., De Carvalho, A.C., Fregnani, J.H., Longatto-Filho, A., Reis, R.M., Scapulatempo-Neto, C., Silveira, H.C.S., Vidal, D.O., Burnette, A., Eschbacher, J., Hermes, B., Noss, A., Singh, R., Anderson, M.L., Castro, P.D., Ittmann, M., Huntsman, D., Kohl, B., Le, X., Thorp, R., Andry, C., Duffy, E.R., Lyadov, V., Paklina, O., Setdikova, G., Shabunin, A., Tavobilov, M., McPherson, C., Warnick, R., Berkowitz, R., Cramer, D., Feltmate, C., Horowitz, N., Kibel, A., Muto, M., Raut, C.P., Malykh, A., Barnholtz-Sloan, J.S., Barrett, W., Devine, K., Fulop, J., Ostrom, Q.T., Shimmel, K., Wolinsky, Y., Sloan, A.E., De Rose, A., Giuliante, F., Goodman, M., Karlan, B.Y., Hagedorn, C.H., Eckman, J., Harr, J., Myers, J., Tucker, K., Zach, L.A., Deyarmin, B., Hu, H., Kvecher, L., Larson, C., Mural, R.J., Somiari, S., Vicha, A., Zelinka, T., Bennett, J., Iacocca, M., Rabeno, B., Swanson, P., Latour, M., Lacombe, L., T\^etu, B., Bergeron, A., McGraw, M., Staugaitis, S.M., Chabot, J., Hibshoosh, H., Sepulveda, A., Su, T., Wang, T., Potapova, O., Voronina, O., Desjardins, L., Mariani, O., Roman-Roman, S., Sastre, X., Stern, M.-H., Cheng, F., Signoretti, S., Berchuck, A., Bigner, D., Lipp, E., Marks, J., McCall, S., McLendon, R., Secord, A., Sharp, A., Behera, M., Brat, D.J., Chen, A., Delman, K., Force, S., Khuri, F., Magliocca, K., Maithel, S., Olson, J.J., Owonikoko, T., Pickens, A., Ramalingam, S., Shin, D.M., Sica, G., Van Meir, E.G., Zhang, H., Eijckenboom, W., Gillis, A., Korpershoek, E., Looijenga, L., Oosterhuis, W., Stoop, H., Van Kessel, K.E., Zwarthoff, E.C., Calatozzolo, C., Cuppini, L., Cuzzubbo, S., DiMeco, F., Finocchiaro, G., Mattei, L., Perin, A., Pollo, B., Chen, C., Houck, J., Lohavanichbutr, P., Hartmann, A., Stoehr, C., Stoehr, R., Taubert, H., Wach, S., Wullich, B., Kycler, W., Murawa, D., Wiznerowicz, M., Chung, K., Edenfield, W.J., Martin, J., Baudin, E., Bubley, G., Bueno, R., De Rienzo, A., Richards, W.G., Kalkanis, S., Mikkelsen, T., Noushmehr, H., Scarpace, L., Girard, N., Aymerich, M., Campo, E., Gine, E., Guillermo, A.L., Van Bang, N., Hanh, P.T., Phu, B.D., Tang, Y., Colman, H., Evason, K., Dottino, P.R., Martignetti, J.A., Gabra, H., Juhl, H., Akeredolu, T., Stepa, S., Hoon, D., Ahn, K., Kang, K.J., Beuschlein, F., Breggia, A., Birrer, M., Bell, D., Borad, M., Bryce, A.H., Castle, E., Chandan, V., Cheville, J., Copland, J.A., Farnell, M., Flotte, T., Giama, N., Ho, T., Kendrick, M., Kocher, J.-P., Kopp, K., Moser, C., Nagorney, D., O'Brien, D., O'Neill, B.P., Patel, T., Petersen, G., Que, F., Rivera, M., Roberts, L., Smallridge, R., Smyrk, T., Stanton, M., Thompson, R.H., Torbenson, M., Yang, J.D., Zhang, L., Brimo, F., Ajani, J.A., Gonzalez, A.M.A., Behrens, C., Bondaruk, J., Broaddus, R., Czerniak, B., Esmaeli, B., Fujimoto, J., Gershenwald, J., Guo, C., Lazar, A.J., Logothetis, C., Meric-Bernstam, F., Moran, C., Ramondetta, L., Rice, D., Sood, A., Tamboli, P., Thompson, T., Troncoso, P., Tsao, A., Wistuba, I., Carter, C., Haydu, L., Hersey, P., Jakrot, V., Kakavand, H., Kefford, R., Lee, K., Long, G., Mann, G., Quinn, M., Saw, R., Scolyer, R., Shannon, K., Spillane, A., Stretch, O., Synott, M., Thompson, J., Wilmott, J., Al-Ahmadie, H., Chan, T.A., Ghossein, R., Gopalan, A., Levine, D.A., Reuter, V., Singer, S., Singh, B., Tien, N.V., Broudy, T., Mirsaidi, C., Nair, P., Drwiega, P., Miller, J., Smith, J., Zaren, H., Park, J.-W., Hung, N.P., Kebebew, E., Linehan, W.M., Metwalli, A.R., Pacak, K., Pinto, P.A., Schiffman, M., Schmidt, L.S., Vocke, C.D., Wentzensen, N., Worrell, R., Yang, H., Moncrieff, M., Goparaju, C., Melamed, J., Pass, H., Botnariuc, N., Caraman, I., Cernat, M., Chemencedji, I., Clipca, A., Doruc, S., Gorincioi, G., Mura, S., Pirtac, M., Stancul, I., Tcaciuc, D., Albert, M., Alexopoulou, I., Arnaout, A., Bartlett, J., Engel, J., Gilbert, S., Parfitt, J., Sekhon, H., Thomas, G., Rassl, D.M., Rintoul, R.C., Bifulco, C., Tamakawa, R., Urba, W., Hayward, N., Timmers, H., Antenucci, A., Facciolo, F., Grazi, G., Marino, M., Merola, R., De Krijger, R., Gimenez-Roqueplo, A.-P., Piche, A., Chevalier, S., McKercher, G., Birsoy, K., Barnett, G., Brewer, C., Farver, C., Naska, T., Pennell, N.A., Raymond, D., Schilero, C., Smolenski, K., Williams, F., Morrison, C., Borgia, J.A., Liptay, M.J., Pool, M., Seder, C.W., Junker, K., Omberg, L., Dinkin, M., Manikhas, G., Alvaro, D., Bragazzi, M.C., Cardinale, V., Carpino, G., Gaudio, E., Chesla, D., Cottingham, S., Dubina, M., Moiseenko, F., Dhanasekaran, R., Becker, K.-F., Janssen, K.-P., Slotta-Huspenina, J., Abdel-Rahman, M.H., Aziz, D., Bell, S., Cebulla, C.M., Davis, A., Duell, R., Elder, J.B., Hilty, J., Kumar, B., Lang, J., Lehman, N.L., Mandt, R., Nguyen, P., Pilarski, R., Rai, K., Schoenfield, L., Senecal, K., Wakely, P., Hansen, P., Lechan, R., Powers, J., Tischler, A., Grizzle, W.E., Sexton, K.C., Kastl, A., Henderson, J., Porten, S., Waldmann, J., Fassnacht, M., Asa, S.L., Schadendorf, D., Couce, M., Graefen, M., Huland, H., Sauter, G., Schlomm, T., Simon, R., Tennstedt, P., Olabode, O., Nelson, M., Bathe, O., Carroll, P.R., Chan, J.M., Disaia, P., Glenn, P., Kelley, R.K., Landen, C.N., Phillips, J., Prados, M., Simko, J., Smith-McCune, K., VandenBerg, S., Roggin, K., Fehrenbach, A., Kendler, A., Sifri, S., Steele, R., Jimeno, A., Carey, F., Forgie, I., Mannelli, M., Carney, M., Hernandez, B., Campos, B., Herold-Mende, C., Jungk, C., Unterberg, A., Von Deimling, A., Bossler, A., Galbraith, J., Jacobus, L., Knudson, M., Knutson, T., Ma, D., Milhem, M., Sigmund, R., Godwin, A.K., Madan, R., Rosenthal, H.G., Adebamowo, C., Adebamowo, S.N., Boussioutas, A., Beer, D., Giordano, T., Mes-Masson, A.-M., Saad, F., Bocklage, T., Landrum, L., Mannel, R., Moore, K., Moxley, K., Postier, R., Walker, J., Zuna, R., Feldman, M., Valdivieso, F., Dhir, R., Luketich, J., Pinero, E.M.M., Quintero-Aguilo, M., Carlotti, C.G., Dos Santos, J.S., Kemp, R., Sankarankuty, A., Tirapelli, D., Catto, J., Agnew, K., Swisher, E., Creaney, J., Robinson, B., Shelley, C.S., Godwin, E.M., Kendall, S., Shipman, C., Bradford, C., Carey, T., Haddad, A., Moyer, J., Peterson, L., Prince, M., Rozek, L., Wolf, G., Bowman, R., Fong, K.M., Yang, I., Korst, R., Rathmell, W.K., Fantacone-Campbell, J.L., Hooke, J.A., Kovatich, A.J., Shriver, C.D., DiPersio, J., Drake, B., Govindan, R., Heath, S., Ley, T., Van Tine, B., Westervelt, P., Rubin, M.A., Lee, J.I., Aredes, N.D., Mariamidze, A., Lazar, A.J., Serody, J.S., Demicco, E.G., Disis, M.L., Vincent, B.G., Shmulevich, I.: The immune landscape of cancer. Immunity 48(4), 812–83014 (2018). https://doi.org/10.1016/j.immuni.2018.03.023</w:t>
+      </w:r>
+    </w:p>
+    <w:p>
+      <w:pPr>
+        <w:spacing w:after="60"/>
+        <w:ind w:left="312" w:hanging="312"/>
+      </w:pPr>
+      <w:r>
+        <w:rPr>
+          <w:rFonts w:ascii="Times New Roman" w:hAnsi="Times New Roman" w:eastAsia="Times New Roman"/>
+          <w:b w:val="0"/>
+          <w:i w:val="0"/>
+          <w:sz w:val="18"/>
+        </w:rPr>
+        <w:t>[32] Zhang, L., Li, Z., Skrzypczynska, K.M., Fang, Q., Zhang, W., O'Brien, S.A., He, Y., Wang, L., Zhang, Q., Kim, A., Gao, R., Orf, J., Wang, T., Sawant, D., Kang, J., Bhatt, D., Lu, D., Li, C.-M., Rapaport, A.S., Perez, K., Ye, Y., Wang, S., Hu, X., Ren, X., Ouyang, W., Shen, Z., Egen, J.G., Zhang, Z., Yu, X.: Single-cell analyses inform mechanisms of myeloid-targeted therapies in colon cancer. Cell 181(2), 442–45929 (2020). https://doi.org/10.1016/j.cell.2020.03.048</w:t>
+      </w:r>
+    </w:p>
+    <w:p>
+      <w:pPr>
+        <w:spacing w:after="60"/>
+        <w:ind w:left="312" w:hanging="312"/>
+      </w:pPr>
+      <w:r>
+        <w:rPr>
+          <w:rFonts w:ascii="Times New Roman" w:hAnsi="Times New Roman" w:eastAsia="Times New Roman"/>
+          <w:b w:val="0"/>
+          <w:i w:val="0"/>
+          <w:sz w:val="18"/>
+        </w:rPr>
+        <w:t>[33] Davey Smith, G., Ebrahim, S.: `mendelian randomization': Can genetic epidemiology contribute to understanding environmental determinants of disease?*. International Journal of Epidemiology 32(1), 1–22 (2003). https://doi.org/10.1093/ije/dyg070</w:t>
+      </w:r>
+    </w:p>
+    <w:p>
+      <w:pPr>
+        <w:spacing w:after="60"/>
+        <w:ind w:left="312" w:hanging="312"/>
+      </w:pPr>
+      <w:r>
+        <w:rPr>
+          <w:rFonts w:ascii="Times New Roman" w:hAnsi="Times New Roman" w:eastAsia="Times New Roman"/>
+          <w:b w:val="0"/>
+          <w:i w:val="0"/>
+          <w:sz w:val="18"/>
+        </w:rPr>
+        <w:t>[34] Hagberg, A., Swart, P., Chult, D.: Exploring network structure, dynamics, and function using NetworkX. In: Proceedings of the 7th Python in Science Conference. (2008). https://doi.org/10.25080/TCWV9851</w:t>
+      </w:r>
+    </w:p>
+    <w:p>
+      <w:pPr>
+        <w:spacing w:after="60"/>
+        <w:ind w:left="312" w:hanging="312"/>
+      </w:pPr>
+      <w:r>
+        <w:rPr>
+          <w:rFonts w:ascii="Times New Roman" w:hAnsi="Times New Roman" w:eastAsia="Times New Roman"/>
+          <w:b w:val="0"/>
+          <w:i w:val="0"/>
+          <w:sz w:val="18"/>
+        </w:rPr>
+        <w:t>[35] Vosa, U., Claringbould, A., Westra, H.-J., Bonder, M.J., Deelen, P., Zeng, B., Kirsten, H., Saha, A., Kreuzhuber, R., Yazar, S., Brugge, H., Oelen, R., De Vries, D.H., Van Der Wijst, M.G.P., Kasela, S., Pervjakova, N., Alves, I., Fave, M.-J., Agbessi, M., Christiansen, M.W., Jansen, R., Seppala, I., Tong, L., Teumer, A., Schramm, K., Hemani, G., Verlouw, J., Yaghootkar, H., Sonmez Flitman, R., Brown, A., Kukushkina, V., Kalnapenkis, A., Rueger, S., Porcu, E., Kronberg, J., Kettunen, J., Lee, B., Zhang, F., Qi, T., Hernandez, J.A., Arindrarto, W., Beutner, F., BIOS Consortium, 'T Hoen, P.A.C., Van Meurs, J., Van Dongen, J., Van Iterson, M., Swertz, M.A., i2QTL Consortium, Jan Bonder, M., Dmitrieva, J., Elansary, M., Fairfax, B.P., Georges, M., Heijmans, B.T., Hewitt, A.W., Kahonen, M., Kim, Y., Knight, J.C., Kovacs, P., Krohn, K., Li, S., Loeffler, M., Marigorta, U.M., Mei, H., Momozawa, Y., Muller-Nurasyid, M., Nauck, M., Nivard, M.G., Penninx, B.W.J.H., Pritchard, J.K., Raitakari, O.T., Rotzschke, O., Slagboom, E.P., Stehouwer, C.D.A., Stumvoll, M., Sullivan, P., 'T Hoen, P.A.C., Thiery, J., Tonjes, A., Van Dongen, J., Van Iterson, M., Veldink, J.H., Volker, U., Warmerdam, R., Wijmenga, C., Swertz, M., Andiappan, A., Montgomery, G.W., Ripatti, S., Perola, M., Kutalik, Z., Dermitzakis, E., Bergmann, S., Frayling, T., Van Meurs, J., Prokisch, H., Ahsan, H., Pierce, B.L., Lehtimaki, T., Boomsma, D.I., Psaty, B.M., Gharib, S.A., Awadalla, P., Milani, L., Ouwehand, W.H., Downes, K., Stegle, O., Battle, A., Visscher, P.M., Yang, J., Scholz, M., Powell, J., Gibson, G., Esko, T., Franke, L.: Large-scale cis- and trans-eQTL analyses identify thousands of genetic loci and polygenic scores that regulate blood gene expression. Nature Genetics 53(9), 1300–1310 (2021). https://doi.org/10.1038/s41588-021-00913-z</w:t>
+      </w:r>
+    </w:p>
+    <w:p>
+      <w:pPr>
+        <w:spacing w:after="60"/>
+        <w:ind w:left="312" w:hanging="312"/>
+      </w:pPr>
+      <w:r>
+        <w:rPr>
+          <w:rFonts w:ascii="Times New Roman" w:hAnsi="Times New Roman" w:eastAsia="Times New Roman"/>
+          <w:b w:val="0"/>
+          <w:i w:val="0"/>
+          <w:sz w:val="18"/>
+        </w:rPr>
+        <w:t>[36] Zhu, Z., Zhang, F., Hu, H., Bakshi, A., Robinson, M.R., Powell, J.E., Montgomery, G.W., Goddard, M.E., Wray, N.R., Visscher, P.M., Yang, J.: Integration of summary data from GWAS and eQTL studies predicts complex trait gene targets. Nature Genetics 48(5), 481–487 (2016). https://doi.org/10.1038/ng.3538</w:t>
+      </w:r>
+    </w:p>
+    <w:p>
+      <w:pPr>
+        <w:spacing w:after="60"/>
+        <w:ind w:left="312" w:hanging="312"/>
+      </w:pPr>
+      <w:r>
+        <w:rPr>
+          <w:rFonts w:ascii="Times New Roman" w:hAnsi="Times New Roman" w:eastAsia="Times New Roman"/>
+          <w:b w:val="0"/>
+          <w:i w:val="0"/>
+          <w:sz w:val="18"/>
+        </w:rPr>
+        <w:t>[37] McKinney, W.: Data structures for statistical computing in python. SciPy 2010 (2010). https://doi.org/10.25080/Majora-92bf1922-00a</w:t>
+      </w:r>
+    </w:p>
+    <w:p>
+      <w:pPr>
+        <w:spacing w:after="60"/>
+        <w:ind w:left="312" w:hanging="312"/>
+      </w:pPr>
+      <w:r>
+        <w:rPr>
+          <w:rFonts w:ascii="Times New Roman" w:hAnsi="Times New Roman" w:eastAsia="Times New Roman"/>
+          <w:b w:val="0"/>
+          <w:i w:val="0"/>
+          <w:sz w:val="18"/>
+        </w:rPr>
+        <w:t>[38] Harris, C.R., Millman, K.J., van der Walt, S.J., Gommers, R., Virtanen, P., Cournapeau, D., Wieser, E., Taylor, J., Berg, S., Smith, N.J., Kern, R., Picus, M., Hoyer, S., van Kerkwijk, M.H., Brett, M., Haldane, A., del Rio, J.F., Wiebe, M., Peterson, P., Gerard-Marchant, P., Sheppard, K., Reddy, T., Weckesser, W., Abbasi, H., Gohlke, C., Oliphant, T.E.: Array programming with NumPy. Nature 585(7825), 357–362 (2020). https://doi.org/10.1038/s41586-020-2649-2</w:t>
+      </w:r>
+    </w:p>
+    <w:p>
+      <w:pPr>
+        <w:spacing w:after="60"/>
+        <w:ind w:left="312" w:hanging="312"/>
+      </w:pPr>
+      <w:r>
+        <w:rPr>
+          <w:rFonts w:ascii="Times New Roman" w:hAnsi="Times New Roman" w:eastAsia="Times New Roman"/>
+          <w:b w:val="0"/>
+          <w:i w:val="0"/>
+          <w:sz w:val="18"/>
+        </w:rPr>
+        <w:t>[39] Virtanen, P., Gommers, R., Oliphant, T.E., Haberland, M., Reddy, T., Cournapeau, D., Burovski, E., Peterson, P., Weckesser, W., Bright, J., Van Der Walt, S.J., Brett, M., Wilson, J., Millman, K.J., Mayorov, N., Nelson, A.R.J., Jones, E., Kern, R., Larson, E., Carey, C.J., Polat, \. I., Feng, Y., Moore, E.W., VanderPlas, J., Laxalde, D., Perktold, J., Cimrman, R., Henriksen, I., Quintero, E.A., Harris, C.R., Archibald, A.M., Ribeiro, A.H., Pedregosa, F., Van Mulbregt, P., SciPy 1.0 Contributors, Vijaykumar, A., Bardelli, A.P., Rothberg, A., Hilboll, A., Kloeckner, A., Scopatz, A., Lee, A., Rokem, A., Woods, C.N., Fulton, C., Masson, C., Haggstrom, C., Fitzgerald, C., Nicholson, D.A., Hagen, D.R., Pasechnik, D.V., Olivetti, E., Martin, E., Wieser, E., Silva, F., Lenders, F., Wilhelm, F., Young, G., Price, G.A., Ingold, G.-L., Allen, G.E., Lee, G.R., Audren, H., Probst, I., Dietrich, J.P., Silterra, J., Webber, J.T., Slavi c, J., Nothman, J., Buchner, J., Kulick, J., Schonberger, J.L., De Miranda Cardoso, J.V., Reimer, J., Harrington, J., Rodriguez, J.L.C., Nunez-Iglesias, J., Kuczynski, J., Tritz, K., Thoma, M., Newville, M., Kummerer, M., Bolingbroke, M., Tartre, M., Pak, M., Smith, N.J., Nowaczyk, N., Shebanov, N., Pavlyk, O., Brodtkorb, P.A., Lee, P., McGibbon, R.T., Feldbauer, R., Lewis, S., Tygier, S., Sievert, S., Vigna, S., Peterson, S., More, S., Pudlik, T., Oshima, T., Pingel, T.J., Robitaille, T.P., Spura, T., Jones, T.R., Cera, T., Leslie, T., Zito, T., Krauss, T., Upadhyay, U., Halchenko, Y.O., V\'azquez-Baeza, Y.: SciPy 1.0: Fundamental algorithms for scientific computing in python. Nature Methods 17(3), 261–272 (2020). https://doi.org/10.1038/s41592-019-0686-2</w:t>
+      </w:r>
+    </w:p>
+    <w:p>
+      <w:pPr>
+        <w:spacing w:after="60"/>
+        <w:ind w:left="312" w:hanging="312"/>
+      </w:pPr>
+      <w:r>
+        <w:rPr>
+          <w:rFonts w:ascii="Times New Roman" w:hAnsi="Times New Roman" w:eastAsia="Times New Roman"/>
+          <w:b w:val="0"/>
+          <w:i w:val="0"/>
+          <w:sz w:val="18"/>
+        </w:rPr>
+        <w:t>[40] Hunter, J.D.: Matplotlib: A 2D graphics environment. Computing in Science &amp; Engineering 9(3), 90–95 (2007). https://doi.org/10.1109/MCSE.2007.55</w:t>
+      </w:r>
+    </w:p>
+    <w:p>
+      <w:pPr>
+        <w:spacing w:after="60"/>
+        <w:ind w:left="312" w:hanging="312"/>
+      </w:pPr>
+      <w:r>
+        <w:rPr>
+          <w:rFonts w:ascii="Times New Roman" w:hAnsi="Times New Roman" w:eastAsia="Times New Roman"/>
+          <w:b w:val="0"/>
+          <w:i w:val="0"/>
+          <w:sz w:val="18"/>
+        </w:rPr>
+        <w:t>[41] Waskom, M.: Seaborn: Statistical data visualization. Journal of Open Source Software 6(60), 3021 (2021). https://doi.org/10.21105/joss.03021</w:t>
+      </w:r>
+    </w:p>
+    <w:p>
+      <w:pPr>
+        <w:spacing w:after="60"/>
+        <w:ind w:left="312" w:hanging="312"/>
+      </w:pPr>
+      <w:r>
+        <w:rPr>
+          <w:rFonts w:ascii="Times New Roman" w:hAnsi="Times New Roman" w:eastAsia="Times New Roman"/>
+          <w:b w:val="0"/>
+          <w:i w:val="0"/>
+          <w:sz w:val="18"/>
+        </w:rPr>
+        <w:t>[42] Pedregosa, F., Varoquaux, G., Gramfort, A., Michel, V., Thirion, B., Grisel, O., Blondel, M., Prettenhofer, P., Weiss, R., Dubourg, V., Vanderplas, J., Passos, A., Cournapeau, D., Brucher, M., Perrot, M., Duchesnay, \'E.: Scikit-learn: Machine learning in python. J. Mach. Learn. Res. 12(null), 2825–2830 (2011).</w:t>
+      </w:r>
+    </w:p>
+    <w:p>
+      <w:pPr>
+        <w:spacing w:after="60"/>
+        <w:ind w:left="312" w:hanging="312"/>
+      </w:pPr>
+      <w:r>
+        <w:rPr>
+          <w:rFonts w:ascii="Times New Roman" w:hAnsi="Times New Roman" w:eastAsia="Times New Roman"/>
+          <w:b w:val="0"/>
+          <w:i w:val="0"/>
+          <w:sz w:val="18"/>
+        </w:rPr>
+        <w:t>[43] Tang, Z., Kang, B., Li, C., Chen, T., Zhang, Z.: GEPIA2: An enhanced web server for large-scale expression profiling and interactive analysis. Nucleic Acids Research 47(W1), 556–560 (2019). https://doi.org/10.1093/nar/gkz430</w:t>
+      </w:r>
+    </w:p>
+    <w:p>
+      <w:pPr>
+        <w:spacing w:after="60"/>
+        <w:ind w:left="312" w:hanging="312"/>
+      </w:pPr>
+      <w:r>
+        <w:rPr>
+          <w:rFonts w:ascii="Times New Roman" w:hAnsi="Times New Roman" w:eastAsia="Times New Roman"/>
+          <w:b w:val="0"/>
+          <w:i w:val="0"/>
+          <w:sz w:val="18"/>
+        </w:rPr>
+        <w:t>[44] Hemani, G., Zheng, J., Elsworth, B., Wade, K.H., Haberland, V., Baird, D., Laurin, C., Burgess, S., Bowden, J., Langdon, R., Tan, V.Y., Yarmolinsky, J., Shihab, H.A., Timpson, N.J., Evans, D.M., Relton, C., Martin, R.M., Davey Smith, G., Gaunt, T.R., Haycock, P.C.: The MR-base platform supports systematic causal inference across the human phenome. eLife 7, 34408 (2018). https://doi.org/10.7554/eLife.34408</w:t>
+      </w:r>
+    </w:p>
+    <w:p>
+      <w:pPr>
+        <w:spacing w:after="60"/>
+        <w:ind w:left="312" w:hanging="312"/>
+      </w:pPr>
+      <w:r>
+        <w:rPr>
+          <w:rFonts w:ascii="Times New Roman" w:hAnsi="Times New Roman" w:eastAsia="Times New Roman"/>
+          <w:b w:val="0"/>
+          <w:i w:val="0"/>
+          <w:sz w:val="18"/>
+        </w:rPr>
+        <w:t>[45] Pan, L., Luo, J., Nie, C., Fan, S., Wang, X., Peng, S., Liang, Q.: A deep learning framework integrating tumor microenvironmental features accurately predicts multiple driver gene mutations in lung cancer pathology images. Cancer Research (2025). https://doi.org/10.1158/0008-5472.CAN-25-0582</w:t>
+      </w:r>
+    </w:p>
+    <w:p>
+      <w:pPr>
+        <w:spacing w:after="60"/>
+        <w:ind w:left="312" w:hanging="312"/>
+      </w:pPr>
+      <w:r>
+        <w:rPr>
+          <w:rFonts w:ascii="Times New Roman" w:hAnsi="Times New Roman" w:eastAsia="Times New Roman"/>
+          <w:b w:val="0"/>
+          <w:i w:val="0"/>
+          <w:sz w:val="18"/>
+        </w:rPr>
+        <w:t>[46] Xu, H., Wang, S., Fang, M., Luo, S., Chen, C., Wan, S., Wang, R., Tang, M., Xue, T., Li, B., Lin, J., Qu, K.: SPACEL: Deep learning-based characterization of spatial transcriptome architectures. Nature Communications 14(1), 7603 (2023). https://doi.org/10.1038/s41467-023-43220-3</w:t>
+      </w:r>
+    </w:p>
+    <w:p>
+      <w:pPr>
+        <w:spacing w:after="60"/>
+        <w:ind w:left="312" w:hanging="312"/>
+      </w:pPr>
+      <w:r>
+        <w:rPr>
+          <w:rFonts w:ascii="Times New Roman" w:hAnsi="Times New Roman" w:eastAsia="Times New Roman"/>
+          <w:b w:val="0"/>
+          <w:i w:val="0"/>
+          <w:sz w:val="18"/>
+        </w:rPr>
+        <w:t>[47] Ravi, V.M., Will, P., Kueckelhaus, J., Sun, N., Joseph, K., Salie, H., Vollmer, L., Kuliesiute, U., von Ehr, J., Benotmane, J.K., Neidert, N., Follo, M., Scherer, F., Goeldner, J.M., Behringer, S.P., Franco, P., Khiat, M., Zhang, J., Hofmann, U.G., Fung, C., Ricklefs, F.L., Lamszus, K., Boerries, M., Ku, M., Beck, J., Sankowski, R., Schwabenland, M., Prinz, M., Schuller, U., Killmer, S., Bengsch, B., Walch, A.K., Delev, D., Schnell, O., Heiland, D.H.: Spatially resolved multi-omics deciphers bidirectional tumor-host interdependence in glioblastoma. Cancer Cell 40(6), 639–65513 (2022). https://doi.org/10.1016/j.ccell.2022.05.009</w:t>
+      </w:r>
+    </w:p>
+    <w:p>
+      <w:pPr>
+        <w:spacing w:after="60"/>
+        <w:ind w:left="312" w:hanging="312"/>
+      </w:pPr>
+      <w:r>
+        <w:rPr>
+          <w:rFonts w:ascii="Times New Roman" w:hAnsi="Times New Roman" w:eastAsia="Times New Roman"/>
+          <w:b w:val="0"/>
+          <w:i w:val="0"/>
+          <w:sz w:val="18"/>
+        </w:rPr>
+        <w:t>[48] Li, Q., Zhang, X., Ke, R.: https://doi.org/10.3389/fgene.2022.906158</w:t>
+      </w:r>
+    </w:p>
+    <w:p>
+      <w:pPr>
+        <w:spacing w:after="60"/>
+        <w:ind w:left="312" w:hanging="312"/>
+      </w:pPr>
+      <w:r>
+        <w:rPr>
+          <w:rFonts w:ascii="Times New Roman" w:hAnsi="Times New Roman" w:eastAsia="Times New Roman"/>
+          <w:b w:val="0"/>
+          <w:i w:val="0"/>
+          <w:sz w:val="18"/>
+        </w:rPr>
+        <w:t>[49] Petitprez, F., De Reyni\`es, A., Keung, E.Z., Chen, T.W.-W., Sun, C.-M., Calderaro, J., Jeng, Y.-M., Hsiao, L.-P., Lacroix, L., Bougouin, A., Moreira, M., Lacroix, G., Natario, I., Adam, J., Lucchesi, C., Laizet, Y., Toulmonde, M., Burgess, M.A., Bolejack, V., Reinke, D., Wani, K.M., Wang, W.-L., Lazar, A.J., Roland, C.L., Wargo, J.A., Italiano, A., Saut\`es-Fridman, C., Tawbi, H.A., Fridman, W.H.: B cells are associated with survival and immunotherapy response in sarcoma. Nature 577(7791), 556–560 (2020). https://doi.org/10.1038/s41586-019-1906-8</w:t>
+      </w:r>
+    </w:p>
+    <w:p>
+      <w:pPr>
+        <w:spacing w:after="60"/>
+        <w:ind w:left="312" w:hanging="312"/>
+      </w:pPr>
+      <w:r>
+        <w:rPr>
+          <w:rFonts w:ascii="Times New Roman" w:hAnsi="Times New Roman" w:eastAsia="Times New Roman"/>
+          <w:b w:val="0"/>
+          <w:i w:val="0"/>
+          <w:sz w:val="18"/>
+        </w:rPr>
+        <w:t>[50] Helmink, B.A., Reddy, S.M., Gao, J., Zhang, S., Basar, R., Thakur, R., Yizhak, K., Sade-Feldman, M., Blando, J., Han, G., Gopalakrishnan, V., Xi, Y., Zhao, H., Amaria, R.N., Tawbi, H.A., Cogdill, A.P., Liu, W., LeBleu, V.S., Kugeratski, F.G., Patel, S., Davies, M.A., Hwu, P., Lee, J.E., Gershenwald, J.E., Lucci, A., Arora, R., Woodman, S., Keung, E.Z., Gaudreau, P.-O., Reuben, A., Spencer, C.N., Burton, E.M., Haydu, L.E., Lazar, A.J., Zapassodi, R., Hudgens, C.W., Ledesma, D.A., Ong, S., Bailey, M., Warren, S., Rao, D., Krijgsman, O., Rozeman, E.A., Peeper, D., Blank, C.U., Schumacher, T.N., Butterfield, L.H., Zelazowska, M.A., McBride, K.M., Kalluri, R., Allison, J., Petitprez, F., Fridman, W.H., Saut\`es-Fridman, C., Hacohen, N., Rezvani, K., Sharma, P., Tetzlaff, M.T., Wang, L., Wargo, J.A.: B cells and tertiary lymphoid structures promote immunotherapy response. Nature 577(7791), 549–555 (2020). https://doi.org/10.1038/s41586-019-1922-8</w:t>
+      </w:r>
+    </w:p>
+    <w:p>
+      <w:pPr>
+        <w:spacing w:after="60"/>
+        <w:ind w:left="312" w:hanging="312"/>
+      </w:pPr>
+      <w:r>
+        <w:rPr>
+          <w:rFonts w:ascii="Times New Roman" w:hAnsi="Times New Roman" w:eastAsia="Times New Roman"/>
+          <w:b w:val="0"/>
+          <w:i w:val="0"/>
+          <w:sz w:val="18"/>
+        </w:rPr>
+        <w:t>[51] Rakaee, M., Tafavvoghi, M., Ricciuti, B., Alessi, J.V., Cortellini, A., Citarella, F., Nibid, L., Perrone, G., Adib, E., Fulgenzi, C.A.M., Hidalgo Filho, C.M., Di Federico, A., Jabar, F., Hashemi, S., Houda, I., Richardsen, E., Rasmussen Busund, L.-T., Donnem, T., Bahce, I., Pinato, D.J., Helland,., Sholl, L.M., Awad, M.M., Kwiatkowski, D.J.: Deep learning model for predicting immunotherapy response in advanced non-small cell lung cancer. JAMA oncology 11(2), 109–118 (2025). https://doi.org/10.1001/jamaoncol.2024.5356</w:t>
+      </w:r>
+    </w:p>
+    <w:p>
+      <w:pPr>
+        <w:spacing w:after="60"/>
+        <w:ind w:left="312" w:hanging="312"/>
+      </w:pPr>
+      <w:r>
+        <w:rPr>
+          <w:rFonts w:ascii="Times New Roman" w:hAnsi="Times New Roman" w:eastAsia="Times New Roman"/>
+          <w:sz w:val="18"/>
+        </w:rPr>
+        <w:t>[52] Barrett, T., Wilhite, S.E., Ledoux, P., Evangelista, C., Kim, I.F., Tomashevsky, M., Marshall, K.A., Phillippy, K.H., Sherman, P.M., Holko, M., Yefanov, A., Lee, H., Zhang, N., Robertson, C.L., Serova, N., Davis, S., Soboleva, A.: NCBI GEO: Archive for functional genomics data sets-update. Nucleic Acids Research 41(D1), 991–995 (2012). https://doi.org/10.1093/nar/gks1193</w:t>
+      </w:r>
+    </w:p>
+    <w:p>
+      <w:pPr>
+        <w:spacing w:after="60"/>
+        <w:ind w:left="312" w:hanging="312"/>
+      </w:pPr>
+      <w:r>
+        <w:rPr>
+          <w:rFonts w:ascii="Times New Roman" w:hAnsi="Times New Roman" w:eastAsia="Times New Roman"/>
+          <w:b w:val="0"/>
+          <w:i w:val="0"/>
+          <w:sz w:val="18"/>
+        </w:rPr>
+        <w:t>[53] Uhlen, M., Zhang, C., Lee, S., Sjostedt, E., Fagerberg, L., Bidkhori, G., Benfeitas, R., Arif, M., Liu, Z., Edfors, F., Sanli, K., Von Feilitzen, K., Oksvold, P., Lundberg, E., Hober, S., Nilsson, P., Mattsson, J., Schwenk, J.M., Brunnstrom, H., Glimelius, B., Sjoblom, T., Edqvist, P.-H., Djureinovic, D., Micke, P., Lindskog, C., Mardinoglu, A., Ponten, F.: A pathology atlas of the human cancer transcriptome. Science 357(6352), 2507 (2017). https://doi.org/10.1126/science.aan2507</w:t>
       </w:r>
     </w:p>
     <w:sectPr>

</xml_diff>

<commit_message>
Apply AMA references and verify citation metadata
</commit_message>
<xml_diff>
--- a/manuscript/main_manuscript.docx
+++ b/manuscript/main_manuscript.docx
@@ -264,11 +264,62 @@
       <w:r>
         <w:rPr>
           <w:rFonts w:ascii="Times New Roman" w:hAnsi="Times New Roman" w:eastAsia="Times New Roman"/>
-          <w:b w:val="0"/>
-          <w:i w:val="0"/>
-          <w:sz w:val="22"/>
-        </w:rPr>
-        <w:t>Non-small cell lung cancer (NSCLC) remains a major cause of cancer mortality, and immune checkpoint blockade has improved outcomes for a subset of patients [1–5]. However, PD-L1 expression, tumor mutational burden, and bulk immune-expression summaries do not fully capture the spatial and cellular organization of the tumor microenvironment (TME) [8, 9]. A central cancer-informatics problem is therefore not simply to build another retrospective classifier, but to determine whether candidate immune signals remain interpretable when traced across independent data types. Spatial transcriptomics and single-cell technologies now make it possible to examine whether immune programs visible in bulk data also map to spatial contexts that can be traced across available datasets [14–16].</w:t>
+          <w:sz w:val="22"/>
+        </w:rPr>
+        <w:t>Non-small cell lung cancer (NSCLC) remains a major cause of cancer mortality.</w:t>
+      </w:r>
+      <w:r>
+        <w:rPr>
+          <w:rFonts w:ascii="Times New Roman" w:hAnsi="Times New Roman" w:eastAsia="Times New Roman"/>
+          <w:sz w:val="22"/>
+          <w:vertAlign w:val="superscript"/>
+        </w:rPr>
+        <w:t>1-3</w:t>
+      </w:r>
+      <w:r>
+        <w:rPr>
+          <w:rFonts w:ascii="Times New Roman" w:hAnsi="Times New Roman" w:eastAsia="Times New Roman"/>
+          <w:sz w:val="22"/>
+        </w:rPr>
+        <w:t xml:space="preserve"> Immune checkpoint blockade has improved outcomes for a subset of patients.</w:t>
+      </w:r>
+      <w:r>
+        <w:rPr>
+          <w:rFonts w:ascii="Times New Roman" w:hAnsi="Times New Roman" w:eastAsia="Times New Roman"/>
+          <w:sz w:val="22"/>
+          <w:vertAlign w:val="superscript"/>
+        </w:rPr>
+        <w:t>4,5</w:t>
+      </w:r>
+      <w:r>
+        <w:rPr>
+          <w:rFonts w:ascii="Times New Roman" w:hAnsi="Times New Roman" w:eastAsia="Times New Roman"/>
+          <w:sz w:val="22"/>
+        </w:rPr>
+        <w:t xml:space="preserve"> However, PD-L1 expression, tumor mutational burden, and bulk immune-expression summaries do not fully capture the spatial and cellular organization of the tumor microenvironment (TME).</w:t>
+      </w:r>
+      <w:r>
+        <w:rPr>
+          <w:rFonts w:ascii="Times New Roman" w:hAnsi="Times New Roman" w:eastAsia="Times New Roman"/>
+          <w:sz w:val="22"/>
+          <w:vertAlign w:val="superscript"/>
+        </w:rPr>
+        <w:t>8,9</w:t>
+      </w:r>
+      <w:r>
+        <w:rPr>
+          <w:rFonts w:ascii="Times New Roman" w:hAnsi="Times New Roman" w:eastAsia="Times New Roman"/>
+          <w:sz w:val="22"/>
+        </w:rPr>
+        <w:t xml:space="preserve"> A central cancer-informatics problem is therefore not simply to build another retrospective classifier, but to determine whether candidate immune signals remain interpretable when traced across independent data types. Spatial transcriptomics and single-cell technologies now make it possible to examine whether immune programs visible in bulk data also map to spatial contexts that can be traced across available datasets.</w:t>
+      </w:r>
+      <w:r>
+        <w:rPr>
+          <w:rFonts w:ascii="Times New Roman" w:hAnsi="Times New Roman" w:eastAsia="Times New Roman"/>
+          <w:sz w:val="22"/>
+          <w:vertAlign w:val="superscript"/>
+        </w:rPr>
+        <w:t>14-16</w:t>
       </w:r>
     </w:p>
     <w:p>
@@ -428,11 +479,24 @@
       <w:r>
         <w:rPr>
           <w:rFonts w:ascii="Times New Roman" w:hAnsi="Times New Roman" w:eastAsia="Times New Roman"/>
-          <w:b w:val="0"/>
-          <w:i w:val="0"/>
-          <w:sz w:val="22"/>
-        </w:rPr>
-        <w:t>This study used a staged, retrospective public-data design [25–27]. The evidence hierarchy was defined before interpretation: (1) TCGA NSCLC was used for discovery, feature stability, and internal score-behavior assessment; (2) GEO cohorts were used for external prognostic traceability where complete follow-up was available; (3) Visium and CosMx SMI datasets were used to evaluate spatial context, with inference emphasized at the patient, section, or paired-contrast level; and (4) immunotherapy-treated cohorts were treated as exploratory response-association datasets because of small sample sizes and tumor-type heterogeneity (Figure fig:1). No external cohort was used to tune the feature set, select a clinical threshold, or upgrade the analysis to prospective validation.</w:t>
+          <w:sz w:val="22"/>
+        </w:rPr>
+        <w:t>This study used a staged, retrospective public-data design.</w:t>
+      </w:r>
+      <w:r>
+        <w:rPr>
+          <w:rFonts w:ascii="Times New Roman" w:hAnsi="Times New Roman" w:eastAsia="Times New Roman"/>
+          <w:sz w:val="22"/>
+          <w:vertAlign w:val="superscript"/>
+        </w:rPr>
+        <w:t>25-27</w:t>
+      </w:r>
+      <w:r>
+        <w:rPr>
+          <w:rFonts w:ascii="Times New Roman" w:hAnsi="Times New Roman" w:eastAsia="Times New Roman"/>
+          <w:sz w:val="22"/>
+        </w:rPr>
+        <w:t xml:space="preserve"> The evidence hierarchy was defined before interpretation: (1) TCGA NSCLC was used for discovery, feature stability, and internal score-behavior assessment; (2) GEO cohorts were used for external prognostic traceability where complete follow-up was available; (3) Visium and CosMx SMI datasets were used to evaluate spatial context, with inference emphasized at the patient, section, or paired-contrast level; and (4) immunotherapy-treated cohorts were treated as exploratory response-association datasets because of small sample sizes and tumor-type heterogeneity (Figure 1). No external cohort was used to tune the feature set, select a clinical threshold, or upgrade the analysis to prospective validation.</w:t>
       </w:r>
     </w:p>
     <w:bookmarkStart w:id="15" w:name="fig:1"/>
@@ -566,11 +630,24 @@
       <w:r>
         <w:rPr>
           <w:rFonts w:ascii="Times New Roman" w:hAnsi="Times New Roman" w:eastAsia="Times New Roman"/>
-          <w:b w:val="0"/>
-          <w:i w:val="0"/>
-          <w:sz w:val="22"/>
-        </w:rPr>
-        <w:t>Discovery Cohort (TCGA): TCGA LUAD and LUSC transcriptomic and clinical data were retrieved from the NCI Genomic Data Commons [28, 29]. A total of 1,100 TCGA NSCLC tumor samples were initially considered (595 LUAD and 505 LUSC). After quality control and availability filtering, 1,038 samples contributed to discovery analyses. Analyses requiring complete survival, stage, or model features used the corresponding complete-case subsets; denominators are reported with each analysis.</w:t>
+          <w:sz w:val="22"/>
+        </w:rPr>
+        <w:t>Discovery Cohort (TCGA): TCGA LUAD and LUSC transcriptomic and clinical data were retrieved from the NCI Genomic Data Commons.</w:t>
+      </w:r>
+      <w:r>
+        <w:rPr>
+          <w:rFonts w:ascii="Times New Roman" w:hAnsi="Times New Roman" w:eastAsia="Times New Roman"/>
+          <w:sz w:val="22"/>
+          <w:vertAlign w:val="superscript"/>
+        </w:rPr>
+        <w:t>28,29</w:t>
+      </w:r>
+      <w:r>
+        <w:rPr>
+          <w:rFonts w:ascii="Times New Roman" w:hAnsi="Times New Roman" w:eastAsia="Times New Roman"/>
+          <w:sz w:val="22"/>
+        </w:rPr>
+        <w:t xml:space="preserve"> A total of 1,100 TCGA NSCLC tumor samples were initially considered (595 LUAD and 505 LUSC). After quality control and availability filtering, 1,038 samples contributed to discovery analyses. Analyses requiring complete survival, stage, or model features used the corresponding complete-case subsets; denominators are reported with each analysis.</w:t>
       </w:r>
     </w:p>
     <w:p>
@@ -711,11 +788,39 @@
       <w:r>
         <w:rPr>
           <w:rFonts w:ascii="Times New Roman" w:hAnsi="Times New Roman" w:eastAsia="Times New Roman"/>
-          <w:b w:val="0"/>
-          <w:i w:val="0"/>
-          <w:sz w:val="22"/>
-        </w:rPr>
-        <w:t>Phase 1: MR-based gene prioritization: Mendelian randomization (MR) was used to prioritize genes with expression-linked immune-context associations [33], not to prove mechanism or treatment relevance. We used eQTL data from eQTLGen [35] and GTEx v8 with TwoSampleMR (v0.5.6), and inspected sensitivity diagnostics before assigning confidence.</w:t>
+          <w:sz w:val="22"/>
+        </w:rPr>
+        <w:t>Phase 1: MR-based gene prioritization: Mendelian randomization (MR) was used to prioritize genes with expression-linked immune-context associations.</w:t>
+      </w:r>
+      <w:r>
+        <w:rPr>
+          <w:rFonts w:ascii="Times New Roman" w:hAnsi="Times New Roman" w:eastAsia="Times New Roman"/>
+          <w:sz w:val="22"/>
+          <w:vertAlign w:val="superscript"/>
+        </w:rPr>
+        <w:t>33</w:t>
+      </w:r>
+      <w:r>
+        <w:rPr>
+          <w:rFonts w:ascii="Times New Roman" w:hAnsi="Times New Roman" w:eastAsia="Times New Roman"/>
+          <w:sz w:val="22"/>
+        </w:rPr>
+        <w:t xml:space="preserve"> It was not used to prove mechanism or treatment relevance. We used eQTL data from eQTLGen.</w:t>
+      </w:r>
+      <w:r>
+        <w:rPr>
+          <w:rFonts w:ascii="Times New Roman" w:hAnsi="Times New Roman" w:eastAsia="Times New Roman"/>
+          <w:sz w:val="22"/>
+          <w:vertAlign w:val="superscript"/>
+        </w:rPr>
+        <w:t>35</w:t>
+      </w:r>
+      <w:r>
+        <w:rPr>
+          <w:rFonts w:ascii="Times New Roman" w:hAnsi="Times New Roman" w:eastAsia="Times New Roman"/>
+          <w:sz w:val="22"/>
+        </w:rPr>
+        <w:t xml:space="preserve"> GTEx v8 and TwoSampleMR (v0.5.6) were used for supporting analyses, and sensitivity diagnostics were inspected before assigning confidence.</w:t>
       </w:r>
     </w:p>
     <w:p>
@@ -1538,11 +1643,54 @@
       <w:r>
         <w:rPr>
           <w:rFonts w:ascii="Times New Roman" w:hAnsi="Times New Roman" w:eastAsia="Times New Roman"/>
-          <w:b w:val="0"/>
-          <w:i w:val="0"/>
-          <w:sz w:val="22"/>
-        </w:rPr>
-        <w:t>All statistical analyses were performed using R and Python. Python-based data manipulation and visualization used Pandas [37], NumPy [38], SciPy [39], Matplotlib [40], and Seaborn [41]. Machine-learning tasks used Scikit-learn [42]. Survival analysis used Kaplan–Meier curves and Cox proportional hazards models. Model performance was evaluated with time-dependent AUC, concordance index (C-index), and hazard ratios with 95% confidence intervals where available. P-values computed from spot- or cell-level spatial summaries were treated as within-section descriptive statistics, not as independent patient-level inference. Data and code availability are detailed in the Declarations section.</w:t>
+          <w:sz w:val="22"/>
+        </w:rPr>
+        <w:t>All statistical analyses were performed using R and Python. Python-based data manipulation and numerical computing used Pandas, NumPy, and SciPy.</w:t>
+      </w:r>
+      <w:r>
+        <w:rPr>
+          <w:rFonts w:ascii="Times New Roman" w:hAnsi="Times New Roman" w:eastAsia="Times New Roman"/>
+          <w:sz w:val="22"/>
+          <w:vertAlign w:val="superscript"/>
+        </w:rPr>
+        <w:t>37-39</w:t>
+      </w:r>
+      <w:r>
+        <w:rPr>
+          <w:rFonts w:ascii="Times New Roman" w:hAnsi="Times New Roman" w:eastAsia="Times New Roman"/>
+          <w:sz w:val="22"/>
+        </w:rPr>
+        <w:t xml:space="preserve"> Visualization used Matplotlib and Seaborn.</w:t>
+      </w:r>
+      <w:r>
+        <w:rPr>
+          <w:rFonts w:ascii="Times New Roman" w:hAnsi="Times New Roman" w:eastAsia="Times New Roman"/>
+          <w:sz w:val="22"/>
+          <w:vertAlign w:val="superscript"/>
+        </w:rPr>
+        <w:t>40,41</w:t>
+      </w:r>
+      <w:r>
+        <w:rPr>
+          <w:rFonts w:ascii="Times New Roman" w:hAnsi="Times New Roman" w:eastAsia="Times New Roman"/>
+          <w:sz w:val="22"/>
+        </w:rPr>
+        <w:t xml:space="preserve"> Machine-learning tasks used Scikit-learn.</w:t>
+      </w:r>
+      <w:r>
+        <w:rPr>
+          <w:rFonts w:ascii="Times New Roman" w:hAnsi="Times New Roman" w:eastAsia="Times New Roman"/>
+          <w:sz w:val="22"/>
+          <w:vertAlign w:val="superscript"/>
+        </w:rPr>
+        <w:t>42</w:t>
+      </w:r>
+      <w:r>
+        <w:rPr>
+          <w:rFonts w:ascii="Times New Roman" w:hAnsi="Times New Roman" w:eastAsia="Times New Roman"/>
+          <w:sz w:val="22"/>
+        </w:rPr>
+        <w:t xml:space="preserve"> Survival analysis used Kaplan-Meier curves and Cox proportional hazards models. Model performance was evaluated with time-dependent AUC, concordance index (C-index), and hazard ratios with 95% confidence intervals where available. P-values computed from spot- or cell-level spatial summaries were treated as within-section descriptive statistics, not as independent patient-level inference. Data and code availability are detailed in the Declarations section.</w:t>
       </w:r>
     </w:p>
     <w:bookmarkEnd w:id="22"/>
@@ -1630,11 +1778,24 @@
       <w:r>
         <w:rPr>
           <w:rFonts w:ascii="Times New Roman" w:hAnsi="Times New Roman" w:eastAsia="Times New Roman"/>
-          <w:b w:val="0"/>
-          <w:i w:val="0"/>
-          <w:sz w:val="22"/>
-        </w:rPr>
-        <w:t>We used two-sample Mendelian randomization [44] (MR), implemented in the TwoSampleMR R package, as a gene-prioritization layer. MR estimates were interpreted as expression-linked associations under instrumental-variable assumptions, not as proof of spatial mechanism, therapeutic actionability, or clinical utility.</w:t>
+          <w:sz w:val="22"/>
+        </w:rPr>
+        <w:t>We used two-sample Mendelian randomization as a gene-prioritization layer.</w:t>
+      </w:r>
+      <w:r>
+        <w:rPr>
+          <w:rFonts w:ascii="Times New Roman" w:hAnsi="Times New Roman" w:eastAsia="Times New Roman"/>
+          <w:sz w:val="22"/>
+          <w:vertAlign w:val="superscript"/>
+        </w:rPr>
+        <w:t>44</w:t>
+      </w:r>
+      <w:r>
+        <w:rPr>
+          <w:rFonts w:ascii="Times New Roman" w:hAnsi="Times New Roman" w:eastAsia="Times New Roman"/>
+          <w:sz w:val="22"/>
+        </w:rPr>
+        <w:t xml:space="preserve"> MR was implemented in the TwoSampleMR R package. MR estimates were interpreted as expression-linked associations under instrumental-variable assumptions, not as proof of spatial mechanism, therapeutic actionability, or clinical utility.</w:t>
       </w:r>
     </w:p>
     <w:p>
@@ -1789,11 +1950,24 @@
       <w:r>
         <w:rPr>
           <w:rFonts w:ascii="Times New Roman" w:hAnsi="Times New Roman" w:eastAsia="Times New Roman"/>
-          <w:b w:val="0"/>
-          <w:i w:val="0"/>
-          <w:sz w:val="22"/>
-        </w:rPr>
-        <w:t>To assess spatial context among C1Q, SPP1, and immune-marker programs, we calculated correlations and local spatial statistics across multiple spatial scales (50 μm, 100 μm, and 200 μm where available) [47, 48]. Bivariate Moran's I, Geary's C, and local indicators of spatial association were used as descriptive spatial summaries with permutation-based significance testing and Benjamini–Hochberg correction. These analyses were interpreted as evidence of co-localization or spatial separation, not as proof of direct biological interaction.</w:t>
+          <w:sz w:val="22"/>
+        </w:rPr>
+        <w:t>To assess spatial context among C1Q, SPP1, and immune-marker programs, we calculated correlations and local spatial statistics across multiple spatial scales (50 μm, 100 μm, and 200 μm where available).</w:t>
+      </w:r>
+      <w:r>
+        <w:rPr>
+          <w:rFonts w:ascii="Times New Roman" w:hAnsi="Times New Roman" w:eastAsia="Times New Roman"/>
+          <w:sz w:val="22"/>
+          <w:vertAlign w:val="superscript"/>
+        </w:rPr>
+        <w:t>47,48</w:t>
+      </w:r>
+      <w:r>
+        <w:rPr>
+          <w:rFonts w:ascii="Times New Roman" w:hAnsi="Times New Roman" w:eastAsia="Times New Roman"/>
+          <w:sz w:val="22"/>
+        </w:rPr>
+        <w:t xml:space="preserve"> Bivariate Moran's I, Geary's C, and local indicators of spatial association were used as descriptive spatial summaries with permutation-based significance testing and Benjamini-Hochberg correction. These analyses were interpreted as evidence of co-localization or spatial separation, not as proof of direct biological interaction.</w:t>
       </w:r>
     </w:p>
     <w:bookmarkEnd w:id="29"/>
@@ -14201,11 +14375,24 @@
       <w:r>
         <w:rPr>
           <w:rFonts w:ascii="Times New Roman" w:hAnsi="Times New Roman" w:eastAsia="Times New Roman"/>
-          <w:b w:val="0"/>
-          <w:i w:val="0"/>
-          <w:sz w:val="22"/>
-        </w:rPr>
-        <w:t>Gene Expression Omnibus datasets: NCBI GEO [52] (https://www.ncbi.nlm.nih.gov/geo/).</w:t>
+          <w:sz w:val="22"/>
+        </w:rPr>
+        <w:t>Gene Expression Omnibus datasets: NCBI GEO.</w:t>
+      </w:r>
+      <w:r>
+        <w:rPr>
+          <w:rFonts w:ascii="Times New Roman" w:hAnsi="Times New Roman" w:eastAsia="Times New Roman"/>
+          <w:sz w:val="22"/>
+          <w:vertAlign w:val="superscript"/>
+        </w:rPr>
+        <w:t>52</w:t>
+      </w:r>
+      <w:r>
+        <w:rPr>
+          <w:rFonts w:ascii="Times New Roman" w:hAnsi="Times New Roman" w:eastAsia="Times New Roman"/>
+          <w:sz w:val="22"/>
+        </w:rPr>
+        <w:t xml:space="preserve"> https://www.ncbi.nlm.nih.gov/geo/.</w:t>
       </w:r>
     </w:p>
     <w:p>
@@ -14332,11 +14519,24 @@
       <w:r>
         <w:rPr>
           <w:rFonts w:ascii="Times New Roman" w:hAnsi="Times New Roman" w:eastAsia="Times New Roman"/>
-          <w:b w:val="0"/>
-          <w:i w:val="0"/>
-          <w:sz w:val="22"/>
-        </w:rPr>
-        <w:t>Immunohistochemistry images: Human Protein Atlas [53] (https://www.proteinatlas.org); figure-specific source and license notes are provided in the source-data manifest.</w:t>
+          <w:sz w:val="22"/>
+        </w:rPr>
+        <w:t>Immunohistochemistry images: Human Protein Atlas.</w:t>
+      </w:r>
+      <w:r>
+        <w:rPr>
+          <w:rFonts w:ascii="Times New Roman" w:hAnsi="Times New Roman" w:eastAsia="Times New Roman"/>
+          <w:sz w:val="22"/>
+          <w:vertAlign w:val="superscript"/>
+        </w:rPr>
+        <w:t>53</w:t>
+      </w:r>
+      <w:r>
+        <w:rPr>
+          <w:rFonts w:ascii="Times New Roman" w:hAnsi="Times New Roman" w:eastAsia="Times New Roman"/>
+          <w:sz w:val="22"/>
+        </w:rPr>
+        <w:t xml:space="preserve"> https://www.proteinatlas.org; figure-specific source and license notes are provided in the source-data manifest.</w:t>
       </w:r>
     </w:p>
     <w:p>
@@ -14636,11 +14836,9 @@
       <w:r>
         <w:rPr>
           <w:rFonts w:ascii="Times New Roman" w:hAnsi="Times New Roman" w:eastAsia="Times New Roman"/>
-          <w:b w:val="0"/>
-          <w:i w:val="0"/>
           <w:sz w:val="18"/>
         </w:rPr>
-        <w:t>[1] Sung, H., Ferlay, J., Siegel, R.L., Laversanne, M., Soerjomataram, I., Jemal, A., Bray, F.: Global cancer statistics 2020: GLOBOCAN estimates of incidence and mortality worldwide for 36 cancers in 185 countries. CA: A Cancer Journal for Clinicians 71(3), 209–249 (2021). https://doi.org/10.3322/caac.21660</w:t>
+        <w:t>1. Sung H, Ferlay J, Siegel RL, et al. Global Cancer Statistics 2020: GLOBOCAN Estimates of Incidence and Mortality Worldwide for 36 Cancers in 185 Countries. CA Cancer J Clin. 2021;71(3):209-249. doi:10.3322/caac.21660</w:t>
       </w:r>
     </w:p>
     <w:p>
@@ -14651,11 +14849,9 @@
       <w:r>
         <w:rPr>
           <w:rFonts w:ascii="Times New Roman" w:hAnsi="Times New Roman" w:eastAsia="Times New Roman"/>
-          <w:b w:val="0"/>
-          <w:i w:val="0"/>
           <w:sz w:val="18"/>
         </w:rPr>
-        <w:t>[2] Chen, Z., Fillmore, C.M., Hammerman, P.S., Kim, C.F., Wong, K.-K.: Non-small-cell lung cancers: A heterogeneous set of diseases. Nature Reviews Cancer 14(8), 535–546 (2014). https://doi.org/10.1038/nrc3775</w:t>
+        <w:t>2. Chen Z, Fillmore CM, Hammerman PS, Kim CF, Wong KK. Non-small-cell lung cancers: a heterogeneous set of diseases. Nat Rev Cancer. 2014;14(8):535-546. doi:10.1038/nrc3775</w:t>
       </w:r>
     </w:p>
     <w:p>
@@ -14668,7 +14864,7 @@
           <w:rFonts w:ascii="Times New Roman" w:hAnsi="Times New Roman" w:eastAsia="Times New Roman"/>
           <w:sz w:val="18"/>
         </w:rPr>
-        <w:t>[3] Reck, M., Rodriguez-Abreu, D., Robinson, A.G., Hui, R., Csoszi, T., Fulop, A., Gottfried, M., Peled, N., Tafreshi, A., Cuffe, S., O'Brien, M., Rao, S., Hotta, K., Leiby, M.A., Lubiniecki, G.M., Shentu, Y., Rangwala, R., Brahmer, J.R.: Pembrolizumab versus chemotherapy for PD-L1-positive non-small-cell lung cancer. New England Journal of Medicine 375(19), 1823–1833 (2016). https://doi.org/10.1056/NEJMoa1606774</w:t>
+        <w:t>3. Reck M, Rodríguez-Abreu D, Robinson AG, et al. Pembrolizumab versus Chemotherapy for PD-L1–Positive Non–Small-Cell Lung Cancer. N Engl J Med. 2016;375(19):1823-1833. doi:10.1056/nejmoa1606774</w:t>
       </w:r>
     </w:p>
     <w:p>
@@ -14681,7 +14877,7 @@
           <w:rFonts w:ascii="Times New Roman" w:hAnsi="Times New Roman" w:eastAsia="Times New Roman"/>
           <w:sz w:val="18"/>
         </w:rPr>
-        <w:t>[4] Herbst, R.S., Giaccone, G., De Marinis, F., Reinmuth, N., Vergnenegre, A., Barrios, C.H., Morise, M., Felip, E., Andric, Z., Geater, S., \"Ozguro glu, M., Zou, W., Sandler, A., Enquist, I., Komatsubara, K., Deng, Y., Kuriki, H., Wen, X., McCleland, M., Mocci, S., Jassem, J., Spigel, D.R.: Atezolizumab for first-line treatment of PD-L1-selected patients with NSCLC. New England Journal of Medicine 383(14), 1328–1339 (2020). https://doi.org/10.1056/NEJMoa1917346</w:t>
+        <w:t>4. Herbst RS, Giaccone G, de Marinis F, et al. Atezolizumab for First-Line Treatment of PD-L1–Selected Patients with NSCLC. N Engl J Med. 2020;383(14):1328-1339. doi:10.1056/nejmoa1917346</w:t>
       </w:r>
     </w:p>
     <w:p>
@@ -14694,7 +14890,7 @@
           <w:rFonts w:ascii="Times New Roman" w:hAnsi="Times New Roman" w:eastAsia="Times New Roman"/>
           <w:sz w:val="18"/>
         </w:rPr>
-        <w:t>[5] Gandhi, L., Rodriguez-Abreu, D., Gadgeel, S., Esteban, E., Felip, E., De Angelis, F., Domine, M., Clingan, P., Hochmair, M.J., Powell, S.F., Cheng, S.Y.-S., Bischoff, H.G., Peled, N., Grossi, F., Jennens, R.R., Reck, M., Hui, R., Garon, E.B., Boyer, M., Rubio-Viqueira, B., Novello, S., Kurata, T., Gray, J.E., Vida, J., Wei, Z., Yang, J., Raftopoulos, H., Pietanza, M.C., Garassino, M.C.: Pembrolizumab plus chemotherapy in metastatic non-small-cell lung cancer. New England Journal of Medicine 378(22), 2078–2092 (2018). https://doi.org/10.1056/NEJMoa1801005</w:t>
+        <w:t>5. Gandhi L, Rodríguez-Abreu D, Gadgeel S, et al. Pembrolizumab plus Chemotherapy in Metastatic Non–Small-Cell Lung Cancer. N Engl J Med. 2018;378(22):2078-2092. doi:10.1056/nejmoa1801005</w:t>
       </w:r>
     </w:p>
     <w:p>
@@ -14705,11 +14901,9 @@
       <w:r>
         <w:rPr>
           <w:rFonts w:ascii="Times New Roman" w:hAnsi="Times New Roman" w:eastAsia="Times New Roman"/>
-          <w:b w:val="0"/>
-          <w:i w:val="0"/>
           <w:sz w:val="18"/>
         </w:rPr>
-        <w:t>[6] Passaro, A., Attili, I., de Marinis, F.: Neoadjuvant chemotherapy plus immunotherapy in early-stage resectable non-small-cell lung cancer. Journal of Clinical Oncology: Official Journal of the American Society of Clinical Oncology 40(25), 2871–2877 (2022). https://doi.org/10.1200/JCO.22.00873</w:t>
+        <w:t>6. Passaro A, Attili I, de Marinis F. Neoadjuvant Chemotherapy Plus Immunotherapy in Early-Stage Resectable Non–Small-Cell Lung Cancer. J Clin Oncol. 2022;40(25):2871-2877. doi:10.1200/jco.22.00873</w:t>
       </w:r>
     </w:p>
     <w:p>
@@ -14720,11 +14914,9 @@
       <w:r>
         <w:rPr>
           <w:rFonts w:ascii="Times New Roman" w:hAnsi="Times New Roman" w:eastAsia="Times New Roman"/>
-          <w:b w:val="0"/>
-          <w:i w:val="0"/>
           <w:sz w:val="18"/>
         </w:rPr>
-        <w:t>[7] Hellmann, M.D., Ciuleanu, T.-E., Pluzanski, A., Lee, J.S., Otterson, G.A., Audigier-Valette, C., Minenza, E., Linardou, H., Burgers, S., Salman, P., Borghaei, H., Ramalingam, S.S., Brahmer, J., Reck, M., O'Byrne, K.J., Geese, W.J., Green, G., Chang, H., Szustakowski, J., Bhagavatheeswaran, P., Healey, D., Fu, Y., Nathan, F., Paz-Ares, L.: Nivolumab plus ipilimumab in lung cancer with a high tumor mutational burden. New England Journal of Medicine 378(22), 2093–2104 (2018). https://doi.org/10.1056/NEJMoa1801946</w:t>
+        <w:t>7. Hellmann MD, Ciuleanu TE, Pluzanski A, et al. Nivolumab plus Ipilimumab in Lung Cancer with a High Tumor Mutational Burden. N Engl J Med. 2018;378(22):2093-2104. doi:10.1056/nejmoa1801946</w:t>
       </w:r>
     </w:p>
     <w:p>
@@ -14735,11 +14927,9 @@
       <w:r>
         <w:rPr>
           <w:rFonts w:ascii="Times New Roman" w:hAnsi="Times New Roman" w:eastAsia="Times New Roman"/>
-          <w:b w:val="0"/>
-          <w:i w:val="0"/>
           <w:sz w:val="18"/>
         </w:rPr>
-        <w:t>[8] Marabelle, A., Fakih, M., Lopez, J., Shah, M., Shapira-Frommer, R., Nakagawa, K., Chung, H.C., Kindler, H.L., Lopez-Martin, J.A., Miller, W.H., Italiano, A., Kao, S., Piha-Paul, S.A., Delord, J.-P., McWilliams, R.R., Fabrizio, D.A., Aurora-Garg, D., Xu, L., Jin, F., Norwood, K., Bang, Y.-J.: Association of tumour mutational burden with outcomes in patients with advanced solid tumours treated with pembrolizumab: Prospective biomarker analysis of the multicohort, open-label, phase 2 KEYNOTE-158 study. The Lancet Oncology 21(10), 1353–1365 (2020). https://doi.org/10.1016/S1470-2045(20)30445-9</w:t>
+        <w:t>8. Marabelle A, Fakih M, Lopez J, et al. Association of tumour mutational burden with outcomes in patients with advanced solid tumours treated with pembrolizumab: prospective biomarker analysis of the multicohort, open-label, phase 2 KEYNOTE-158 study. Lancet Oncol. 2020;21(10):1353-1365. doi:10.1016/s1470-2045(20)30445-9</w:t>
       </w:r>
     </w:p>
     <w:p>
@@ -14750,11 +14940,9 @@
       <w:r>
         <w:rPr>
           <w:rFonts w:ascii="Times New Roman" w:hAnsi="Times New Roman" w:eastAsia="Times New Roman"/>
-          <w:b w:val="0"/>
-          <w:i w:val="0"/>
           <w:sz w:val="18"/>
         </w:rPr>
-        <w:t>[9] Topalian, S.L., Taube, J.M., Anders, R.A., Pardoll, D.M.: Mechanism-driven biomarkers to guide immune checkpoint blockade in cancer therapy. Nature Reviews Cancer 16(5), 275–287 (2016). https://doi.org/10.1038/nrc.2016.36</w:t>
+        <w:t>9. Topalian SL, Taube JM, Anders RA, Pardoll DM. Mechanism-driven biomarkers to guide immune checkpoint blockade in cancer therapy. Nat Rev Cancer. 2016;16(5):275-287. doi:10.1038/nrc.2016.36</w:t>
       </w:r>
     </w:p>
     <w:p>
@@ -14765,11 +14953,9 @@
       <w:r>
         <w:rPr>
           <w:rFonts w:ascii="Times New Roman" w:hAnsi="Times New Roman" w:eastAsia="Times New Roman"/>
-          <w:b w:val="0"/>
-          <w:i w:val="0"/>
           <w:sz w:val="18"/>
         </w:rPr>
-        <w:t>[10] Schoenfeld, A.J., Hellmann, M.D.: Acquired resistance to immune checkpoint inhibitors. Cancer Cell 37(4), 443–455 (2020). https://doi.org/10.1016/j.ccell.2020.03.017</w:t>
+        <w:t>10. Schoenfeld AJ, Hellmann MD. Acquired Resistance to Immune Checkpoint Inhibitors. Cancer Cell. 2020;37(4):443-455. doi:10.1016/j.ccell.2020.03.017</w:t>
       </w:r>
     </w:p>
     <w:p>
@@ -14780,11 +14966,9 @@
       <w:r>
         <w:rPr>
           <w:rFonts w:ascii="Times New Roman" w:hAnsi="Times New Roman" w:eastAsia="Times New Roman"/>
-          <w:b w:val="0"/>
-          <w:i w:val="0"/>
           <w:sz w:val="18"/>
         </w:rPr>
-        <w:t>[11] Vodnala, S.K., Eil, R., Kishton, R.J., Sukumar, M., Yamamoto, T.N., Ha, N.-H., Lee, P.-H., Shin, M., Patel, S.J., Yu, Z., Palmer, D.C., Kruhlak, M.J., Liu, X., Locasale, J.W., Huang, J., Roychoudhuri, R., Finkel, T., Klebanoff, C.A., Restifo, N.P.: T cell stemness and dysfunction in tumors are triggered by a common mechanism. Science 363(6434), 0135 (2019). https://doi.org/10.1126/science.aau0135</w:t>
+        <w:t>11. Vodnala SK, Eil R, Kishton RJ, et al. T cell stemness and dysfunction in tumors are triggered by a common mechanism. Science. 2019;363(6434):0135. doi:10.1126/science.aau0135</w:t>
       </w:r>
     </w:p>
     <w:p>
@@ -14795,11 +14979,9 @@
       <w:r>
         <w:rPr>
           <w:rFonts w:ascii="Times New Roman" w:hAnsi="Times New Roman" w:eastAsia="Times New Roman"/>
-          <w:b w:val="0"/>
-          <w:i w:val="0"/>
           <w:sz w:val="18"/>
         </w:rPr>
-        <w:t>[12] Vigneron, N.: Human tumor antigens and cancer immunotherapy. BioMed Research International 2015, 1–17 (2015). https://doi.org/10.1155/2015/948501</w:t>
+        <w:t>12. Vigneron N. Human Tumor Antigens and Cancer Immunotherapy. BioMed Research International. 2015;2015:1-17. doi:10.1155/2015/948501</w:t>
       </w:r>
     </w:p>
     <w:p>
@@ -14810,11 +14992,9 @@
       <w:r>
         <w:rPr>
           <w:rFonts w:ascii="Times New Roman" w:hAnsi="Times New Roman" w:eastAsia="Times New Roman"/>
-          <w:b w:val="0"/>
-          <w:i w:val="0"/>
           <w:sz w:val="18"/>
         </w:rPr>
-        <w:t>[13] Jerby-Arnon, L., Shah, P., Cuoco, M.S., Rodman, C., Su, M.-J., Melms, J.C., Leeson, R., Kanodia, A., Mei, S., Lin, J.-R., Wang, S., Rabasha, B., Liu, D., Zhang, G., Margolais, C., Ashenberg, O., Ott, P.A., Buchbinder, E.I., Haq, R., Hodi, F.S., Boland, G.M., Sullivan, R.J., Frederick, D.T., Miao, B., Moll, T., Flaherty, K.T., Herlyn, M., Jenkins, R.W., Thummalapalli, R., Kowalczyk, M.S., Canadas, I., Schilling, B., Cartwright, A.N.R., Luoma, A.M., Malu, S., Hwu, P., Bernatchez, C., Forget, M.-A., Barbie, D.A., Shalek, A.K., Tirosh, I., Sorger, P.K., Wucherpfennig, K., Van Allen, E.M., Schadendorf, D., Johnson, B.E., Rotem, A., Rozenblatt-Rosen, O., Garraway, L.A., Yoon, C.H., Izar, B., Regev, A.: A cancer cell program promotes T cell exclusion and resistance to checkpoint blockade. Cell 175(4), 984–99724 (2018). https://doi.org/10.1016/j.cell.2018.09.006</w:t>
+        <w:t>13. Jerby-Arnon L, Shah P, Cuoco MS, et al. A Cancer Cell Program Promotes T Cell Exclusion and Resistance to Checkpoint Blockade. Cell. 2018;175(4):984-997.e24. doi:10.1016/j.cell.2018.09.006</w:t>
       </w:r>
     </w:p>
     <w:p>
@@ -14825,11 +15005,9 @@
       <w:r>
         <w:rPr>
           <w:rFonts w:ascii="Times New Roman" w:hAnsi="Times New Roman" w:eastAsia="Times New Roman"/>
-          <w:b w:val="0"/>
-          <w:i w:val="0"/>
           <w:sz w:val="18"/>
         </w:rPr>
-        <w:t>[14] Staahl, P.L., Salmen, F., Vickovic, S., Lundmark, A., Navarro, J.F., Magnusson, J., Giacomello, S., Asp, M., Westholm, J.O., Huss, M., Mollbrink, A., Linnarsson, S., Codeluppi, S., Borg,., Ponten, F., Costea, P.I., Sahlen, P., Mulder, J., Bergmann, O., Lundeberg, J., Frisen, J.: Visualization and analysis of gene expression in tissue sections by spatial transcriptomics. Science 353(6294), 78–82 (2016). https://doi.org/10.1126/science.aaf2403</w:t>
+        <w:t>14. Ståhl PL, Salmén F, Vickovic S, et al. Visualization and analysis of gene expression in tissue sections by spatial transcriptomics. Science. 2016;353(6294):78-82. doi:10.1126/science.aaf2403</w:t>
       </w:r>
     </w:p>
     <w:p>
@@ -14840,11 +15018,9 @@
       <w:r>
         <w:rPr>
           <w:rFonts w:ascii="Times New Roman" w:hAnsi="Times New Roman" w:eastAsia="Times New Roman"/>
-          <w:b w:val="0"/>
-          <w:i w:val="0"/>
           <w:sz w:val="18"/>
         </w:rPr>
-        <w:t>[15] Marx, V.: Method of the year: Spatially resolved transcriptomics. Nature Methods 18(1), 9–14 (2021). https://doi.org/10.1038/s41592-020-01033-y</w:t>
+        <w:t>15. Marx V. Method of the Year: spatially resolved transcriptomics. Nat Methods. 2021;18(1):9-14. doi:10.1038/s41592-020-01033-y</w:t>
       </w:r>
     </w:p>
     <w:p>
@@ -14855,11 +15031,9 @@
       <w:r>
         <w:rPr>
           <w:rFonts w:ascii="Times New Roman" w:hAnsi="Times New Roman" w:eastAsia="Times New Roman"/>
-          <w:b w:val="0"/>
-          <w:i w:val="0"/>
           <w:sz w:val="18"/>
         </w:rPr>
-        <w:t>[16] Zilionis, R., Engblom, C., Pfirschke, C., Savova, V., Zemmour, D., Saatcioglu, H.D., Krishnan, I., Maroni, G., Meyerovitz, C.V., Kerwin, C.M., Choi, S., Richards, W.G., De Rienzo, A., Tenen, D.G., Bueno, R., Levantini, E., Pittet, M.J., Klein, A.M.: Single-cell transcriptomics of human and mouse lung cancers reveals conserved myeloid populations across individuals and species. Immunity 50(5), 1317–133410 (2019). https://doi.org/10.1016/j.immuni.2019.03.009</w:t>
+        <w:t>16. Zilionis R, Engblom C, Pfirschke C, et al. Single-Cell Transcriptomics of Human and Mouse Lung Cancers Reveals Conserved Myeloid Populations across Individuals and Species. Immunity. 2019;50(5):1317-1334.e10. doi:10.1016/j.immuni.2019.03.009</w:t>
       </w:r>
     </w:p>
     <w:p>
@@ -14870,11 +15044,9 @@
       <w:r>
         <w:rPr>
           <w:rFonts w:ascii="Times New Roman" w:hAnsi="Times New Roman" w:eastAsia="Times New Roman"/>
-          <w:b w:val="0"/>
-          <w:i w:val="0"/>
           <w:sz w:val="18"/>
         </w:rPr>
-        <w:t>[17] Laumont, C.M., Nelson, B.H.: B cells in the tumor microenvironment: Multi-faceted organizers, regulators, and effectors of anti-tumor immunity. Cancer Cell 41(3), 466–489 (2023). https://doi.org/10.1016/j.ccell.2023.02.017</w:t>
+        <w:t>17. Laumont CM, Nelson BH. B cells in the tumor microenvironment: Multi-faceted organizers, regulators, and effectors of anti-tumor immunity. Cancer Cell. 2023;41(3):466-489. doi:10.1016/j.ccell.2023.02.017</w:t>
       </w:r>
     </w:p>
     <w:p>
@@ -14885,11 +15057,9 @@
       <w:r>
         <w:rPr>
           <w:rFonts w:ascii="Times New Roman" w:hAnsi="Times New Roman" w:eastAsia="Times New Roman"/>
-          <w:b w:val="0"/>
-          <w:i w:val="0"/>
           <w:sz w:val="18"/>
         </w:rPr>
-        <w:t>[18] Janesick, A., Shelansky, R., Gottscho, A.D., Wagner, F., Williams, S.R., Rouault, M., Beliakoff, G., Morrison, C.A., Oliveira, M.F., Sicherman, J.T., Kohlway, A., Abousoud, J., Drennon, T.Y., Mohabbat, S.H., 10x Development Teams, Taylor, S.E.B.: High resolution mapping of the tumor microenvironment using integrated single-cell, spatial and in situ analysis. Nature Communications 14(1), 8353 (2023). https://doi.org/10.1038/s41467-023-43458-x</w:t>
+        <w:t>18. Janesick A, Shelansky R, Gottscho AD, et al. High resolution mapping of the tumor microenvironment using integrated single-cell, spatial and in situ analysis. Nat Commun. 2023;14(1):8353. doi:10.1038/s41467-023-43458-x</w:t>
       </w:r>
     </w:p>
     <w:p>
@@ -14900,11 +15070,9 @@
       <w:r>
         <w:rPr>
           <w:rFonts w:ascii="Times New Roman" w:hAnsi="Times New Roman" w:eastAsia="Times New Roman"/>
-          <w:b w:val="0"/>
-          <w:i w:val="0"/>
           <w:sz w:val="18"/>
         </w:rPr>
-        <w:t>[19] He, K., Zhang, X., Ren, S., Sun, J.: Deep residual learning for image recognition. In: 2016 IEEE Conference on Computer Vision and Pattern Recognition (CVPR), pp. 770–778. IEEE, Las Vegas, NV, USA (2016). https://doi.org/10.1109/CVPR.2016.90</w:t>
+        <w:t>19. He K, Zhang X, Ren S, Sun J. Deep Residual Learning for Image Recognition. 2016 IEEE Conference on Computer Vision and Pattern Recognition (CVPR). 2016:770-778. doi:10.1109/cvpr.2016.90</w:t>
       </w:r>
     </w:p>
     <w:p>
@@ -14915,11 +15083,9 @@
       <w:r>
         <w:rPr>
           <w:rFonts w:ascii="Times New Roman" w:hAnsi="Times New Roman" w:eastAsia="Times New Roman"/>
-          <w:b w:val="0"/>
-          <w:i w:val="0"/>
           <w:sz w:val="18"/>
         </w:rPr>
-        <w:t>[20] Campanella, G., Hanna, M.G., Geneslaw, L., Miraflor, A., Werneck Krauss Silva, V., Busam, K.J., Brogi, E., Reuter, V.E., Klimstra, D.S., Fuchs, T.J.: Clinical-grade computational pathology using weakly supervised deep learning on whole slide images. Nature Medicine 25(8), 1301–1309 (2019). https://doi.org/10.1038/s41591-019-0508-1</w:t>
+        <w:t>20. Campanella G, Hanna MG, Geneslaw L, et al. Clinical-grade computational pathology using weakly supervised deep learning on whole slide images. Nat Med. 2019;25(8):1301-1309. doi:10.1038/s41591-019-0508-1</w:t>
       </w:r>
     </w:p>
     <w:p>
@@ -14930,11 +15096,9 @@
       <w:r>
         <w:rPr>
           <w:rFonts w:ascii="Times New Roman" w:hAnsi="Times New Roman" w:eastAsia="Times New Roman"/>
-          <w:b w:val="0"/>
-          <w:i w:val="0"/>
           <w:sz w:val="18"/>
         </w:rPr>
-        <w:t>[21] Valanarasu, J.M.J., Xu, H., Usuyama, N., Kim, C., Wong, C., Argaw, P., Ben Shimol, R., Crabtree, A., Matlock, K., Bartlett, A.Q., Bagga, J., Gu, Y., Zhang, S., Naumann, T., Fox, B.A., Wright, B., Robicsek, A., Piening, B., Bifulco, C., Wang, S., Poon, H.: https://doi.org/10.1016/j.cell.2025.11.016</w:t>
+        <w:t>21. Valanarasu JMJ, Xu H, Usuyama N, et al. Multimodal AI generates virtual population for tumor microenvironment modeling. Cell. 2026;189(2):386-400.e19. doi:10.1016/j.cell.2025.11.016</w:t>
       </w:r>
     </w:p>
     <w:p>
@@ -14945,11 +15109,9 @@
       <w:r>
         <w:rPr>
           <w:rFonts w:ascii="Times New Roman" w:hAnsi="Times New Roman" w:eastAsia="Times New Roman"/>
-          <w:b w:val="0"/>
-          <w:i w:val="0"/>
           <w:sz w:val="18"/>
         </w:rPr>
-        <w:t>[22] Wu, Y., Yang, S., Ma, J., Chen, Z., Song, G., Rao, D., Cheng, Y., Huang, S., Liu, Y., Jiang, S., Liu, J., Huang, X., Wang, X., Qiu, S., Xu, J., Xi, R., Bai, F., Zhou, J., Fan, J., Zhang, X., Gao, Q.: Spatiotemporal immune landscape of colorectal cancer liver metastasis at single-cell level. Cancer Discovery 12(1), 134–153 (2022). https://doi.org/10.1158/2159-8290.CD-21-0316</w:t>
+        <w:t>22. Wu Y, Yang S, Ma J, et al. Spatiotemporal Immune Landscape of Colorectal Cancer Liver Metastasis at Single-Cell Level. Cancer Discovery. 2022;12(1):134-153. doi:10.1158/2159-8290.cd-21-0316</w:t>
       </w:r>
     </w:p>
     <w:p>
@@ -14960,11 +15122,9 @@
       <w:r>
         <w:rPr>
           <w:rFonts w:ascii="Times New Roman" w:hAnsi="Times New Roman" w:eastAsia="Times New Roman"/>
-          <w:b w:val="0"/>
-          <w:i w:val="0"/>
           <w:sz w:val="18"/>
         </w:rPr>
-        <w:t>[23] Chen, R.J., Lu, M.Y., Williamson, D.F.K., Chen, T.Y., Lipkova, J., Noor, Z., Shaban, M., Shady, M., Williams, M., Joo, B., Mahmood, F.: Pan-cancer integrative histology-genomic analysis via multimodal deep learning. Cancer Cell 40(8), 865–8786 (2022). https://doi.org/10.1016/j.ccell.2022.07.004</w:t>
+        <w:t>23. Chen RJ, Lu MY, Williamson DFK, et al. Pan-cancer integrative histology-genomic analysis via multimodal deep learning. Cancer Cell. 2022;40(8):865-878.e6. doi:10.1016/j.ccell.2022.07.004</w:t>
       </w:r>
     </w:p>
     <w:p>
@@ -14975,11 +15135,9 @@
       <w:r>
         <w:rPr>
           <w:rFonts w:ascii="Times New Roman" w:hAnsi="Times New Roman" w:eastAsia="Times New Roman"/>
-          <w:b w:val="0"/>
-          <w:i w:val="0"/>
           <w:sz w:val="18"/>
         </w:rPr>
-        <w:t>[24] Thorsson, V., Gibbs, D.L., Brown, S.D., Wolf, D., Bortone, D.S., Ou Yang, T.-H., Porta-Pardo, E., Gao, G.F., Plaisier, C.L., Eddy, J.A., Ziv, E., Culhane, A.C., Paull, E.O., Sivakumar, I.K.A., Gentles, A.J., Malhotra, R., Farshidfar, F., Colaprico, A., Parker, J.S., Mose, L.E., Vo, N.S., Liu, J., Liu, Y., Rader, J., Dhankani, V., Reynolds, S.M., Bowlby, R., Califano, A., Cherniack, A.D., Anastassiou, D., Bedognetti, D., Mokrab, Y., Newman, A.M., Rao, A., Chen, K., Krasnitz, A., Hu, H., Malta, T.M., Noushmehr, H., Pedamallu, C.S., Bullman, S., Ojesina, A.I., Lamb, A., Zhou, W., Shen, H., Choueiri, T.K., Weinstein, J.N., Guinney, J., Saltz, J., Holt, R.A., Rabkin, C.S., Caesar-Johnson, S.J., Demchok, J.A., Felau, I., Kasapi, M., Ferguson, M.L., Hutter, C.M., Sofia, H.J., Tarnuzzer, R., Wang, Z., Yang, L., Zenklusen, J.C., Zhang, J.J., Chudamani, S., Liu, J., Lolla, L., Naresh, R., Pihl, T., Sun, Q., Wan, Y., Wu, Y., Cho, J., DeFreitas, T., Frazer, S., Gehlenborg, N., Getz, G., Heiman, D.I., Kim, J., Lawrence, M.S., Lin, P., Meier, S., Noble, M.S., Saksena, G., Voet, D., Zhang, H., Bernard, B., Chambwe, N., Dhankani, V., Knijnenburg, T., Kramer, R., Leinonen, K., Liu, Y., Miller, M., Reynolds, S., Shmulevich, I., Thorsson, V., Zhang, W., Akbani, R., Broom, B.M., Hegde, A.M., Ju, Z., Kanchi, R.S., Korkut, A., Li, J., Liang, H., Ling, S., Liu, W., Lu, Y., Mills, G.B., Ng, K.-S., Rao, A., Ryan, M., Wang, J., Weinstein, J.N., Zhang, J., Abeshouse, A., Armenia, J., Chakravarty, D., Chatila, W.K., De Bruijn, I., Gao, J., Gross, B.E., Heins, Z.J., Kundra, R., La, K., Ladanyi, M., Luna, A., Nissan, M.G., Ochoa, A., Phillips, S.M., Reznik, E., Sanchez-Vega, F., Sander, C., Schultz, N., Sheridan, R., Sumer, S.O., Sun, Y., Taylor, B.S., Wang, J., Zhang, H., Anur, P., Peto, M., Spellman, P., Benz, C., Stuart, J.M., Wong, C.K., Yau, C., Hayes, D.N., Parker, J.S., Wilkerson, M.D., Ally, A., Balasundaram, M., Bowlby, R., Brooks, D., Carlsen, R., Chuah, E., Dhalla, N., Holt, R., Jones, S.J.M., Kasaian, K., Lee, D., Ma, Y., Marra, M.A., Mayo, M., Moore, R.A., Mungall, A.J., Mungall, K., Robertson, A.G., Sadeghi, S., Schein, J.E., Sipahimalani, P., Tam, A., Thiessen, N., Tse, K., Wong, T., Berger, A.C., Beroukhim, R., Cherniack, A.D., Cibulskis, C., Gabriel, S.B., Gao, G.F., Ha, G., Meyerson, M., Schumacher, S.E., Shih, J., Kucherlapati, M.H., Kucherlapati, R.S., Baylin, S., Cope, L., Danilova, L., Bootwalla, M.S., Lai, P.H., Maglinte, D.T., Van Den Berg, D.J., Weisenberger, D.J., Auman, J.T., Balu, S., Bodenheimer, T., Fan, C., Hoadley, K.A., Hoyle, A.P., Jefferys, S.R., Jones, C.D., Meng, S., Mieczkowski, P.A., Mose, L.E., Perou, A.H., Perou, C.M., Roach, J., Shi, Y., Simons, J.V., Skelly, T., Soloway, M.G., Tan, D., Veluvolu, U., Fan, H., Hinoue, T., Laird, P.W., Shen, H., Zhou, W., Bellair, M., Chang, K., Covington, K., Creighton, C.J., Dinh, H., Doddapaneni, H., Donehower, L.A., Drummond, J., Gibbs, R.A., Glenn, R., Hale, W., Han, Y., Hu, J., Korchina, V., Lee, S., Lewis, L., Li, W., Liu, X., Morgan, M., Morton, D., Muzny, D., Santibanez, J., Sheth, M., Shinbrot, E., Wang, L., Wang, M., Wheeler, D.A., Xi, L., Zhao, F., Hess, J., Appelbaum, E.L., Bailey, M., Cordes, M.G., Ding, L., Fronick, C.C., Fulton, L.A., Fulton, R.S., Kandoth, C., Mardis, E.R., McLellan, M.D., Miller, C.A., Schmidt, H.K., Wilson, R.K., Crain, D., Curley, E., Gardner, J., Lau, K., Mallery, D., Morris, S., Paulauskis, J., Penny, R., Shelton, C., Shelton, T., Sherman, M., Thompson, E., Yena, P., Bowen, J., Gastier-Foster, J.M., Gerken, M., Leraas, K.M., Lichtenberg, T.M., Ramirez, N.C., Wise, L., Zmuda, E., Corcoran, N., Costello, T., Hovens, C., Carvalho, A.L., De Carvalho, A.C., Fregnani, J.H., Longatto-Filho, A., Reis, R.M., Scapulatempo-Neto, C., Silveira, H.C.S., Vidal, D.O., Burnette, A., Eschbacher, J., Hermes, B., Noss, A., Singh, R., Anderson, M.L., Castro, P.D., Ittmann, M., Huntsman, D., Kohl, B., Le, X., Thorp, R., Andry, C., Duffy, E.R., Lyadov, V., Paklina, O., Setdikova, G., Shabunin, A., Tavobilov, M., McPherson, C., Warnick, R., Berkowitz, R., Cramer, D., Feltmate, C., Horowitz, N., Kibel, A., Muto, M., Raut, C.P., Malykh, A., Barnholtz-Sloan, J.S., Barrett, W., Devine, K., Fulop, J., Ostrom, Q.T., Shimmel, K., Wolinsky, Y., Sloan, A.E., De Rose, A., Giuliante, F., Goodman, M., Karlan, B.Y., Hagedorn, C.H., Eckman, J., Harr, J., Myers, J., Tucker, K., Zach, L.A., Deyarmin, B., Hu, H., Kvecher, L., Larson, C., Mural, R.J., Somiari, S., Vicha, A., Zelinka, T., Bennett, J., Iacocca, M., Rabeno, B., Swanson, P., Latour, M., Lacombe, L., T\^etu, B., Bergeron, A., McGraw, M., Staugaitis, S.M., Chabot, J., Hibshoosh, H., Sepulveda, A., Su, T., Wang, T., Potapova, O., Voronina, O., Desjardins, L., Mariani, O., Roman-Roman, S., Sastre, X., Stern, M.-H., Cheng, F., Signoretti, S., Berchuck, A., Bigner, D., Lipp, E., Marks, J., McCall, S., McLendon, R., Secord, A., Sharp, A., Behera, M., Brat, D.J., Chen, A., Delman, K., Force, S., Khuri, F., Magliocca, K., Maithel, S., Olson, J.J., Owonikoko, T., Pickens, A., Ramalingam, S., Shin, D.M., Sica, G., Van Meir, E.G., Zhang, H., Eijckenboom, W., Gillis, A., Korpershoek, E., Looijenga, L., Oosterhuis, W., Stoop, H., Van Kessel, K.E., Zwarthoff, E.C., Calatozzolo, C., Cuppini, L., Cuzzubbo, S., DiMeco, F., Finocchiaro, G., Mattei, L., Perin, A., Pollo, B., Chen, C., Houck, J., Lohavanichbutr, P., Hartmann, A., Stoehr, C., Stoehr, R., Taubert, H., Wach, S., Wullich, B., Kycler, W., Murawa, D., Wiznerowicz, M., Chung, K., Edenfield, W.J., Martin, J., Baudin, E., Bubley, G., Bueno, R., De Rienzo, A., Richards, W.G., Kalkanis, S., Mikkelsen, T., Noushmehr, H., Scarpace, L., Girard, N., Aymerich, M., Campo, E., Gine, E., Guillermo, A.L., Van Bang, N., Hanh, P.T., Phu, B.D., Tang, Y., Colman, H., Evason, K., Dottino, P.R., Martignetti, J.A., Gabra, H., Juhl, H., Akeredolu, T., Stepa, S., Hoon, D., Ahn, K., Kang, K.J., Beuschlein, F., Breggia, A., Birrer, M., Bell, D., Borad, M., Bryce, A.H., Castle, E., Chandan, V., Cheville, J., Copland, J.A., Farnell, M., Flotte, T., Giama, N., Ho, T., Kendrick, M., Kocher, J.-P., Kopp, K., Moser, C., Nagorney, D., O'Brien, D., O'Neill, B.P., Patel, T., Petersen, G., Que, F., Rivera, M., Roberts, L., Smallridge, R., Smyrk, T., Stanton, M., Thompson, R.H., Torbenson, M., Yang, J.D., Zhang, L., Brimo, F., Ajani, J.A., Gonzalez, A.M.A., Behrens, C., Bondaruk, J., Broaddus, R., Czerniak, B., Esmaeli, B., Fujimoto, J., Gershenwald, J., Guo, C., Lazar, A.J., Logothetis, C., Meric-Bernstam, F., Moran, C., Ramondetta, L., Rice, D., Sood, A., Tamboli, P., Thompson, T., Troncoso, P., Tsao, A., Wistuba, I., Carter, C., Haydu, L., Hersey, P., Jakrot, V., Kakavand, H., Kefford, R., Lee, K., Long, G., Mann, G., Quinn, M., Saw, R., Scolyer, R., Shannon, K., Spillane, A., Stretch, O., Synott, M., Thompson, J., Wilmott, J., Al-Ahmadie, H., Chan, T.A., Ghossein, R., Gopalan, A., Levine, D.A., Reuter, V., Singer, S., Singh, B., Tien, N.V., Broudy, T., Mirsaidi, C., Nair, P., Drwiega, P., Miller, J., Smith, J., Zaren, H., Park, J.-W., Hung, N.P., Kebebew, E., Linehan, W.M., Metwalli, A.R., Pacak, K., Pinto, P.A., Schiffman, M., Schmidt, L.S., Vocke, C.D., Wentzensen, N., Worrell, R., Yang, H., Moncrieff, M., Goparaju, C., Melamed, J., Pass, H., Botnariuc, N., Caraman, I., Cernat, M., Chemencedji, I., Clipca, A., Doruc, S., Gorincioi, G., Mura, S., Pirtac, M., Stancul, I., Tcaciuc, D., Albert, M., Alexopoulou, I., Arnaout, A., Bartlett, J., Engel, J., Gilbert, S., Parfitt, J., Sekhon, H., Thomas, G., Rassl, D.M., Rintoul, R.C., Bifulco, C., Tamakawa, R., Urba, W., Hayward, N., Timmers, H., Antenucci, A., Facciolo, F., Grazi, G., Marino, M., Merola, R., De Krijger, R., Gimenez-Roqueplo, A.-P., Piche, A., Chevalier, S., McKercher, G., Birsoy, K., Barnett, G., Brewer, C., Farver, C., Naska, T., Pennell, N.A., Raymond, D., Schilero, C., Smolenski, K., Williams, F., Morrison, C., Borgia, J.A., Liptay, M.J., Pool, M., Seder, C.W., Junker, K., Omberg, L., Dinkin, M., Manikhas, G., Alvaro, D., Bragazzi, M.C., Cardinale, V., Carpino, G., Gaudio, E., Chesla, D., Cottingham, S., Dubina, M., Moiseenko, F., Dhanasekaran, R., Becker, K.-F., Janssen, K.-P., Slotta-Huspenina, J., Abdel-Rahman, M.H., Aziz, D., Bell, S., Cebulla, C.M., Davis, A., Duell, R., Elder, J.B., Hilty, J., Kumar, B., Lang, J., Lehman, N.L., Mandt, R., Nguyen, P., Pilarski, R., Rai, K., Schoenfield, L., Senecal, K., Wakely, P., Hansen, P., Lechan, R., Powers, J., Tischler, A., Grizzle, W.E., Sexton, K.C., Kastl, A., Henderson, J., Porten, S., Waldmann, J., Fassnacht, M., Asa, S.L., Schadendorf, D., Couce, M., Graefen, M., Huland, H., Sauter, G., Schlomm, T., Simon, R., Tennstedt, P., Olabode, O., Nelson, M., Bathe, O., Carroll, P.R., Chan, J.M., Disaia, P., Glenn, P., Kelley, R.K., Landen, C.N., Phillips, J., Prados, M., Simko, J., Smith-McCune, K., VandenBerg, S., Roggin, K., Fehrenbach, A., Kendler, A., Sifri, S., Steele, R., Jimeno, A., Carey, F., Forgie, I., Mannelli, M., Carney, M., Hernandez, B., Campos, B., Herold-Mende, C., Jungk, C., Unterberg, A., Von Deimling, A., Bossler, A., Galbraith, J., Jacobus, L., Knudson, M., Knutson, T., Ma, D., Milhem, M., Sigmund, R., Godwin, A.K., Madan, R., Rosenthal, H.G., Adebamowo, C., Adebamowo, S.N., Boussioutas, A., Beer, D., Giordano, T., Mes-Masson, A.-M., Saad, F., Bocklage, T., Landrum, L., Mannel, R., Moore, K., Moxley, K., Postier, R., Walker, J., Zuna, R., Feldman, M., Valdivieso, F., Dhir, R., Luketich, J., Pinero, E.M.M., Quintero-Aguilo, M., Carlotti, C.G., Dos Santos, J.S., Kemp, R., Sankarankuty, A., Tirapelli, D., Catto, J., Agnew, K., Swisher, E., Creaney, J., Robinson, B., Shelley, C.S., Godwin, E.M., Kendall, S., Shipman, C., Bradford, C., Carey, T., Haddad, A., Moyer, J., Peterson, L., Prince, M., Rozek, L., Wolf, G., Bowman, R., Fong, K.M., Yang, I., Korst, R., Rathmell, W.K., Fantacone-Campbell, J.L., Hooke, J.A., Kovatich, A.J., Shriver, C.D., DiPersio, J., Drake, B., Govindan, R., Heath, S., Ley, T., Van Tine, B., Westervelt, P., Rubin, M.A., Lee, J.I., Aredes, N.D., Mariamidze, A., Lazar, A.J., Serody, J.S., Demicco, E.G., Disis, M.L., Vincent, B.G., Shmulevich, I.: The immune landscape of cancer. Immunity 48(4), 812–83014 (2018). https://doi.org/10.1016/j.immuni.2018.03.023</w:t>
+        <w:t>24. Thorsson V, Gibbs DL, Brown SD, et al. The Immune Landscape of Cancer. Immunity. 2018;48(4):812-830.e14. doi:10.1016/j.immuni.2018.03.023</w:t>
       </w:r>
     </w:p>
     <w:p>
@@ -14990,11 +15148,9 @@
       <w:r>
         <w:rPr>
           <w:rFonts w:ascii="Times New Roman" w:hAnsi="Times New Roman" w:eastAsia="Times New Roman"/>
-          <w:b w:val="0"/>
-          <w:i w:val="0"/>
           <w:sz w:val="18"/>
         </w:rPr>
-        <w:t>[25] Subramanian, I., Verma, S., Kumar, S., Jere, A., Anamika, K.: Multi-omics data integration, interpretation, and its application. Bioinformatics and Biology Insights 14, 117793221989905 (2020). https://doi.org/10.1177/1177932219899051</w:t>
+        <w:t>25. Subramanian I, Verma S, Kumar S, Jere A, Anamika K. Multi-omics Data Integration, Interpretation, and Its Application. Bioinform Biol Insights. 2020;14:117793221989905. doi:10.1177/1177932219899051</w:t>
       </w:r>
     </w:p>
     <w:p>
@@ -15007,7 +15163,7 @@
           <w:rFonts w:ascii="Times New Roman" w:hAnsi="Times New Roman" w:eastAsia="Times New Roman"/>
           <w:sz w:val="18"/>
         </w:rPr>
-        <w:t>[26] Chaudhary, K., Poirion, O.B., Lu, L., Garmire, L.X.: Deep learning-based multi-omics integration robustly predicts survival in liver cancer. Clinical Cancer Research 24(6), 1248–1259 (2018). https://doi.org/10.1158/1078-0432.CCR-17-0853</w:t>
+        <w:t>26. Chaudhary K, Poirion OB, Lu L, Garmire LX. Deep Learning–Based Multi-Omics Integration Robustly Predicts Survival in Liver Cancer. Clinical Cancer Res. 2018;24(6):1248-1259. doi:10.1158/1078-0432.ccr-17-0853</w:t>
       </w:r>
     </w:p>
     <w:p>
@@ -15018,11 +15174,9 @@
       <w:r>
         <w:rPr>
           <w:rFonts w:ascii="Times New Roman" w:hAnsi="Times New Roman" w:eastAsia="Times New Roman"/>
-          <w:b w:val="0"/>
-          <w:i w:val="0"/>
           <w:sz w:val="18"/>
         </w:rPr>
-        <w:t>[27] Sammut, S.-J., Crispin-Ortuzar, M., Chin, S.-F., Provenzano, E., Bardwell, H.A., Ma, W., Cope, W., Dariush, A., Dawson, S.-J., Abraham, J.E., Dunn, J., Hiller, L., Thomas, J., Cameron, D.A., Bartlett, J.M.S., Hayward, L., Pharoah, P.D., Markowetz, F., Rueda, O.M., Earl, H.M., Caldas, C.: Multi-omic machine learning predictor of breast cancer therapy response. Nature 601(7894), 623–629 (2022). https://doi.org/10.1038/s41586-021-04278-5</w:t>
+        <w:t>27. Sammut SJ, Crispin-Ortuzar M, Chin SF, et al. Multi-omic machine learning predictor of breast cancer therapy response. Nature. 2022;601(7894):623-629. doi:10.1038/s41586-021-04278-5</w:t>
       </w:r>
     </w:p>
     <w:p>
@@ -15033,11 +15187,9 @@
       <w:r>
         <w:rPr>
           <w:rFonts w:ascii="Times New Roman" w:hAnsi="Times New Roman" w:eastAsia="Times New Roman"/>
-          <w:b w:val="0"/>
-          <w:i w:val="0"/>
           <w:sz w:val="18"/>
         </w:rPr>
-        <w:t>[28] Hoadley, K.A., Yau, C., Hinoue, T., Wolf, D.M., Lazar, A.J., Drill, E., Shen, R., Taylor, A.M., Cherniack, A.D., Thorsson, V., Akbani, R., Bowlby, R., Wong, C.K., Wiznerowicz, M., Sanchez-Vega, F., Robertson, A.G., Schneider, B.G., Lawrence, M.S., Noushmehr, H., Malta, T.M., Caesar-Johnson, S.J., Demchok, J.A., Felau, I., Kasapi, M., Ferguson, M.L., Hutter, C.M., Sofia, H.J., Tarnuzzer, R., Wang, Z., Yang, L., Zenklusen, J.C., Zhang, J.J., Chudamani, S., Liu, J., Lolla, L., Naresh, R., Pihl, T., Sun, Q., Wan, Y., Wu, Y., Cho, J., DeFreitas, T., Frazer, S., Gehlenborg, N., Getz, G., Heiman, D.I., Kim, J., Lawrence, M.S., Lin, P., Meier, S., Noble, M.S., Saksena, G., Voet, D., Zhang, H., Bernard, B., Chambwe, N., Dhankani, V., Knijnenburg, T., Kramer, R., Leinonen, K., Liu, Y., Miller, M., Reynolds, S., Shmulevich, I., Thorsson, V., Zhang, W., Akbani, R., Broom, B.M., Hegde, A.M., Ju, Z., Kanchi, R.S., Korkut, A., Li, J., Liang, H., Ling, S., Liu, W., Lu, Y., Mills, G.B., Ng, K.-S., Rao, A., Ryan, M., Wang, J., Weinstein, J.N., Zhang, J., Abeshouse, A., Armenia, J., Chakravarty, D., Chatila, W.K., De Bruijn, I., Gao, J., Gross, B.E., Heins, Z.J., Kundra, R., La, K., Ladanyi, M., Luna, A., Nissan, M.G., Ochoa, A., Phillips, S.M., Reznik, E., Sanchez-Vega, F., Sander, C., Schultz, N., Sheridan, R., Sumer, S.O., Sun, Y., Taylor, B.S., Wang, J., Zhang, H., Anur, P., Peto, M., Spellman, P., Benz, C., Stuart, J.M., Wong, C.K., Yau, C., Hayes, D.N., Parker, J.S., Wilkerson, M.D., Ally, A., Balasundaram, M., Bowlby, R., Brooks, D., Carlsen, R., Chuah, E., Dhalla, N., Holt, R., Jones, S.J.M., Kasaian, K., Lee, D., Ma, Y., Marra, M.A., Mayo, M., Moore, R.A., Mungall, A.J., Mungall, K., Robertson, A.G., Sadeghi, S., Schein, J.E., Sipahimalani, P., Tam, A., Thiessen, N., Tse, K., Wong, T., Berger, A.C., Beroukhim, R., Cherniack, A.D., Cibulskis, C., Gabriel, S.B., Gao, G.F., Ha, G., Meyerson, M., Schumacher, S.E., Shih, J., Kucherlapati, M.H., Kucherlapati, R.S., Baylin, S., Cope, L., Danilova, L., Bootwalla, M.S., Lai, P.H., Maglinte, D.T., Van Den Berg, D.J., Weisenberger, D.J., Auman, J.T., Balu, S., Bodenheimer, T., Fan, C., Hoadley, K.A., Hoyle, A.P., Jefferys, S.R., Jones, C.D., Meng, S., Mieczkowski, P.A., Mose, L.E., Perou, A.H., Perou, C.M., Roach, J., Shi, Y., Simons, J.V., Skelly, T., Soloway, M.G., Tan, D., Veluvolu, U., Fan, H., Hinoue, T., Laird, P.W., Shen, H., Zhou, W., Bellair, M., Chang, K., Covington, K., Creighton, C.J., Dinh, H., Doddapaneni, H., Donehower, L.A., Drummond, J., Gibbs, R.A., Glenn, R., Hale, W., Han, Y., Hu, J., Korchina, V., Lee, S., Lewis, L., Li, W., Liu, X., Morgan, M., Morton, D., Muzny, D., Santibanez, J., Sheth, M., Shinbrot, E., Wang, L., Wang, M., Wheeler, D.A., Xi, L., Zhao, F., Hess, J., Appelbaum, E.L., Bailey, M., Cordes, M.G., Ding, L., Fronick, C.C., Fulton, L.A., Fulton, R.S., Kandoth, C., Mardis, E.R., McLellan, M.D., Miller, C.A., Schmidt, H.K., Wilson, R.K., Crain, D., Curley, E., Gardner, J., Lau, K., Mallery, D., Morris, S., Paulauskis, J., Penny, R., Shelton, C., Shelton, T., Sherman, M., Thompson, E., Yena, P., Bowen, J., Gastier-Foster, J.M., Gerken, M., Leraas, K.M., Lichtenberg, T.M., Ramirez, N.C., Wise, L., Zmuda, E., Corcoran, N., Costello, T., Hovens, C., Carvalho, A.L., De Carvalho, A.C., Fregnani, J.H., Longatto-Filho, A., Reis, R.M., Scapulatempo-Neto, C., Silveira, H.C.S., Vidal, D.O., Burnette, A., Eschbacher, J., Hermes, B., Noss, A., Singh, R., Anderson, M.L., Castro, P.D., Ittmann, M., Huntsman, D., Kohl, B., Le, X., Thorp, R., Andry, C., Duffy, E.R., Lyadov, V., Paklina, O., Setdikova, G., Shabunin, A., Tavobilov, M., McPherson, C., Warnick, R., Berkowitz, R., Cramer, D., Feltmate, C., Horowitz, N., Kibel, A., Muto, M., Raut, C.P., Malykh, A., Barnholtz-Sloan, J.S., Barrett, W., Devine, K., Fulop, J., Ostrom, Q.T., Shimmel, K., Wolinsky, Y., Sloan, A.E., De Rose, A., Giuliante, F., Goodman, M., Karlan, B.Y., Hagedorn, C.H., Eckman, J., Harr, J., Myers, J., Tucker, K., Zach, L.A., Deyarmin, B., Hu, H., Kvecher, L., Larson, C., Mural, R.J., Somiari, S., Vicha, A., Zelinka, T., Bennett, J., Iacocca, M., Rabeno, B., Swanson, P., Latour, M., Lacombe, L., T\^etu, B., Bergeron, A., McGraw, M., Staugaitis, S.M., Chabot, J., Hibshoosh, H., Sepulveda, A., Su, T., Wang, T., Potapova, O., Voronina, O., Desjardins, L., Mariani, O., Roman-Roman, S., Sastre, X., Stern, M.-H., Cheng, F., Signoretti, S., Berchuck, A., Bigner, D., Lipp, E., Marks, J., McCall, S., McLendon, R., Secord, A., Sharp, A., Behera, M., Brat, D.J., Chen, A., Delman, K., Force, S., Khuri, F., Magliocca, K., Maithel, S., Olson, J.J., Owonikoko, T., Pickens, A., Ramalingam, S., Shin, D.M., Sica, G., Van Meir, E.G., Zhang, H., Eijckenboom, W., Gillis, A., Korpershoek, E., Looijenga, L., Oosterhuis, W., Stoop, H., Van Kessel, K.E., Zwarthoff, E.C., Calatozzolo, C., Cuppini, L., Cuzzubbo, S., DiMeco, F., Finocchiaro, G., Mattei, L., Perin, A., Pollo, B., Chen, C., Houck, J., Lohavanichbutr, P., Hartmann, A., Stoehr, C., Stoehr, R., Taubert, H., Wach, S., Wullich, B., Kycler, W., Murawa, D., Wiznerowicz, M., Chung, K., Edenfield, W.J., Martin, J., Baudin, E., Bubley, G., Bueno, R., De Rienzo, A., Richards, W.G., Kalkanis, S., Mikkelsen, T., Noushmehr, H., Scarpace, L., Girard, N., Aymerich, M., Campo, E., Gine, E., Guillermo, A.L., Van Bang, N., Hanh, P.T., Phu, B.D., Tang, Y., Colman, H., Evason, K., Dottino, P.R., Martignetti, J.A., Gabra, H., Juhl, H., Akeredolu, T., Stepa, S., Hoon, D., Ahn, K., Kang, K.J., Beuschlein, F., Breggia, A., Birrer, M., Bell, D., Borad, M., Bryce, A.H., Castle, E., Chandan, V., Cheville, J., Copland, J.A., Farnell, M., Flotte, T., Giama, N., Ho, T., Kendrick, M., Kocher, J.-P., Kopp, K., Moser, C., Nagorney, D., O'Brien, D., O'Neill, B.P., Patel, T., Petersen, G., Que, F., Rivera, M., Roberts, L., Smallridge, R., Smyrk, T., Stanton, M., Thompson, R.H., Torbenson, M., Yang, J.D., Zhang, L., Brimo, F., Ajani, J.A., Gonzalez, A.M.A., Behrens, C., Bondaruk, O., Broaddus, R., Czerniak, B., Esmaeli, B., Fujimoto, J., Gershenwald, J., Guo, C., Lazar, A.J., Logothetis, C., Meric-Bernstam, F., Moran, C., Ramondetta, L., Rice, D., Sood, A., Tamboli, P., Thompson, T., Troncoso, P., Tsao, A., Wistuba, I., Carter, C., Haydu, L., Hersey, P., Jakrot, V., Kakavand, H., Kefford, R., Lee, K., Long, G., Mann, G., Quinn, M., Saw, R., Scolyer, R., Shannon, K., Spillane, A., Stretch, J., Synott, M., Thompson, J., Wilmott, J., Al-Ahmadie, H., Chan, T.A., Ghossein, R., Gopalan, A., Levine, D.A., Reuter, V., Singer, S., Singh, B., Tien, N.V., Broudy, T., Mirsaidi, C., Nair, P., Drwiega, P., Miller, J., Smith, J., Zaren, H., Park, J.-W., Hung, N.P., Kebebew, E., Linehan, W.M., Metwalli, A.R., Pacak, K., Pinto, P.A., Schiffman, M., Schmidt, L.S., Vocke, C.D., Wentzensen, N., Worrell, R., Yang, H., Moncrieff, M., Goparaju, C., Melamed, J., Pass, H., Botnariuc, N., Caraman, I., Cernat, M., Chemencedji, I., Clipca, A., Doruc, S., Gorincioi, G., Mura, S., Pirtac, M., Stancul, I., Tcaciuc, D., Albert, M., Alexopoulou, I., Arnaout, A., Bartlett, J., Engel, J., Gilbert, S., Parfitt, J., Sekhon, H., Thomas, G., Rassl, D.M., Rintoul, R.C., Bifulco, C., Tamakawa, R., Urba, W., Hayward, N., Timmers, H., Antenucci, A., Facciolo, F., Grazi, G., Marino, M., Merola, R., De Krijger, R., Gimenez-Roqueplo, A.-P., Piche, A., Chevalier, S., McKercher, G., Birsoy, K., Barnett, G., Brewer, C., Farver, C., Naska, T., Pennell, N.A., Raymond, D., Schilero, C., Smolenski, K., Williams, F., Morrison, C., Borgia, J.A., Liptay, M.J., Pool, M., Seder, C.W., Junker, K., Omberg, L., Dinkin, M., Manikhas, G., Alvaro, D., Bragazzi, M.C., Cardinale, V., Carpino, G., Gaudio, E., Chesla, D., Cottingham, S., Dubina, M., Moiseenko, F., Dhanasekaran, R., Becker, K.-F., Janssen, K.-P., Slotta-Huspenina, J., Abdel-Rahman, M.H., Aziz, D., Bell, S., Cebulla, C.M., Davis, A., Duell, R., Elder, J.B., Hilty, J., Kumar, B., Lang, J., Lehman, N.L., Mandt, R., Nguyen, P., Pilarski, R., Rai, K., Schoenfield, L., Senecal, K., Wakely, P., Hansen, P., Lechan, R., Powers, J., Tischler, A., Grizzle, W.E., Sexton, K.C., Kastl, A., Henderson, J., Porten, S., Waldmann, J., Fassnacht, M., Asa, S.L., Schadendorf, D., Couce, M., Graefen, M., Huland, H., Sauter, G., Schlomm, T., Simon, R., Tennstedt, P., Olabode, O., Nelson, M., Bathe, O., Carroll, P.R., Chan, J.M., Disaia, P., Glenn, P., Kelley, R.K., Landen, C.N., Phillips, J., Prados, M., Simko, J., Smith-McCune, K., VandenBerg, S., Roggin, K., Fehrenbach, A., Kendler, A., Sifri, S., Steele, R., Jimeno, A., Carey, F., Forgie, I., Mannelli, M., Carney, M., Hernandez, B., Campos, B., Herold-Mende, C., Jungk, C., Unterberg, A., Von Deimling, A., Bossler, A., Galbraith, J., Jacobus, L., Knudson, M., Knutson, T., Ma, D., Milhem, M., Sigmund, R., Godwin, A.K., Madan, R., Rosenthal, H.G., Adebamowo, C., Adebamowo, S.N., Boussioutas, A., Beer, D., Giordano, T., Mes-Masson, A.-M., Saad, F., Bocklage, T., Landrum, L., Mannel, R., Moore, K., Moxley, K., Postier, R., Walker, J., Zuna, R., Feldman, M., Valdivieso, F., Dhir, R., Luketich, J., Pinero, E.M.M., Quintero-Aguilo, M., Carlotti, C.G., Dos Santos, J.S., Kemp, R., Sankarankuty, A., Tirapelli, D., Catto, J., Agnew, K., Swisher, E., Creaney, J., Robinson, B., Shelley, C.S., Godwin, E.M., Kendall, S., Shipman, C., Bradford, C., Carey, T., Haddad, A., Moyer, J., Peterson, L., Prince, M., Rozek, L., Wolf, G., Bowman, R., Fong, K.M., Yang, I., Korst, R., Rathmell, W.K., Fantacone-Campbell, J.L., Hooke, J.A., Kovatich, A.J., Shriver, C.D., DiPersio, J., Drake, B., Govindan, R., Heath, S., Ley, T., Van Tine, B., Westervelt, P., Rubin, M.A., Lee, J.I., Aredes, N.D., Mariamidze, A., Stuart, J.M., Benz, C.C., Laird, P.W.: Cell-of-origin patterns dominate the molecular classification of 10,000 tumors from 33 types of cancer. Cell 173(2), 291–3046 (2018). https://doi.org/10.1016/j.cell.2018.03.022</w:t>
+        <w:t>28. Hoadley KA, Yau C, Hinoue T, et al. Cell-of-Origin Patterns Dominate the Molecular Classification of 10,000 Tumors from 33 Types of Cancer. Cell. 2018;173(2):291-304.e6. doi:10.1016/j.cell.2018.03.022</w:t>
       </w:r>
     </w:p>
     <w:p>
@@ -15048,11 +15200,9 @@
       <w:r>
         <w:rPr>
           <w:rFonts w:ascii="Times New Roman" w:hAnsi="Times New Roman" w:eastAsia="Times New Roman"/>
-          <w:b w:val="0"/>
-          <w:i w:val="0"/>
           <w:sz w:val="18"/>
         </w:rPr>
-        <w:t>[29] The Cancer Genome Atlas Research Network: Comprehensive molecular profiling of lung adenocarcinoma. Nature 511(7511), 543–550 (2014). https://doi.org/10.1038/nature13385</w:t>
+        <w:t>29. The Cancer Genome Atlas Research Network. Comprehensive molecular profiling of lung adenocarcinoma. Nature. 2014;511(7511):543-550. doi:10.1038/nature13385</w:t>
       </w:r>
     </w:p>
     <w:p>
@@ -15063,11 +15213,9 @@
       <w:r>
         <w:rPr>
           <w:rFonts w:ascii="Times New Roman" w:hAnsi="Times New Roman" w:eastAsia="Times New Roman"/>
-          <w:b w:val="0"/>
-          <w:i w:val="0"/>
           <w:sz w:val="18"/>
         </w:rPr>
-        <w:t>[30] The Cancer Genome Atlas Research Network: Comprehensive genomic characterization of squamous cell lung cancers. Nature 489(7417), 519–525 (2012). https://doi.org/10.1038/nature11404</w:t>
+        <w:t>30. The Cancer Genome Atlas Research Network. Comprehensive genomic characterization of squamous cell lung cancers. Nature. 2012;489(7417):519-525. doi:10.1038/nature11404</w:t>
       </w:r>
     </w:p>
     <w:p>
@@ -15078,11 +15226,9 @@
       <w:r>
         <w:rPr>
           <w:rFonts w:ascii="Times New Roman" w:hAnsi="Times New Roman" w:eastAsia="Times New Roman"/>
-          <w:b w:val="0"/>
-          <w:i w:val="0"/>
           <w:sz w:val="18"/>
         </w:rPr>
-        <w:t>[31] Thorsson, V., Gibbs, D.L., Brown, S.D., Wolf, D., Bortone, D.S., Ou Yang, T.-H., Porta-Pardo, E., Gao, G.F., Plaisier, C.L., Eddy, J.A., Ziv, E., Culhane, A.C., Paull, E.O., Sivakumar, I.K.A., Gentles, A.J., Malhotra, R., Farshidfar, F., Colaprico, A., Parker, J.S., Mose, L.E., Vo, N.S., Liu, J., Liu, Y., Rader, J., Dhankani, V., Reynolds, S.M., Bowlby, R., Califano, A., Cherniack, A.D., Anastassiou, D., Bedognetti, D., Mokrab, Y., Newman, A.M., Rao, A., Chen, K., Krasnitz, A., Hu, H., Malta, T.M., Noushmehr, H., Pedamallu, C.S., Bullman, S., Ojesina, A.I., Lamb, A., Zhou, W., Shen, H., Choueiri, T.K., Weinstein, J.N., Guinney, J., Saltz, J., Holt, R.A., Rabkin, C.S., Caesar-Johnson, S.J., Demchok, J.A., Felau, I., Kasapi, M., Ferguson, M.L., Hutter, C.M., Sofia, H.J., Tarnuzzer, R., Wang, Z., Yang, L., Zenklusen, J.C., Zhang, J.J., Chudamani, S., Liu, J., Lolla, L., Naresh, R., Pihl, T., Sun, Q., Wan, Y., Wu, Y., Cho, J., DeFreitas, T., Frazer, S., Gehlenborg, N., Getz, G., Heiman, D.I., Kim, J., Lawrence, M.S., Lin, P., Meier, S., Noble, M.S., Saksena, G., Voet, D., Zhang, H., Bernard, B., Chambwe, N., Dhankani, V., Knijnenburg, T., Kramer, R., Leinonen, K., Liu, Y., Miller, M., Reynolds, S., Shmulevich, I., Thorsson, V., Zhang, W., Akbani, R., Broom, B.M., Hegde, A.M., Ju, Z., Kanchi, R.S., Korkut, A., Li, J., Liang, H., Ling, S., Liu, W., Lu, Y., Mills, G.B., Ng, K.-S., Rao, A., Ryan, M., Wang, J., Weinstein, J.N., Zhang, J., Abeshouse, A., Armenia, J., Chakravarty, D., Chatila, W.K., De Bruijn, I., Gao, J., Gross, B.E., Heins, Z.J., Kundra, R., La, K., Ladanyi, M., Luna, A., Nissan, M.G., Ochoa, A., Phillips, S.M., Reznik, E., Sanchez-Vega, F., Sander, C., Schultz, N., Sheridan, R., Sumer, S.O., Sun, Y., Taylor, B.S., Wang, J., Zhang, H., Anur, P., Peto, M., Spellman, P., Benz, C., Stuart, J.M., Wong, C.K., Yau, C., Hayes, D.N., Parker, J.S., Wilkerson, M.D., Ally, A., Balasundaram, M., Bowlby, R., Brooks, D., Carlsen, R., Chuah, E., Dhalla, N., Holt, R., Jones, S.J.M., Kasaian, K., Lee, D., Ma, Y., Marra, M.A., Mayo, M., Moore, R.A., Mungall, A.J., Mungall, K., Robertson, A.G., Sadeghi, S., Schein, J.E., Sipahimalani, P., Tam, A., Thiessen, N., Tse, K., Wong, T., Berger, A.C., Beroukhim, R., Cherniack, A.D., Cibulskis, C., Gabriel, S.B., Gao, G.F., Ha, G., Meyerson, M., Schumacher, S.E., Shih, J., Kucherlapati, M.H., Kucherlapati, R.S., Baylin, S., Cope, L., Danilova, L., Bootwalla, M.S., Lai, P.H., Maglinte, D.T., Van Den Berg, D.J., Weisenberger, D.J., Auman, J.T., Balu, S., Bodenheimer, T., Fan, C., Hoadley, K.A., Hoyle, A.P., Jefferys, S.R., Jones, C.D., Meng, S., Mieczkowski, P.A., Mose, L.E., Perou, A.H., Perou, C.M., Roach, J., Shi, Y., Simons, J.V., Skelly, T., Soloway, M.G., Tan, D., Veluvolu, U., Fan, H., Hinoue, T., Laird, P.W., Shen, H., Zhou, W., Bellair, M., Chang, K., Covington, K., Creighton, C.J., Dinh, H., Doddapaneni, H., Donehower, L.A., Drummond, J., Gibbs, R.A., Glenn, R., Hale, W., Han, Y., Hu, J., Korchina, V., Lee, S., Lewis, L., Li, W., Liu, X., Morgan, M., Morton, D., Muzny, D., Santibanez, J., Sheth, M., Shinbrot, E., Wang, L., Wang, M., Wheeler, D.A., Xi, L., Zhao, F., Hess, J., Appelbaum, E.L., Bailey, M., Cordes, M.G., Ding, L., Fronick, C.C., Fulton, L.A., Fulton, R.S., Kandoth, C., Mardis, E.R., McLellan, M.D., Miller, C.A., Schmidt, H.K., Wilson, R.K., Crain, D., Curley, E., Gardner, J., Lau, K., Mallery, D., Morris, S., Paulauskis, J., Penny, R., Shelton, C., Shelton, T., Sherman, M., Thompson, E., Yena, P., Bowen, J., Gastier-Foster, J.M., Gerken, M., Leraas, K.M., Lichtenberg, T.M., Ramirez, N.C., Wise, L., Zmuda, E., Corcoran, N., Costello, T., Hovens, C., Carvalho, A.L., De Carvalho, A.C., Fregnani, J.H., Longatto-Filho, A., Reis, R.M., Scapulatempo-Neto, C., Silveira, H.C.S., Vidal, D.O., Burnette, A., Eschbacher, J., Hermes, B., Noss, A., Singh, R., Anderson, M.L., Castro, P.D., Ittmann, M., Huntsman, D., Kohl, B., Le, X., Thorp, R., Andry, C., Duffy, E.R., Lyadov, V., Paklina, O., Setdikova, G., Shabunin, A., Tavobilov, M., McPherson, C., Warnick, R., Berkowitz, R., Cramer, D., Feltmate, C., Horowitz, N., Kibel, A., Muto, M., Raut, C.P., Malykh, A., Barnholtz-Sloan, J.S., Barrett, W., Devine, K., Fulop, J., Ostrom, Q.T., Shimmel, K., Wolinsky, Y., Sloan, A.E., De Rose, A., Giuliante, F., Goodman, M., Karlan, B.Y., Hagedorn, C.H., Eckman, J., Harr, J., Myers, J., Tucker, K., Zach, L.A., Deyarmin, B., Hu, H., Kvecher, L., Larson, C., Mural, R.J., Somiari, S., Vicha, A., Zelinka, T., Bennett, J., Iacocca, M., Rabeno, B., Swanson, P., Latour, M., Lacombe, L., T\^etu, B., Bergeron, A., McGraw, M., Staugaitis, S.M., Chabot, J., Hibshoosh, H., Sepulveda, A., Su, T., Wang, T., Potapova, O., Voronina, O., Desjardins, L., Mariani, O., Roman-Roman, S., Sastre, X., Stern, M.-H., Cheng, F., Signoretti, S., Berchuck, A., Bigner, D., Lipp, E., Marks, J., McCall, S., McLendon, R., Secord, A., Sharp, A., Behera, M., Brat, D.J., Chen, A., Delman, K., Force, S., Khuri, F., Magliocca, K., Maithel, S., Olson, J.J., Owonikoko, T., Pickens, A., Ramalingam, S., Shin, D.M., Sica, G., Van Meir, E.G., Zhang, H., Eijckenboom, W., Gillis, A., Korpershoek, E., Looijenga, L., Oosterhuis, W., Stoop, H., Van Kessel, K.E., Zwarthoff, E.C., Calatozzolo, C., Cuppini, L., Cuzzubbo, S., DiMeco, F., Finocchiaro, G., Mattei, L., Perin, A., Pollo, B., Chen, C., Houck, J., Lohavanichbutr, P., Hartmann, A., Stoehr, C., Stoehr, R., Taubert, H., Wach, S., Wullich, B., Kycler, W., Murawa, D., Wiznerowicz, M., Chung, K., Edenfield, W.J., Martin, J., Baudin, E., Bubley, G., Bueno, R., De Rienzo, A., Richards, W.G., Kalkanis, S., Mikkelsen, T., Noushmehr, H., Scarpace, L., Girard, N., Aymerich, M., Campo, E., Gine, E., Guillermo, A.L., Van Bang, N., Hanh, P.T., Phu, B.D., Tang, Y., Colman, H., Evason, K., Dottino, P.R., Martignetti, J.A., Gabra, H., Juhl, H., Akeredolu, T., Stepa, S., Hoon, D., Ahn, K., Kang, K.J., Beuschlein, F., Breggia, A., Birrer, M., Bell, D., Borad, M., Bryce, A.H., Castle, E., Chandan, V., Cheville, J., Copland, J.A., Farnell, M., Flotte, T., Giama, N., Ho, T., Kendrick, M., Kocher, J.-P., Kopp, K., Moser, C., Nagorney, D., O'Brien, D., O'Neill, B.P., Patel, T., Petersen, G., Que, F., Rivera, M., Roberts, L., Smallridge, R., Smyrk, T., Stanton, M., Thompson, R.H., Torbenson, M., Yang, J.D., Zhang, L., Brimo, F., Ajani, J.A., Gonzalez, A.M.A., Behrens, C., Bondaruk, J., Broaddus, R., Czerniak, B., Esmaeli, B., Fujimoto, J., Gershenwald, J., Guo, C., Lazar, A.J., Logothetis, C., Meric-Bernstam, F., Moran, C., Ramondetta, L., Rice, D., Sood, A., Tamboli, P., Thompson, T., Troncoso, P., Tsao, A., Wistuba, I., Carter, C., Haydu, L., Hersey, P., Jakrot, V., Kakavand, H., Kefford, R., Lee, K., Long, G., Mann, G., Quinn, M., Saw, R., Scolyer, R., Shannon, K., Spillane, A., Stretch, O., Synott, M., Thompson, J., Wilmott, J., Al-Ahmadie, H., Chan, T.A., Ghossein, R., Gopalan, A., Levine, D.A., Reuter, V., Singer, S., Singh, B., Tien, N.V., Broudy, T., Mirsaidi, C., Nair, P., Drwiega, P., Miller, J., Smith, J., Zaren, H., Park, J.-W., Hung, N.P., Kebebew, E., Linehan, W.M., Metwalli, A.R., Pacak, K., Pinto, P.A., Schiffman, M., Schmidt, L.S., Vocke, C.D., Wentzensen, N., Worrell, R., Yang, H., Moncrieff, M., Goparaju, C., Melamed, J., Pass, H., Botnariuc, N., Caraman, I., Cernat, M., Chemencedji, I., Clipca, A., Doruc, S., Gorincioi, G., Mura, S., Pirtac, M., Stancul, I., Tcaciuc, D., Albert, M., Alexopoulou, I., Arnaout, A., Bartlett, J., Engel, J., Gilbert, S., Parfitt, J., Sekhon, H., Thomas, G., Rassl, D.M., Rintoul, R.C., Bifulco, C., Tamakawa, R., Urba, W., Hayward, N., Timmers, H., Antenucci, A., Facciolo, F., Grazi, G., Marino, M., Merola, R., De Krijger, R., Gimenez-Roqueplo, A.-P., Piche, A., Chevalier, S., McKercher, G., Birsoy, K., Barnett, G., Brewer, C., Farver, C., Naska, T., Pennell, N.A., Raymond, D., Schilero, C., Smolenski, K., Williams, F., Morrison, C., Borgia, J.A., Liptay, M.J., Pool, M., Seder, C.W., Junker, K., Omberg, L., Dinkin, M., Manikhas, G., Alvaro, D., Bragazzi, M.C., Cardinale, V., Carpino, G., Gaudio, E., Chesla, D., Cottingham, S., Dubina, M., Moiseenko, F., Dhanasekaran, R., Becker, K.-F., Janssen, K.-P., Slotta-Huspenina, J., Abdel-Rahman, M.H., Aziz, D., Bell, S., Cebulla, C.M., Davis, A., Duell, R., Elder, J.B., Hilty, J., Kumar, B., Lang, J., Lehman, N.L., Mandt, R., Nguyen, P., Pilarski, R., Rai, K., Schoenfield, L., Senecal, K., Wakely, P., Hansen, P., Lechan, R., Powers, J., Tischler, A., Grizzle, W.E., Sexton, K.C., Kastl, A., Henderson, J., Porten, S., Waldmann, J., Fassnacht, M., Asa, S.L., Schadendorf, D., Couce, M., Graefen, M., Huland, H., Sauter, G., Schlomm, T., Simon, R., Tennstedt, P., Olabode, O., Nelson, M., Bathe, O., Carroll, P.R., Chan, J.M., Disaia, P., Glenn, P., Kelley, R.K., Landen, C.N., Phillips, J., Prados, M., Simko, J., Smith-McCune, K., VandenBerg, S., Roggin, K., Fehrenbach, A., Kendler, A., Sifri, S., Steele, R., Jimeno, A., Carey, F., Forgie, I., Mannelli, M., Carney, M., Hernandez, B., Campos, B., Herold-Mende, C., Jungk, C., Unterberg, A., Von Deimling, A., Bossler, A., Galbraith, J., Jacobus, L., Knudson, M., Knutson, T., Ma, D., Milhem, M., Sigmund, R., Godwin, A.K., Madan, R., Rosenthal, H.G., Adebamowo, C., Adebamowo, S.N., Boussioutas, A., Beer, D., Giordano, T., Mes-Masson, A.-M., Saad, F., Bocklage, T., Landrum, L., Mannel, R., Moore, K., Moxley, K., Postier, R., Walker, J., Zuna, R., Feldman, M., Valdivieso, F., Dhir, R., Luketich, J., Pinero, E.M.M., Quintero-Aguilo, M., Carlotti, C.G., Dos Santos, J.S., Kemp, R., Sankarankuty, A., Tirapelli, D., Catto, J., Agnew, K., Swisher, E., Creaney, J., Robinson, B., Shelley, C.S., Godwin, E.M., Kendall, S., Shipman, C., Bradford, C., Carey, T., Haddad, A., Moyer, J., Peterson, L., Prince, M., Rozek, L., Wolf, G., Bowman, R., Fong, K.M., Yang, I., Korst, R., Rathmell, W.K., Fantacone-Campbell, J.L., Hooke, J.A., Kovatich, A.J., Shriver, C.D., DiPersio, J., Drake, B., Govindan, R., Heath, S., Ley, T., Van Tine, B., Westervelt, P., Rubin, M.A., Lee, J.I., Aredes, N.D., Mariamidze, A., Lazar, A.J., Serody, J.S., Demicco, E.G., Disis, M.L., Vincent, B.G., Shmulevich, I.: The immune landscape of cancer. Immunity 48(4), 812–83014 (2018). https://doi.org/10.1016/j.immuni.2018.03.023</w:t>
+        <w:t>31. Thorsson V, Gibbs DL, Brown SD, et al. The Immune Landscape of Cancer. Immunity. 2018;48(4):812-830.e14. doi:10.1016/j.immuni.2018.03.023</w:t>
       </w:r>
     </w:p>
     <w:p>
@@ -15093,11 +15239,9 @@
       <w:r>
         <w:rPr>
           <w:rFonts w:ascii="Times New Roman" w:hAnsi="Times New Roman" w:eastAsia="Times New Roman"/>
-          <w:b w:val="0"/>
-          <w:i w:val="0"/>
           <w:sz w:val="18"/>
         </w:rPr>
-        <w:t>[32] Zhang, L., Li, Z., Skrzypczynska, K.M., Fang, Q., Zhang, W., O'Brien, S.A., He, Y., Wang, L., Zhang, Q., Kim, A., Gao, R., Orf, J., Wang, T., Sawant, D., Kang, J., Bhatt, D., Lu, D., Li, C.-M., Rapaport, A.S., Perez, K., Ye, Y., Wang, S., Hu, X., Ren, X., Ouyang, W., Shen, Z., Egen, J.G., Zhang, Z., Yu, X.: Single-cell analyses inform mechanisms of myeloid-targeted therapies in colon cancer. Cell 181(2), 442–45929 (2020). https://doi.org/10.1016/j.cell.2020.03.048</w:t>
+        <w:t>32. Zhang L, Li Z, Skrzypczynska KM, et al. Single-Cell Analyses Inform Mechanisms of Myeloid-Targeted Therapies in Colon Cancer. Cell. 2020;181(2):442-459.e29. doi:10.1016/j.cell.2020.03.048</w:t>
       </w:r>
     </w:p>
     <w:p>
@@ -15108,11 +15252,9 @@
       <w:r>
         <w:rPr>
           <w:rFonts w:ascii="Times New Roman" w:hAnsi="Times New Roman" w:eastAsia="Times New Roman"/>
-          <w:b w:val="0"/>
-          <w:i w:val="0"/>
           <w:sz w:val="18"/>
         </w:rPr>
-        <w:t>[33] Davey Smith, G., Ebrahim, S.: `mendelian randomization': Can genetic epidemiology contribute to understanding environmental determinants of disease?*. International Journal of Epidemiology 32(1), 1–22 (2003). https://doi.org/10.1093/ije/dyg070</w:t>
+        <w:t>33. Davey Smith G, Ebrahim S. ‘Mendelian randomization’: can genetic epidemiology contribute to understanding environmental determinants of disease?*. International Journal of Epidemiology. 2003;32(1):1-22. doi:10.1093/ije/dyg070</w:t>
       </w:r>
     </w:p>
     <w:p>
@@ -15123,11 +15265,9 @@
       <w:r>
         <w:rPr>
           <w:rFonts w:ascii="Times New Roman" w:hAnsi="Times New Roman" w:eastAsia="Times New Roman"/>
-          <w:b w:val="0"/>
-          <w:i w:val="0"/>
           <w:sz w:val="18"/>
         </w:rPr>
-        <w:t>[34] Hagberg, A., Swart, P., Chult, D.: Exploring network structure, dynamics, and function using NetworkX. In: Proceedings of the 7th Python in Science Conference. (2008). https://doi.org/10.25080/TCWV9851</w:t>
+        <w:t>34. Hagberg AA, Schult DA, Swart PJ. Exploring Network Structure, Dynamics, and Function using NetworkX. Proceedings of the Python in Science Conference. 2008:11-15. doi:10.25080/tcwv9851</w:t>
       </w:r>
     </w:p>
     <w:p>
@@ -15138,11 +15278,9 @@
       <w:r>
         <w:rPr>
           <w:rFonts w:ascii="Times New Roman" w:hAnsi="Times New Roman" w:eastAsia="Times New Roman"/>
-          <w:b w:val="0"/>
-          <w:i w:val="0"/>
           <w:sz w:val="18"/>
         </w:rPr>
-        <w:t>[35] Vosa, U., Claringbould, A., Westra, H.-J., Bonder, M.J., Deelen, P., Zeng, B., Kirsten, H., Saha, A., Kreuzhuber, R., Yazar, S., Brugge, H., Oelen, R., De Vries, D.H., Van Der Wijst, M.G.P., Kasela, S., Pervjakova, N., Alves, I., Fave, M.-J., Agbessi, M., Christiansen, M.W., Jansen, R., Seppala, I., Tong, L., Teumer, A., Schramm, K., Hemani, G., Verlouw, J., Yaghootkar, H., Sonmez Flitman, R., Brown, A., Kukushkina, V., Kalnapenkis, A., Rueger, S., Porcu, E., Kronberg, J., Kettunen, J., Lee, B., Zhang, F., Qi, T., Hernandez, J.A., Arindrarto, W., Beutner, F., BIOS Consortium, 'T Hoen, P.A.C., Van Meurs, J., Van Dongen, J., Van Iterson, M., Swertz, M.A., i2QTL Consortium, Jan Bonder, M., Dmitrieva, J., Elansary, M., Fairfax, B.P., Georges, M., Heijmans, B.T., Hewitt, A.W., Kahonen, M., Kim, Y., Knight, J.C., Kovacs, P., Krohn, K., Li, S., Loeffler, M., Marigorta, U.M., Mei, H., Momozawa, Y., Muller-Nurasyid, M., Nauck, M., Nivard, M.G., Penninx, B.W.J.H., Pritchard, J.K., Raitakari, O.T., Rotzschke, O., Slagboom, E.P., Stehouwer, C.D.A., Stumvoll, M., Sullivan, P., 'T Hoen, P.A.C., Thiery, J., Tonjes, A., Van Dongen, J., Van Iterson, M., Veldink, J.H., Volker, U., Warmerdam, R., Wijmenga, C., Swertz, M., Andiappan, A., Montgomery, G.W., Ripatti, S., Perola, M., Kutalik, Z., Dermitzakis, E., Bergmann, S., Frayling, T., Van Meurs, J., Prokisch, H., Ahsan, H., Pierce, B.L., Lehtimaki, T., Boomsma, D.I., Psaty, B.M., Gharib, S.A., Awadalla, P., Milani, L., Ouwehand, W.H., Downes, K., Stegle, O., Battle, A., Visscher, P.M., Yang, J., Scholz, M., Powell, J., Gibson, G., Esko, T., Franke, L.: Large-scale cis- and trans-eQTL analyses identify thousands of genetic loci and polygenic scores that regulate blood gene expression. Nature Genetics 53(9), 1300–1310 (2021). https://doi.org/10.1038/s41588-021-00913-z</w:t>
+        <w:t>35. Võsa U, Claringbould A, Westra HJ, et al. Large-scale cis- and trans-eQTL analyses identify thousands of genetic loci and polygenic scores that regulate blood gene expression. Nat Genet. 2021;53(9):1300-1310. doi:10.1038/s41588-021-00913-z</w:t>
       </w:r>
     </w:p>
     <w:p>
@@ -15153,11 +15291,9 @@
       <w:r>
         <w:rPr>
           <w:rFonts w:ascii="Times New Roman" w:hAnsi="Times New Roman" w:eastAsia="Times New Roman"/>
-          <w:b w:val="0"/>
-          <w:i w:val="0"/>
           <w:sz w:val="18"/>
         </w:rPr>
-        <w:t>[36] Zhu, Z., Zhang, F., Hu, H., Bakshi, A., Robinson, M.R., Powell, J.E., Montgomery, G.W., Goddard, M.E., Wray, N.R., Visscher, P.M., Yang, J.: Integration of summary data from GWAS and eQTL studies predicts complex trait gene targets. Nature Genetics 48(5), 481–487 (2016). https://doi.org/10.1038/ng.3538</w:t>
+        <w:t>36. Zhu Z, Zhang F, Hu H, et al. Integration of summary data from GWAS and eQTL studies predicts complex trait gene targets. Nat Genet. 2016;48(5):481-487. doi:10.1038/ng.3538</w:t>
       </w:r>
     </w:p>
     <w:p>
@@ -15168,11 +15304,9 @@
       <w:r>
         <w:rPr>
           <w:rFonts w:ascii="Times New Roman" w:hAnsi="Times New Roman" w:eastAsia="Times New Roman"/>
-          <w:b w:val="0"/>
-          <w:i w:val="0"/>
           <w:sz w:val="18"/>
         </w:rPr>
-        <w:t>[37] McKinney, W.: Data structures for statistical computing in python. SciPy 2010 (2010). https://doi.org/10.25080/Majora-92bf1922-00a</w:t>
+        <w:t>37. McKinney W. Data Structures for Statistical Computing in Python. Proceedings of the Python in Science Conference. 2010:56-61. doi:10.25080/majora-92bf1922-00a</w:t>
       </w:r>
     </w:p>
     <w:p>
@@ -15183,11 +15317,9 @@
       <w:r>
         <w:rPr>
           <w:rFonts w:ascii="Times New Roman" w:hAnsi="Times New Roman" w:eastAsia="Times New Roman"/>
-          <w:b w:val="0"/>
-          <w:i w:val="0"/>
           <w:sz w:val="18"/>
         </w:rPr>
-        <w:t>[38] Harris, C.R., Millman, K.J., van der Walt, S.J., Gommers, R., Virtanen, P., Cournapeau, D., Wieser, E., Taylor, J., Berg, S., Smith, N.J., Kern, R., Picus, M., Hoyer, S., van Kerkwijk, M.H., Brett, M., Haldane, A., del Rio, J.F., Wiebe, M., Peterson, P., Gerard-Marchant, P., Sheppard, K., Reddy, T., Weckesser, W., Abbasi, H., Gohlke, C., Oliphant, T.E.: Array programming with NumPy. Nature 585(7825), 357–362 (2020). https://doi.org/10.1038/s41586-020-2649-2</w:t>
+        <w:t>38. Harris CR, Millman KJ, van der Walt SJ, et al. Array programming with NumPy. Nature. 2020;585(7825):357-362. doi:10.1038/s41586-020-2649-2</w:t>
       </w:r>
     </w:p>
     <w:p>
@@ -15198,11 +15330,9 @@
       <w:r>
         <w:rPr>
           <w:rFonts w:ascii="Times New Roman" w:hAnsi="Times New Roman" w:eastAsia="Times New Roman"/>
-          <w:b w:val="0"/>
-          <w:i w:val="0"/>
           <w:sz w:val="18"/>
         </w:rPr>
-        <w:t>[39] Virtanen, P., Gommers, R., Oliphant, T.E., Haberland, M., Reddy, T., Cournapeau, D., Burovski, E., Peterson, P., Weckesser, W., Bright, J., Van Der Walt, S.J., Brett, M., Wilson, J., Millman, K.J., Mayorov, N., Nelson, A.R.J., Jones, E., Kern, R., Larson, E., Carey, C.J., Polat, \. I., Feng, Y., Moore, E.W., VanderPlas, J., Laxalde, D., Perktold, J., Cimrman, R., Henriksen, I., Quintero, E.A., Harris, C.R., Archibald, A.M., Ribeiro, A.H., Pedregosa, F., Van Mulbregt, P., SciPy 1.0 Contributors, Vijaykumar, A., Bardelli, A.P., Rothberg, A., Hilboll, A., Kloeckner, A., Scopatz, A., Lee, A., Rokem, A., Woods, C.N., Fulton, C., Masson, C., Haggstrom, C., Fitzgerald, C., Nicholson, D.A., Hagen, D.R., Pasechnik, D.V., Olivetti, E., Martin, E., Wieser, E., Silva, F., Lenders, F., Wilhelm, F., Young, G., Price, G.A., Ingold, G.-L., Allen, G.E., Lee, G.R., Audren, H., Probst, I., Dietrich, J.P., Silterra, J., Webber, J.T., Slavi c, J., Nothman, J., Buchner, J., Kulick, J., Schonberger, J.L., De Miranda Cardoso, J.V., Reimer, J., Harrington, J., Rodriguez, J.L.C., Nunez-Iglesias, J., Kuczynski, J., Tritz, K., Thoma, M., Newville, M., Kummerer, M., Bolingbroke, M., Tartre, M., Pak, M., Smith, N.J., Nowaczyk, N., Shebanov, N., Pavlyk, O., Brodtkorb, P.A., Lee, P., McGibbon, R.T., Feldbauer, R., Lewis, S., Tygier, S., Sievert, S., Vigna, S., Peterson, S., More, S., Pudlik, T., Oshima, T., Pingel, T.J., Robitaille, T.P., Spura, T., Jones, T.R., Cera, T., Leslie, T., Zito, T., Krauss, T., Upadhyay, U., Halchenko, Y.O., V\'azquez-Baeza, Y.: SciPy 1.0: Fundamental algorithms for scientific computing in python. Nature Methods 17(3), 261–272 (2020). https://doi.org/10.1038/s41592-019-0686-2</w:t>
+        <w:t>39. Virtanen P, Gommers R, Oliphant TE, et al. SciPy 1.0: fundamental algorithms for scientific computing in Python. Nat Methods. 2020;17(3):261-272. doi:10.1038/s41592-019-0686-2</w:t>
       </w:r>
     </w:p>
     <w:p>
@@ -15213,11 +15343,9 @@
       <w:r>
         <w:rPr>
           <w:rFonts w:ascii="Times New Roman" w:hAnsi="Times New Roman" w:eastAsia="Times New Roman"/>
-          <w:b w:val="0"/>
-          <w:i w:val="0"/>
           <w:sz w:val="18"/>
         </w:rPr>
-        <w:t>[40] Hunter, J.D.: Matplotlib: A 2D graphics environment. Computing in Science &amp; Engineering 9(3), 90–95 (2007). https://doi.org/10.1109/MCSE.2007.55</w:t>
+        <w:t>40. Hunter JD. Matplotlib: A 2D Graphics Environment. Comput. Sci. Eng. 2007;9(3):90-95. doi:10.1109/mcse.2007.55</w:t>
       </w:r>
     </w:p>
     <w:p>
@@ -15228,11 +15356,9 @@
       <w:r>
         <w:rPr>
           <w:rFonts w:ascii="Times New Roman" w:hAnsi="Times New Roman" w:eastAsia="Times New Roman"/>
-          <w:b w:val="0"/>
-          <w:i w:val="0"/>
           <w:sz w:val="18"/>
         </w:rPr>
-        <w:t>[41] Waskom, M.: Seaborn: Statistical data visualization. Journal of Open Source Software 6(60), 3021 (2021). https://doi.org/10.21105/joss.03021</w:t>
+        <w:t>41. Waskom M. seaborn: statistical data visualization. JOSS. 2021;6(60):3021. doi:10.21105/joss.03021</w:t>
       </w:r>
     </w:p>
     <w:p>
@@ -15243,11 +15369,9 @@
       <w:r>
         <w:rPr>
           <w:rFonts w:ascii="Times New Roman" w:hAnsi="Times New Roman" w:eastAsia="Times New Roman"/>
-          <w:b w:val="0"/>
-          <w:i w:val="0"/>
           <w:sz w:val="18"/>
         </w:rPr>
-        <w:t>[42] Pedregosa, F., Varoquaux, G., Gramfort, A., Michel, V., Thirion, B., Grisel, O., Blondel, M., Prettenhofer, P., Weiss, R., Dubourg, V., Vanderplas, J., Passos, A., Cournapeau, D., Brucher, M., Perrot, M., Duchesnay, \'E.: Scikit-learn: Machine learning in python. J. Mach. Learn. Res. 12(null), 2825–2830 (2011).</w:t>
+        <w:t>42. Pedregosa F, Varoquaux G, Gramfort A, et al. Scikit-learn: Machine learning in python. J Mach Learn Res. 2011;12:2825-2830.</w:t>
       </w:r>
     </w:p>
     <w:p>
@@ -15258,11 +15382,9 @@
       <w:r>
         <w:rPr>
           <w:rFonts w:ascii="Times New Roman" w:hAnsi="Times New Roman" w:eastAsia="Times New Roman"/>
-          <w:b w:val="0"/>
-          <w:i w:val="0"/>
           <w:sz w:val="18"/>
         </w:rPr>
-        <w:t>[43] Tang, Z., Kang, B., Li, C., Chen, T., Zhang, Z.: GEPIA2: An enhanced web server for large-scale expression profiling and interactive analysis. Nucleic Acids Research 47(W1), 556–560 (2019). https://doi.org/10.1093/nar/gkz430</w:t>
+        <w:t>43. Tang Z, Kang B, Li C, Chen T, Zhang Z. GEPIA2: an enhanced web server for large-scale expression profiling and interactive analysis. Nucleic Acids Res. 2019;47(W1):W556-W560. doi:10.1093/nar/gkz430</w:t>
       </w:r>
     </w:p>
     <w:p>
@@ -15273,11 +15395,9 @@
       <w:r>
         <w:rPr>
           <w:rFonts w:ascii="Times New Roman" w:hAnsi="Times New Roman" w:eastAsia="Times New Roman"/>
-          <w:b w:val="0"/>
-          <w:i w:val="0"/>
           <w:sz w:val="18"/>
         </w:rPr>
-        <w:t>[44] Hemani, G., Zheng, J., Elsworth, B., Wade, K.H., Haberland, V., Baird, D., Laurin, C., Burgess, S., Bowden, J., Langdon, R., Tan, V.Y., Yarmolinsky, J., Shihab, H.A., Timpson, N.J., Evans, D.M., Relton, C., Martin, R.M., Davey Smith, G., Gaunt, T.R., Haycock, P.C.: The MR-base platform supports systematic causal inference across the human phenome. eLife 7, 34408 (2018). https://doi.org/10.7554/eLife.34408</w:t>
+        <w:t>44. Hemani G, Zheng J, Elsworth B, et al. The MR-Base platform supports systematic causal inference across the human phenome. eLife. 2018;7:34408. doi:10.7554/elife.34408</w:t>
       </w:r>
     </w:p>
     <w:p>
@@ -15288,11 +15408,9 @@
       <w:r>
         <w:rPr>
           <w:rFonts w:ascii="Times New Roman" w:hAnsi="Times New Roman" w:eastAsia="Times New Roman"/>
-          <w:b w:val="0"/>
-          <w:i w:val="0"/>
           <w:sz w:val="18"/>
         </w:rPr>
-        <w:t>[45] Pan, L., Luo, J., Nie, C., Fan, S., Wang, X., Peng, S., Liang, Q.: A deep learning framework integrating tumor microenvironmental features accurately predicts multiple driver gene mutations in lung cancer pathology images. Cancer Research (2025). https://doi.org/10.1158/0008-5472.CAN-25-0582</w:t>
+        <w:t>45. Pan L, Luo J, Nie C, et al. A Deep Learning Framework Integrating Tumor Microenvironmental Features Accurately Predicts Multiple Driver Gene Mutations in Lung Cancer Pathology Images. Cancer Res. 2026;86(5):1319-1337. doi:10.1158/0008-5472.can-25-0582</w:t>
       </w:r>
     </w:p>
     <w:p>
@@ -15303,11 +15421,9 @@
       <w:r>
         <w:rPr>
           <w:rFonts w:ascii="Times New Roman" w:hAnsi="Times New Roman" w:eastAsia="Times New Roman"/>
-          <w:b w:val="0"/>
-          <w:i w:val="0"/>
           <w:sz w:val="18"/>
         </w:rPr>
-        <w:t>[46] Xu, H., Wang, S., Fang, M., Luo, S., Chen, C., Wan, S., Wang, R., Tang, M., Xue, T., Li, B., Lin, J., Qu, K.: SPACEL: Deep learning-based characterization of spatial transcriptome architectures. Nature Communications 14(1), 7603 (2023). https://doi.org/10.1038/s41467-023-43220-3</w:t>
+        <w:t>46. Xu H, Wang S, Fang M, et al. SPACEL: deep learning-based characterization of spatial transcriptome architectures. Nat Commun. 2023;14(1):7603. doi:10.1038/s41467-023-43220-3</w:t>
       </w:r>
     </w:p>
     <w:p>
@@ -15318,11 +15434,9 @@
       <w:r>
         <w:rPr>
           <w:rFonts w:ascii="Times New Roman" w:hAnsi="Times New Roman" w:eastAsia="Times New Roman"/>
-          <w:b w:val="0"/>
-          <w:i w:val="0"/>
           <w:sz w:val="18"/>
         </w:rPr>
-        <w:t>[47] Ravi, V.M., Will, P., Kueckelhaus, J., Sun, N., Joseph, K., Salie, H., Vollmer, L., Kuliesiute, U., von Ehr, J., Benotmane, J.K., Neidert, N., Follo, M., Scherer, F., Goeldner, J.M., Behringer, S.P., Franco, P., Khiat, M., Zhang, J., Hofmann, U.G., Fung, C., Ricklefs, F.L., Lamszus, K., Boerries, M., Ku, M., Beck, J., Sankowski, R., Schwabenland, M., Prinz, M., Schuller, U., Killmer, S., Bengsch, B., Walch, A.K., Delev, D., Schnell, O., Heiland, D.H.: Spatially resolved multi-omics deciphers bidirectional tumor-host interdependence in glioblastoma. Cancer Cell 40(6), 639–65513 (2022). https://doi.org/10.1016/j.ccell.2022.05.009</w:t>
+        <w:t>47. Ravi VM, Will P, Kueckelhaus J, et al. Spatially resolved multi-omics deciphers bidirectional tumor-host interdependence in glioblastoma. Cancer Cell. 2022;40(6):639-655.e13. doi:10.1016/j.ccell.2022.05.009</w:t>
       </w:r>
     </w:p>
     <w:p>
@@ -15333,11 +15447,9 @@
       <w:r>
         <w:rPr>
           <w:rFonts w:ascii="Times New Roman" w:hAnsi="Times New Roman" w:eastAsia="Times New Roman"/>
-          <w:b w:val="0"/>
-          <w:i w:val="0"/>
           <w:sz w:val="18"/>
         </w:rPr>
-        <w:t>[48] Li, Q., Zhang, X., Ke, R.: https://doi.org/10.3389/fgene.2022.906158</w:t>
+        <w:t>48. Li Q, Zhang X, Ke R. Spatial Transcriptomics for Tumor Heterogeneity Analysis. Front Genet. 2022;13. doi:10.3389/fgene.2022.906158</w:t>
       </w:r>
     </w:p>
     <w:p>
@@ -15348,11 +15460,9 @@
       <w:r>
         <w:rPr>
           <w:rFonts w:ascii="Times New Roman" w:hAnsi="Times New Roman" w:eastAsia="Times New Roman"/>
-          <w:b w:val="0"/>
-          <w:i w:val="0"/>
           <w:sz w:val="18"/>
         </w:rPr>
-        <w:t>[49] Petitprez, F., De Reyni\`es, A., Keung, E.Z., Chen, T.W.-W., Sun, C.-M., Calderaro, J., Jeng, Y.-M., Hsiao, L.-P., Lacroix, L., Bougouin, A., Moreira, M., Lacroix, G., Natario, I., Adam, J., Lucchesi, C., Laizet, Y., Toulmonde, M., Burgess, M.A., Bolejack, V., Reinke, D., Wani, K.M., Wang, W.-L., Lazar, A.J., Roland, C.L., Wargo, J.A., Italiano, A., Saut\`es-Fridman, C., Tawbi, H.A., Fridman, W.H.: B cells are associated with survival and immunotherapy response in sarcoma. Nature 577(7791), 556–560 (2020). https://doi.org/10.1038/s41586-019-1906-8</w:t>
+        <w:t>49. Petitprez F, de Reyniès A, Keung EZ, et al. B cells are associated with survival and immunotherapy response in sarcoma. Nature. 2020;577(7791):556-560. doi:10.1038/s41586-019-1906-8</w:t>
       </w:r>
     </w:p>
     <w:p>
@@ -15363,11 +15473,9 @@
       <w:r>
         <w:rPr>
           <w:rFonts w:ascii="Times New Roman" w:hAnsi="Times New Roman" w:eastAsia="Times New Roman"/>
-          <w:b w:val="0"/>
-          <w:i w:val="0"/>
           <w:sz w:val="18"/>
         </w:rPr>
-        <w:t>[50] Helmink, B.A., Reddy, S.M., Gao, J., Zhang, S., Basar, R., Thakur, R., Yizhak, K., Sade-Feldman, M., Blando, J., Han, G., Gopalakrishnan, V., Xi, Y., Zhao, H., Amaria, R.N., Tawbi, H.A., Cogdill, A.P., Liu, W., LeBleu, V.S., Kugeratski, F.G., Patel, S., Davies, M.A., Hwu, P., Lee, J.E., Gershenwald, J.E., Lucci, A., Arora, R., Woodman, S., Keung, E.Z., Gaudreau, P.-O., Reuben, A., Spencer, C.N., Burton, E.M., Haydu, L.E., Lazar, A.J., Zapassodi, R., Hudgens, C.W., Ledesma, D.A., Ong, S., Bailey, M., Warren, S., Rao, D., Krijgsman, O., Rozeman, E.A., Peeper, D., Blank, C.U., Schumacher, T.N., Butterfield, L.H., Zelazowska, M.A., McBride, K.M., Kalluri, R., Allison, J., Petitprez, F., Fridman, W.H., Saut\`es-Fridman, C., Hacohen, N., Rezvani, K., Sharma, P., Tetzlaff, M.T., Wang, L., Wargo, J.A.: B cells and tertiary lymphoid structures promote immunotherapy response. Nature 577(7791), 549–555 (2020). https://doi.org/10.1038/s41586-019-1922-8</w:t>
+        <w:t>50. Helmink BA, Reddy SM, Gao J, et al. B cells and tertiary lymphoid structures promote immunotherapy response. Nature. 2020;577(7791):549-555. doi:10.1038/s41586-019-1922-8</w:t>
       </w:r>
     </w:p>
     <w:p>
@@ -15378,11 +15486,9 @@
       <w:r>
         <w:rPr>
           <w:rFonts w:ascii="Times New Roman" w:hAnsi="Times New Roman" w:eastAsia="Times New Roman"/>
-          <w:b w:val="0"/>
-          <w:i w:val="0"/>
           <w:sz w:val="18"/>
         </w:rPr>
-        <w:t>[51] Rakaee, M., Tafavvoghi, M., Ricciuti, B., Alessi, J.V., Cortellini, A., Citarella, F., Nibid, L., Perrone, G., Adib, E., Fulgenzi, C.A.M., Hidalgo Filho, C.M., Di Federico, A., Jabar, F., Hashemi, S., Houda, I., Richardsen, E., Rasmussen Busund, L.-T., Donnem, T., Bahce, I., Pinato, D.J., Helland,., Sholl, L.M., Awad, M.M., Kwiatkowski, D.J.: Deep learning model for predicting immunotherapy response in advanced non-small cell lung cancer. JAMA oncology 11(2), 109–118 (2025). https://doi.org/10.1001/jamaoncol.2024.5356</w:t>
+        <w:t>51. Rakaee M, Tafavvoghi M, Ricciuti B, et al. Deep Learning Model for Predicting Immunotherapy Response in Advanced Non−Small Cell Lung Cancer. JAMA Oncol. 2025;11(2):109. doi:10.1001/jamaoncol.2024.5356</w:t>
       </w:r>
     </w:p>
     <w:p>
@@ -15395,7 +15501,7 @@
           <w:rFonts w:ascii="Times New Roman" w:hAnsi="Times New Roman" w:eastAsia="Times New Roman"/>
           <w:sz w:val="18"/>
         </w:rPr>
-        <w:t>[52] Barrett, T., Wilhite, S.E., Ledoux, P., Evangelista, C., Kim, I.F., Tomashevsky, M., Marshall, K.A., Phillippy, K.H., Sherman, P.M., Holko, M., Yefanov, A., Lee, H., Zhang, N., Robertson, C.L., Serova, N., Davis, S., Soboleva, A.: NCBI GEO: Archive for functional genomics data sets-update. Nucleic Acids Research 41(D1), 991–995 (2012). https://doi.org/10.1093/nar/gks1193</w:t>
+        <w:t>52. Barrett T, Wilhite SE, Ledoux P, et al. NCBI GEO: archive for functional genomics data sets—update. Nucleic Acids Res. 2012;41(D1):D991-D995. doi:10.1093/nar/gks1193</w:t>
       </w:r>
     </w:p>
     <w:p>
@@ -15406,11 +15512,9 @@
       <w:r>
         <w:rPr>
           <w:rFonts w:ascii="Times New Roman" w:hAnsi="Times New Roman" w:eastAsia="Times New Roman"/>
-          <w:b w:val="0"/>
-          <w:i w:val="0"/>
           <w:sz w:val="18"/>
         </w:rPr>
-        <w:t>[53] Uhlen, M., Zhang, C., Lee, S., Sjostedt, E., Fagerberg, L., Bidkhori, G., Benfeitas, R., Arif, M., Liu, Z., Edfors, F., Sanli, K., Von Feilitzen, K., Oksvold, P., Lundberg, E., Hober, S., Nilsson, P., Mattsson, J., Schwenk, J.M., Brunnstrom, H., Glimelius, B., Sjoblom, T., Edqvist, P.-H., Djureinovic, D., Micke, P., Lindskog, C., Mardinoglu, A., Ponten, F.: A pathology atlas of the human cancer transcriptome. Science 357(6352), 2507 (2017). https://doi.org/10.1126/science.aan2507</w:t>
+        <w:t>53. Uhlen M, Zhang C, Lee S, et al. A pathology atlas of the human cancer transcriptome. Science. 2017;357(6352):2507. doi:10.1126/science.aan2507</w:t>
       </w:r>
     </w:p>
     <w:sectPr>

</xml_diff>

<commit_message>
Polish final manuscript formatting for Cancer Informatics
</commit_message>
<xml_diff>
--- a/manuscript/main_manuscript.docx
+++ b/manuscript/main_manuscript.docx
@@ -897,6 +897,8 @@
     <w:p>
       <w:pPr>
         <w:pStyle w:val="Caption"/>
+        <w:keepNext/>
+        <w:keepLines/>
         <w:spacing w:before="120" w:after="80" w:line="276" w:lineRule="auto"/>
         <w:jc w:val="left"/>
       </w:pPr>
@@ -1512,6 +1514,7 @@
     </w:tbl>
     <w:p>
       <w:pPr>
+        <w:keepLines/>
         <w:spacing w:before="40" w:after="120" w:line="276" w:lineRule="auto"/>
         <w:jc w:val="left"/>
       </w:pPr>
@@ -1690,7 +1693,7 @@
           <w:rFonts w:ascii="Times New Roman" w:hAnsi="Times New Roman" w:eastAsia="Times New Roman"/>
           <w:sz w:val="22"/>
         </w:rPr>
-        <w:t xml:space="preserve"> Survival analysis used Kaplan-Meier curves and Cox proportional hazards models. Model performance was evaluated with time-dependent AUC, concordance index (C-index), and hazard ratios with 95% confidence intervals where available. P-values computed from spot- or cell-level spatial summaries were treated as within-section descriptive statistics, not as independent patient-level inference. Data and code availability are detailed in the Declarations section.</w:t>
+        <w:t xml:space="preserve"> Survival analysis used Kaplan-Meier curves and Cox proportional hazards models. Model performance was evaluated with time-dependent AUC, concordance index (C-index), and hazard ratios with 95% confidence intervals where available. P-values computed from spot- or cell-level spatial summaries were treated as within-section descriptive statistics, not as independent patient-level inference. Data and code availability are detailed in the Statements and Declarations section.</w:t>
       </w:r>
     </w:p>
     <w:bookmarkEnd w:id="22"/>
@@ -2433,6 +2436,8 @@
     <w:p>
       <w:pPr>
         <w:pStyle w:val="Caption"/>
+        <w:keepNext/>
+        <w:keepLines/>
         <w:spacing w:before="120" w:after="80" w:line="276" w:lineRule="auto"/>
         <w:jc w:val="left"/>
       </w:pPr>
@@ -6189,6 +6194,7 @@
     </w:tbl>
     <w:p>
       <w:pPr>
+        <w:keepLines/>
         <w:spacing w:before="0" w:after="120" w:line="276" w:lineRule="auto"/>
         <w:jc w:val="left"/>
       </w:pPr>
@@ -6205,6 +6211,8 @@
     <w:p>
       <w:pPr>
         <w:pStyle w:val="Caption"/>
+        <w:keepNext/>
+        <w:keepLines/>
         <w:spacing w:before="120" w:after="80" w:line="276" w:lineRule="auto"/>
         <w:jc w:val="left"/>
       </w:pPr>
@@ -8839,6 +8847,7 @@
     </w:tbl>
     <w:p>
       <w:pPr>
+        <w:keepLines/>
         <w:spacing w:before="40" w:after="120" w:line="276" w:lineRule="auto"/>
         <w:jc w:val="left"/>
       </w:pPr>
@@ -10215,6 +10224,8 @@
     <w:p>
       <w:pPr>
         <w:pStyle w:val="Caption"/>
+        <w:keepNext/>
+        <w:keepLines/>
         <w:spacing w:before="120" w:after="80" w:line="276" w:lineRule="auto"/>
         <w:jc w:val="left"/>
       </w:pPr>
@@ -12414,6 +12425,7 @@
     </w:tbl>
     <w:p>
       <w:pPr>
+        <w:keepLines/>
         <w:spacing w:before="40" w:after="120" w:line="276" w:lineRule="auto"/>
         <w:jc w:val="left"/>
       </w:pPr>
@@ -12431,6 +12443,8 @@
     <w:p>
       <w:pPr>
         <w:pStyle w:val="Caption"/>
+        <w:keepNext/>
+        <w:keepLines/>
         <w:spacing w:before="120" w:after="80" w:line="276" w:lineRule="auto"/>
         <w:jc w:val="left"/>
       </w:pPr>
@@ -13467,6 +13481,7 @@
     </w:tbl>
     <w:p>
       <w:pPr>
+        <w:keepLines/>
         <w:spacing w:before="0" w:after="120" w:line="276" w:lineRule="auto"/>
         <w:jc w:val="left"/>
       </w:pPr>
@@ -14251,10 +14266,9 @@
         <w:rPr>
           <w:rFonts w:ascii="Times New Roman" w:hAnsi="Times New Roman" w:eastAsia="Times New Roman"/>
           <w:b/>
-          <w:i w:val="0"/>
           <w:sz w:val="28"/>
         </w:rPr>
-        <w:t>Declarations</w:t>
+        <w:t>Statements and Declarations</w:t>
       </w:r>
     </w:p>
     <w:p>

</xml_diff>

<commit_message>
Normalize manuscript text color and caption styling
</commit_message>
<xml_diff>
--- a/manuscript/main_manuscript.docx
+++ b/manuscript/main_manuscript.docx
@@ -13,6 +13,7 @@
           <w:rFonts w:ascii="Times New Roman" w:hAnsi="Times New Roman" w:eastAsia="Times New Roman"/>
           <w:b/>
           <w:i w:val="0"/>
+          <w:color w:val="000000"/>
           <w:sz w:val="32"/>
         </w:rPr>
         <w:t>C1Q/SPP1 Macrophage Spatial Context as a Traceability Feature in Non-Small Cell Lung Cancer: A Public Multi-Cohort Cancer-Informatics Study</w:t>
@@ -89,6 +90,7 @@
         <w:rPr>
           <w:rFonts w:ascii="Times New Roman" w:hAnsi="Times New Roman" w:eastAsia="Times New Roman"/>
           <w:b/>
+          <w:color w:val="000000"/>
           <w:sz w:val="24"/>
         </w:rPr>
         <w:t xml:space="preserve">Abstract</w:t>
@@ -251,6 +253,7 @@
         <w:rPr>
           <w:rFonts w:ascii="Times New Roman" w:hAnsi="Times New Roman" w:eastAsia="Times New Roman"/>
           <w:b/>
+          <w:color w:val="000000"/>
           <w:sz w:val="28"/>
         </w:rPr>
         <w:t xml:space="preserve">Introduction</w:t>
@@ -451,6 +454,7 @@
         <w:rPr>
           <w:rFonts w:ascii="Times New Roman" w:hAnsi="Times New Roman" w:eastAsia="Times New Roman"/>
           <w:b/>
+          <w:color w:val="000000"/>
           <w:sz w:val="28"/>
         </w:rPr>
         <w:t xml:space="preserve">Methods</w:t>
@@ -466,6 +470,7 @@
         <w:rPr>
           <w:rFonts w:ascii="Times New Roman" w:hAnsi="Times New Roman" w:eastAsia="Times New Roman"/>
           <w:b/>
+          <w:color w:val="000000"/>
           <w:sz w:val="24"/>
         </w:rPr>
         <w:t xml:space="preserve">Study Design and Evidence Hierarchy</w:t>
@@ -555,6 +560,7 @@
     <w:p>
       <w:pPr>
         <w:pStyle w:val="Caption"/>
+        <w:keepLines/>
         <w:spacing w:before="60" w:after="160" w:line="276" w:lineRule="auto"/>
         <w:jc w:val="left"/>
       </w:pPr>
@@ -562,6 +568,7 @@
         <w:rPr>
           <w:rFonts w:ascii="Times New Roman" w:hAnsi="Times New Roman" w:eastAsia="Times New Roman"/>
           <w:b/>
+          <w:i/>
           <w:sz w:val="20"/>
         </w:rPr>
         <w:t>Figure 1. Integrated study design and evidence overview.</w:t>
@@ -570,6 +577,7 @@
         <w:rPr>
           <w:rFonts w:ascii="Times New Roman" w:hAnsi="Times New Roman" w:eastAsia="Times New Roman"/>
           <w:b w:val="0"/>
+          <w:i/>
           <w:sz w:val="20"/>
         </w:rPr>
         <w:t xml:space="preserve"> Panel A, Analytical workflow: TCGA/GEO data acquisition, feature selection, MR-based prioritization, spatial transcriptomics, retrospective score-behavior assessment, and external traceability. Panel B, Multi-layer evidence framework: genetic, spatial, computational, and clinical evidence layers are interpreted as complementary support rather than a directed causal sequence. Panel C, Conceptual spatial-context representation: C1Q-enriched regions, SPP1-enriched regions, and CD8-marker context are shown as a schematic guide to the spatial analyses.</w:t>
@@ -587,6 +595,7 @@
           <w:rFonts w:ascii="Times New Roman" w:hAnsi="Times New Roman" w:eastAsia="Times New Roman"/>
           <w:b/>
           <w:i/>
+          <w:color w:val="000000"/>
           <w:sz w:val="22"/>
         </w:rPr>
         <w:t xml:space="preserve">Conservative Interpretation Rules</w:t>
@@ -617,6 +626,7 @@
           <w:rFonts w:ascii="Times New Roman" w:hAnsi="Times New Roman" w:eastAsia="Times New Roman"/>
           <w:b/>
           <w:i/>
+          <w:color w:val="000000"/>
           <w:sz w:val="22"/>
         </w:rPr>
         <w:t xml:space="preserve">Data Acquisition and Quality Control</w:t>
@@ -762,6 +772,7 @@
         <w:rPr>
           <w:rFonts w:ascii="Times New Roman" w:hAnsi="Times New Roman" w:eastAsia="Times New Roman"/>
           <w:b/>
+          <w:color w:val="000000"/>
           <w:sz w:val="24"/>
         </w:rPr>
         <w:t xml:space="preserve">C1Q/SPP1 Traceability Framework</w:t>
@@ -1539,6 +1550,7 @@
         <w:rPr>
           <w:rFonts w:ascii="Times New Roman" w:hAnsi="Times New Roman" w:eastAsia="Times New Roman"/>
           <w:b/>
+          <w:color w:val="000000"/>
           <w:sz w:val="24"/>
         </w:rPr>
         <w:t xml:space="preserve">Neighborhood Enrichment Analysis</w:t>
@@ -1587,6 +1599,7 @@
         <w:rPr>
           <w:rFonts w:ascii="Times New Roman" w:hAnsi="Times New Roman" w:eastAsia="Times New Roman"/>
           <w:b/>
+          <w:color w:val="000000"/>
           <w:sz w:val="24"/>
         </w:rPr>
         <w:t xml:space="preserve">Data Preprocessing and Statistical Analysis</w:t>
@@ -1603,6 +1616,7 @@
           <w:rFonts w:ascii="Times New Roman" w:hAnsi="Times New Roman" w:eastAsia="Times New Roman"/>
           <w:b/>
           <w:i/>
+          <w:color w:val="000000"/>
           <w:sz w:val="22"/>
         </w:rPr>
         <w:t xml:space="preserve">Transcriptome Data Preprocessing</w:t>
@@ -1633,6 +1647,7 @@
           <w:rFonts w:ascii="Times New Roman" w:hAnsi="Times New Roman" w:eastAsia="Times New Roman"/>
           <w:b/>
           <w:i/>
+          <w:color w:val="000000"/>
           <w:sz w:val="22"/>
         </w:rPr>
         <w:t xml:space="preserve">Statistical Analysis</w:t>
@@ -1708,6 +1723,7 @@
         <w:rPr>
           <w:rFonts w:ascii="Times New Roman" w:hAnsi="Times New Roman" w:eastAsia="Times New Roman"/>
           <w:b/>
+          <w:color w:val="000000"/>
           <w:sz w:val="24"/>
         </w:rPr>
         <w:t xml:space="preserve">Sample Size and Statistical Power</w:t>
@@ -1737,6 +1753,7 @@
         <w:rPr>
           <w:rFonts w:ascii="Times New Roman" w:hAnsi="Times New Roman" w:eastAsia="Times New Roman"/>
           <w:b/>
+          <w:color w:val="000000"/>
           <w:sz w:val="24"/>
         </w:rPr>
         <w:t xml:space="preserve">Nested Cross-Validation Framework</w:t>
@@ -1768,6 +1785,7 @@
         <w:rPr>
           <w:rFonts w:ascii="Times New Roman" w:hAnsi="Times New Roman" w:eastAsia="Times New Roman"/>
           <w:b/>
+          <w:color w:val="000000"/>
           <w:sz w:val="24"/>
         </w:rPr>
         <w:t xml:space="preserve">Mendelian Randomization for Gene Prioritization</w:t>
@@ -1827,6 +1845,7 @@
         <w:rPr>
           <w:rFonts w:ascii="Times New Roman" w:hAnsi="Times New Roman" w:eastAsia="Times New Roman"/>
           <w:b/>
+          <w:color w:val="000000"/>
           <w:sz w:val="24"/>
         </w:rPr>
         <w:t xml:space="preserve">Spatial Transcriptomics Analysis</w:t>
@@ -1856,6 +1875,7 @@
           <w:rFonts w:ascii="Times New Roman" w:hAnsi="Times New Roman" w:eastAsia="Times New Roman"/>
           <w:b/>
           <w:i/>
+          <w:color w:val="000000"/>
           <w:sz w:val="22"/>
         </w:rPr>
         <w:t xml:space="preserve">Spatial Autocorrelation Analysis</w:t>
@@ -1910,6 +1930,7 @@
           <w:rFonts w:ascii="Times New Roman" w:hAnsi="Times New Roman" w:eastAsia="Times New Roman"/>
           <w:b/>
           <w:i/>
+          <w:color w:val="000000"/>
           <w:sz w:val="22"/>
         </w:rPr>
         <w:t xml:space="preserve">Cell Type Deconvolution</w:t>
@@ -1940,6 +1961,7 @@
           <w:rFonts w:ascii="Times New Roman" w:hAnsi="Times New Roman" w:eastAsia="Times New Roman"/>
           <w:b/>
           <w:i/>
+          <w:color w:val="000000"/>
           <w:sz w:val="22"/>
         </w:rPr>
         <w:t xml:space="preserve">Spatial Co-localization Analysis</w:t>
@@ -1985,6 +2007,7 @@
         <w:rPr>
           <w:rFonts w:ascii="Times New Roman" w:hAnsi="Times New Roman" w:eastAsia="Times New Roman"/>
           <w:b/>
+          <w:color w:val="000000"/>
           <w:sz w:val="24"/>
         </w:rPr>
         <w:t xml:space="preserve">Counterfactual Scoring and Sensitivity Analysis</w:t>
@@ -2067,6 +2090,7 @@
         <w:rPr>
           <w:rFonts w:ascii="Times New Roman" w:hAnsi="Times New Roman" w:eastAsia="Times New Roman"/>
           <w:b/>
+          <w:color w:val="000000"/>
           <w:sz w:val="24"/>
         </w:rPr>
         <w:t xml:space="preserve">Retrospective Score Construction and Evaluation</w:t>
@@ -2096,6 +2120,7 @@
           <w:rFonts w:ascii="Times New Roman" w:hAnsi="Times New Roman" w:eastAsia="Times New Roman"/>
           <w:b/>
           <w:i/>
+          <w:color w:val="000000"/>
           <w:sz w:val="22"/>
         </w:rPr>
         <w:t xml:space="preserve">External Traceability Assessment</w:t>
@@ -2126,6 +2151,7 @@
           <w:rFonts w:ascii="Times New Roman" w:hAnsi="Times New Roman" w:eastAsia="Times New Roman"/>
           <w:b/>
           <w:i/>
+          <w:color w:val="000000"/>
           <w:sz w:val="22"/>
         </w:rPr>
         <w:t xml:space="preserve">Score-Behavior Metrics</w:t>
@@ -2156,6 +2182,7 @@
           <w:rFonts w:ascii="Times New Roman" w:hAnsi="Times New Roman" w:eastAsia="Times New Roman"/>
           <w:b/>
           <w:i/>
+          <w:color w:val="000000"/>
           <w:sz w:val="22"/>
         </w:rPr>
         <w:t xml:space="preserve">Clinical Comparator and Incremental-Value Boundaries</w:t>
@@ -2186,6 +2213,7 @@
         <w:rPr>
           <w:rFonts w:ascii="Times New Roman" w:hAnsi="Times New Roman" w:eastAsia="Times New Roman"/>
           <w:b/>
+          <w:color w:val="000000"/>
           <w:sz w:val="24"/>
         </w:rPr>
         <w:t xml:space="preserve">Statistical Analysis</w:t>
@@ -2243,6 +2271,7 @@
         <w:rPr>
           <w:rFonts w:ascii="Times New Roman" w:hAnsi="Times New Roman" w:eastAsia="Times New Roman"/>
           <w:b/>
+          <w:color w:val="000000"/>
           <w:sz w:val="24"/>
         </w:rPr>
         <w:t xml:space="preserve">Hazard Ratio Calculation</w:t>
@@ -2302,6 +2331,7 @@
         <w:rPr>
           <w:rFonts w:ascii="Times New Roman" w:hAnsi="Times New Roman" w:eastAsia="Times New Roman"/>
           <w:b/>
+          <w:color w:val="000000"/>
           <w:sz w:val="24"/>
         </w:rPr>
         <w:t xml:space="preserve">Descriptive Score Construction and Survival Association</w:t>
@@ -2332,6 +2362,7 @@
         <w:rPr>
           <w:rFonts w:ascii="Times New Roman" w:hAnsi="Times New Roman" w:eastAsia="Times New Roman"/>
           <w:b/>
+          <w:color w:val="000000"/>
           <w:sz w:val="28"/>
         </w:rPr>
         <w:t xml:space="preserve">Results</w:t>
@@ -2360,6 +2391,7 @@
         <w:rPr>
           <w:rFonts w:ascii="Times New Roman" w:hAnsi="Times New Roman" w:eastAsia="Times New Roman"/>
           <w:b/>
+          <w:color w:val="000000"/>
           <w:sz w:val="24"/>
         </w:rPr>
         <w:t xml:space="preserve">Study Population and Baseline Characteristics</w:t>
@@ -8872,6 +8904,7 @@
         <w:rPr>
           <w:rFonts w:ascii="Times New Roman" w:hAnsi="Times New Roman" w:eastAsia="Times New Roman"/>
           <w:b/>
+          <w:color w:val="000000"/>
           <w:sz w:val="24"/>
         </w:rPr>
         <w:t xml:space="preserve">Robust Feature Selection via Nested Cross-Validation</w:t>
@@ -8999,6 +9032,7 @@
         <w:rPr>
           <w:rFonts w:ascii="Times New Roman" w:hAnsi="Times New Roman" w:eastAsia="Times New Roman"/>
           <w:b/>
+          <w:color w:val="000000"/>
           <w:sz w:val="24"/>
         </w:rPr>
         <w:t xml:space="preserve">Mendelian Randomization Prioritizes a Candidate Gene Set in NSCLC</w:t>
@@ -9118,6 +9152,7 @@
     <w:p>
       <w:pPr>
         <w:pStyle w:val="Caption"/>
+        <w:keepLines/>
         <w:spacing w:before="60" w:after="160" w:line="276" w:lineRule="auto"/>
         <w:jc w:val="left"/>
       </w:pPr>
@@ -9125,6 +9160,7 @@
         <w:rPr>
           <w:rFonts w:ascii="Times New Roman" w:hAnsi="Times New Roman" w:eastAsia="Times New Roman"/>
           <w:b/>
+          <w:i/>
           <w:sz w:val="20"/>
         </w:rPr>
         <w:t>Figure 2. MR-based gene prioritization.</w:t>
@@ -9133,6 +9169,7 @@
         <w:rPr>
           <w:rFonts w:ascii="Times New Roman" w:hAnsi="Times New Roman" w:eastAsia="Times New Roman"/>
           <w:b w:val="0"/>
+          <w:i/>
           <w:sz w:val="20"/>
         </w:rPr>
         <w:t xml:space="preserve"> Panel A, MR prioritizes C1Q-relevant candidate axes associated with immune phenotype. Panel B, Sensitivity analyses using IVW, MR-Egger, and weighted median estimates. Panel C, Leave-one-out analysis assesses single-SNP influence. Panel D, Bidirectional and directionality checks identify candidates requiring cautious interpretation.</w:t>
@@ -9271,6 +9308,7 @@
         <w:rPr>
           <w:rFonts w:ascii="Times New Roman" w:hAnsi="Times New Roman" w:eastAsia="Times New Roman"/>
           <w:b/>
+          <w:color w:val="000000"/>
           <w:sz w:val="24"/>
         </w:rPr>
         <w:t xml:space="preserve">Patient-Limited Spatial Mapping of C1Q/SPP1 Context</w:t>
@@ -9470,6 +9508,7 @@
     <w:p>
       <w:pPr>
         <w:pStyle w:val="Caption"/>
+        <w:keepLines/>
         <w:spacing w:before="60" w:after="160" w:line="276" w:lineRule="auto"/>
         <w:jc w:val="left"/>
       </w:pPr>
@@ -9477,6 +9516,7 @@
         <w:rPr>
           <w:rFonts w:ascii="Times New Roman" w:hAnsi="Times New Roman" w:eastAsia="Times New Roman"/>
           <w:b/>
+          <w:i/>
           <w:sz w:val="20"/>
         </w:rPr>
         <w:t>Figure 3. Spatial clustering of the C1Q/SPP1 axis.</w:t>
@@ -9485,6 +9525,7 @@
         <w:rPr>
           <w:rFonts w:ascii="Times New Roman" w:hAnsi="Times New Roman" w:eastAsia="Times New Roman"/>
           <w:b w:val="0"/>
+          <w:i/>
           <w:sz w:val="20"/>
         </w:rPr>
         <w:t xml:space="preserve"> Panel A, Spatial clustering of C1Q expression across tumor sections. Panel B, C1Q spatial autocorrelation quantified by Moran’s I. Panel C, Comparison with SPP1-enriched macrophage compartments shows distinct spatial organization. Panel D, CosMx single-cell spatial data provide context-level support for conservation of the pattern.</w:t>
@@ -9619,6 +9660,7 @@
     <w:p>
       <w:pPr>
         <w:pStyle w:val="Caption"/>
+        <w:keepLines/>
         <w:spacing w:before="60" w:after="160" w:line="276" w:lineRule="auto"/>
         <w:jc w:val="left"/>
       </w:pPr>
@@ -9626,6 +9668,7 @@
         <w:rPr>
           <w:rFonts w:ascii="Times New Roman" w:hAnsi="Times New Roman" w:eastAsia="Times New Roman"/>
           <w:b/>
+          <w:i/>
           <w:sz w:val="20"/>
         </w:rPr>
         <w:t>Figure 4. Spatial context of C1Q-associated macrophage states.</w:t>
@@ -9634,6 +9677,7 @@
         <w:rPr>
           <w:rFonts w:ascii="Times New Roman" w:hAnsi="Times New Roman" w:eastAsia="Times New Roman"/>
           <w:b w:val="0"/>
+          <w:i/>
           <w:sz w:val="20"/>
         </w:rPr>
         <w:t xml:space="preserve"> Panel A, Local proximity of C1Q-marker-positive macrophage contexts and CD8-marker-positive contexts. Panel B, Neighborhood enrichment analysis summarizes attraction/avoidance structure. Panel C, Spatial correlation between C1Q and immune markers supports context-level association. Panel D, Spatial contrast between C1Q- and SPP1-enriched niches delineates immune-active versus immune-excluded states.</w:t>
@@ -9651,6 +9695,7 @@
         <w:rPr>
           <w:rFonts w:ascii="Times New Roman" w:hAnsi="Times New Roman" w:eastAsia="Times New Roman"/>
           <w:b/>
+          <w:color w:val="000000"/>
           <w:sz w:val="24"/>
         </w:rPr>
         <w:t xml:space="preserve">Counterfactual Scoring Shows Dependency of the C1Q Module</w:t>
@@ -9768,6 +9813,7 @@
     <w:p>
       <w:pPr>
         <w:pStyle w:val="Caption"/>
+        <w:keepLines/>
         <w:spacing w:before="60" w:after="160" w:line="276" w:lineRule="auto"/>
         <w:jc w:val="left"/>
       </w:pPr>
@@ -9775,6 +9821,7 @@
         <w:rPr>
           <w:rFonts w:ascii="Times New Roman" w:hAnsi="Times New Roman" w:eastAsia="Times New Roman"/>
           <w:b/>
+          <w:i/>
           <w:sz w:val="20"/>
         </w:rPr>
         <w:t>Figure 5. Counterfactual scoring sensitivity of the C1Q axis.</w:t>
@@ -9783,6 +9830,7 @@
         <w:rPr>
           <w:rFonts w:ascii="Times New Roman" w:hAnsi="Times New Roman" w:eastAsia="Times New Roman"/>
           <w:b w:val="0"/>
+          <w:i/>
           <w:sz w:val="20"/>
         </w:rPr>
         <w:t xml:space="preserve"> Panel A, Computational C1Q-axis attenuation reduces composite axis activity. Panel B, Spatial hotspot structure shifts after score recomputation. Panel C, CD8-proxy proximity summaries show threshold-like sensitivity to C1Q-axis attenuation. Panel D, Risk-score distributions shift after counterfactual score recomputation. These analyses test internal score dependency and should not be interpreted as experimental gene attenuation or causal perturbation.</w:t>
@@ -9800,6 +9848,7 @@
         <w:rPr>
           <w:rFonts w:ascii="Times New Roman" w:hAnsi="Times New Roman" w:eastAsia="Times New Roman"/>
           <w:b/>
+          <w:color w:val="000000"/>
           <w:sz w:val="24"/>
         </w:rPr>
         <w:t xml:space="preserve">Retrospective Score Behavior and Outcome Traceability</w:t>
@@ -9946,6 +9995,7 @@
     <w:p>
       <w:pPr>
         <w:pStyle w:val="Caption"/>
+        <w:keepLines/>
         <w:spacing w:before="60" w:after="160" w:line="276" w:lineRule="auto"/>
         <w:jc w:val="left"/>
       </w:pPr>
@@ -9953,6 +10003,7 @@
         <w:rPr>
           <w:rFonts w:ascii="Times New Roman" w:hAnsi="Times New Roman" w:eastAsia="Times New Roman"/>
           <w:b/>
+          <w:i/>
           <w:sz w:val="20"/>
         </w:rPr>
         <w:t>Figure 6. Retrospective score behavior of the C1Q-centered feature set.</w:t>
@@ -9961,6 +10012,7 @@
         <w:rPr>
           <w:rFonts w:ascii="Times New Roman" w:hAnsi="Times New Roman" w:eastAsia="Times New Roman"/>
           <w:b w:val="0"/>
+          <w:i/>
           <w:sz w:val="20"/>
         </w:rPr>
         <w:t xml:space="preserve"> Panel A, Kaplan–Meier analysis shows survival separation between high- and low-score groups in a TCGA complete-case subset. Panel B, Time-dependent ROC curves quantify discrimination at 1, 3, and 5 years. Panels C–E, Risk-score ordering, survival-status distribution, and feature-expression heatmap summarize internal score behavior across patients. Panel F, Decision curve analysis provides exploratory net-benefit visualization and is not interpreted as clinical utility evidence.</w:t>
@@ -10074,6 +10126,7 @@
     <w:p>
       <w:pPr>
         <w:pStyle w:val="Caption"/>
+        <w:keepLines/>
         <w:spacing w:before="60" w:after="160" w:line="276" w:lineRule="auto"/>
         <w:jc w:val="left"/>
       </w:pPr>
@@ -10081,6 +10134,7 @@
         <w:rPr>
           <w:rFonts w:ascii="Times New Roman" w:hAnsi="Times New Roman" w:eastAsia="Times New Roman"/>
           <w:b/>
+          <w:i/>
           <w:sz w:val="20"/>
         </w:rPr>
         <w:t>Figure 7. External traceability and transferability.</w:t>
@@ -10089,6 +10143,7 @@
         <w:rPr>
           <w:rFonts w:ascii="Times New Roman" w:hAnsi="Times New Roman" w:eastAsia="Times New Roman"/>
           <w:b w:val="0"/>
+          <w:i/>
           <w:sz w:val="20"/>
         </w:rPr>
         <w:t xml:space="preserve"> Panel A, Kaplan–Meier display in the GSE31210 traceability cohort summarizes score-group separation. Panel B, Cross-cohort discrimination metrics summarize transferability. Panel C, Cross-platform risk-score consistency is shown as technical traceability. Panel D, Pan-cancer C1Q-axis patterns are interpreted as exploratory biological context. These panels support external traceability rather than definitive evidence.</w:t>
@@ -10106,6 +10161,7 @@
         <w:rPr>
           <w:rFonts w:ascii="Times New Roman" w:hAnsi="Times New Roman" w:eastAsia="Times New Roman"/>
           <w:b/>
+          <w:color w:val="000000"/>
           <w:sz w:val="24"/>
         </w:rPr>
         <w:t xml:space="preserve">Exploratory Immunotherapy-Response Association</w:t>
@@ -10161,6 +10217,7 @@
         <w:rPr>
           <w:rFonts w:ascii="Times New Roman" w:hAnsi="Times New Roman" w:eastAsia="Times New Roman"/>
           <w:b/>
+          <w:color w:val="000000"/>
           <w:sz w:val="24"/>
         </w:rPr>
         <w:t xml:space="preserve">Multivariable Survival Association</w:t>
@@ -10203,6 +10260,7 @@
         <w:rPr>
           <w:rFonts w:ascii="Times New Roman" w:hAnsi="Times New Roman" w:eastAsia="Times New Roman"/>
           <w:b/>
+          <w:color w:val="000000"/>
           <w:sz w:val="24"/>
         </w:rPr>
         <w:t xml:space="preserve">Integration of MR-Prioritized Genes and Spatial Correlations</w:t>
@@ -13507,6 +13565,7 @@
         <w:rPr>
           <w:rFonts w:ascii="Times New Roman" w:hAnsi="Times New Roman" w:eastAsia="Times New Roman"/>
           <w:b/>
+          <w:color w:val="000000"/>
           <w:sz w:val="24"/>
         </w:rPr>
         <w:t xml:space="preserve">Public Protein-Expression Context</w:t>
@@ -13603,6 +13662,7 @@
     <w:p>
       <w:pPr>
         <w:pStyle w:val="Caption"/>
+        <w:keepLines/>
         <w:spacing w:before="60" w:after="160" w:line="276" w:lineRule="auto"/>
         <w:jc w:val="left"/>
       </w:pPr>
@@ -13610,6 +13670,7 @@
         <w:rPr>
           <w:rFonts w:ascii="Times New Roman" w:hAnsi="Times New Roman" w:eastAsia="Times New Roman"/>
           <w:b/>
+          <w:i/>
           <w:sz w:val="20"/>
         </w:rPr>
         <w:t>Figure 8. Public protein-expression context for KCNAB2 and SPP1 and CosMx neighborhood analysis.</w:t>
@@ -13618,6 +13679,7 @@
         <w:rPr>
           <w:rFonts w:ascii="Times New Roman" w:hAnsi="Times New Roman" w:eastAsia="Times New Roman"/>
           <w:b w:val="0"/>
+          <w:i/>
           <w:sz w:val="20"/>
         </w:rPr>
         <w:t xml:space="preserve"> (A) Representative Human Protein Atlas immunohistochemistry (IHC) image of KCNAB2 expression in normal lung tissue. (B) Representative HPA IHC image of KCNAB2 in lung cancer tissue. (C) Single-cell expression distribution of KCNAB2 (nCPM), providing context for candidate-cell localization. (D) Representative HPA IHC image of SPP1 expression in normal lung tissue. (E) Representative HPA IHC image of SPP1 expression in lung cancer tissue. (F) CosMx SMI neighborhood view based on a distinct descriptive index-cell display of C1Q-associated macrophage contexts and CD8-marker-positive contexts; this panel is interpreted as spatial context rather than as confirmatory enrichment or proof of direct interaction. HPA image source pages and license information are listed in the source-data manifest.</w:t>
@@ -13636,6 +13698,7 @@
         <w:rPr>
           <w:rFonts w:ascii="Times New Roman" w:hAnsi="Times New Roman" w:eastAsia="Times New Roman"/>
           <w:b/>
+          <w:color w:val="000000"/>
           <w:sz w:val="28"/>
         </w:rPr>
         <w:t xml:space="preserve">Discussion</w:t>
@@ -13651,6 +13714,7 @@
         <w:rPr>
           <w:rFonts w:ascii="Times New Roman" w:hAnsi="Times New Roman" w:eastAsia="Times New Roman"/>
           <w:b/>
+          <w:color w:val="000000"/>
           <w:sz w:val="24"/>
         </w:rPr>
         <w:t xml:space="preserve">Principal Findings</w:t>
@@ -13806,6 +13870,7 @@
         <w:rPr>
           <w:rFonts w:ascii="Times New Roman" w:hAnsi="Times New Roman" w:eastAsia="Times New Roman"/>
           <w:b/>
+          <w:color w:val="000000"/>
           <w:sz w:val="24"/>
         </w:rPr>
         <w:t xml:space="preserve">Interpretation of the Evidence Chain</w:t>
@@ -13848,6 +13913,7 @@
         <w:rPr>
           <w:rFonts w:ascii="Times New Roman" w:hAnsi="Times New Roman" w:eastAsia="Times New Roman"/>
           <w:b/>
+          <w:color w:val="000000"/>
           <w:sz w:val="24"/>
         </w:rPr>
         <w:t xml:space="preserve">Biological Plausibility of the C1Q/SPP1 Spatial Context</w:t>
@@ -14010,6 +14076,7 @@
         <w:rPr>
           <w:rFonts w:ascii="Times New Roman" w:hAnsi="Times New Roman" w:eastAsia="Times New Roman"/>
           <w:b/>
+          <w:color w:val="000000"/>
           <w:sz w:val="24"/>
         </w:rPr>
         <w:t xml:space="preserve">KCNAB2 as a Candidate Context Feature</w:t>
@@ -14080,6 +14147,7 @@
         <w:rPr>
           <w:rFonts w:ascii="Times New Roman" w:hAnsi="Times New Roman" w:eastAsia="Times New Roman"/>
           <w:b/>
+          <w:color w:val="000000"/>
           <w:sz w:val="24"/>
         </w:rPr>
         <w:t xml:space="preserve">Machine Learning Model Behavior and Its Limits</w:t>
@@ -14122,6 +14190,7 @@
         <w:rPr>
           <w:rFonts w:ascii="Times New Roman" w:hAnsi="Times New Roman" w:eastAsia="Times New Roman"/>
           <w:b/>
+          <w:color w:val="000000"/>
           <w:sz w:val="24"/>
         </w:rPr>
         <w:t xml:space="preserve">Future Translation Requirements</w:t>
@@ -14151,6 +14220,7 @@
         <w:rPr>
           <w:rFonts w:ascii="Times New Roman" w:hAnsi="Times New Roman" w:eastAsia="Times New Roman"/>
           <w:b/>
+          <w:color w:val="000000"/>
           <w:sz w:val="24"/>
         </w:rPr>
         <w:t xml:space="preserve">Limitations and Future Directions</w:t>
@@ -14194,6 +14264,7 @@
         <w:rPr>
           <w:rFonts w:ascii="Times New Roman" w:hAnsi="Times New Roman" w:eastAsia="Times New Roman"/>
           <w:b/>
+          <w:color w:val="000000"/>
           <w:sz w:val="28"/>
         </w:rPr>
         <w:t xml:space="preserve">Conclusions</w:t>
@@ -14223,6 +14294,7 @@
         <w:rPr>
           <w:rFonts w:ascii="Times New Roman" w:hAnsi="Times New Roman" w:eastAsia="Times New Roman"/>
           <w:b/>
+          <w:color w:val="000000"/>
           <w:sz w:val="28"/>
         </w:rPr>
         <w:t xml:space="preserve">Supplementary Information</w:t>
@@ -14266,6 +14338,7 @@
         <w:rPr>
           <w:rFonts w:ascii="Times New Roman" w:hAnsi="Times New Roman" w:eastAsia="Times New Roman"/>
           <w:b/>
+          <w:color w:val="000000"/>
           <w:sz w:val="28"/>
         </w:rPr>
         <w:t>Statements and Declarations</w:t>
@@ -14281,6 +14354,7 @@
           <w:rFonts w:ascii="Times New Roman" w:hAnsi="Times New Roman" w:eastAsia="Times New Roman"/>
           <w:b/>
           <w:i w:val="0"/>
+          <w:color w:val="000000"/>
           <w:sz w:val="24"/>
         </w:rPr>
         <w:t>Ethics Approval and Consent to Participate</w:t>
@@ -14309,6 +14383,7 @@
           <w:rFonts w:ascii="Times New Roman" w:hAnsi="Times New Roman" w:eastAsia="Times New Roman"/>
           <w:b/>
           <w:i w:val="0"/>
+          <w:color w:val="000000"/>
           <w:sz w:val="24"/>
         </w:rPr>
         <w:t>Consent for Publication</w:t>
@@ -14337,6 +14412,7 @@
           <w:rFonts w:ascii="Times New Roman" w:hAnsi="Times New Roman" w:eastAsia="Times New Roman"/>
           <w:b/>
           <w:i w:val="0"/>
+          <w:color w:val="000000"/>
           <w:sz w:val="24"/>
         </w:rPr>
         <w:t>Availability of Data and Materials</w:t>
@@ -14563,6 +14639,7 @@
           <w:rFonts w:ascii="Times New Roman" w:hAnsi="Times New Roman" w:eastAsia="Times New Roman"/>
           <w:b/>
           <w:i w:val="0"/>
+          <w:color w:val="000000"/>
           <w:sz w:val="24"/>
         </w:rPr>
         <w:t>Code Availability</w:t>
@@ -14648,6 +14725,7 @@
           <w:rFonts w:ascii="Times New Roman" w:hAnsi="Times New Roman" w:eastAsia="Times New Roman"/>
           <w:b/>
           <w:i w:val="0"/>
+          <w:color w:val="000000"/>
           <w:sz w:val="24"/>
         </w:rPr>
         <w:t>Reporting Guidelines</w:t>
@@ -14676,6 +14754,7 @@
           <w:rFonts w:ascii="Times New Roman" w:hAnsi="Times New Roman" w:eastAsia="Times New Roman"/>
           <w:b/>
           <w:i w:val="0"/>
+          <w:color w:val="000000"/>
           <w:sz w:val="24"/>
         </w:rPr>
         <w:t>Declaration of Conflicting Interests</w:t>
@@ -14704,6 +14783,7 @@
           <w:rFonts w:ascii="Times New Roman" w:hAnsi="Times New Roman" w:eastAsia="Times New Roman"/>
           <w:b/>
           <w:i w:val="0"/>
+          <w:color w:val="000000"/>
           <w:sz w:val="24"/>
         </w:rPr>
         <w:t>Funding</w:t>
@@ -14732,6 +14812,7 @@
           <w:rFonts w:ascii="Times New Roman" w:hAnsi="Times New Roman" w:eastAsia="Times New Roman"/>
           <w:b/>
           <w:i w:val="0"/>
+          <w:color w:val="000000"/>
           <w:sz w:val="24"/>
         </w:rPr>
         <w:t>Authors' Contributions</w:t>
@@ -14760,6 +14841,7 @@
           <w:rFonts w:ascii="Times New Roman" w:hAnsi="Times New Roman" w:eastAsia="Times New Roman"/>
           <w:b/>
           <w:i w:val="0"/>
+          <w:color w:val="000000"/>
           <w:sz w:val="24"/>
         </w:rPr>
         <w:t>ORCID</w:t>
@@ -14810,6 +14892,7 @@
           <w:rFonts w:ascii="Times New Roman" w:hAnsi="Times New Roman" w:eastAsia="Times New Roman"/>
           <w:b/>
           <w:i w:val="0"/>
+          <w:color w:val="000000"/>
           <w:sz w:val="24"/>
         </w:rPr>
         <w:t>Acknowledgements</w:t>
@@ -14837,6 +14920,7 @@
         <w:rPr>
           <w:rFonts w:ascii="Times New Roman" w:hAnsi="Times New Roman" w:eastAsia="Times New Roman"/>
           <w:b/>
+          <w:color w:val="000000"/>
           <w:sz w:val="28"/>
         </w:rPr>
         <w:t>References</w:t>
@@ -15830,6 +15914,7 @@
     </w:pPr>
     <w:rPr>
       <w:rFonts w:asciiTheme="majorHAnsi" w:cstheme="majorBidi" w:eastAsiaTheme="majorEastAsia" w:hAnsiTheme="majorHAnsi"/>
+      <w:color w:val="000000"/>
       <w:sz w:val="56"/>
       <w:szCs w:val="56"/>
     </w:rPr>
@@ -15964,7 +16049,7 @@
     </w:pPr>
     <w:rPr>
       <w:rFonts w:asciiTheme="majorHAnsi" w:cstheme="majorBidi" w:eastAsiaTheme="majorEastAsia" w:hAnsiTheme="majorHAnsi"/>
-      <w:color w:themeColor="accent1" w:themeShade="BF" w:val="0F4761"/>
+      <w:color w:val="000000"/>
       <w:sz w:val="40"/>
       <w:szCs w:val="40"/>
     </w:rPr>
@@ -15987,7 +16072,7 @@
     </w:pPr>
     <w:rPr>
       <w:rFonts w:asciiTheme="majorHAnsi" w:cstheme="majorBidi" w:eastAsiaTheme="majorEastAsia" w:hAnsiTheme="majorHAnsi"/>
-      <w:color w:themeColor="accent1" w:themeShade="BF" w:val="0F4761"/>
+      <w:color w:val="000000"/>
       <w:sz w:val="32"/>
       <w:szCs w:val="32"/>
     </w:rPr>
@@ -16010,7 +16095,7 @@
     </w:pPr>
     <w:rPr>
       <w:rFonts w:cstheme="majorBidi" w:eastAsiaTheme="majorEastAsia"/>
-      <w:color w:themeColor="accent1" w:themeShade="BF" w:val="0F4761"/>
+      <w:color w:val="000000"/>
       <w:sz w:val="28"/>
       <w:szCs w:val="28"/>
     </w:rPr>
@@ -16035,7 +16120,7 @@
       <w:rFonts w:cstheme="majorBidi" w:eastAsiaTheme="majorEastAsia"/>
       <w:i/>
       <w:iCs/>
-      <w:color w:themeColor="accent1" w:themeShade="BF" w:val="0F4761"/>
+      <w:color w:val="000000"/>
     </w:rPr>
   </w:style>
   <w:style w:styleId="Heading5" w:type="paragraph">

</xml_diff>